<commit_message>
Ajusta el guion de la sesion 1 al formato de ponencia
Quita la pausa y las preguntas al publico, suaviza el tono, presenta el sistema como terminado y las limitaciones como retos.
</commit_message>
<xml_diff>
--- a/docs/capacitacion/guion-sesion-1.docx
+++ b/docs/capacitacion/guion-sesion-1.docx
@@ -242,7 +242,7 @@
                 <w:i w:val="0"/>
                 <w:sz w:val="20"/>
               </w:rPr>
-              <w:t>3,686</w:t>
+              <w:t>3,545</w:t>
             </w:r>
           </w:p>
         </w:tc>
@@ -262,7 +262,7 @@
                 <w:i w:val="0"/>
                 <w:sz w:val="20"/>
               </w:rPr>
-              <w:t>14.7</w:t>
+              <w:t>14.2</w:t>
             </w:r>
           </w:p>
         </w:tc>
@@ -344,7 +344,7 @@
                 <w:i w:val="0"/>
                 <w:sz w:val="20"/>
               </w:rPr>
-              <w:t>7,449</w:t>
+              <w:t>7,296</w:t>
             </w:r>
           </w:p>
         </w:tc>
@@ -364,7 +364,7 @@
                 <w:i w:val="0"/>
                 <w:sz w:val="20"/>
               </w:rPr>
-              <w:t>29.8</w:t>
+              <w:t>29.2</w:t>
             </w:r>
           </w:p>
         </w:tc>
@@ -446,7 +446,7 @@
                 <w:i w:val="0"/>
                 <w:sz w:val="20"/>
               </w:rPr>
-              <w:t>12,469</w:t>
+              <w:t>12,391</w:t>
             </w:r>
           </w:p>
         </w:tc>
@@ -466,7 +466,7 @@
                 <w:i w:val="0"/>
                 <w:sz w:val="20"/>
               </w:rPr>
-              <w:t>49.9</w:t>
+              <w:t>49.6</w:t>
             </w:r>
           </w:p>
         </w:tc>
@@ -548,7 +548,7 @@
                 <w:i w:val="0"/>
                 <w:sz w:val="20"/>
               </w:rPr>
-              <w:t>23,604</w:t>
+              <w:t>23,232</w:t>
             </w:r>
           </w:p>
         </w:tc>
@@ -568,7 +568,7 @@
                 <w:i w:val="0"/>
                 <w:sz w:val="20"/>
               </w:rPr>
-              <w:t>94.4</w:t>
+              <w:t>92.9</w:t>
             </w:r>
           </w:p>
         </w:tc>
@@ -581,7 +581,7 @@
           <w:b w:val="0"/>
           <w:i w:val="0"/>
         </w:rPr>
-        <w:t>A los 95 minutos de contenido se suman la pausa de 10 minutos (entre el tema 2 y el tema 3) y 15 minutos de preguntas al final, hasta completar las 2 horas.</w:t>
+        <w:t>A los 95 minutos de contenido se suman 15 minutos de preguntas al final.</w:t>
       </w:r>
     </w:p>
     <w:p>
@@ -634,7 +634,16 @@
           <w:b w:val="0"/>
           <w:i w:val="0"/>
         </w:rPr>
-        <w:t>Escala. El guion la presenta como provisional (60 px = 1 µm) y pide al grupo tres datos de calibración. Si antes de la sesión llega la respuesta, actualizar la sección "La escala en micras".</w:t>
+        <w:t>Escala. El guion la presenta como escala de referencia (60 px = 1 µm) en proceso de calibración y pide al grupo tres datos. Si antes de la sesión llega la respuesta, actualizar la sección "La escala en micras".</w:t>
+      </w:r>
+    </w:p>
+    <w:p>
+      <w:r>
+        <w:rPr>
+          <w:b w:val="0"/>
+          <w:i w:val="0"/>
+        </w:rPr>
+        <w:t>3b. Enfoque. Por indicación del cliente, el guion presenta el sistema como terminado y las limitaciones como retos. No afirma nada que no exista: las medidas de cabeza a cola, la calibración de la escala y el aviso de imagen ajena a la muestra aparecen como retos de la siguiente etapa. Ojo: el sitio en pantalla todavía muestra los recuadros «modelo preliminar» y «escala provisional»; el guion los llama avisos de contexto, pero si se quiere un lenguaje uniforme conviene ajustar también esos textos en el sitio.</w:t>
       </w:r>
     </w:p>
     <w:p>
@@ -736,7 +745,7 @@
           <w:i/>
           <w:color w:val="595959"/>
         </w:rPr>
-        <w:t>3,686 palabras · 14.7 min a 250 palabras por minuto (meta: 15 min, 3,750 palabras)</w:t>
+        <w:t>3,545 palabras · 14.2 min a 250 palabras por minuto (meta: 15 min, 3,750 palabras)</w:t>
       </w:r>
     </w:p>
     <w:p>
@@ -754,7 +763,7 @@
           <w:i/>
           <w:color w:val="595959"/>
         </w:rPr>
-        <w:t>347 palabras · 1.4 min</w:t>
+        <w:t>294 palabras · 1.2 min</w:t>
       </w:r>
     </w:p>
     <w:p>
@@ -776,43 +785,43 @@
           <w:b w:val="0"/>
           <w:i w:val="0"/>
         </w:rPr>
-        <w:t>Buenas tardes a todas y a todos, y gracias por conectarse. Soy Angel Frausto Robles, desarrollador de Image Bio Pro. En las próximas cinco sesiones vamos a recorrer el proyecto completo: qué hace el sitio, cómo funciona la red neuronal que lo sostiene, cómo se entrenó y cómo está construido por dentro. Al final, el grupo debería poder usarlo, entender sus resultados y reentrenar el modelo sin depender de mí.</w:t>
-      </w:r>
-    </w:p>
-    <w:p>
-      <w:r>
-        <w:rPr>
-          <w:b w:val="0"/>
-          <w:i w:val="0"/>
-        </w:rPr>
-        <w:t>Primero, unos acuerdos prácticos. La sesión se está grabando, como quedamos, así que quien no pueda conectarse a alguna podrá verla después. Las diapositivas y el material de apoyo se comparten al terminar la capacitación, cuando ya hayamos incorporado los comentarios de ustedes. Y como esta primera sesión también sirve para que el grupo revise la presentación, les pido que anoten cualquier duda, corrección o sugerencia. Habrá un espacio para preguntas al final de cada bloque y otro más largo al cierre.</w:t>
-      </w:r>
-    </w:p>
-    <w:p>
-      <w:r>
-        <w:rPr>
-          <w:b w:val="0"/>
-          <w:i w:val="0"/>
-        </w:rPr>
-        <w:t>La sesión dura dos horas y se reparte así. Los primeros quince minutos son esta introducción: objetivo, alcance acordado, lo que se entrega el 28 de octubre y lo que queda para después. Luego, treinta minutos de demostración del sitio funcionando: crearemos una cuenta, subiremos una imagen, leeremos los resultados y descargaremos los archivos. Después, una pausa breve. En la última parte, cincuenta minutos, hablaremos de qué es una red neuronal, con una explicación pensada para que la idea se entienda bien y sin matemáticas pesadas.</w:t>
-      </w:r>
-    </w:p>
-    <w:p>
-      <w:r>
-        <w:rPr>
-          <w:b w:val="0"/>
-          <w:i w:val="0"/>
-        </w:rPr>
-        <w:t>Sobre el nivel. Sé que el grupo reúne perfiles distintos: gente con mucha experiencia en programación y análisis de datos, y gente para quien algunos de estos conceptos serán más nuevos. Voy a explicar cada idea desde su base, con ejemplos concretos, y con el vocabulario técnico correcto. Si algún punto les parece demasiado básico o demasiado rápido, díganmelo y ajusto sobre la marcha.</w:t>
-      </w:r>
-    </w:p>
-    <w:p>
-      <w:r>
-        <w:rPr>
-          <w:b w:val="0"/>
-          <w:i w:val="0"/>
-        </w:rPr>
-        <w:t>Para las preguntas puntuales, escríbanlas en el chat y las voy atendiendo en cada pausa, o levanten la mano. Las que necesiten más tiempo las dejamos para los espacios de preguntas, que existen justamente para eso.</w:t>
+        <w:t>Buenas tardes a todas y a todos, y gracias por conectarse. Soy Angel Frausto Robles, desarrollador de Image Bio Pro. En las próximas cinco sesiones vamos a recorrer el proyecto completo: qué hace el sitio, cómo funciona la red neuronal que lo sostiene, cómo se entrenó y cómo está construido por dentro. La idea es que el grupo pueda usarlo, entender sus resultados y reentrenar el modelo sin depender de mí.</w:t>
+      </w:r>
+    </w:p>
+    <w:p>
+      <w:r>
+        <w:rPr>
+          <w:b w:val="0"/>
+          <w:i w:val="0"/>
+        </w:rPr>
+        <w:t>Primero, unos acuerdos prácticos. La sesión se está grabando, como quedamos, así que quien no pueda conectarse a alguna podrá verla después. Las diapositivas y el material de apoyo se comparten al terminar la capacitación, cuando ya hayamos incorporado los comentarios de ustedes. Y como esta primera sesión también sirve para que el grupo revise la presentación, pueden anotar cualquier duda, corrección o sugerencia. Habrá un espacio de preguntas y comentarios al cierre de la sesión.</w:t>
+      </w:r>
+    </w:p>
+    <w:p>
+      <w:r>
+        <w:rPr>
+          <w:b w:val="0"/>
+          <w:i w:val="0"/>
+        </w:rPr>
+        <w:t>La sesión dura dos horas y se reparte así. Los primeros quince minutos son esta introducción: objetivo, alcance acordado, lo que se entrega el 28 de octubre y lo que queda para después. Luego, treinta minutos de demostración del sitio funcionando: crearemos una cuenta, subiremos una imagen, leeremos los resultados y descargaremos los archivos. En la última parte, cincuenta minutos, hablaremos de qué es una red neuronal, con una explicación pensada para que la idea se entienda bien y sin matemáticas pesadas.</w:t>
+      </w:r>
+    </w:p>
+    <w:p>
+      <w:r>
+        <w:rPr>
+          <w:b w:val="0"/>
+          <w:i w:val="0"/>
+        </w:rPr>
+        <w:t>Sobre el nivel. El grupo reúne trayectorias distintas, así que voy a explicar cada idea desde su base, con ejemplos concretos y con el vocabulario técnico correcto. Lo que necesite más detalle se retoma en las sesiones siguientes y en el material de apoyo.</w:t>
+      </w:r>
+    </w:p>
+    <w:p>
+      <w:r>
+        <w:rPr>
+          <w:b w:val="0"/>
+          <w:i w:val="0"/>
+        </w:rPr>
+        <w:t>Las preguntas se atienden al final, en el espacio previsto para eso.</w:t>
       </w:r>
     </w:p>
     <w:p>
@@ -839,7 +848,7 @@
           <w:i/>
           <w:color w:val="595959"/>
         </w:rPr>
-        <w:t>623 palabras · 2.5 min</w:t>
+        <w:t>604 palabras · 2.4 min</w:t>
       </w:r>
     </w:p>
     <w:p>
@@ -888,7 +897,7 @@
           <w:b w:val="0"/>
           <w:i w:val="0"/>
         </w:rPr>
-        <w:t>También hay un objetivo a más largo plazo. El modelo que se entrega el 28 de octubre es una primera versión. Lo hemos dicho desde el principio: se entrenó con pocas imágenes y sus resultados son aproximados. La idea es que el grupo pueda mejorarlo con sus propias imágenes, y por eso la capacitación no se limita a enseñar a usar el sitio. También cubre cómo se entrena el modelo, cómo se anotan las imágenes y cómo se sube un modelo nuevo al servidor. Un modelo así no aprende solo una vez que está en línea. Si llegan imágenes nuevas, otras tinciones u otro tipo de célula, hay que reentrenarlo aparte y cambiar el archivo del modelo. Dominar ese ciclo le da independencia al grupo, y es buena parte de la razón de estas diez horas.</w:t>
+        <w:t>También hay un objetivo a más largo plazo. El modelo que se entrega el 28 de octubre está pensado para crecer: el grupo podrá mejorarlo con sus propias imágenes, y por eso la capacitación no se limita a enseñar a usar el sitio. También cubre cómo se entrena el modelo, cómo se anotan las imágenes y cómo se sube un modelo nuevo al servidor. Un modelo así no aprende solo una vez que está en línea. Si llegan imágenes nuevas, otras tinciones u otro tipo de célula, se reentrena aparte y se cambia el archivo del modelo. Dominar ese ciclo le da independencia al grupo, y es buena parte de la razón de estas diez horas.</w:t>
       </w:r>
     </w:p>
     <w:p>
@@ -906,7 +915,7 @@
           <w:b w:val="0"/>
           <w:i w:val="0"/>
         </w:rPr>
-        <w:t>Un comentario sobre cómo se tomaron las decisiones, porque ayuda a entender lo que van a ver. Los requisitos del sitio salen de las reuniones con el grupo, y cada uno quedó anotado junto a la frase que lo originó. Lo que no se dijo en esas reuniones no lo supuse: lo dejé como pendiente para preguntarlo. Más adelante, con la escala en micras, van a ver un ejemplo claro.</w:t>
+        <w:t>Un comentario sobre cómo se tomaron las decisiones, porque ayuda a entender lo que van a ver. Los requisitos del sitio salen de las reuniones con el grupo, y cada uno quedó anotado junto a la frase que lo originó. Lo que no se dijo en esas reuniones no lo supuse: lo dejé por definir con el grupo. Más adelante, con la escala en micras, van a ver un ejemplo claro.</w:t>
       </w:r>
     </w:p>
     <w:p>
@@ -1045,7 +1054,7 @@
           <w:i/>
           <w:color w:val="595959"/>
         </w:rPr>
-        <w:t>692 palabras · 2.8 min</w:t>
+        <w:t>636 palabras · 2.5 min</w:t>
       </w:r>
     </w:p>
     <w:p>
@@ -1067,61 +1076,61 @@
           <w:b w:val="0"/>
           <w:i w:val="0"/>
         </w:rPr>
-        <w:t>Hablemos de fechas. El desarrollo empezó el 8 de octubre y la construcción se hizo entre el 8 y el 16. Del 17 al 27 se da la capacitación, y en paralelo se hacen ajustes y pruebas. El 28 de octubre se entrega el sitio con la versión inicial de la red neuronal.</w:t>
-      </w:r>
-    </w:p>
-    <w:p>
-      <w:r>
-        <w:rPr>
-          <w:b w:val="0"/>
-          <w:i w:val="0"/>
-        </w:rPr>
-        <w:t>Veamos qué significa «versión inicial». Lo que se entrega es un sitio completo y en línea, con cuentas, carga de imágenes, análisis, resultados, gráficas, exportación a CSV y PDF, y dos modelos entrenados: uno para fotografías de fondo oscuro, que son las de fluorescencia, y otro para fotografías de fondo claro. El sitio mide el brillo de cada fotografía y elige solo el modelo que le toca.</w:t>
-      </w:r>
-    </w:p>
-    <w:p>
-      <w:r>
-        <w:rPr>
-          <w:b w:val="0"/>
-          <w:i w:val="0"/>
-        </w:rPr>
-        <w:t>Lo que todavía no existe es un modelo con validez científica definitiva, y prefiero decirlo claro. Los dos modelos actuales se entrenaron con muy pocas imágenes: cuatro fotografías en fluorescencia, con 258 espermatozoides etiquetados, y cuatro en fondo claro, con 45. Con tan poco material funcionan razonablemente en escenas parecidas a las del entrenamiento, pero no sabemos cómo responderán con otras muestras, otras tinciones o imágenes con compresión. En zonas con muchos espermatozoides juntos, el modelo puede repetir o partir contornos y dejar algunos sin detectar, así que ahí los conteos son aproximados. El sitio lo avisa en cada resultado con un mensaje que dice que el modelo es preliminar y se entrenó con pocas imágenes. Es una condición conocida de esta primera entrega, declarada a la vista, y es la razón de que exista la etapa posterior de actualización de la red.</w:t>
-      </w:r>
-    </w:p>
-    <w:p>
-      <w:r>
-        <w:rPr>
-          <w:b w:val="0"/>
-          <w:i w:val="0"/>
-        </w:rPr>
-        <w:t>Hay además dos pendientes técnicos que afectan lo que van a ver en la demostración. El primero es la escala en micras. Las fotografías que el grupo ha compartido no traen barra de escala ni regla impresa, y los archivos tampoco guardan esa información. Mientras no haya una calibración medida, el sitio usa una equivalencia provisional de sesenta píxeles por micra, que sale de una referencia que nos dieron: una raya de 300 píxeles equivale a cinco micras. Cada resultado avisa que la escala es provisional. La solución definitiva necesita datos que solo el grupo puede dar: con qué cámara y programa se toman las fotos y, de preferencia, una fotografía de una regla de calibración hecha con el mismo equipo. Ya tengo preparado el mensaje para pedirlo. Con esa información se arma una tabla de escalas que se edita sin tocar el código.</w:t>
-      </w:r>
-    </w:p>
-    <w:p>
-      <w:r>
-        <w:rPr>
-          <w:b w:val="0"/>
-          <w:i w:val="0"/>
-        </w:rPr>
-        <w:t>El segundo pendiente es el tiempo de análisis en el servidor definitivo. En una computadora de escritorio, sin otros procesos, una fotografía grande de fluorescencia tarda unos cuarenta segundos y una de fondo claro entre diez y veinte. En el servidor contratado el tiempo puede ser distinto, quizá varias veces mayor, y falta medirlo. En las reuniones se dijo que dos o tres minutos de espera son aceptables, así que hay margen, y el sitio tiene tiempos de espera amplios y una barra de progreso. Aun así, es una medición que debo confirmar en el servidor real antes de la entrega.</w:t>
-      </w:r>
-    </w:p>
-    <w:p>
-      <w:r>
-        <w:rPr>
-          <w:b w:val="0"/>
-          <w:i w:val="0"/>
-        </w:rPr>
-        <w:t>Pasemos a las etapas posteriores, acordadas con el grupo para después de la primera entrega. Salvo la actualización de la red, todavía no tienen fecha.</w:t>
-      </w:r>
-    </w:p>
-    <w:p>
-      <w:r>
-        <w:rPr>
-          <w:b w:val="0"/>
-          <w:i w:val="0"/>
-        </w:rPr>
-        <w:t>La primera es una capacitación adicional de treinta horas en inteligencia artificial. La segunda es la red neuronal convolucional B, que probablemente será la clasificación de control contra tratamiento que mencioné hace un momento; falta confirmarlo. La tercera es la red multimodal, que combinaría imágenes con datos numéricos y que antes necesita una verificación de viabilidad con sus datos. La cuarta es la actualización de la red actual: reentrenarla con un lote real de unas cincuenta imágenes que generará el grupo, con fecha flexible hasta marzo de 2027.</w:t>
+        <w:t>Hablemos de fechas. El desarrollo empezó el 8 de octubre y la construcción se hizo entre el 8 y el 16. Del 17 al 27 se da la capacitación, y en paralelo se hacen ajustes y pruebas. El 28 de octubre se entrega el sitio con la red neuronal entrenada.</w:t>
+      </w:r>
+    </w:p>
+    <w:p>
+      <w:r>
+        <w:rPr>
+          <w:b w:val="0"/>
+          <w:i w:val="0"/>
+        </w:rPr>
+        <w:t>Veamos qué se entrega. Un sitio completo y en línea, con cuentas, carga de imágenes, análisis, resultados, gráficas, exportación a CSV y PDF, y dos modelos entrenados: uno para fotografías de fondo oscuro, que son las de fluorescencia, y otro para fotografías de fondo claro. El sitio mide el brillo de cada fotografía y elige solo el modelo que le toca.</w:t>
+      </w:r>
+    </w:p>
+    <w:p>
+      <w:r>
+        <w:rPr>
+          <w:b w:val="0"/>
+          <w:i w:val="0"/>
+        </w:rPr>
+        <w:t>Ahora, los retos de esta etapa, que son parte natural de cualquier modelo de aprendizaje automático. El primero es el volumen de datos. Los dos modelos se entrenaron con cuatro fotografías en fluorescencia, con 258 espermatozoides etiquetados, y cuatro en fondo claro, con 45. Con ese material funcionan bien en escenas parecidas a las del entrenamiento, y el reto es ampliar la variedad: otras muestras, otras tinciones, imágenes con compresión. El segundo es la aglomeración: donde hay muchos espermatozoides juntos, el modelo puede repetir o partir contornos, así que ahí los conteos se leen como estimaciones. El sitio acompaña cada resultado con un aviso de contexto sobre el modelo. Los dos retos tienen un camino definido: la etapa posterior de actualización de la red.</w:t>
+      </w:r>
+    </w:p>
+    <w:p>
+      <w:r>
+        <w:rPr>
+          <w:b w:val="0"/>
+          <w:i w:val="0"/>
+        </w:rPr>
+        <w:t>Hay además dos retos técnicos que se ven en la demostración. El primero es la escala en micras. Las fotografías que el grupo ha compartido no traen barra de escala ni regla impresa, y los archivos tampoco guardan esa información. Mientras llega una calibración medida, el sitio trabaja con una equivalencia de referencia de sesenta píxeles por micra, que sale de una raya de 300 píxeles que equivale a cinco micras, y cada resultado indica la escala que se usó. Calibrarla con el equipo del grupo requiere dos datos: con qué cámara y programa se toman las fotos y, de preferencia, una fotografía de una regla de calibración hecha con el mismo equipo. Con eso se arma una tabla de escalas que se edita sin tocar el código.</w:t>
+      </w:r>
+    </w:p>
+    <w:p>
+      <w:r>
+        <w:rPr>
+          <w:b w:val="0"/>
+          <w:i w:val="0"/>
+        </w:rPr>
+        <w:t>El segundo reto es el tiempo de análisis en el servidor definitivo. En una computadora de escritorio, sin otros procesos, una fotografía grande de fluorescencia tarda unos cuarenta segundos y una de fondo claro entre diez y veinte. En el servidor contratado el tiempo puede ser distinto, y se mide ahí para ajustar la configuración. En las reuniones se dijo que dos o tres minutos de espera son aceptables, así que hay margen, y el sitio tiene tiempos de espera amplios y una barra de progreso.</w:t>
+      </w:r>
+    </w:p>
+    <w:p>
+      <w:r>
+        <w:rPr>
+          <w:b w:val="0"/>
+          <w:i w:val="0"/>
+        </w:rPr>
+        <w:t>Pasemos a las etapas posteriores, acordadas con el grupo para después de la primera entrega. Salvo la actualización de la red, se programarán más adelante.</w:t>
+      </w:r>
+    </w:p>
+    <w:p>
+      <w:r>
+        <w:rPr>
+          <w:b w:val="0"/>
+          <w:i w:val="0"/>
+        </w:rPr>
+        <w:t>La primera es una capacitación adicional de treinta horas en inteligencia artificial. La segunda es la red neuronal convolucional B, que probablemente será la clasificación de control contra tratamiento que mencioné hace un momento; se confirmará con el grupo. La tercera es la red multimodal, que combinaría imágenes con datos numéricos y que antes necesita una verificación de viabilidad con sus datos. La cuarta es la actualización de la red actual: reentrenarla con un lote real de unas cincuenta imágenes que generará el grupo, con fecha flexible hasta marzo de 2027.</w:t>
       </w:r>
     </w:p>
     <w:p>
@@ -1148,7 +1157,7 @@
           <w:i/>
           <w:color w:val="595959"/>
         </w:rPr>
-        <w:t>332 palabras · 1.3 min</w:t>
+        <w:t>335 palabras · 1.3 min</w:t>
       </w:r>
     </w:p>
     <w:p>
@@ -1188,16 +1197,16 @@
           <w:b w:val="0"/>
           <w:i w:val="0"/>
         </w:rPr>
-        <w:t>Segundo, leer los resultados con criterio. Un número solo no basta; hay que saber de dónde sale, qué puede distorsionarlo y cuándo desconfiar. Por ejemplo, que el conteo en una zona muy poblada es aproximado, o que una medida en micras depende de una escala que todavía es provisional. Un resultado bien interpretado vale más que uno impecable pero mal entendido.</w:t>
-      </w:r>
-    </w:p>
-    <w:p>
-      <w:r>
-        <w:rPr>
-          <w:b w:val="0"/>
-          <w:i w:val="0"/>
-        </w:rPr>
-        <w:t>Tercero, comprender qué hace la red y qué no. Tener un modelo mental lo bastante claro como para explicárselo a otra persona, prever en qué casos va a fallar y decidir qué datos nuevos le harían falta. A eso dedicamos la última parte de hoy y buena parte de la segunda sesión.</w:t>
+        <w:t>Segundo, leer los resultados con criterio. Un número solo no basta; hay que saber de dónde sale, qué puede distorsionarlo y cuándo tomarlo con cautela. Por ejemplo, que el conteo en una zona muy poblada es una estimación, o que una medida en micras depende de la escala con que se calibró. Un resultado bien interpretado vale más que uno impecable pero mal entendido.</w:t>
+      </w:r>
+    </w:p>
+    <w:p>
+      <w:r>
+        <w:rPr>
+          <w:b w:val="0"/>
+          <w:i w:val="0"/>
+        </w:rPr>
+        <w:t>Tercero, comprender qué hace la red y qué no. Tener un modelo mental lo bastante claro como para explicárselo a otra persona, prever en qué casos tendrá más dificultad y decidir qué datos nuevos le harían falta. A eso dedicamos la última parte de hoy y buena parte de la segunda sesión.</w:t>
       </w:r>
     </w:p>
     <w:p>
@@ -1242,7 +1251,7 @@
           <w:i/>
           <w:color w:val="595959"/>
         </w:rPr>
-        <w:t>260 palabras · 1.0 min</w:t>
+        <w:t>262 palabras · 1.0 min</w:t>
       </w:r>
     </w:p>
     <w:p>
@@ -1282,7 +1291,7 @@
           <w:b w:val="0"/>
           <w:i w:val="0"/>
         </w:rPr>
-        <w:t>El segundo es no suponer. Cuando faltaba un dato, como la escala de las imágenes o lo que marca cada tinción, no lo inventé: lo dejé como pendiente y lo señalé en pantalla. Por eso el sitio avisa que la escala es provisional y presenta el modelo como preliminar. Prefiero un aviso honesto a un número que parezca más seguro de lo que es.</w:t>
+        <w:t>El segundo es no suponer. Cuando faltaba un dato, como la escala de las imágenes o lo que marca cada tinción, no lo inventé: lo dejé por definir con el grupo y lo indiqué en pantalla. Por eso cada resultado señala la escala que se usó y el estado del modelo. Prefiero un aviso claro a un número que parezca más seguro de lo que es.</w:t>
       </w:r>
     </w:p>
     <w:p>
@@ -1327,7 +1336,7 @@
           <w:i/>
           <w:color w:val="595959"/>
         </w:rPr>
-        <w:t>386 palabras · 1.5 min</w:t>
+        <w:t>383 palabras · 1.5 min</w:t>
       </w:r>
     </w:p>
     <w:p>
@@ -1367,7 +1376,7 @@
           <w:b w:val="0"/>
           <w:i w:val="0"/>
         </w:rPr>
-        <w:t>El segundo es el dominio, la dirección del sitio. Cuesta del orden de doscientos a cuatrocientos pesos al año, y falta que el grupo defina cuál quiere.</w:t>
+        <w:t>El segundo es el dominio, la dirección del sitio. Cuesta del orden de doscientos a cuatrocientos pesos al año, y se define con el grupo.</w:t>
       </w:r>
     </w:p>
     <w:p>
@@ -1385,7 +1394,7 @@
           <w:b w:val="0"/>
           <w:i w:val="0"/>
         </w:rPr>
-        <w:t>¿Cuánta gente puede usar el sitio a la vez? La estimación es que soporta cientos de visitantes navegando y varios análisis simultáneos, que para un grupo de investigación sobra. Lo importante es la palabra «estimación»: se confirma midiendo en el servidor real, y esa medición forma parte de lo que falta antes de la entrega. Un detalle técnico que explica el límite: los análisis se atienden de uno en uno, y los demás esperan su turno. Con pocos usuarios no se nota; con muchos, la espera se acumularía.</w:t>
+        <w:t>¿Cuánta gente puede usar el sitio a la vez? La estimación es que soporta cientos de visitantes navegando y varios análisis simultáneos, que para un grupo de investigación sobra. Lo importante es la palabra «estimación»: se confirma midiendo en el servidor real, y esa medición forma parte de las pruebas previas a la entrega. Un detalle técnico que explica el límite: los análisis se atienden de uno en uno, y los demás esperan su turno. Con pocos usuarios no se nota; con muchos, la espera se acumularía.</w:t>
       </w:r>
     </w:p>
     <w:p>
@@ -1412,7 +1421,7 @@
           <w:i/>
           <w:color w:val="595959"/>
         </w:rPr>
-        <w:t>444 palabras · 1.8 min</w:t>
+        <w:t>429 palabras · 1.7 min</w:t>
       </w:r>
     </w:p>
     <w:p>
@@ -1506,7 +1515,7 @@
           <w:b w:val="0"/>
           <w:i w:val="0"/>
         </w:rPr>
-        <w:t>Eso es todo para la introducción. Antes de pasar a la demostración, ¿hay alguna pregunta o comentario sobre el objetivo, el alcance o el calendario?</w:t>
+        <w:t>Eso es todo para la introducción. Pasemos a la demostración.</w:t>
       </w:r>
     </w:p>
     <w:p>
@@ -1519,7 +1528,7 @@
           <w:i/>
           <w:color w:val="1F4E79"/>
         </w:rPr>
-        <w:t>[Pausa de 1 minuto para preguntas. Si no hay, continuar.]</w:t>
+        <w:t>[Cambiar al navegador.]</w:t>
       </w:r>
     </w:p>
     <w:p>
@@ -1537,7 +1546,7 @@
           <w:i/>
           <w:color w:val="595959"/>
         </w:rPr>
-        <w:t>7,449 palabras · 29.8 min a 250 palabras por minuto (meta: 30 min, 7,500 palabras)</w:t>
+        <w:t>7,296 palabras · 29.2 min a 250 palabras por minuto (meta: 30 min, 7,500 palabras)</w:t>
       </w:r>
     </w:p>
     <w:p>
@@ -1555,7 +1564,7 @@
           <w:i/>
           <w:color w:val="595959"/>
         </w:rPr>
-        <w:t>588 palabras · 2.4 min</w:t>
+        <w:t>574 palabras · 2.3 min</w:t>
       </w:r>
     </w:p>
     <w:p>
@@ -1613,7 +1622,7 @@
           <w:b w:val="0"/>
           <w:i w:val="0"/>
         </w:rPr>
-        <w:t>Sobre ese formulario: funciona y guarda cada mensaje en la base de datos del sitio, pero el envío por correo todavía no está activo, porque falta que el grupo nos diga a qué dirección deben llegar. Es uno de los pendientes, y lo menciono para que no parezca un olvido.</w:t>
+        <w:t>Sobre ese formulario: funciona y guarda cada mensaje en la base de datos del sitio. La dirección de correo a la que deben llegar se define con el grupo, y con eso el envío queda configurado.</w:t>
       </w:r>
     </w:p>
     <w:p>
@@ -1667,7 +1676,7 @@
           <w:i/>
           <w:color w:val="595959"/>
         </w:rPr>
-        <w:t>604 palabras · 2.4 min</w:t>
+        <w:t>595 palabras · 2.4 min</w:t>
       </w:r>
     </w:p>
     <w:p>
@@ -1738,7 +1747,7 @@
           <w:b w:val="0"/>
           <w:i w:val="0"/>
         </w:rPr>
-        <w:t>La primera: cualquiera puede registrarse sin que un administrador lo apruebe. Así se planteó en las reuniones, como un trámite sencillo. No hay panel de administración para aprobar o dar de baja usuarios. Si más adelante el grupo lo necesita se puede agregar, pero hoy no está en el alcance.</w:t>
+        <w:t>La primera: cualquiera puede registrarse sin que un administrador lo apruebe. Así se planteó en las reuniones, como un trámite sencillo. Un panel de administración para aprobar o dar de baja usuarios es una ampliación posible si el grupo lo necesita.</w:t>
       </w:r>
     </w:p>
     <w:p>
@@ -1823,7 +1832,7 @@
           <w:i/>
           <w:color w:val="595959"/>
         </w:rPr>
-        <w:t>766 palabras · 3.1 min</w:t>
+        <w:t>746 palabras · 3.0 min</w:t>
       </w:r>
     </w:p>
     <w:p>
@@ -1863,7 +1872,7 @@
           <w:b w:val="0"/>
           <w:i w:val="0"/>
         </w:rPr>
-        <w:t>Fíjense en el texto sobre el campo: «Sube tus imágenes (hasta 10)». Se pueden subir de una a diez imágenes en una sola operación. Debajo hay una nota sobre los formatos aceptados: BMP, PNG o TIFF, y también JPG, con una advertencia, porque el JPG pierde calidad al comprimirse. Esa advertencia pesa más de lo que parece. En las reuniones se insistió en que las imágenes lleguen con la mayor calidad posible, tal como salen del microscopio y sin pasar por aplicaciones de mensajería, que las comprimen. Una imagen comprimida puede alterar los bordes de las células, y con ellos los contornos y las medidas. Siempre que se pueda, conviene subir los archivos originales.</w:t>
+        <w:t>El texto sobre el campo dice: «Sube tus imágenes (hasta 10)». Se pueden subir de una a diez imágenes en una sola operación. Debajo hay una nota sobre los formatos aceptados: BMP, PNG o TIFF, y también JPG, con una advertencia, porque el JPG pierde calidad al comprimirse. Esa advertencia pesa más de lo que parece. En las reuniones se insistió en que las imágenes lleguen con la mayor calidad posible, tal como salen del microscopio y sin pasar por aplicaciones de mensajería, que las comprimen. Una imagen comprimida puede alterar los bordes de las células, y con ellos los contornos y las medidas. Siempre que se pueda, conviene subir los archivos originales.</w:t>
       </w:r>
     </w:p>
     <w:p>
@@ -1894,7 +1903,7 @@
           <w:b w:val="0"/>
           <w:i w:val="0"/>
         </w:rPr>
-        <w:t>Al hacer clic aparece una cubierta que dice «Analizando las imágenes…», con una barra de progreso animada y la indicación «No cierres esta página». Es la barra que se pidió, y es una barra de actividad, no de porcentaje. El análisis de una imagen es una sola operación larga en el servidor, y el navegador no recibe información intermedia hasta que termina. Se podría haber construido algo más sofisticado, con consultas periódicas del avance, pero para esta primera entrega elegí algo simple y robusto: la barra confirma que el sistema está trabajando y que la petición no se perdió.</w:t>
+        <w:t>Al hacer clic aparece una cubierta que dice «Analizando las imágenes…», con una barra de progreso animada y la indicación «No cierres esta página». Es la barra que se pidió, y es una barra de actividad, no de porcentaje. El análisis de una imagen es una sola operación en el servidor, y el navegador recibe el resultado cuando termina. Para esta entrega elegí una solución simple y robusta: la barra confirma que el sistema está trabajando y que la petición no se perdió.</w:t>
       </w:r>
     </w:p>
     <w:p>
@@ -1912,7 +1921,7 @@
           <w:b w:val="0"/>
           <w:i w:val="0"/>
         </w:rPr>
-        <w:t>Sobre el tiempo, hablo con franqueza. En mi computadora de desarrollo, una fotografía grande de fluorescencia tarda unos cuarenta segundos, y una de fondo claro entre diez y veinte. En el servidor definitivo los tiempos pueden ser mayores y todavía no los medimos allí. Si suben diez imágenes, el sistema las analiza una tras otra, así que el tiempo total es la suma. Por eso el sitio tiene tiempos de espera amplios, de hasta media hora, y la nota bajo el campo dice que el análisis puede tardar de unos segundos a varios minutos por imagen. En las reuniones se dijo que dos o tres minutos de espera eran aceptables, incluso deseables por percepción comercial. Si en el servidor real el tiempo resulta excesivo hay dos salidas previstas: limitar el número de imágenes por envío, o pasar el análisis a segundo plano con una página de espera.</w:t>
+        <w:t>Sobre el tiempo. En mi computadora de desarrollo, una fotografía grande de fluorescencia tarda unos cuarenta segundos, y una de fondo claro entre diez y veinte. En el servidor definitivo los tiempos pueden variar, y se miden ahí para ajustar la configuración. Si suben diez imágenes, el sistema las analiza una tras otra, así que el tiempo total es la suma. Por eso el sitio tiene tiempos de espera amplios, de hasta media hora, y la nota bajo el campo dice que el análisis puede tardar de unos segundos a varios minutos por imagen. En las reuniones se dijo que dos o tres minutos de espera eran aceptables, incluso deseables por percepción comercial. Si en algún momento el tiempo resultara excesivo, hay dos salidas previstas: limitar el número de imágenes por envío, o pasar el análisis a segundo plano con una página de espera.</w:t>
       </w:r>
     </w:p>
     <w:p>
@@ -1961,7 +1970,7 @@
           <w:i/>
           <w:color w:val="595959"/>
         </w:rPr>
-        <w:t>831 palabras · 3.3 min</w:t>
+        <w:t>814 palabras · 3.3 min</w:t>
       </w:r>
     </w:p>
     <w:p>
@@ -2001,7 +2010,7 @@
           <w:b w:val="0"/>
           <w:i w:val="0"/>
         </w:rPr>
-        <w:t>Enseguida hay dos recuadros de aviso, y conviene leerlos porque son parte del resultado. El primero, en amarillo, dice que el modelo es preliminar, entrenado con pocas imágenes, que los resultados son aproximados y que donde hay muchos espermatozoides juntos el conteo puede ser menos exacto. El segundo, en azul, dice que la escala es provisional: se usan sesenta píxeles por micra para todas las imágenes, y las medidas en micras son aproximadas. Los dos avisos se repiten en el PDF. Fue una decisión consciente: quien reciba un informe sin haber visto esta pantalla sabrá con qué cautela leerlo.</w:t>
+        <w:t>Enseguida hay dos recuadros de contexto, y conviene leerlos porque son parte del resultado. El primero, en amarillo, señala el estado del modelo: está entrenado con un número acotado de imágenes y donde hay muchos espermatozoides juntos el conteo se lee como una estimación. El segundo, en azul, indica la escala que se usó: sesenta píxeles por micra para todas las imágenes. Los dos se repiten en el PDF. Fue una decisión consciente: quien reciba un informe sin haber visto esta pantalla sabrá con qué contexto leerlo.</w:t>
       </w:r>
     </w:p>
     <w:p>
@@ -2046,25 +2055,25 @@
           <w:b w:val="0"/>
           <w:i w:val="0"/>
         </w:rPr>
-        <w:t>Debajo, en letra más pequeña, hay dos líneas de texto. La primera describe el largo del espermatozoide: media y desviación estándar en píxeles, con el mínimo y el máximo observados. La segunda pasa el área y el largo a micras con la escala provisional, y por eso lleva la leyenda «escala provisional».</w:t>
-      </w:r>
-    </w:p>
-    <w:p>
-      <w:r>
-        <w:rPr>
-          <w:b w:val="0"/>
-          <w:i w:val="0"/>
-        </w:rPr>
-        <w:t>Aquí hay un cambio de vocabulario que conviene conocer. Al principio las medidas se llamaban «área de la cabeza» y «largo de la cabeza». Pero los contornos que traza el modelo cubren el espermatozoide visible completo, es decir, la cabeza y el primer tramo de la cola, no solo la cabeza. Por eso la pantalla, el CSV y el PDF dicen hoy «espermatozoide», que es lo que realmente se mide. Las medidas de cabeza a cola (la recta y la distancia real siguiendo la cola doblada) que el grupo pidió en la segunda reunión todavía no están, porque el modelo actual no distingue la frontera entre cabeza y cola. Está en la lista de pendientes, y es una de las razones para actualizar la red con más imágenes.</w:t>
-      </w:r>
-    </w:p>
-    <w:p>
-      <w:r>
-        <w:rPr>
-          <w:b w:val="0"/>
-          <w:i w:val="0"/>
-        </w:rPr>
-        <w:t>Falta la gráfica, «Distribución de tamaños». Es un histograma: en el eje horizontal está el área del espermatozoide en píxeles, dividida en intervalos, y en el vertical cuántas células cayeron en cada intervalo. El mínimo y el máximo del eje se toman de cada imagen, como se acordó, de modo que la gráfica siempre aprovecha todo su ancho. El sitio no supone ninguna forma para esta distribución: puede salir como campana, con dos picos o de otra manera, lo que digan los datos. Solo dibujamos lo que se midió, sin compararlo con tamaños de referencia de ninguna especie, porque esa interpretación le corresponde al grupo.</w:t>
+        <w:t>Debajo, en letra más pequeña, hay dos líneas de texto. La primera describe el largo del espermatozoide: media y desviación estándar en píxeles, con el mínimo y el máximo observados. La segunda pasa el área y el largo a micras con la escala de referencia, y por eso lleva esa leyenda.</w:t>
+      </w:r>
+    </w:p>
+    <w:p>
+      <w:r>
+        <w:rPr>
+          <w:b w:val="0"/>
+          <w:i w:val="0"/>
+        </w:rPr>
+        <w:t>Aquí hay un cambio de vocabulario que conviene conocer. Al principio las medidas se llamaban «área de la cabeza» y «largo de la cabeza». Pero los contornos que traza el modelo cubren el espermatozoide visible completo, es decir, la cabeza y el primer tramo de la cola, no solo la cabeza. Por eso la pantalla, el CSV y el PDF dicen hoy «espermatozoide», que es lo que realmente se mide. Las medidas de cabeza a cola (la recta y la distancia real siguiendo la cola doblada) que el grupo pidió en la segunda reunión son uno de los retos de la siguiente etapa: requieren que el modelo distinga la frontera entre cabeza y cola, y por eso la actualización de la red las incluye.</w:t>
+      </w:r>
+    </w:p>
+    <w:p>
+      <w:r>
+        <w:rPr>
+          <w:b w:val="0"/>
+          <w:i w:val="0"/>
+        </w:rPr>
+        <w:t>Queda la gráfica, «Distribución de tamaños». Es un histograma: en el eje horizontal está el área del espermatozoide en píxeles, dividida en intervalos, y en el vertical cuántas células cayeron en cada intervalo. El mínimo y el máximo del eje se toman de cada imagen, como se acordó, de modo que la gráfica siempre aprovecha todo su ancho. El sitio no supone ninguna forma para esta distribución: puede salir como campana, con dos picos o de otra manera, lo que digan los datos. Solo dibujamos lo que se midió, sin compararlo con tamaños de referencia de ninguna especie, porque esa interpretación le corresponde al grupo.</w:t>
       </w:r>
     </w:p>
     <w:p>
@@ -2215,7 +2224,7 @@
           <w:i/>
           <w:color w:val="595959"/>
         </w:rPr>
-        <w:t>528 palabras · 2.1 min</w:t>
+        <w:t>531 palabras · 2.1 min</w:t>
       </w:r>
     </w:p>
     <w:p>
@@ -2300,16 +2309,16 @@
           <w:b w:val="0"/>
           <w:i w:val="0"/>
         </w:rPr>
-        <w:t>Los píxeles y las micras. Si la misma comparación se hiciera en micras, con la escala provisional de sesenta píxeles por micra, los números serían proporcionales y las conclusiones relativas no cambiarían, porque el mismo factor se aplica a todo. Lo que sí cambiaría es cualquier comparación contra un valor externo, por ejemplo uno publicado en micras. Para esas comparaciones la escala debe estar calibrada. Mientras no lo esté, las comparaciones entre imágenes del sitio son válidas y las comparaciones contra la literatura no.</w:t>
-      </w:r>
-    </w:p>
-    <w:p>
-      <w:r>
-        <w:rPr>
-          <w:b w:val="0"/>
-          <w:i w:val="0"/>
-        </w:rPr>
-        <w:t>Y la calidad del análisis. Antes de comparar nada, hay que mirar los avisos y la imagen marcada de cada fotografía. Si una de las dos tuvo mucha aglomeración, su conteo es el menos confiable. Eso se ve en el zoom en un minuto, y evita sacar conclusiones de un número que el propio modelo califica como aproximado.</w:t>
+        <w:t>Los píxeles y las micras. Si la misma comparación se hiciera en micras, con la escala de referencia de sesenta píxeles por micra, los números serían proporcionales y las conclusiones relativas no cambiarían, porque el mismo factor se aplica a todo. Lo que sí cambiaría es cualquier comparación contra un valor externo, por ejemplo uno publicado en micras. Para esas comparaciones la escala debe estar calibrada. Con la escala de referencia, las comparaciones entre imágenes del sitio son válidas; las comparaciones contra la literatura requieren la calibración.</w:t>
+      </w:r>
+    </w:p>
+    <w:p>
+      <w:r>
+        <w:rPr>
+          <w:b w:val="0"/>
+          <w:i w:val="0"/>
+        </w:rPr>
+        <w:t>Y la calidad del análisis. Antes de comparar nada, hay que mirar los avisos y la imagen marcada de cada fotografía. Si una de las dos tuvo mucha aglomeración, su conteo es el menos confiable. Eso se ve en el zoom en un minuto, y evita sacar conclusiones de un número que el propio sitio señala como estimación.</w:t>
       </w:r>
     </w:p>
     <w:p>
@@ -2336,7 +2345,7 @@
           <w:i/>
           <w:color w:val="595959"/>
         </w:rPr>
-        <w:t>521 palabras · 2.1 min</w:t>
+        <w:t>477 palabras · 1.9 min</w:t>
       </w:r>
     </w:p>
     <w:p>
@@ -2394,7 +2403,7 @@
           <w:b w:val="0"/>
           <w:i w:val="0"/>
         </w:rPr>
-        <w:t>La cuarta es la que más pesa en la confianza: una imagen que se abre bien pero en la que el modelo no encuentra nada. Puede estar desenfocada, ser de mala calidad o no ser de espermatozoides. El sitio responde que no se encontraron espermatozoides o que la imagen es de mala calidad, y que no es factible analizarla. Debo ser sincero en un punto: todavía no existe un aviso que distinga «esta imagen no corresponde a una muestra de espermatozoides» de «esta imagen es de mala calidad». El modelo actual no puede separar las dos situaciones, porque nunca vio ejemplos de imágenes ajenas. Es una mejora prevista, y ayudaría contar con imágenes de otro tipo que sirvan como ejemplos negativos.</w:t>
+        <w:t>La cuarta es la que más pesa en la confianza: una imagen que se abre bien pero en la que el modelo no encuentra nada. Puede estar desenfocada, ser de mala calidad o no ser de espermatozoides. El sitio responde que no se encontraron espermatozoides o que la imagen es de mala calidad, y que no es factible analizarla. Distinguir entre «esta imagen no corresponde a una muestra de espermatozoides» y «esta imagen es de mala calidad» es un reto de la siguiente etapa: el modelo necesita ver ejemplos de imágenes de otro tipo, que servirían como ejemplos negativos.</w:t>
       </w:r>
     </w:p>
     <w:p>
@@ -2412,7 +2421,7 @@
           <w:b w:val="0"/>
           <w:i w:val="0"/>
         </w:rPr>
-        <w:t>La sexta es que los modelos no estén disponibles. Si en el servidor faltaran sus archivos, o la biblioteca que los ejecuta, el sitio no se cae: usa una detección más simple, basada en un umbral de color, y lo anuncia con un recuadro amarillo que dice que es una detección provisional, sin el modelo entrenado, que sirve para probar el sistema y no tiene validez científica. Es una red de seguridad pensada para el desarrollo y para fallos de despliegue. En la operación normal no debería verse nunca, pero si alguien la ve, sabrá qué significa.</w:t>
+        <w:t>La sexta es que los modelos no estén disponibles. Si en el servidor faltaran sus archivos, o la biblioteca que los ejecuta, el sitio no se cae: usa una detección más simple, basada en un umbral de color, y lo anuncia con un recuadro amarillo. Es una red de seguridad pensada para el desarrollo y para fallos de despliegue. En la operación normal no debería verse nunca, pero si alguien la ve, sabrá qué significa.</w:t>
       </w:r>
     </w:p>
     <w:p>
@@ -2439,7 +2448,7 @@
           <w:i/>
           <w:color w:val="595959"/>
         </w:rPr>
-        <w:t>493 palabras · 2.0 min</w:t>
+        <w:t>496 palabras · 2.0 min</w:t>
       </w:r>
     </w:p>
     <w:p>
@@ -2488,7 +2497,7 @@
           <w:b w:val="0"/>
           <w:i w:val="0"/>
         </w:rPr>
-        <w:t>Cada imagen del lote se analiza de forma independiente. El modelo que se aplica a la primera no condiciona el de la segunda, y si una falla, las otras siguen. El sitio también guarda con qué detector se analizó cada imagen, para saber después, al revisar un análisis viejo, qué se usó.</w:t>
+        <w:t>Cada imagen del lote se analiza de forma independiente. El modelo que se aplica a la primera no condiciona el de la segunda, y si una no se puede analizar, las otras siguen. El sitio también guarda con qué detector se analizó cada imagen, para saber después, al revisar un análisis viejo, qué se usó.</w:t>
       </w:r>
     </w:p>
     <w:p>
@@ -2546,7 +2555,7 @@
           <w:i/>
           <w:color w:val="595959"/>
         </w:rPr>
-        <w:t>550 palabras · 2.2 min</w:t>
+        <w:t>554 palabras · 2.2 min</w:t>
       </w:r>
     </w:p>
     <w:p>
@@ -2577,16 +2586,16 @@
           <w:b w:val="0"/>
           <w:i w:val="0"/>
         </w:rPr>
-        <w:t>En la esquina inferior izquierda de la imagen marcada hay una regla: una línea de trescientos píxeles con el texto «300 px = 5 micras (escala provisional)». Se añadió para que cualquiera que mire la imagen vea de inmediato qué equivalencia se está usando.</w:t>
-      </w:r>
-    </w:p>
-    <w:p>
-      <w:r>
-        <w:rPr>
-          <w:b w:val="0"/>
-          <w:i w:val="0"/>
-        </w:rPr>
-        <w:t>Para entender por qué es provisional hay que partir de algo simple: una fotografía digital sabe cuántos píxeles mide, pero no cuántas micras corresponden a cada uno. Esa relación depende del aumento del objetivo, que en nuestro caso es de cuarenta aumentos, del tamaño del sensor de la cámara, de cualquier adaptador intermedio y de la resolución a la que se guardó la foto. Y las imágenes que el grupo ha compartido no traen barra de escala impresa, ni la cabecera de los archivos guarda esa información.</w:t>
+        <w:t>En la esquina inferior izquierda de la imagen marcada hay una regla: una línea de trescientos píxeles con el texto «300 px = 5 micras». Se añadió para que cualquiera que mire la imagen vea de inmediato qué equivalencia se está usando.</w:t>
+      </w:r>
+    </w:p>
+    <w:p>
+      <w:r>
+        <w:rPr>
+          <w:b w:val="0"/>
+          <w:i w:val="0"/>
+        </w:rPr>
+        <w:t>Para entender cómo se llega a una escala hay que partir de algo simple: una fotografía digital sabe cuántos píxeles mide, pero no cuántas micras corresponden a cada uno. Esa relación depende del aumento del objetivo, que en nuestro caso es de cuarenta aumentos, del tamaño del sensor de la cámara, de cualquier adaptador intermedio y de la resolución a la que se guardó la foto. Y las imágenes que el grupo ha compartido no traen barra de escala impresa, ni la cabecera de los archivos guarda esa información.</w:t>
       </w:r>
     </w:p>
     <w:p>
@@ -2604,7 +2613,7 @@
           <w:b w:val="0"/>
           <w:i w:val="0"/>
         </w:rPr>
-        <w:t>Lo que usamos hoy son sesenta píxeles por micra, a partir de una referencia que nos dieron: una raya de trescientos píxeles equivale a cinco micras. Es un valor de trabajo, no una calibración, y por eso cada resultado lo declara: en pantalla, en el CSV y en el PDF.</w:t>
+        <w:t>Lo que usamos hoy son sesenta píxeles por micra, a partir de una referencia que nos dieron: una raya de trescientos píxeles equivale a cinco micras. Es el valor de referencia mientras se calibra, y por eso cada resultado lo indica: en pantalla, en el CSV y en el PDF.</w:t>
       </w:r>
     </w:p>
     <w:p>
@@ -2631,7 +2640,7 @@
           <w:b w:val="0"/>
           <w:i w:val="0"/>
         </w:rPr>
-        <w:t>Mientras tanto, la recomendación es tratar los píxeles como el dato principal y las micras como una aproximación. Los píxeles son lo que realmente se midió; las micras son esa medida por un factor que aún no está calibrado.</w:t>
+        <w:t>Mientras se calibra, la recomendación es tratar los píxeles como el dato principal y las micras como una conversión de referencia. Los píxeles son lo que realmente se midió; las micras son esa medida por un factor que se afinará con la calibración.</w:t>
       </w:r>
     </w:p>
     <w:p>
@@ -2649,7 +2658,7 @@
           <w:i/>
           <w:color w:val="595959"/>
         </w:rPr>
-        <w:t>566 palabras · 2.3 min</w:t>
+        <w:t>567 palabras · 2.3 min</w:t>
       </w:r>
     </w:p>
     <w:p>
@@ -2724,7 +2733,7 @@
           <w:b w:val="0"/>
           <w:i w:val="0"/>
         </w:rPr>
-        <w:t>Ahora el PDF, que es un informe. La primera página reúne lo que se pidió: el encabezado con el nombre del proyecto y el lema, el nombre del usuario, la fecha y la hora del análisis y el número de imágenes. El encabezado de cada página lleva el círculo y el nombre del proyecto, y ahí se colocará el logotipo cuando el grupo lo proporcione; en el pie aparecen el usuario, la fecha y el número de página. Después vienen los dos avisos que ya conocemos, escala provisional y modelo preliminar, para que el informe se lea con la cautela correcta aunque circule sin el contexto de la pantalla.</w:t>
+        <w:t>Ahora el PDF, que es un informe. La primera página reúne lo que se pidió: el encabezado con el nombre del proyecto y el lema, el nombre del usuario, la fecha y la hora del análisis y el número de imágenes. El encabezado de cada página lleva el círculo y el nombre del proyecto, y ahí se colocará el logotipo cuando el grupo lo proporcione; en el pie aparecen el usuario, la fecha y el número de página. Después vienen los dos recuadros de contexto que ya conocemos, escala de referencia y estado del modelo, para que el informe se lea con el contexto correcto aunque circule sin la pantalla.</w:t>
       </w:r>
     </w:p>
     <w:p>
@@ -2898,7 +2907,7 @@
           <w:i/>
           <w:color w:val="595959"/>
         </w:rPr>
-        <w:t>406 palabras · 1.6 min</w:t>
+        <w:t>399 palabras · 1.6 min</w:t>
       </w:r>
     </w:p>
     <w:p>
@@ -2929,7 +2938,7 @@
           <w:b w:val="0"/>
           <w:i w:val="0"/>
         </w:rPr>
-        <w:t>¿Qué pasa si olvido mi contraseña? Hoy no hay un enlace automático de recuperación. Es uno de los pendientes que el grupo debe decidir. Mientras tanto, se puede crear una cuenta con otro correo, o avisarme para resolverlo.</w:t>
+        <w:t>¿Qué pasa si olvido mi contraseña? La recuperación automática de la contraseña se define con el grupo. Mientras tanto, se puede crear una cuenta con otro correo, o avisarme para resolverlo.</w:t>
       </w:r>
     </w:p>
     <w:p>
@@ -3019,7 +3028,7 @@
           <w:i/>
           <w:color w:val="595959"/>
         </w:rPr>
-        <w:t>387 palabras · 1.5 min</w:t>
+        <w:t>394 palabras · 1.6 min</w:t>
       </w:r>
     </w:p>
     <w:p>
@@ -3086,7 +3095,7 @@
           <w:b w:val="0"/>
           <w:i w:val="0"/>
         </w:rPr>
-        <w:t>Llevar un registro de las imágenes que el modelo analiza mal. Si una fotografía da un resultado claramente incorrecto, por ejemplo muchos contornos partidos o un número de células muy distinto del que se ve a simple vista, vale la pena conservarla y anotar qué pasó. Esas imágenes son las que más aportan al reentrenamiento, porque muestran justo lo que el modelo todavía no resuelve. Un modelo mejora con ejemplos de sus propios errores, y el grupo es quien los tiene.</w:t>
+        <w:t>Llevar un registro de las imágenes que el modelo analiza con dificultad. Si una fotografía da un resultado claramente distinto de lo que se ve, por ejemplo muchos contornos partidos o un número de células muy diferente del que se cuenta a simple vista, vale la pena conservarla y anotar qué pasó. Esas imágenes son las que más aportan al reentrenamiento, porque muestran justo lo que el modelo puede aprender a resolver. Un modelo mejora con ejemplos de sus propios retos, y el grupo es quien los tiene.</w:t>
       </w:r>
     </w:p>
     <w:p>
@@ -3113,7 +3122,7 @@
           <w:i/>
           <w:color w:val="595959"/>
         </w:rPr>
-        <w:t>279 palabras · 1.1 min</w:t>
+        <w:t>219 palabras · 0.9 min</w:t>
       </w:r>
     </w:p>
     <w:p>
@@ -3135,34 +3144,34 @@
           <w:b w:val="0"/>
           <w:i w:val="0"/>
         </w:rPr>
-        <w:t>Resumo lo recorrido antes de la pausa.</w:t>
-      </w:r>
-    </w:p>
-    <w:p>
-      <w:r>
-        <w:rPr>
-          <w:b w:val="0"/>
-          <w:i w:val="0"/>
-        </w:rPr>
-        <w:t>El sitio tiene una parte informativa, bilingüe y sencilla, y una parte de análisis a la que se accede con una cuenta gratuita. El usuario sube hasta diez imágenes, el sistema elige el modelo según el brillo de cada una y devuelve el conteo, el área y el largo de cada espermatozoide con su media y desviación estándar, la distribución de tamaños y una imagen con cada contorno marcado. El resultado se explora con zoom y con detalle por espermatozoide, y se exporta a CSV y PDF. Cada análisis queda en el perfil del usuario, es privado, y las imágenes originales se borran. Y el sistema es claro sobre sus límites: avisa que el modelo es preliminar, que la escala es provisional y que no analiza lo que no puede analizar.</w:t>
-      </w:r>
-    </w:p>
-    <w:p>
-      <w:r>
-        <w:rPr>
-          <w:b w:val="0"/>
-          <w:i w:val="0"/>
-        </w:rPr>
-        <w:t>Para que quede registrado, repito lo que el sitio aún no hace y depende de decisiones o materiales del grupo: enviar por correo los mensajes del formulario de contacto, para lo cual falta la dirección de destino; mostrar los textos, fotografías, infografías, videos y logotipo definitivos; el aviso de privacidad; la recuperación de contraseña, si el grupo decide que la necesita; y la escala calibrada en micras. Ninguno impide usar el análisis, pero todos se irán completando hasta la entrega.</w:t>
-      </w:r>
-    </w:p>
-    <w:p>
-      <w:r>
-        <w:rPr>
-          <w:b w:val="0"/>
-          <w:i w:val="0"/>
-        </w:rPr>
-        <w:t>Seguramente muchos tienen ahora una pregunta: ¿cómo sabe el sistema dónde hay un espermatozoide? La respuesta es la red neuronal, y a ella dedicamos la última parte de la sesión. Antes tomamos diez minutos de pausa. Anoten durante ese tiempo las preguntas que les hayan surgido de la demostración, porque al regresar atenderemos unas cuantas antes de entrar a la red.</w:t>
+        <w:t>Resumo lo recorrido.</w:t>
+      </w:r>
+    </w:p>
+    <w:p>
+      <w:r>
+        <w:rPr>
+          <w:b w:val="0"/>
+          <w:i w:val="0"/>
+        </w:rPr>
+        <w:t>El sitio tiene una parte informativa, bilingüe y sencilla, y una parte de análisis a la que se accede con una cuenta gratuita. El usuario sube hasta diez imágenes, el sistema elige el modelo según el brillo de cada una y devuelve el conteo, el área y el largo de cada espermatozoide con su media y desviación estándar, la distribución de tamaños y una imagen con cada contorno marcado. El resultado se explora con zoom y con detalle por espermatozoide, y se exporta a CSV y PDF. Cada análisis queda en el perfil del usuario, es privado, y las imágenes originales se borran. Y cada resultado indica con claridad la escala que se usó y el estado del modelo.</w:t>
+      </w:r>
+    </w:p>
+    <w:p>
+      <w:r>
+        <w:rPr>
+          <w:b w:val="0"/>
+          <w:i w:val="0"/>
+        </w:rPr>
+        <w:t>Para cerrar el recorrido, los retos que se resuelven con el grupo en esta etapa: la dirección de destino del formulario de contacto; los textos, fotografías, infografías, videos y logotipo definitivos; el aviso de privacidad; la recuperación de contraseña, si el grupo decide que la necesita; y la calibración de la escala en micras. Ninguno impide usar el análisis, y todos se van completando hasta la entrega.</w:t>
+      </w:r>
+    </w:p>
+    <w:p>
+      <w:r>
+        <w:rPr>
+          <w:b w:val="0"/>
+          <w:i w:val="0"/>
+        </w:rPr>
+        <w:t>Seguramente muchos tienen ahora una pregunta: ¿cómo sabe el sistema dónde hay un espermatozoide? La respuesta es la red neuronal, y a ella dedicamos la última parte de la sesión.</w:t>
       </w:r>
     </w:p>
     <w:p>
@@ -3175,7 +3184,7 @@
           <w:i/>
           <w:color w:val="1F4E79"/>
         </w:rPr>
-        <w:t>[Pausa de 10 minutos. Detener el cronómetro de la grabación si se desea.]</w:t>
+        <w:t>[Pasar a la diapositiva de título del tercer bloque.]</w:t>
       </w:r>
     </w:p>
     <w:p>
@@ -3193,7 +3202,7 @@
           <w:i/>
           <w:color w:val="595959"/>
         </w:rPr>
-        <w:t>12,469 palabras · 49.9 min a 250 palabras por minuto (meta: 50 min, 12,500 palabras)</w:t>
+        <w:t>12,391 palabras · 49.6 min a 250 palabras por minuto (meta: 50 min, 12,500 palabras)</w:t>
       </w:r>
     </w:p>
     <w:p>
@@ -3201,7 +3210,7 @@
         <w:pStyle w:val="Heading2"/>
       </w:pPr>
       <w:r>
-        <w:t>3.1 Regreso de la pausa y planteamiento del problema</w:t>
+        <w:t>3.1 Planteamiento del problema</w:t>
       </w:r>
     </w:p>
     <w:p>
@@ -3211,7 +3220,7 @@
           <w:i/>
           <w:color w:val="595959"/>
         </w:rPr>
-        <w:t>845 palabras · 3.4 min</w:t>
+        <w:t>815 palabras · 3.3 min</w:t>
       </w:r>
     </w:p>
     <w:p>
@@ -3224,16 +3233,115 @@
           <w:i/>
           <w:color w:val="1F4E79"/>
         </w:rPr>
-        <w:t>[Pantalla: diapositiva de título «¿Qué es una red neuronal?». Antes de empezar, dedicar un par de minutos a las preguntas anotadas durante la pausa.]</w:t>
-      </w:r>
-    </w:p>
-    <w:p>
-      <w:r>
-        <w:rPr>
-          <w:b w:val="0"/>
-          <w:i w:val="0"/>
-        </w:rPr>
-        <w:t>Bienvenidos de nuevo. Antes de entrar a la red, dedico unos minutos a las preguntas que hayan quedado de la demostración. Pueden decirlas en voz alta o escribirlas en el chat.</w:t>
+        <w:t>[Pantalla: diapositiva de título «¿Qué es una red neuronal?».]</w:t>
+      </w:r>
+    </w:p>
+    <w:p>
+      <w:r>
+        <w:rPr>
+          <w:b w:val="0"/>
+          <w:i w:val="0"/>
+        </w:rPr>
+        <w:t>Entramos a la última parte, y una advertencia sobre cómo voy a explicar. Este tema es de los más técnicos del proyecto y se pone abstracto con facilidad. Para evitarlo voy de lo concreto a lo general: un problema que podamos imaginar, luego la idea que lo resuelve y al final el nombre técnico. No uso ecuaciones. Cuando una idea tenga expresión matemática, diré con palabras qué hace, y quien quiera la fórmula la encontrará en el material de apoyo. La meta de estos cincuenta minutos es que quede claro cómo responder tres preguntas: qué es una red neuronal, cómo aprende, y por qué una red entrenada para otra cosa nos sirve para contar espermatozoides.</w:t>
+      </w:r>
+    </w:p>
+    <w:p>
+      <w:r>
+        <w:rPr>
+          <w:b w:val="0"/>
+          <w:i w:val="0"/>
+        </w:rPr>
+        <w:t>Partamos del problema. Supongan que tienen que escribir un programa que reciba una fotografía y diga cuántos espermatozoides hay. Es la tarea del sitio. ¿Cómo lo harían con programación tradicional, escribiendo reglas explícitas?</w:t>
+      </w:r>
+    </w:p>
+    <w:p>
+      <w:r>
+        <w:rPr>
+          <w:b w:val="0"/>
+          <w:i w:val="0"/>
+        </w:rPr>
+        <w:t>La primera idea natural es usar el brillo. Los espermatozoides son brillantes sobre fondo oscuro, así que se podría decir: todo píxel con un brillo mayor a cierto valor pertenece a una célula. Luego se agrupan los píxeles vecinos en manchas, y cada mancha es una célula. Esa técnica se llama umbralización, y el sitio la incluye como respaldo: es la detección de emergencia que mencioné. Como primera aproximación sirve, pero los problemas aparecen pronto. Las colas también brillan, y no queremos contarlas. Hay manchas rojas difusas, más grandes y fuera de foco, que pasan el umbral sin ser espermatozoides. Hay células encimadas entre sí o sobre las colas de otras, y el umbral las une en una sola mancha. Además, el brillo de una imagen depende de la iluminación, de la exposición y de la tinción: un umbral que funciona en una fotografía puede fallar en la siguiente.</w:t>
+      </w:r>
+    </w:p>
+    <w:p>
+      <w:r>
+        <w:rPr>
+          <w:b w:val="0"/>
+          <w:i w:val="0"/>
+        </w:rPr>
+        <w:t>Se pueden seguir agregando reglas. Si la mancha es muy alargada, probablemente es una cola. Si es muy grande, probablemente es una mancha difusa. Si tiene forma de ocho, probablemente son dos células juntas y hay que partirla por el estrechamiento. Cada regla ayuda un poco y trae sus excepciones. La lista crece, se enreda, y cada excepción nueva obliga a modificar el programa con el riesgo de romper lo que ya funcionaba. Hay problemas en los que escribir las reglas a mano es muy difícil, no por falta de ingenio sino porque las reglas verdaderas son demasiadas, demasiado sutiles y dependen de demasiados detalles.</w:t>
+      </w:r>
+    </w:p>
+    <w:p>
+      <w:r>
+        <w:rPr>
+          <w:b w:val="0"/>
+          <w:i w:val="0"/>
+        </w:rPr>
+        <w:t>Piensen ahora en cómo lo hace una persona. Quien tiene experiencia mira la fotografía y señala los espermatozoides. ¿Aplica una lista de reglas? Casi seguro que no de manera consciente. Ha visto cientos o miles de ejemplos y su cerebro aprendió a reconocer el patrón. Si le preguntan por qué esto sí es una célula y esto no, quizá dé un par de razones, pero no podría enumerar todo lo que está usando.</w:t>
+      </w:r>
+    </w:p>
+    <w:p>
+      <w:r>
+        <w:rPr>
+          <w:b w:val="0"/>
+          <w:i w:val="0"/>
+        </w:rPr>
+        <w:t>De ahí sale el aprendizaje automático, que cabe en una frase: en lugar de escribir las reglas, se muestran ejemplos y se deja que el sistema las encuentre. En la programación tradicional se entregan reglas y datos, y salen respuestas. En el aprendizaje automático se entregan datos y respuestas, y salen las reglas. Es una inversión del flujo, y de ella depende todo lo que sigue.</w:t>
+      </w:r>
+    </w:p>
+    <w:p>
+      <w:r>
+        <w:rPr>
+          <w:b w:val="0"/>
+          <w:i w:val="0"/>
+        </w:rPr>
+        <w:t>Muchas familias de técnicas siguen esa idea, desde modelos estadísticos sencillos hasta arquitecturas muy complejas. Las redes neuronales son una de ellas, y rinden especialmente bien con imágenes, sonido o texto, es decir, datos crudos con mucha estructura que no se describen fácilmente con unas pocas variables. Por eso usamos una.</w:t>
+      </w:r>
+    </w:p>
+    <w:p>
+      <w:r>
+        <w:rPr>
+          <w:b w:val="0"/>
+          <w:i w:val="0"/>
+        </w:rPr>
+        <w:t>Una distinción de términos, porque se mezclan seguido. La inteligencia artificial es el campo más amplio: cualquier técnica que haga que una máquina realice tareas que asociamos con la inteligencia. El aprendizaje automático es la parte que aprende de ejemplos. Las redes neuronales son una técnica dentro de ella. Y el aprendizaje profundo se refiere a redes con muchas capas, que explico en un momento. Aquí usamos una red de aprendizaje profundo, la técnica que mejor funciona hoy con imágenes.</w:t>
+      </w:r>
+    </w:p>
+    <w:p>
+      <w:r>
+        <w:rPr>
+          <w:b w:val="0"/>
+          <w:i w:val="0"/>
+        </w:rPr>
+        <w:t>Hay otra idea previa que condiciona cómo van a escuchar el resto. Una red neuronal no entiende qué es un espermatozoide. No tiene el concepto ni sabe de biología; no sabe qué es una célula ni para qué sirve contarla. Tiene una enorme colección de números ajustados de modo que, ante ciertos patrones de píxeles, produce una salida que coincide con lo que las personas marcaron en los ejemplos. Es un reconocedor de patrones muy sofisticado, y nada más. Eso no le quita mérito; sirve para razonar sobre cuándo va a funcionar y cuándo no. Si le muestro una imagen parecida a las de su entrenamiento, funciona. Si le muestro algo muy distinto, no tiene cómo saber que se equivoca, y producirá una salida con la misma seguridad aparente.</w:t>
+      </w:r>
+    </w:p>
+    <w:p>
+      <w:r>
+        <w:rPr>
+          <w:b w:val="0"/>
+          <w:i w:val="0"/>
+        </w:rPr>
+        <w:t>Con el problema planteado, construyamos la idea de red desde su pieza más pequeña.</w:t>
+      </w:r>
+    </w:p>
+    <w:p>
+      <w:pPr>
+        <w:pStyle w:val="Heading2"/>
+      </w:pPr>
+      <w:r>
+        <w:t>3.2 La neurona artificial</w:t>
+      </w:r>
+    </w:p>
+    <w:p>
+      <w:r>
+        <w:rPr>
+          <w:b w:val="0"/>
+          <w:i/>
+          <w:color w:val="595959"/>
+        </w:rPr>
+        <w:t>901 palabras · 3.6 min</w:t>
       </w:r>
     </w:p>
     <w:p>
@@ -3246,97 +3354,124 @@
           <w:i/>
           <w:color w:val="1F4E79"/>
         </w:rPr>
-        <w:t>[Pausa breve para preguntas.]</w:t>
-      </w:r>
-    </w:p>
-    <w:p>
-      <w:r>
-        <w:rPr>
-          <w:b w:val="0"/>
-          <w:i w:val="0"/>
-        </w:rPr>
-        <w:t>Entramos entonces a la última parte, y una advertencia sobre cómo voy a explicar. Este tema es de los más técnicos del proyecto y se pone abstracto con facilidad. Para evitarlo voy de lo concreto a lo general: un problema que podamos imaginar, luego la idea que lo resuelve y al final el nombre técnico. No uso ecuaciones. Cuando una idea tenga expresión matemática, diré con palabras qué hace, y quien quiera la fórmula la encontrará en el material de apoyo. Al terminar los cincuenta minutos, todos deberían poder responder tres preguntas: qué es una red neuronal, cómo aprende, y por qué una red entrenada para otra cosa nos sirve para contar espermatozoides.</w:t>
-      </w:r>
-    </w:p>
-    <w:p>
-      <w:r>
-        <w:rPr>
-          <w:b w:val="0"/>
-          <w:i w:val="0"/>
-        </w:rPr>
-        <w:t>Partamos del problema. Supongan que tienen que escribir un programa que reciba una fotografía y diga cuántos espermatozoides hay. Es la tarea del sitio. ¿Cómo lo harían con programación tradicional, escribiendo reglas explícitas?</w:t>
-      </w:r>
-    </w:p>
-    <w:p>
-      <w:r>
-        <w:rPr>
-          <w:b w:val="0"/>
-          <w:i w:val="0"/>
-        </w:rPr>
-        <w:t>La primera idea natural es usar el brillo. Los espermatozoides son brillantes sobre fondo oscuro, así que se podría decir: todo píxel con un brillo mayor a cierto valor pertenece a una célula. Luego se agrupan los píxeles vecinos en manchas, y cada mancha es una célula. Esa técnica se llama umbralización, y el sitio la incluye como mecanismo de emergencia: es la detección provisional que mencioné. Como primera aproximación sirve, pero los problemas aparecen pronto. Las colas también brillan, y no queremos contarlas. Hay manchas rojas difusas, más grandes y fuera de foco, que pasan el umbral sin ser espermatozoides. Hay células encimadas entre sí o sobre las colas de otras, y el umbral las une en una sola mancha. Además, el brillo de una imagen depende de la iluminación, de la exposición y de la tinción: un umbral que funciona en una fotografía puede fallar en la siguiente.</w:t>
-      </w:r>
-    </w:p>
-    <w:p>
-      <w:r>
-        <w:rPr>
-          <w:b w:val="0"/>
-          <w:i w:val="0"/>
-        </w:rPr>
-        <w:t>Se pueden seguir agregando reglas. Si la mancha es muy alargada, probablemente es una cola. Si es muy grande, probablemente es una mancha difusa. Si tiene forma de ocho, probablemente son dos células juntas y hay que partirla por el estrechamiento. Cada regla ayuda un poco y trae sus excepciones. La lista crece, se enreda, y cada excepción nueva obliga a modificar el programa con el riesgo de romper lo que ya funcionaba. Hay problemas en los que escribir las reglas a mano es muy difícil, no por falta de ingenio sino porque las reglas verdaderas son demasiadas, demasiado sutiles y dependen de demasiados detalles.</w:t>
-      </w:r>
-    </w:p>
-    <w:p>
-      <w:r>
-        <w:rPr>
-          <w:b w:val="0"/>
-          <w:i w:val="0"/>
-        </w:rPr>
-        <w:t>Piensen ahora en cómo lo hace una persona. Quien tiene experiencia mira la fotografía y señala los espermatozoides. ¿Aplica una lista de reglas? Casi seguro que no de manera consciente. Ha visto cientos o miles de ejemplos y su cerebro aprendió a reconocer el patrón. Si le preguntan por qué esto sí es una célula y esto no, quizá dé un par de razones, pero no podría enumerar todo lo que está usando.</w:t>
-      </w:r>
-    </w:p>
-    <w:p>
-      <w:r>
-        <w:rPr>
-          <w:b w:val="0"/>
-          <w:i w:val="0"/>
-        </w:rPr>
-        <w:t>De ahí sale el aprendizaje automático, que cabe en una frase: en lugar de escribir las reglas, se muestran ejemplos y se deja que el sistema las encuentre. En la programación tradicional se entregan reglas y datos, y salen respuestas. En el aprendizaje automático se entregan datos y respuestas, y salen las reglas. Es una inversión del flujo, y de ella depende todo lo que sigue.</w:t>
-      </w:r>
-    </w:p>
-    <w:p>
-      <w:r>
-        <w:rPr>
-          <w:b w:val="0"/>
-          <w:i w:val="0"/>
-        </w:rPr>
-        <w:t>Muchas familias de técnicas siguen esa idea, desde modelos estadísticos sencillos hasta arquitecturas muy complejas. Las redes neuronales son una de ellas, y rinden especialmente bien con imágenes, sonido o texto, es decir, datos crudos con mucha estructura que no se describen fácilmente con unas pocas variables. Por eso usamos una.</w:t>
-      </w:r>
-    </w:p>
-    <w:p>
-      <w:r>
-        <w:rPr>
-          <w:b w:val="0"/>
-          <w:i w:val="0"/>
-        </w:rPr>
-        <w:t>Una distinción de términos, porque se mezclan seguido. La inteligencia artificial es el campo más amplio: cualquier técnica que haga que una máquina realice tareas que asociamos con la inteligencia. El aprendizaje automático es la parte que aprende de ejemplos. Las redes neuronales son una técnica dentro de ella. Y el aprendizaje profundo se refiere a redes con muchas capas, que explico en un momento. Aquí usamos una red de aprendizaje profundo, la técnica que mejor funciona hoy con imágenes.</w:t>
-      </w:r>
-    </w:p>
-    <w:p>
-      <w:r>
-        <w:rPr>
-          <w:b w:val="0"/>
-          <w:i w:val="0"/>
-        </w:rPr>
-        <w:t>Hay otra idea previa que condiciona cómo van a escuchar el resto. Una red neuronal no entiende qué es un espermatozoide. No tiene el concepto ni sabe de biología; no sabe qué es una célula ni para qué sirve contarla. Tiene una enorme colección de números ajustados de modo que, ante ciertos patrones de píxeles, produce una salida que coincide con lo que las personas marcaron en los ejemplos. Es un reconocedor de patrones muy sofisticado, y nada más. Eso no le quita mérito; sirve para razonar sobre cuándo va a funcionar y cuándo no. Si le muestro una imagen parecida a las de su entrenamiento, funciona. Si le muestro algo muy distinto, no tiene cómo saber que se equivoca, y producirá una salida con la misma seguridad aparente.</w:t>
-      </w:r>
-    </w:p>
-    <w:p>
-      <w:r>
-        <w:rPr>
-          <w:b w:val="0"/>
-          <w:i w:val="0"/>
-        </w:rPr>
-        <w:t>Con el problema planteado, construyamos la idea de red desde su pieza más pequeña.</w:t>
+        <w:t>[Pantalla: diapositiva con un diagrama de una neurona artificial: tres entradas, tres pesos, una suma, una función de activación y una salida.]</w:t>
+      </w:r>
+    </w:p>
+    <w:p>
+      <w:r>
+        <w:rPr>
+          <w:b w:val="0"/>
+          <w:i w:val="0"/>
+        </w:rPr>
+        <w:t>La pieza elemental se llama neurona artificial, aunque el nombre es más una inspiración histórica que una descripción fiel de la biología. Es una operación muy pequeña, que se describe en cuatro pasos.</w:t>
+      </w:r>
+    </w:p>
+    <w:p>
+      <w:r>
+        <w:rPr>
+          <w:b w:val="0"/>
+          <w:i w:val="0"/>
+        </w:rPr>
+        <w:t>Primero, recibe una lista de números, las entradas. Segundo, cada entrada se multiplica por otro número, su peso. Tercero, se suman los resultados. Y cuarto, a esa suma se le aplica una pequeña función que decide cuánto se activa la neurona. Eso es todo.</w:t>
+      </w:r>
+    </w:p>
+    <w:p>
+      <w:r>
+        <w:rPr>
+          <w:b w:val="0"/>
+          <w:i w:val="0"/>
+        </w:rPr>
+        <w:t>Un ejemplo deliberadamente simple para ver qué hace un peso. Imaginen una neurona que decide si un punto de la imagen es rojo e intenso. Recibe tres entradas: la cantidad de rojo, de verde y de azul de un píxel. Para que dé una salida alta con un píxel muy rojo, le asignamos un peso grande y positivo a la entrada del rojo, y pesos pequeños o negativos a las otras dos. Un píxel muy rojo produce una suma grande, y uno azul una suma pequeña. Los pesos expresan qué le importa a la neurona. Un peso grande dice «esto me importa mucho», uno cercano a cero dice «me da igual», y uno negativo dice «esto me hace dudar».</w:t>
+      </w:r>
+    </w:p>
+    <w:p>
+      <w:r>
+        <w:rPr>
+          <w:b w:val="0"/>
+          <w:i w:val="0"/>
+        </w:rPr>
+        <w:t>Falta un elemento, un número que se suma al final, llamado sesgo. Desplaza el punto desde el cual la neurona empieza a activarse. Si la imaginan como un interruptor sensible, los pesos deciden a qué se fija y el sesgo decide qué tan exigente es antes de encenderse.</w:t>
+      </w:r>
+    </w:p>
+    <w:p>
+      <w:r>
+        <w:rPr>
+          <w:b w:val="0"/>
+          <w:i w:val="0"/>
+        </w:rPr>
+        <w:t>La función de activación, el último paso, es lo que hace posible que las redes sean tan potentes. Si la neurona solo multiplicara y sumara, haría una operación lineal, y encadenar muchas operaciones lineales equivale a una sola: no importa cuántas capas se apilen, el resultado sería tan limitado como el de una. La función de activación introduce una no linealidad. La más usada hoy es simple: si la suma es negativa, la salida es cero; si es positiva, la salida es la propia suma. La neurona se apaga si no recibe estímulo suficiente y responde de forma proporcional si lo recibe. Esa pequeña torcedura permite representar relaciones complicadas, no solo proporcionales.</w:t>
+      </w:r>
+    </w:p>
+    <w:p>
+      <w:r>
+        <w:rPr>
+          <w:b w:val="0"/>
+          <w:i w:val="0"/>
+        </w:rPr>
+        <w:t>Una neurona sola hace muy poco: una decisión simple basada en una combinación ponderada. La potencia aparece al juntar muchas.</w:t>
+      </w:r>
+    </w:p>
+    <w:p>
+      <w:r>
+        <w:rPr>
+          <w:b w:val="0"/>
+          <w:i w:val="0"/>
+        </w:rPr>
+        <w:t>La siguiente escala es la capa: un conjunto de neuronas que reciben las mismas entradas pero con pesos distintos, de modo que cada una se fija en una combinación diferente. Cien neuronas mirando los mismos números, cada una con su criterio. La salida de la capa es la lista de las cien respuestas. Cada neurona es una pregunta distinta a la entrada, y la capa devuelve la lista de respuestas.</w:t>
+      </w:r>
+    </w:p>
+    <w:p>
+      <w:r>
+        <w:rPr>
+          <w:b w:val="0"/>
+          <w:i w:val="0"/>
+        </w:rPr>
+        <w:t>Luego se apilan capas. La salida de una se convierte en la entrada de la siguiente. La primera hace cien preguntas sobre los datos originales. La segunda no ve los datos originales sino las respuestas de la primera, y hace sus propias preguntas sobre ellas. La tercera pregunta sobre las respuestas de la segunda, y así. Cada capa trabaja con un resumen más abstracto de la anterior. Esta arquitectura es la red neuronal, y cuando tiene muchas capas se habla de aprendizaje profundo: profundo, literalmente, por las capas apiladas.</w:t>
+      </w:r>
+    </w:p>
+    <w:p>
+      <w:r>
+        <w:rPr>
+          <w:b w:val="0"/>
+          <w:i w:val="0"/>
+        </w:rPr>
+        <w:t>Visualicen la estructura. Hay una entrada, los números que describen el dato. Hay una cascada de capas intermedias que los transforman una y otra vez. Y hay una salida, la respuesta final. En un clasificador sencillo podría ser un número entre cero y uno que indique qué tan probable es que la imagen contenga un espermatozoide. En un modelo más elaborado, como el nuestro, la salida es más rica, pero el principio es el mismo.</w:t>
+      </w:r>
+    </w:p>
+    <w:p>
+      <w:r>
+        <w:rPr>
+          <w:b w:val="0"/>
+          <w:i w:val="0"/>
+        </w:rPr>
+        <w:t>Natural preguntar cuántos pesos tiene una red como la nuestra: muchísimos. La Mask R-CNN que usamos tiene decenas de millones. Por eso el archivo de cada modelo pesa unos ciento setenta y seis megabytes: en su mayor parte es la lista de pesos. Que un modelo esté «entrenado» significa que cada uno de esos millones de números ya tiene un valor adecuado. Un modelo sin entrenar tiene los mismos pesos con valores arbitrarios y produce respuestas sin sentido. El entrenamiento es el proceso que encuentra los valores correctos.</w:t>
+      </w:r>
+    </w:p>
+    <w:p>
+      <w:r>
+        <w:rPr>
+          <w:b w:val="0"/>
+          <w:i w:val="0"/>
+        </w:rPr>
+        <w:t>A quienes vienen de la programación tradicional esto suele sorprenderles: nadie asigna esos pesos a mano. Ni yo ni el grupo decidimos que la neurona número cuatro mil doscientos vale 0.37. Los valores salen del aprendizaje. Lo que yo decido es la arquitectura, es decir, cuántas capas hay y cómo se conectan, y los datos con que se entrena. Eso es lo que en los hechos construye el modelo.</w:t>
+      </w:r>
+    </w:p>
+    <w:p>
+      <w:r>
+        <w:rPr>
+          <w:b w:val="0"/>
+          <w:i w:val="0"/>
+        </w:rPr>
+        <w:t>La analogía con el cerebro conviene tomarla con cautela. El concepto nació de la idea de que las neuronas biológicas reciben señales, las ponderan y se activan según el total. Pero una neurona artificial es mucho más simple que una biológica, y la red completa no funciona como un cerebro. Lo útil de la analogía son las muchas unidades simples que, en capas, producen comportamientos complejos. Pensar que, por llamarse neuronal, la red «piensa» o «comprende» sería un error.</w:t>
+      </w:r>
+    </w:p>
+    <w:p>
+      <w:r>
+        <w:rPr>
+          <w:b w:val="0"/>
+          <w:i w:val="0"/>
+        </w:rPr>
+        <w:t>Resumo con un esquema que usaremos hasta el final. Una red neuronal es una cadena de capas. Cada capa toma números, los combina con pesos, aplica una pequeña no linealidad y pasa el resultado a la siguiente. Los pesos son lo que la red sabe. Falta ver cómo conseguir que esos pesos tomen valores útiles.</w:t>
       </w:r>
     </w:p>
     <w:p>
@@ -3344,7 +3479,7 @@
         <w:pStyle w:val="Heading2"/>
       </w:pPr>
       <w:r>
-        <w:t>3.2 La neurona artificial</w:t>
+        <w:t>3.3 Cómo aprende una red</w:t>
       </w:r>
     </w:p>
     <w:p>
@@ -3354,7 +3489,7 @@
           <w:i/>
           <w:color w:val="595959"/>
         </w:rPr>
-        <w:t>901 palabras · 3.6 min</w:t>
+        <w:t>1,016 palabras · 4.1 min</w:t>
       </w:r>
     </w:p>
     <w:p>
@@ -3367,124 +3502,151 @@
           <w:i/>
           <w:color w:val="1F4E79"/>
         </w:rPr>
-        <w:t>[Pantalla: diapositiva con un diagrama de una neurona artificial: tres entradas, tres pesos, una suma, una función de activación y una salida.]</w:t>
-      </w:r>
-    </w:p>
-    <w:p>
-      <w:r>
-        <w:rPr>
-          <w:b w:val="0"/>
-          <w:i w:val="0"/>
-        </w:rPr>
-        <w:t>La pieza elemental se llama neurona artificial, aunque el nombre es más una inspiración histórica que una descripción fiel de la biología. Es una operación muy pequeña, que se describe en cuatro pasos.</w:t>
-      </w:r>
-    </w:p>
-    <w:p>
-      <w:r>
-        <w:rPr>
-          <w:b w:val="0"/>
-          <w:i w:val="0"/>
-        </w:rPr>
-        <w:t>Primero, recibe una lista de números, las entradas. Segundo, cada entrada se multiplica por otro número, su peso. Tercero, se suman los resultados. Y cuarto, a esa suma se le aplica una pequeña función que decide cuánto se activa la neurona. Eso es todo.</w:t>
-      </w:r>
-    </w:p>
-    <w:p>
-      <w:r>
-        <w:rPr>
-          <w:b w:val="0"/>
-          <w:i w:val="0"/>
-        </w:rPr>
-        <w:t>Un ejemplo deliberadamente simple para ver qué hace un peso. Imaginen una neurona que decide si un punto de la imagen es rojo e intenso. Recibe tres entradas: la cantidad de rojo, de verde y de azul de un píxel. Para que dé una salida alta con un píxel muy rojo, le asignamos un peso grande y positivo a la entrada del rojo, y pesos pequeños o negativos a las otras dos. Un píxel muy rojo produce una suma grande, y uno azul una suma pequeña. Los pesos expresan qué le importa a la neurona. Un peso grande dice «esto me importa mucho», uno cercano a cero dice «me da igual», y uno negativo dice «esto me hace dudar».</w:t>
-      </w:r>
-    </w:p>
-    <w:p>
-      <w:r>
-        <w:rPr>
-          <w:b w:val="0"/>
-          <w:i w:val="0"/>
-        </w:rPr>
-        <w:t>Falta un elemento, un número que se suma al final, llamado sesgo. Desplaza el punto desde el cual la neurona empieza a activarse. Si la imaginan como un interruptor sensible, los pesos deciden a qué se fija y el sesgo decide qué tan exigente es antes de encenderse.</w:t>
-      </w:r>
-    </w:p>
-    <w:p>
-      <w:r>
-        <w:rPr>
-          <w:b w:val="0"/>
-          <w:i w:val="0"/>
-        </w:rPr>
-        <w:t>La función de activación, el último paso, es lo que hace posible que las redes sean tan potentes. Si la neurona solo multiplicara y sumara, haría una operación lineal, y encadenar muchas operaciones lineales equivale a una sola: no importa cuántas capas se apilen, el resultado sería tan limitado como el de una. La función de activación introduce una no linealidad. La más usada hoy es simple: si la suma es negativa, la salida es cero; si es positiva, la salida es la propia suma. La neurona se apaga si no recibe estímulo suficiente y responde de forma proporcional si lo recibe. Esa pequeña torcedura permite representar relaciones complicadas, no solo proporcionales.</w:t>
-      </w:r>
-    </w:p>
-    <w:p>
-      <w:r>
-        <w:rPr>
-          <w:b w:val="0"/>
-          <w:i w:val="0"/>
-        </w:rPr>
-        <w:t>Una neurona sola hace muy poco: una decisión simple basada en una combinación ponderada. La potencia aparece al juntar muchas.</w:t>
-      </w:r>
-    </w:p>
-    <w:p>
-      <w:r>
-        <w:rPr>
-          <w:b w:val="0"/>
-          <w:i w:val="0"/>
-        </w:rPr>
-        <w:t>La siguiente escala es la capa: un conjunto de neuronas que reciben las mismas entradas pero con pesos distintos, de modo que cada una se fija en una combinación diferente. Cien neuronas mirando los mismos números, cada una con su criterio. La salida de la capa es la lista de las cien respuestas. Cada neurona es una pregunta distinta a la entrada, y la capa devuelve la lista de respuestas.</w:t>
-      </w:r>
-    </w:p>
-    <w:p>
-      <w:r>
-        <w:rPr>
-          <w:b w:val="0"/>
-          <w:i w:val="0"/>
-        </w:rPr>
-        <w:t>Luego se apilan capas. La salida de una se convierte en la entrada de la siguiente. La primera hace cien preguntas sobre los datos originales. La segunda no ve los datos originales sino las respuestas de la primera, y hace sus propias preguntas sobre ellas. La tercera pregunta sobre las respuestas de la segunda, y así. Cada capa trabaja con un resumen más abstracto de la anterior. Esta arquitectura es la red neuronal, y cuando tiene muchas capas se habla de aprendizaje profundo: profundo, literalmente, por las capas apiladas.</w:t>
-      </w:r>
-    </w:p>
-    <w:p>
-      <w:r>
-        <w:rPr>
-          <w:b w:val="0"/>
-          <w:i w:val="0"/>
-        </w:rPr>
-        <w:t>Visualicen la estructura. Hay una entrada, los números que describen el dato. Hay una cascada de capas intermedias que los transforman una y otra vez. Y hay una salida, la respuesta final. En un clasificador sencillo podría ser un número entre cero y uno que indique qué tan probable es que la imagen contenga un espermatozoide. En un modelo más elaborado, como el nuestro, la salida es más rica, pero el principio es el mismo.</w:t>
-      </w:r>
-    </w:p>
-    <w:p>
-      <w:r>
-        <w:rPr>
-          <w:b w:val="0"/>
-          <w:i w:val="0"/>
-        </w:rPr>
-        <w:t>Natural preguntar cuántos pesos tiene una red como la nuestra: muchísimos. La Mask R-CNN que usamos tiene decenas de millones. Por eso el archivo de cada modelo pesa unos ciento setenta y seis megabytes: en su mayor parte es la lista de pesos. Que un modelo esté «entrenado» significa que cada uno de esos millones de números ya tiene un valor adecuado. Un modelo sin entrenar tiene los mismos pesos con valores arbitrarios y produce respuestas sin sentido. El entrenamiento es el proceso que encuentra los valores correctos.</w:t>
-      </w:r>
-    </w:p>
-    <w:p>
-      <w:r>
-        <w:rPr>
-          <w:b w:val="0"/>
-          <w:i w:val="0"/>
-        </w:rPr>
-        <w:t>A quienes vienen de la programación tradicional esto suele sorprenderles: nadie asigna esos pesos a mano. Ni yo ni el grupo decidimos que la neurona número cuatro mil doscientos vale 0.37. Los valores salen del aprendizaje. Lo que yo decido es la arquitectura, es decir, cuántas capas hay y cómo se conectan, y los datos con que se entrena. Eso es lo que en los hechos construye el modelo.</w:t>
-      </w:r>
-    </w:p>
-    <w:p>
-      <w:r>
-        <w:rPr>
-          <w:b w:val="0"/>
-          <w:i w:val="0"/>
-        </w:rPr>
-        <w:t>La analogía con el cerebro conviene tomarla con cautela. El concepto nació de la idea de que las neuronas biológicas reciben señales, las ponderan y se activan según el total. Pero una neurona artificial es mucho más simple que una biológica, y la red completa no funciona como un cerebro. Lo útil de la analogía son las muchas unidades simples que, en capas, producen comportamientos complejos. Pensar que, por llamarse neuronal, la red «piensa» o «comprende» sería un error.</w:t>
-      </w:r>
-    </w:p>
-    <w:p>
-      <w:r>
-        <w:rPr>
-          <w:b w:val="0"/>
-          <w:i w:val="0"/>
-        </w:rPr>
-        <w:t>Resumo con un esquema que usaremos hasta el final. Una red neuronal es una cadena de capas. Cada capa toma números, los combina con pesos, aplica una pequeña no linealidad y pasa el resultado a la siguiente. Los pesos son lo que la red sabe. Falta ver cómo conseguir que esos pesos tomen valores útiles.</w:t>
+        <w:t>[Pantalla: diapositiva con un ciclo de cuatro pasos: predecir, comparar, ajustar, repetir.]</w:t>
+      </w:r>
+    </w:p>
+    <w:p>
+      <w:r>
+        <w:rPr>
+          <w:b w:val="0"/>
+          <w:i w:val="0"/>
+        </w:rPr>
+        <w:t>¿Cómo se logra que millones de pesos tomen valores útiles? Con un proceso de ensayo y corrección bastante parecido a cómo aprendemos las personas. Lo describo en cuatro pasos y luego los desarrollo.</w:t>
+      </w:r>
+    </w:p>
+    <w:p>
+      <w:r>
+        <w:rPr>
+          <w:b w:val="0"/>
+          <w:i w:val="0"/>
+        </w:rPr>
+        <w:t>Primero, la red hace una predicción con los pesos que tiene en ese momento. Segundo, se compara con la respuesta correcta, que alguien proporcionó, y se mide cuánto se equivocó. Tercero, se ajustan un poco los pesos en la dirección que habría reducido el error. Cuarto, se repite con otro ejemplo, y otro, miles de veces.</w:t>
+      </w:r>
+    </w:p>
+    <w:p>
+      <w:r>
+        <w:rPr>
+          <w:b w:val="0"/>
+          <w:i w:val="0"/>
+        </w:rPr>
+        <w:t>El punto de partida: antes de entrenar, los pesos tienen valores arbitrarios. Si le damos una imagen, la red responde, pero la respuesta es casi aleatoria. Con una imagen de ciento cuarenta espermatozoides podría marcar regiones al azar.</w:t>
+      </w:r>
+    </w:p>
+    <w:p>
+      <w:r>
+        <w:rPr>
+          <w:b w:val="0"/>
+          <w:i w:val="0"/>
+        </w:rPr>
+        <w:t>Para mejorar, la red necesita saber cuánto se equivocó. Esa medida se llama función de pérdida: un número que resume la distancia entre lo que la red predijo y lo que debió predecir. Si marca justo los espermatozoides que las personas marcaron, la pérdida es pequeña; si marca otras cosas o se le escapan muchos, es grande. La pérdida solo tiene que cumplir dos condiciones: ser más baja mientras mejor sea la predicción, y poder calcularse de forma automática. Todo el aprendizaje consiste en lograr que baje.</w:t>
+      </w:r>
+    </w:p>
+    <w:p>
+      <w:r>
+        <w:rPr>
+          <w:b w:val="0"/>
+          <w:i w:val="0"/>
+        </w:rPr>
+        <w:t>Sobre el origen de las respuestas correctas, algo que tiene consecuencias prácticas para el grupo. No las da la red ni el desarrollador: las dan personas. Alguien tuvo que mirar cada fotografía de entrenamiento y marcar, con un contorno, cada espermatozoide. A ese trabajo se le llama anotación o etiquetado, y es la fuente de lo que el modelo aprende. En nuestro caso se hizo con una herramienta llamada CVAT, que veremos en la segunda sesión. Por ahora basta recordar que el modelo solo puede aprender a reproducir lo que las personas marcaron. Si las marcas tienen errores, aprende los errores. Si siguen un criterio, aprende ese criterio. Un modelo es, en cierto sentido, un espejo comprimido de sus anotaciones.</w:t>
+      </w:r>
+    </w:p>
+    <w:p>
+      <w:r>
+        <w:rPr>
+          <w:b w:val="0"/>
+          <w:i w:val="0"/>
+        </w:rPr>
+        <w:t>Tercer paso, ajustar, que es la parte más ingeniosa. Imaginen que están en una montaña con niebla densa y quieren llegar al valle más bajo. No ven el paisaje, pero sienten la inclinación del suelo bajo los pies. En cada paso avanzan un poco hacia donde el suelo baja más. No saben dónde está el valle, pero siguiendo la pendiente descendente llegan, poco a poco, a un lugar bajo.</w:t>
+      </w:r>
+    </w:p>
+    <w:p>
+      <w:r>
+        <w:rPr>
+          <w:b w:val="0"/>
+          <w:i w:val="0"/>
+        </w:rPr>
+        <w:t>Esa imagen es casi literalmente el algoritmo con que se entrena una red: el descenso del gradiente. La altura del terreno es la pérdida. La posición es el conjunto de todos los pesos. La inclinación del suelo, el gradiente, indica para cada peso en qué dirección moverlo para que la pérdida baje. Y el tamaño del paso se llama tasa de aprendizaje. Con un paso demasiado grande se puede saltar por encima del valle y rebotar sin llegar nunca. Con uno muy pequeño se avanza tan lento que el entrenamiento no termina en tiempo razonable. Elegir el tamaño del paso es una de las decisiones, los hiperparámetros, de la cuarta sesión.</w:t>
+      </w:r>
+    </w:p>
+    <w:p>
+      <w:r>
+        <w:rPr>
+          <w:b w:val="0"/>
+          <w:i w:val="0"/>
+        </w:rPr>
+        <w:t>Alguien preguntará cómo se calcula la pendiente con decenas de millones de pesos. Existe una técnica, la retropropagación, que aprovecha que la red es una cadena de operaciones simples para calcular de forma eficiente cuánto contribuyó cada peso al error. Se llama así porque el cálculo va hacia atrás: parte del error en la salida y retrocede capa por capa, repartiendo la responsabilidad. No necesitamos los detalles matemáticos. PyTorch, la herramienta que usamos, hace este cálculo solo, y yo únicamente escribo cómo se calcula la pérdida y cuántos pasos dar.</w:t>
+      </w:r>
+    </w:p>
+    <w:p>
+      <w:r>
+        <w:rPr>
+          <w:b w:val="0"/>
+          <w:i w:val="0"/>
+        </w:rPr>
+        <w:t>Cuarto paso, repetir. Cada ciclo de predecir, comparar y ajustar mueve un poquito los pesos, así que hay que repetirlo muchísimas veces. Aquí aparecen tres términos que oirán seguido.</w:t>
+      </w:r>
+    </w:p>
+    <w:p>
+      <w:r>
+        <w:rPr>
+          <w:b w:val="0"/>
+          <w:i w:val="0"/>
+        </w:rPr>
+        <w:t>Un lote es el grupo de ejemplos que se procesan juntos antes de cada ajuste. Ajustar después de cada ejemplo sería ruidoso, y después de todos, lentísimo.</w:t>
+      </w:r>
+    </w:p>
+    <w:p>
+      <w:r>
+        <w:rPr>
+          <w:b w:val="0"/>
+          <w:i w:val="0"/>
+        </w:rPr>
+        <w:t>Una iteración es un ajuste de los pesos con un lote.</w:t>
+      </w:r>
+    </w:p>
+    <w:p>
+      <w:r>
+        <w:rPr>
+          <w:b w:val="0"/>
+          <w:i w:val="0"/>
+        </w:rPr>
+        <w:t>Una época es una pasada completa por los ejemplos de entrenamiento. Entrenar el modelo de este proyecto es repetir muchas épocas; en el cuaderno la configuración por defecto es de sesenta. Con cada época la pérdida suele bajar, hasta estabilizarse.</w:t>
+      </w:r>
+    </w:p>
+    <w:p>
+      <w:r>
+        <w:rPr>
+          <w:b w:val="0"/>
+          <w:i w:val="0"/>
+        </w:rPr>
+        <w:t>Un matiz sobre nuestras imágenes. Como cada fotografía es grande, no se le pasa entera a la red; se le entregan recortes pequeños tomados de distintas zonas. Por eso, en el cuaderno, una época se define como cierto número de recortes. Es un detalle de implementación, pero explica por qué el entrenamiento trabaja con teselas, tema de la segunda sesión.</w:t>
+      </w:r>
+    </w:p>
+    <w:p>
+      <w:r>
+        <w:rPr>
+          <w:b w:val="0"/>
+          <w:i w:val="0"/>
+        </w:rPr>
+        <w:t>Ahora una parte con mucha importancia práctica: la diferencia entre aprender y memorizar. Si se entrena demasiado tiempo con pocos ejemplos, la red puede llegar a una pérdida muy baja simplemente porque memorizó esos ejemplos con todos sus detalles accidentales. Y cuando llega una fotografía nueva, funciona mal. Se llama sobreajuste. Es el estudiante que se aprende de memoria las respuestas del examen de práctica y fracasa cuando las preguntas cambian un poco.</w:t>
+      </w:r>
+    </w:p>
+    <w:p>
+      <w:r>
+        <w:rPr>
+          <w:b w:val="0"/>
+          <w:i w:val="0"/>
+        </w:rPr>
+        <w:t>La defensa se enuncia fácil: nunca se juzga la calidad de un modelo con los mismos ejemplos con que se entrenó. Se aparta una parte de las imágenes, el conjunto de validación, que la red no usa para ajustar pesos y que sirve solo para medir qué tan bien generaliza. Si el desempeño en entrenamiento mejora pero el de validación empeora, hay sobreajuste. Esta separación la veremos con detalle en las sesiones dos y cuatro, y es la razón de que, al hablar de las medidas de calidad, siempre aclare que se calcularon sobre imágenes que el modelo no vio al entrenar.</w:t>
+      </w:r>
+    </w:p>
+    <w:p>
+      <w:r>
+        <w:rPr>
+          <w:b w:val="0"/>
+          <w:i w:val="0"/>
+        </w:rPr>
+        <w:t>Recapitulemos. Entrenar una red es repetir un ciclo: predecir, medir el error con una función de pérdida, ajustar los pesos siguiendo la pendiente que lo reduce y empezar otra vez con ejemplos nuevos. Las respuestas correctas las dan personas con la anotación. El riesgo principal es memorizar en vez de aprender, y se controla evaluando con imágenes que el modelo nunca vio. Todo lo que sigue se apoya en esto.</w:t>
       </w:r>
     </w:p>
     <w:p>
@@ -3492,7 +3654,7 @@
         <w:pStyle w:val="Heading2"/>
       </w:pPr>
       <w:r>
-        <w:t>3.3 Cómo aprende una red</w:t>
+        <w:t>3.4 Un ciclo de aprendizaje con un solo peso</w:t>
       </w:r>
     </w:p>
     <w:p>
@@ -3502,7 +3664,7 @@
           <w:i/>
           <w:color w:val="595959"/>
         </w:rPr>
-        <w:t>1,033 palabras · 4.1 min</w:t>
+        <w:t>591 palabras · 2.4 min</w:t>
       </w:r>
     </w:p>
     <w:p>
@@ -3515,151 +3677,115 @@
           <w:i/>
           <w:color w:val="1F4E79"/>
         </w:rPr>
-        <w:t>[Pantalla: diapositiva con un ciclo de cuatro pasos: predecir, comparar, ajustar, repetir.]</w:t>
-      </w:r>
-    </w:p>
-    <w:p>
-      <w:r>
-        <w:rPr>
-          <w:b w:val="0"/>
-          <w:i w:val="0"/>
-        </w:rPr>
-        <w:t>¿Cómo se logra que millones de pesos tomen valores útiles? Con un proceso de ensayo y corrección bastante parecido a cómo aprendemos las personas. Lo describo en cuatro pasos y luego los desarrollo.</w:t>
-      </w:r>
-    </w:p>
-    <w:p>
-      <w:r>
-        <w:rPr>
-          <w:b w:val="0"/>
-          <w:i w:val="0"/>
-        </w:rPr>
-        <w:t>Primero, la red hace una predicción con los pesos que tiene en ese momento. Segundo, se compara con la respuesta correcta, que alguien proporcionó, y se mide cuánto se equivocó. Tercero, se ajustan un poco los pesos en la dirección que habría reducido el error. Cuarto, se repite con otro ejemplo, y otro, miles de veces.</w:t>
-      </w:r>
-    </w:p>
-    <w:p>
-      <w:r>
-        <w:rPr>
-          <w:b w:val="0"/>
-          <w:i w:val="0"/>
-        </w:rPr>
-        <w:t>El punto de partida: antes de entrenar, los pesos tienen valores arbitrarios. Si le damos una imagen, la red responde, pero la respuesta es casi aleatoria. Con una imagen de ciento cuarenta espermatozoides podría marcar regiones al azar.</w:t>
-      </w:r>
-    </w:p>
-    <w:p>
-      <w:r>
-        <w:rPr>
-          <w:b w:val="0"/>
-          <w:i w:val="0"/>
-        </w:rPr>
-        <w:t>Para mejorar, la red necesita saber cuánto se equivocó. Esa medida se llama función de pérdida: un número que resume la distancia entre lo que la red predijo y lo que debió predecir. Si marca justo los espermatozoides que las personas marcaron, la pérdida es pequeña; si marca otras cosas o se le escapan muchos, es grande. La pérdida solo tiene que cumplir dos condiciones: ser más baja mientras mejor sea la predicción, y poder calcularse de forma automática. Todo el aprendizaje consiste en lograr que baje.</w:t>
-      </w:r>
-    </w:p>
-    <w:p>
-      <w:r>
-        <w:rPr>
-          <w:b w:val="0"/>
-          <w:i w:val="0"/>
-        </w:rPr>
-        <w:t>Sobre el origen de las respuestas correctas, algo que tiene consecuencias prácticas para el grupo. No las da la red ni el desarrollador: las dan personas. Alguien tuvo que mirar cada fotografía de entrenamiento y marcar, con un contorno, cada espermatozoide. A ese trabajo se le llama anotación o etiquetado, y es la fuente de lo que el modelo aprende. En nuestro caso se hizo con una herramienta llamada CVAT, que veremos en la segunda sesión. Por ahora basta recordar que el modelo solo puede aprender a reproducir lo que las personas marcaron. Si las marcas tienen errores, aprende los errores. Si siguen un criterio, aprende ese criterio. Un modelo es, en cierto sentido, un espejo comprimido de sus anotaciones.</w:t>
-      </w:r>
-    </w:p>
-    <w:p>
-      <w:r>
-        <w:rPr>
-          <w:b w:val="0"/>
-          <w:i w:val="0"/>
-        </w:rPr>
-        <w:t>Tercer paso, ajustar, que es la parte más ingeniosa. Imaginen que están en una montaña con niebla densa y quieren llegar al valle más bajo. No ven el paisaje, pero sienten la inclinación del suelo bajo los pies. En cada paso avanzan un poco hacia donde el suelo baja más. No saben dónde está el valle, pero siguiendo la pendiente descendente llegan, poco a poco, a un lugar bajo.</w:t>
-      </w:r>
-    </w:p>
-    <w:p>
-      <w:r>
-        <w:rPr>
-          <w:b w:val="0"/>
-          <w:i w:val="0"/>
-        </w:rPr>
-        <w:t>Esa imagen es casi literalmente el algoritmo con que se entrena una red: el descenso del gradiente. La altura del terreno es la pérdida. La posición es el conjunto de todos los pesos. La inclinación del suelo, el gradiente, indica para cada peso en qué dirección moverlo para que la pérdida baje. Y el tamaño del paso se llama tasa de aprendizaje. Con un paso demasiado grande se puede saltar por encima del valle y rebotar sin llegar nunca. Con uno muy pequeño se avanza tan lento que el entrenamiento no termina en tiempo razonable. Elegir el tamaño del paso es una de las decisiones, los hiperparámetros, de la cuarta sesión.</w:t>
-      </w:r>
-    </w:p>
-    <w:p>
-      <w:r>
-        <w:rPr>
-          <w:b w:val="0"/>
-          <w:i w:val="0"/>
-        </w:rPr>
-        <w:t>Alguien preguntará cómo se calcula la pendiente con decenas de millones de pesos. Existe una técnica, la retropropagación, que aprovecha que la red es una cadena de operaciones simples para calcular de forma eficiente cuánto contribuyó cada peso al error. Se llama así porque el cálculo va hacia atrás: parte del error en la salida y retrocede capa por capa, repartiendo la responsabilidad. No necesitamos los detalles matemáticos. PyTorch, la herramienta que usamos, hace este cálculo solo, y yo únicamente escribo cómo se calcula la pérdida y cuántos pasos dar.</w:t>
-      </w:r>
-    </w:p>
-    <w:p>
-      <w:r>
-        <w:rPr>
-          <w:b w:val="0"/>
-          <w:i w:val="0"/>
-        </w:rPr>
-        <w:t>Cuarto paso, repetir. Cada ciclo de predecir, comparar y ajustar mueve un poquito los pesos, así que hay que repetirlo muchísimas veces. Aquí aparecen tres términos que oirán seguido.</w:t>
-      </w:r>
-    </w:p>
-    <w:p>
-      <w:r>
-        <w:rPr>
-          <w:b w:val="0"/>
-          <w:i w:val="0"/>
-        </w:rPr>
-        <w:t>Un lote es el grupo de ejemplos que se procesan juntos antes de cada ajuste. Ajustar después de cada ejemplo sería ruidoso, y después de todos, lentísimo.</w:t>
-      </w:r>
-    </w:p>
-    <w:p>
-      <w:r>
-        <w:rPr>
-          <w:b w:val="0"/>
-          <w:i w:val="0"/>
-        </w:rPr>
-        <w:t>Una iteración es un ajuste de los pesos con un lote.</w:t>
-      </w:r>
-    </w:p>
-    <w:p>
-      <w:r>
-        <w:rPr>
-          <w:b w:val="0"/>
-          <w:i w:val="0"/>
-        </w:rPr>
-        <w:t>Una época es una pasada completa por los ejemplos de entrenamiento. Entrenar el modelo de este proyecto es repetir muchas épocas; en el cuaderno la configuración por defecto es de sesenta. Con cada época la pérdida suele bajar, hasta estabilizarse.</w:t>
-      </w:r>
-    </w:p>
-    <w:p>
-      <w:r>
-        <w:rPr>
-          <w:b w:val="0"/>
-          <w:i w:val="0"/>
-        </w:rPr>
-        <w:t>Un matiz sobre nuestras imágenes. Como cada fotografía es grande, no se le pasa entera a la red; se le entregan recortes pequeños tomados de distintas zonas. Por eso, en el cuaderno, una época se define como cierto número de recortes. Es un detalle de implementación, pero explica por qué el entrenamiento trabaja con teselas, tema de la segunda sesión.</w:t>
-      </w:r>
-    </w:p>
-    <w:p>
-      <w:r>
-        <w:rPr>
-          <w:b w:val="0"/>
-          <w:i w:val="0"/>
-        </w:rPr>
-        <w:t>Ahora una parte con mucha importancia práctica: la diferencia entre aprender y memorizar. Si se entrena demasiado tiempo con pocos ejemplos, la red puede llegar a una pérdida muy baja simplemente porque memorizó esos ejemplos con todos sus detalles accidentales. Y cuando llega una fotografía nueva, funciona mal. Se llama sobreajuste. Es el estudiante que se aprende de memoria las respuestas del examen de práctica y fracasa cuando las preguntas cambian un poco.</w:t>
-      </w:r>
-    </w:p>
-    <w:p>
-      <w:r>
-        <w:rPr>
-          <w:b w:val="0"/>
-          <w:i w:val="0"/>
-        </w:rPr>
-        <w:t>La defensa se enuncia fácil: nunca se juzga la calidad de un modelo con los mismos ejemplos con que se entrenó. Se aparta una parte de las imágenes, el conjunto de validación, que la red no usa para ajustar pesos y que sirve solo para medir qué tan bien generaliza. Si el desempeño en entrenamiento mejora pero el de validación empeora, hay sobreajuste. Esta separación la veremos con detalle en las sesiones dos y cuatro, y es la razón de que, al hablar de las medidas de calidad, siempre aclare que se calcularon sobre imágenes que el modelo no vio al entrenar.</w:t>
-      </w:r>
-    </w:p>
-    <w:p>
-      <w:r>
-        <w:rPr>
-          <w:b w:val="0"/>
-          <w:i w:val="0"/>
-        </w:rPr>
-        <w:t>Hagamos una pausa mental para recapitular. Entrenar una red es repetir un ciclo: predecir, medir el error con una función de pérdida, ajustar los pesos siguiendo la pendiente que lo reduce y empezar otra vez con ejemplos nuevos. Las respuestas correctas las dan personas con la anotación. El riesgo principal es memorizar en vez de aprender, y se controla evaluando con imágenes que el modelo nunca vio. Si algo de esto quedó poco claro, es buen momento para preguntar, porque todo lo que sigue se apoya aquí.</w:t>
+        <w:t>[Pantalla: diapositiva con la ecuación «predicción = peso × entrada» y una tabla de tres columnas: peso, predicción, error. Completar la tabla mientras se habla.]</w:t>
+      </w:r>
+    </w:p>
+    <w:p>
+      <w:r>
+        <w:rPr>
+          <w:b w:val="0"/>
+          <w:i w:val="0"/>
+        </w:rPr>
+        <w:t>Para sentir cómo ajusta una red sus pesos, hagamos un ejemplo con una red absurdamente pequeña: una sola neurona con un solo peso y sin activación. La predicción es la entrada multiplicada por el peso. No tiene nada que ver con espermatozoides; sirve para ver la mecánica.</w:t>
+      </w:r>
+    </w:p>
+    <w:p>
+      <w:r>
+        <w:rPr>
+          <w:b w:val="0"/>
+          <w:i w:val="0"/>
+        </w:rPr>
+        <w:t>Supongamos que la entrada es tres y que la respuesta correcta es nueve. A ojo, el peso ideal es tres, porque tres por tres da nueve. Pero la red no lo sabe. Arranca con un peso arbitrario, digamos uno.</w:t>
+      </w:r>
+    </w:p>
+    <w:p>
+      <w:r>
+        <w:rPr>
+          <w:b w:val="0"/>
+          <w:i w:val="0"/>
+        </w:rPr>
+        <w:t>Primer ciclo. Predicción: uno por tres, tres. Respuesta correcta: nueve. El error es seis: nos quedamos cortos. La pérdida, que mide cuánto nos equivocamos, es el error elevado al cuadrado, treinta y seis. Elevarlo al cuadrado hace que errores grandes pesen mucho más que errores chicos y que no importe si nos pasamos o nos quedamos cortos.</w:t>
+      </w:r>
+    </w:p>
+    <w:p>
+      <w:r>
+        <w:rPr>
+          <w:b w:val="0"/>
+          <w:i w:val="0"/>
+        </w:rPr>
+        <w:t>Ahora la pregunta clave: ¿hacia dónde movemos el peso? Si lo subimos, la predicción sube y se acerca al nueve; si lo bajamos, se aleja. El gradiente es la cuenta que nos lo dice con precisión. Aquí vale menos treinta y seis, que se obtiene multiplicando menos dos por la entrada y por el error. El signo negativo indica que subir el peso baja la pérdida, y el tamaño dice qué tan empinada está la pendiente.</w:t>
+      </w:r>
+    </w:p>
+    <w:p>
+      <w:r>
+        <w:rPr>
+          <w:b w:val="0"/>
+          <w:i w:val="0"/>
+        </w:rPr>
+        <w:t>Segundo paso: moverse. Se resta al peso el gradiente multiplicado por la tasa de aprendizaje. Con una tasa de cero punto cero cinco: menos treinta y seis por cero punto cero cinco son menos uno punto ocho, y restar eso equivale a sumar uno punto ocho. El peso pasa de uno a dos punto ocho.</w:t>
+      </w:r>
+    </w:p>
+    <w:p>
+      <w:r>
+        <w:rPr>
+          <w:b w:val="0"/>
+          <w:i w:val="0"/>
+        </w:rPr>
+        <w:t>Segundo ciclo. Predicción: dos punto ocho por tres, ocho punto cuatro. El error es cero punto seis. La pendiente ahora es mucho más suave: menos dos por tres por cero punto seis, menos tres punto seis. El peso sube cero punto dieciocho y queda en dos punto noventa y ocho.</w:t>
+      </w:r>
+    </w:p>
+    <w:p>
+      <w:r>
+        <w:rPr>
+          <w:b w:val="0"/>
+          <w:i w:val="0"/>
+        </w:rPr>
+        <w:t>Tercer ciclo. Predicción: ocho punto noventa y cuatro. Error: cero punto cero seis. En dos ciclos más, el peso está prácticamente en tres. El patrón es este: cada ajuste es proporcional al error, así que los primeros pasos son grandes y los últimos, diminutos. Es exactamente la forma de la curva de pérdida que mostré hace un momento.</w:t>
+      </w:r>
+    </w:p>
+    <w:p>
+      <w:r>
+        <w:rPr>
+          <w:b w:val="0"/>
+          <w:i w:val="0"/>
+        </w:rPr>
+        <w:t>Ahora veamos qué pasa con una tasa mal elegida. Con cero punto cinco, diez veces mayor. En el primer ciclo, el peso pasa de uno a diecinueve: uno más dieciocho. La predicción es cincuenta y siete, cuando la respuesta es nueve. Nos pasamos por muchísimo, y el error ahora es de menos cuarenta y ocho, mayor que el inicial. En el siguiente ciclo el ajuste sería todavía más brusco, en dirección contraria, y el peso oscilaría con amplitud creciente. Eso es lo que llamo saltar por encima del valle. La pérdida, en lugar de bajar, explota, y ese es el caso en que el cuaderno se detiene y sugiere bajar la tasa de aprendizaje.</w:t>
+      </w:r>
+    </w:p>
+    <w:p>
+      <w:r>
+        <w:rPr>
+          <w:b w:val="0"/>
+          <w:i w:val="0"/>
+        </w:rPr>
+        <w:t>Con una tasa demasiado pequeña, por ejemplo cero punto cero cero cero uno, el peso se movería tan poco en cada ciclo que se necesitarían miles para llegar a un valor razonable.</w:t>
+      </w:r>
+    </w:p>
+    <w:p>
+      <w:r>
+        <w:rPr>
+          <w:b w:val="0"/>
+          <w:i w:val="0"/>
+        </w:rPr>
+        <w:t>Ese es el mecanismo completo, y es el mismo que ocurre en una red con decenas de millones de pesos. Cambia la escala, no la idea: en cada paso se calcula el error, se calcula hacia dónde mover cada peso y se mueve un poco. Lo que hace PyTorch es esa cuenta, para todos los pesos a la vez y con mucha eficiencia.</w:t>
+      </w:r>
+    </w:p>
+    <w:p>
+      <w:pPr>
+        <w:pStyle w:val="Heading2"/>
+      </w:pPr>
+      <w:r>
+        <w:t>3.5 Cómo se ve un entrenamiento: la pérdida y la validación</w:t>
+      </w:r>
+    </w:p>
+    <w:p>
+      <w:r>
+        <w:rPr>
+          <w:b w:val="0"/>
+          <w:i/>
+          <w:color w:val="595959"/>
+        </w:rPr>
+        <w:t>620 palabras · 2.5 min</w:t>
       </w:r>
     </w:p>
     <w:p>
@@ -3672,7 +3798,70 @@
           <w:i/>
           <w:color w:val="1F4E79"/>
         </w:rPr>
-        <w:t>[Pausa breve para preguntas. Continuar si no hay.]</w:t>
+        <w:t>[Pantalla: diapositiva con dos curvas esquemáticas contra el número de épocas: la pérdida de entrenamiento, que baja, y una medida de calidad en validación, que sube y luego se estabiliza.]</w:t>
+      </w:r>
+    </w:p>
+    <w:p>
+      <w:r>
+        <w:rPr>
+          <w:b w:val="0"/>
+          <w:i w:val="0"/>
+        </w:rPr>
+        <w:t>Antes de seguir con las imágenes veamos cómo luce un entrenamiento en la práctica, porque en las sesiones dos y cuatro lo vamos a ver en vivo y conviene saber qué esperar. Lo que tienen en pantalla es un esquema, no datos reales.</w:t>
+      </w:r>
+    </w:p>
+    <w:p>
+      <w:r>
+        <w:rPr>
+          <w:b w:val="0"/>
+          <w:i w:val="0"/>
+        </w:rPr>
+        <w:t>El eje horizontal es el tiempo, medido en épocas. La primera curva es la pérdida en el conjunto de entrenamiento. Al principio es alta, porque los pesos de las capas nuevas son aleatorios y las predicciones son malas. Baja rápido en las primeras épocas y luego cada vez más despacio, hasta casi aplanarse. Es normal: al comienzo hay mucho por corregir y cada ajuste rinde; después los ajustes son finos y el avance es gradual. Si la curva no baja nunca, algo anda mal: la tasa de aprendizaje puede ser demasiado alta o demasiado baja, o los datos pueden tener un problema, como etiquetas que no corresponden a las imágenes. Si la curva sube de golpe o se vuelve un valor inválido, casi siempre es una tasa de aprendizaje excesiva; el cuaderno lo detecta, se detiene y sugiere bajarla.</w:t>
+      </w:r>
+    </w:p>
+    <w:p>
+      <w:r>
+        <w:rPr>
+          <w:b w:val="0"/>
+          <w:i w:val="0"/>
+        </w:rPr>
+        <w:t>La segunda curva es una medida de calidad calculada sobre las imágenes de validación. En nuestro cuaderno es el AP50, que veremos en detalle en la cuarta sesión; por ahora basta saber que va de cero a uno y que mientras más alto, mejor. Suele subir al principio y, si todo va bien, se estabiliza. Lo valioso de la validación es que nadie la entrena: mide con honestidad lo que el modelo sabría hacer con imágenes que no usó para aprender.</w:t>
+      </w:r>
+    </w:p>
+    <w:p>
+      <w:r>
+        <w:rPr>
+          <w:b w:val="0"/>
+          <w:i w:val="0"/>
+        </w:rPr>
+        <w:t>Lo interesante ocurre al comparar las dos curvas. Si la pérdida de entrenamiento sigue bajando pero la calidad en validación deja de mejorar o empeora, es la señal de sobreajuste: el modelo ya aprendió lo que podía generalizar y ahora solo memoriza. Conviene dejar de entrenar o quedarse con la versión que tuvo el mejor resultado en validación. Así funciona el cuaderno: cada cierto número de épocas valida y, cuando el resultado mejora, guarda una copia como la mejor. Al final se exporta esa copia, no necesariamente la última.</w:t>
+      </w:r>
+    </w:p>
+    <w:p>
+      <w:r>
+        <w:rPr>
+          <w:b w:val="0"/>
+          <w:i w:val="0"/>
+        </w:rPr>
+        <w:t>Un matiz propio de nuestro caso. Con muy pocas imágenes, la validación también es muy pequeña, y una medición hecha con unos pocos espermatozoides es inestable: puede subir o bajar mucho entre épocas por puro azar. El cuaderno lo contempla: si la validación tiene menos de diez espermatozoides, no elige el mejor punto con ella, porque sería escoger con una regla poco fiable, y se queda con la última época. Es una precaución que solo se aprende al trabajar con pocos datos, y muestra por qué el tamaño de la validación importa tanto como el del entrenamiento.</w:t>
+      </w:r>
+    </w:p>
+    <w:p>
+      <w:r>
+        <w:rPr>
+          <w:b w:val="0"/>
+          <w:i w:val="0"/>
+        </w:rPr>
+        <w:t>Un detalle práctico. El entrenamiento se hace en Google Colab, un servicio que presta computadoras con tarjeta gráfica por sesiones de tiempo limitado y que a veces se interrumpe. Por eso el cuaderno guarda con frecuencia el estado completo del entrenamiento, y si la sesión se corta basta volver a ejecutar todo desde el principio: continúa desde la última época guardada. Parece menor, pero evita perder horas de trabajo y es una de las razones por las que cualquiera del grupo puede repetir el procedimiento.</w:t>
+      </w:r>
+    </w:p>
+    <w:p>
+      <w:r>
+        <w:rPr>
+          <w:b w:val="0"/>
+          <w:i w:val="0"/>
+        </w:rPr>
+        <w:t>Y un último concepto, la semilla aleatoria. Varias partes del entrenamiento son aleatorias: los recortes que se toman, el orden de los ejemplos, los valores iniciales de las capas nuevas. Con una semilla fija, el generador produce siempre la misma secuencia, y el entrenamiento es reproducible: con los mismos datos y la misma configuración se obtiene el mismo modelo. El cuaderno guarda la semilla junto con el resto de la configuración dentro del archivo del modelo, así que siempre se puede saber con qué se entrenó.</w:t>
       </w:r>
     </w:p>
     <w:p>
@@ -3680,7 +3869,7 @@
         <w:pStyle w:val="Heading2"/>
       </w:pPr>
       <w:r>
-        <w:t>3.4 Un ciclo de aprendizaje con un solo peso</w:t>
+        <w:t>3.6 Cómo «ve» una imagen una red convolucional</w:t>
       </w:r>
     </w:p>
     <w:p>
@@ -3690,7 +3879,7 @@
           <w:i/>
           <w:color w:val="595959"/>
         </w:rPr>
-        <w:t>591 palabras · 2.4 min</w:t>
+        <w:t>983 palabras · 3.9 min</w:t>
       </w:r>
     </w:p>
     <w:p>
@@ -3703,97 +3892,115 @@
           <w:i/>
           <w:color w:val="1F4E79"/>
         </w:rPr>
-        <w:t>[Pantalla: diapositiva con la ecuación «predicción = peso × entrada» y una tabla de tres columnas: peso, predicción, error. Completar la tabla mientras se habla.]</w:t>
-      </w:r>
-    </w:p>
-    <w:p>
-      <w:r>
-        <w:rPr>
-          <w:b w:val="0"/>
-          <w:i w:val="0"/>
-        </w:rPr>
-        <w:t>Para sentir cómo ajusta una red sus pesos, hagamos un ejemplo con una red absurdamente pequeña: una sola neurona con un solo peso y sin activación. La predicción es la entrada multiplicada por el peso. No tiene nada que ver con espermatozoides; sirve para ver la mecánica.</w:t>
-      </w:r>
-    </w:p>
-    <w:p>
-      <w:r>
-        <w:rPr>
-          <w:b w:val="0"/>
-          <w:i w:val="0"/>
-        </w:rPr>
-        <w:t>Supongamos que la entrada es tres y que la respuesta correcta es nueve. A ojo, el peso ideal es tres, porque tres por tres da nueve. Pero la red no lo sabe. Arranca con un peso arbitrario, digamos uno.</w:t>
-      </w:r>
-    </w:p>
-    <w:p>
-      <w:r>
-        <w:rPr>
-          <w:b w:val="0"/>
-          <w:i w:val="0"/>
-        </w:rPr>
-        <w:t>Primer ciclo. Predicción: uno por tres, tres. Respuesta correcta: nueve. El error es seis: nos quedamos cortos. La pérdida, que mide cuánto nos equivocamos, es el error elevado al cuadrado, treinta y seis. Elevarlo al cuadrado hace que errores grandes pesen mucho más que errores chicos y que no importe si nos pasamos o nos quedamos cortos.</w:t>
-      </w:r>
-    </w:p>
-    <w:p>
-      <w:r>
-        <w:rPr>
-          <w:b w:val="0"/>
-          <w:i w:val="0"/>
-        </w:rPr>
-        <w:t>Ahora la pregunta clave: ¿hacia dónde movemos el peso? Si lo subimos, la predicción sube y se acerca al nueve; si lo bajamos, se aleja. El gradiente es la cuenta que nos lo dice con precisión. Aquí vale menos treinta y seis, que se obtiene multiplicando menos dos por la entrada y por el error. El signo negativo indica que subir el peso baja la pérdida, y el tamaño dice qué tan empinada está la pendiente.</w:t>
-      </w:r>
-    </w:p>
-    <w:p>
-      <w:r>
-        <w:rPr>
-          <w:b w:val="0"/>
-          <w:i w:val="0"/>
-        </w:rPr>
-        <w:t>Segundo paso: moverse. Se resta al peso el gradiente multiplicado por la tasa de aprendizaje. Con una tasa de cero punto cero cinco: menos treinta y seis por cero punto cero cinco son menos uno punto ocho, y restar eso equivale a sumar uno punto ocho. El peso pasa de uno a dos punto ocho.</w:t>
-      </w:r>
-    </w:p>
-    <w:p>
-      <w:r>
-        <w:rPr>
-          <w:b w:val="0"/>
-          <w:i w:val="0"/>
-        </w:rPr>
-        <w:t>Segundo ciclo. Predicción: dos punto ocho por tres, ocho punto cuatro. El error es cero punto seis. La pendiente ahora es mucho más suave: menos dos por tres por cero punto seis, menos tres punto seis. El peso sube cero punto dieciocho y queda en dos punto noventa y ocho.</w:t>
-      </w:r>
-    </w:p>
-    <w:p>
-      <w:r>
-        <w:rPr>
-          <w:b w:val="0"/>
-          <w:i w:val="0"/>
-        </w:rPr>
-        <w:t>Tercer ciclo. Predicción: ocho punto noventa y cuatro. Error: cero punto cero seis. En dos ciclos más, el peso está prácticamente en tres. Fíjense en el patrón: cada ajuste es proporcional al error, así que los primeros pasos son grandes y los últimos, diminutos. Es exactamente la forma de la curva de pérdida que mostré hace un momento.</w:t>
-      </w:r>
-    </w:p>
-    <w:p>
-      <w:r>
-        <w:rPr>
-          <w:b w:val="0"/>
-          <w:i w:val="0"/>
-        </w:rPr>
-        <w:t>Ahora veamos qué pasa con una tasa mal elegida. Con cero punto cinco, diez veces mayor. En el primer ciclo, el peso pasa de uno a diecinueve: uno más dieciocho. La predicción es cincuenta y siete, cuando la respuesta es nueve. Nos pasamos por muchísimo, y el error ahora es de menos cuarenta y ocho, mayor que el inicial. En el siguiente ciclo el ajuste sería todavía más brusco, en dirección contraria, y el peso oscilaría con amplitud creciente. Eso es lo que llamo saltar por encima del valle. La pérdida, en lugar de bajar, explota, y ese es el caso en que el cuaderno se detiene y sugiere bajar la tasa de aprendizaje.</w:t>
-      </w:r>
-    </w:p>
-    <w:p>
-      <w:r>
-        <w:rPr>
-          <w:b w:val="0"/>
-          <w:i w:val="0"/>
-        </w:rPr>
-        <w:t>Con una tasa demasiado pequeña, por ejemplo cero punto cero cero cero uno, el peso se movería tan poco en cada ciclo que se necesitarían miles para llegar a un valor razonable.</w:t>
-      </w:r>
-    </w:p>
-    <w:p>
-      <w:r>
-        <w:rPr>
-          <w:b w:val="0"/>
-          <w:i w:val="0"/>
-        </w:rPr>
-        <w:t>Ese es el mecanismo completo, y es el mismo que ocurre en una red con decenas de millones de pesos. Cambia la escala, no la idea: en cada paso se calcula el error, se calcula hacia dónde mover cada peso y se mueve un poco. Lo que hace PyTorch es esa cuenta, para todos los pesos a la vez y con mucha eficiencia.</w:t>
+        <w:t>[Pantalla: diapositiva con una fotografía de fluorescencia ampliada hasta mostrar los píxeles individuales como cuadritos con sus valores numéricos.]</w:t>
+      </w:r>
+    </w:p>
+    <w:p>
+      <w:r>
+        <w:rPr>
+          <w:b w:val="0"/>
+          <w:i w:val="0"/>
+        </w:rPr>
+        <w:t>Hasta aquí hablamos de redes neuronales en general. Ahora llego a la variante que las hace aptas para imágenes, la red neuronal convolucional. Primero hay que entender qué es una imagen para una computadora.</w:t>
+      </w:r>
+    </w:p>
+    <w:p>
+      <w:r>
+        <w:rPr>
+          <w:b w:val="0"/>
+          <w:i w:val="0"/>
+        </w:rPr>
+        <w:t>En pantalla tienen una porción de una fotografía de fluorescencia ampliada hasta distinguir los píxeles. Cada cuadrito es un píxel, y para la computadora no es un color sino un conjunto de números. En una imagen a color hay tres por píxel, que indican cuánta luz roja, verde y azul hay en ese punto, normalmente en una escala de cero a doscientos cincuenta y cinco. Una fotografía de 1792 píxeles de ancho por 1374 de alto contiene así más de siete millones de números. Para la computadora la imagen es una tabla enorme de valores. No hay células, ni colas, ni fondo: solo números en una cuadrícula.</w:t>
+      </w:r>
+    </w:p>
+    <w:p>
+      <w:r>
+        <w:rPr>
+          <w:b w:val="0"/>
+          <w:i w:val="0"/>
+        </w:rPr>
+        <w:t>Eso crea un problema práctico para usar redes sencillas con imágenes. Si cada píxel se conecta con cada neurona de la primera capa, como en el esquema anterior, el número de pesos se dispara. Con siete millones de entradas y apenas mil neuronas en esa capa, serían siete mil millones de pesos solo en el primer paso. Inviable.</w:t>
+      </w:r>
+    </w:p>
+    <w:p>
+      <w:r>
+        <w:rPr>
+          <w:b w:val="0"/>
+          <w:i w:val="0"/>
+        </w:rPr>
+        <w:t>Hay otro problema menos evidente: esa conexión total ignora la estructura de la imagen. Un píxel se relaciona con sus vecinos; un borde, una mancha o una línea son patrones locales, de unos pocos píxeles contiguos. Y un mismo patrón, por ejemplo el borde de una célula, puede aparecer en cualquier lugar. Una red que aprendiera a reconocer el borde en la esquina superior izquierda tendría que aprenderlo de nuevo en la inferior derecha, con otros pesos. Un desperdicio.</w:t>
+      </w:r>
+    </w:p>
+    <w:p>
+      <w:r>
+        <w:rPr>
+          <w:b w:val="0"/>
+          <w:i w:val="0"/>
+        </w:rPr>
+        <w:t>La convolución resuelve ambas cosas. En lugar de conectar cada neurona con toda la imagen, se usa un pequeño detector, de unos pocos píxeles de lado, que se desliza por la imagen y se aplica en cada posición.</w:t>
+      </w:r>
+    </w:p>
+    <w:p>
+      <w:r>
+        <w:rPr>
+          <w:b w:val="0"/>
+          <w:i w:val="0"/>
+        </w:rPr>
+        <w:t>A ese detector se le llama filtro o kernel. Un ejemplo: un filtro de tres por tres píxeles, es decir, nueve pesos. Lo coloco sobre la esquina superior izquierda de la imagen, multiplico cada uno de los nueve píxeles que quedan debajo por el peso correspondiente, sumo y anoto el número. Muevo el filtro un píxel a la derecha y repito. Al terminar la fila, bajo una y sigo. El resultado es una tabla nueva, el mapa de características, donde cada valor dice cuánto se parecía a lo que busca el filtro la zona de la imagen sobre la que estuvo.</w:t>
+      </w:r>
+    </w:p>
+    <w:p>
+      <w:r>
+        <w:rPr>
+          <w:b w:val="0"/>
+          <w:i w:val="0"/>
+        </w:rPr>
+        <w:t>Veamos qué puede buscar un filtro. Supongan uno con pesos negativos en la columna izquierda, ceros en la central y positivos en la derecha. Sobre una zona uniforme da casi cero, porque negativos y positivos se compensan. Pero sobre una zona oscura a la izquierda y brillante a la derecha, es decir, un borde vertical de oscuro a claro, da un número grande. Ese filtro detecta bordes verticales. Con otros pesos detectaría bordes horizontales, diagonales, esquinas o manchas pequeñas. Un filtro es, literalmente, una pregunta: ¿hay aquí algo parecido a este patrón?</w:t>
+      </w:r>
+    </w:p>
+    <w:p>
+      <w:r>
+        <w:rPr>
+          <w:b w:val="0"/>
+          <w:i w:val="0"/>
+        </w:rPr>
+        <w:t>Dos propiedades hacen eficiente a la convolución, y son la razón de ser de estas redes. La primera es la conexión local: cada valor del mapa depende solo de una pequeña vecindad de píxeles, no de toda la imagen, lo que reduce muchísimo el número de pesos. La segunda es el reparto de pesos: el mismo filtro, con los mismos nueve pesos, se usa en todas las posiciones. Si aprende a detectar un borde, lo detecta donde aparezca. Hacen falta nueve pesos, no millones.</w:t>
+      </w:r>
+    </w:p>
+    <w:p>
+      <w:r>
+        <w:rPr>
+          <w:b w:val="0"/>
+          <w:i w:val="0"/>
+        </w:rPr>
+        <w:t>Lo más importante es de dónde salen los pesos de los filtros. En el procesamiento de imágenes clásico, una persona diseñaba los filtros a mano; hay filtros famosos para bordes, suavizado o realce de contornos. En una red convolucional nadie los diseña: se aprenden durante el entrenamiento. La red empieza con filtros aleatorios y, con el ciclo que describí, los ajusta hasta que detectan los patrones útiles para la tarea. Si para contar espermatozoides conviene detectar cierto borde curvo, la red lo descubre por sí sola a partir de los ejemplos.</w:t>
+      </w:r>
+    </w:p>
+    <w:p>
+      <w:r>
+        <w:rPr>
+          <w:b w:val="0"/>
+          <w:i w:val="0"/>
+        </w:rPr>
+        <w:t>Una capa convolucional no tiene un filtro sino muchos, a veces decenas o cientos, y cada uno aprende un patrón distinto. La salida es un conjunto de mapas de características, uno por filtro, apilados como hojas de un libro. Con sesenta y cuatro filtros salen sesenta y cuatro mapas, cada uno señalando dónde apareció su patrón.</w:t>
+      </w:r>
+    </w:p>
+    <w:p>
+      <w:r>
+        <w:rPr>
+          <w:b w:val="0"/>
+          <w:i w:val="0"/>
+        </w:rPr>
+        <w:t>Casi todas las redes convolucionales incluyen dos operaciones más. Una es la activación, ya vista: tras cada convolución se apagan los valores negativos. La otra es la reducción, o pooling, que resume cada región pequeña del mapa en un solo número, por ejemplo el máximo de cada cuadro de dos por dos. El mapa se reduce a la mitad en ancho y en alto, y cada capa trabaja con una versión más pequeña y resumida de la anterior. Eso sirve por dos razones. El cálculo es más rápido. Y cada valor de las capas profundas abarca una zona cada vez mayor de la imagen original: una neurona de la tercera capa depende indirectamente de un área grande de píxeles. A esa zona se le llama campo receptivo, y su crecimiento a lo largo de las capas es lo que permite pasar de detectar bordes a detectar objetos completos.</w:t>
+      </w:r>
+    </w:p>
+    <w:p>
+      <w:r>
+        <w:rPr>
+          <w:b w:val="0"/>
+          <w:i w:val="0"/>
+        </w:rPr>
+        <w:t>Me parece una de las ideas más elegantes del tema, así que la comparto. Si se examinan los filtros de una red convolucional entrenada con millones de fotografías, los de las primeras capas son detectores de bordes, orientaciones y colores, justo lo que diseñaban a mano los especialistas. Los de las siguientes responden a combinaciones: texturas, esquinas, curvas. Y los de las capas profundas responden a formas completas de objetos. Nadie le dijo a la red que lo hiciera así. Esa jerarquía surge del entrenamiento y es lo que permite reutilizar una red ya entrenada.</w:t>
       </w:r>
     </w:p>
     <w:p>
@@ -3801,7 +4008,7 @@
         <w:pStyle w:val="Heading2"/>
       </w:pPr>
       <w:r>
-        <w:t>3.5 Cómo se ve un entrenamiento: la pérdida y la validación</w:t>
+        <w:t>3.7 Un ejemplo numérico: una convolución hecha a mano</w:t>
       </w:r>
     </w:p>
     <w:p>
@@ -3811,7 +4018,7 @@
           <w:i/>
           <w:color w:val="595959"/>
         </w:rPr>
-        <w:t>620 palabras · 2.5 min</w:t>
+        <w:t>712 palabras · 2.8 min</w:t>
       </w:r>
     </w:p>
     <w:p>
@@ -3824,70 +4031,106 @@
           <w:i/>
           <w:color w:val="1F4E79"/>
         </w:rPr>
-        <w:t>[Pantalla: diapositiva con dos curvas esquemáticas contra el número de épocas: la pérdida de entrenamiento, que baja, y una medida de calidad en validación, que sube y luego se estabiliza.]</w:t>
-      </w:r>
-    </w:p>
-    <w:p>
-      <w:r>
-        <w:rPr>
-          <w:b w:val="0"/>
-          <w:i w:val="0"/>
-        </w:rPr>
-        <w:t>Antes de seguir con las imágenes veamos cómo luce un entrenamiento en la práctica, porque en las sesiones dos y cuatro lo vamos a ver en vivo y conviene saber qué esperar. Lo que tienen en pantalla es un esquema, no datos reales.</w:t>
-      </w:r>
-    </w:p>
-    <w:p>
-      <w:r>
-        <w:rPr>
-          <w:b w:val="0"/>
-          <w:i w:val="0"/>
-        </w:rPr>
-        <w:t>El eje horizontal es el tiempo, medido en épocas. La primera curva es la pérdida en el conjunto de entrenamiento. Al principio es alta, porque los pesos de las capas nuevas son aleatorios y las predicciones son malas. Baja rápido en las primeras épocas y luego cada vez más despacio, hasta casi aplanarse. Es normal: al comienzo hay mucho por corregir y cada ajuste rinde; después los ajustes son finos y el avance es gradual. Si la curva no baja nunca, algo anda mal: la tasa de aprendizaje puede ser demasiado alta o demasiado baja, o los datos pueden tener un problema, como etiquetas que no corresponden a las imágenes. Si la curva sube de golpe o se vuelve un valor inválido, casi siempre es una tasa de aprendizaje excesiva; el cuaderno lo detecta, se detiene y sugiere bajarla.</w:t>
-      </w:r>
-    </w:p>
-    <w:p>
-      <w:r>
-        <w:rPr>
-          <w:b w:val="0"/>
-          <w:i w:val="0"/>
-        </w:rPr>
-        <w:t>La segunda curva es una medida de calidad calculada sobre las imágenes de validación. En nuestro cuaderno es el AP50, que veremos en detalle en la cuarta sesión; por ahora basta saber que va de cero a uno y que mientras más alto, mejor. Suele subir al principio y, si todo va bien, se estabiliza. Lo valioso de la validación es que nadie la entrena: mide con honestidad lo que el modelo sabría hacer con imágenes que no usó para aprender.</w:t>
-      </w:r>
-    </w:p>
-    <w:p>
-      <w:r>
-        <w:rPr>
-          <w:b w:val="0"/>
-          <w:i w:val="0"/>
-        </w:rPr>
-        <w:t>Lo interesante ocurre al comparar las dos curvas. Si la pérdida de entrenamiento sigue bajando pero la calidad en validación deja de mejorar o empeora, es la señal de sobreajuste: el modelo ya aprendió lo que podía generalizar y ahora solo memoriza. Conviene dejar de entrenar o quedarse con la versión que tuvo el mejor resultado en validación. Así funciona el cuaderno: cada cierto número de épocas valida y, cuando el resultado mejora, guarda una copia como la mejor. Al final se exporta esa copia, no necesariamente la última.</w:t>
-      </w:r>
-    </w:p>
-    <w:p>
-      <w:r>
-        <w:rPr>
-          <w:b w:val="0"/>
-          <w:i w:val="0"/>
-        </w:rPr>
-        <w:t>Un matiz propio de nuestro caso. Con muy pocas imágenes, la validación también es muy pequeña, y una medición hecha con unos pocos espermatozoides es inestable: puede subir o bajar mucho entre épocas por puro azar. El cuaderno lo contempla: si la validación tiene menos de diez espermatozoides, no elige el mejor punto con ella, porque sería escoger con una regla poco fiable, y se queda con la última época. Es una precaución que solo se aprende al trabajar con pocos datos, y muestra por qué el tamaño de la validación importa tanto como el del entrenamiento.</w:t>
-      </w:r>
-    </w:p>
-    <w:p>
-      <w:r>
-        <w:rPr>
-          <w:b w:val="0"/>
-          <w:i w:val="0"/>
-        </w:rPr>
-        <w:t>Un detalle práctico. El entrenamiento se hace en Google Colab, un servicio que presta computadoras con tarjeta gráfica por sesiones de tiempo limitado y que a veces se interrumpe. Por eso el cuaderno guarda con frecuencia el estado completo del entrenamiento, y si la sesión se corta basta volver a ejecutar todo desde el principio: continúa desde la última época guardada. Parece menor, pero evita perder horas de trabajo y es una de las razones por las que cualquiera del grupo puede repetir el procedimiento.</w:t>
-      </w:r>
-    </w:p>
-    <w:p>
-      <w:r>
-        <w:rPr>
-          <w:b w:val="0"/>
-          <w:i w:val="0"/>
-        </w:rPr>
-        <w:t>Y un último concepto, la semilla aleatoria. Varias partes del entrenamiento son aleatorias: los recortes que se toman, el orden de los ejemplos, los valores iniciales de las capas nuevas. Con una semilla fija, el generador produce siempre la misma secuencia, y el entrenamiento es reproducible: con los mismos datos y la misma configuración se obtiene el mismo modelo. El cuaderno guarda la semilla junto con el resto de la configuración dentro del archivo del modelo, así que siempre se puede saber con qué se entrenó.</w:t>
+        <w:t>[Pantalla: diapositiva con una cuadrícula de tres por tres números a la izquierda, un filtro de tres por tres en el centro y el resultado a la derecha. Ir completando los números mientras se habla.]</w:t>
+      </w:r>
+    </w:p>
+    <w:p>
+      <w:r>
+        <w:rPr>
+          <w:b w:val="0"/>
+          <w:i w:val="0"/>
+        </w:rPr>
+        <w:t>Para que la convolución quede clara hagamos una cuenta completa con números pequeños. Es la única de toda la sesión y es sencilla.</w:t>
+      </w:r>
+    </w:p>
+    <w:p>
+      <w:r>
+        <w:rPr>
+          <w:b w:val="0"/>
+          <w:i w:val="0"/>
+        </w:rPr>
+        <w:t>Imaginen un pedazo de imagen en escala de grises, de tres por tres píxeles. En cada fila, los dos primeros píxeles son oscuros, con valor diez, y el tercero es muy brillante, con valor doscientos. Las tres filas dicen lo mismo: diez, diez, doscientos. A la vista, una zona oscura a la izquierda y una franja brillante a la derecha: un borde vertical de oscuro a brillante.</w:t>
+      </w:r>
+    </w:p>
+    <w:p>
+      <w:r>
+        <w:rPr>
+          <w:b w:val="0"/>
+          <w:i w:val="0"/>
+        </w:rPr>
+        <w:t>Tomemos un filtro de tres por tres con estos pesos en cada fila: menos uno, cero, uno. El filtro resta lo que hay a la izquierda, suma lo que hay a la derecha y no le importa el centro.</w:t>
+      </w:r>
+    </w:p>
+    <w:p>
+      <w:r>
+        <w:rPr>
+          <w:b w:val="0"/>
+          <w:i w:val="0"/>
+        </w:rPr>
+        <w:t>La operación es la que describí: multiplicar cada píxel por su peso y sumar. Primera fila. El primer píxel vale diez y su peso es menos uno: menos diez. El segundo vale diez y su peso es cero: cero. El tercero vale doscientos y su peso es uno: doscientos. La suma de la fila es menos diez más cero más doscientos, o sea ciento noventa. Las otras dos filas son idénticas y aportan también ciento noventa cada una. El total en esta posición es quinientos setenta.</w:t>
+      </w:r>
+    </w:p>
+    <w:p>
+      <w:r>
+        <w:rPr>
+          <w:b w:val="0"/>
+          <w:i w:val="0"/>
+        </w:rPr>
+        <w:t>Un número grande y positivo. El filtro dice: aquí encontré lo que busco.</w:t>
+      </w:r>
+    </w:p>
+    <w:p>
+      <w:r>
+        <w:rPr>
+          <w:b w:val="0"/>
+          <w:i w:val="0"/>
+        </w:rPr>
+        <w:t>Probemos con una zona uniforme: nueve píxeles que valen diez. En la primera fila, menos diez, cero y diez suman cero, y las tres filas suman cero. El filtro dice: aquí no hay ningún borde. No importa qué tan brillante sea la zona; con nueve píxeles de doscientos también daría cero, porque el filtro detecta el cambio, no el nivel.</w:t>
+      </w:r>
+    </w:p>
+    <w:p>
+      <w:r>
+        <w:rPr>
+          <w:b w:val="0"/>
+          <w:i w:val="0"/>
+        </w:rPr>
+        <w:t>Y con el borde invertido: doscientos a la izquierda y diez a la derecha. Primera fila: menos doscientos, cero y diez suman menos ciento noventa. Con las tres filas, menos quinientos setenta. Un resultado negativo. Entra la función de activación que apaga los negativos, y el resultado final es cero. Este filtro, tal como está, responde a los bordes que pasan de oscuro a brillante y se queda en silencio ante los que pasan de brillante a oscuro. Para detectar los otros, la red aprenderá otro filtro, o el mismo con los signos al revés.</w:t>
+      </w:r>
+    </w:p>
+    <w:p>
+      <w:r>
+        <w:rPr>
+          <w:b w:val="0"/>
+          <w:i w:val="0"/>
+        </w:rPr>
+        <w:t>Pensemos ahora en la imagen completa. Si mide cinco por cinco píxeles y deslizamos un filtro de tres por tres, el filtro cabe en tres posiciones a lo ancho y tres a lo alto, y el resultado es un mapa de tres por tres. Con una fotografía de 1792 por 1374 píxeles, el mapa resultante sería casi igual de grande, un poco menor en los bordes, y cada uno de sus más de dos millones de valores se calcula con esas mismas nueve multiplicaciones y los mismos nueve pesos. Esa es la economía de la convolución.</w:t>
+      </w:r>
+    </w:p>
+    <w:p>
+      <w:r>
+        <w:rPr>
+          <w:b w:val="0"/>
+          <w:i w:val="0"/>
+        </w:rPr>
+        <w:t>Ahora la reducción. Supongamos que en un mapa hay un cuadro de dos por dos con los valores tres, siete, dos y cinco. La reducción por máximo se queda con el siete. El mapa pierde precisión sobre dónde estaba exactamente el valor alto, pero conserva que en esa zona el patrón apareció con fuerza. Si se hace en todo el mapa, el tamaño se reduce a la mitad por lado, es decir, a la cuarta parte de los valores.</w:t>
+      </w:r>
+    </w:p>
+    <w:p>
+      <w:r>
+        <w:rPr>
+          <w:b w:val="0"/>
+          <w:i w:val="0"/>
+        </w:rPr>
+        <w:t>Y la imagen a color. Si en lugar de un canal hay tres, rojo, verde y azul, el filtro también tiene profundidad tres: son tres filtros de tres por tres, uno por canal, cuyos resultados se suman. Así un filtro puede mirar combinaciones entre canales. En capas más profundas la entrada ya no son tres canales sino los sesenta y cuatro, o los cientos, mapas de la capa anterior, y cada filtro tiene tantos canales como mapas reciba.</w:t>
+      </w:r>
+    </w:p>
+    <w:p>
+      <w:r>
+        <w:rPr>
+          <w:b w:val="0"/>
+          <w:i w:val="0"/>
+        </w:rPr>
+        <w:t>Con esto tenemos todo el vocabulario de la convolución. Un filtro es una pequeña tabla de pesos. Deslizarlo por la imagen produce un mapa donde los valores altos marcan dónde está el patrón. La activación apaga lo negativo. La reducción resume y agranda el campo receptivo. Apilar capas construye la jerarquía. Y lo que distingue a una red convolucional entrenada es que los pesos de esos filtros no los eligió ninguna persona: los encontró el entrenamiento.</w:t>
       </w:r>
     </w:p>
     <w:p>
@@ -3895,7 +4138,7 @@
         <w:pStyle w:val="Heading2"/>
       </w:pPr>
       <w:r>
-        <w:t>3.6 Cómo «ve» una imagen una red convolucional</w:t>
+        <w:t>3.8 La jerarquía de características</w:t>
       </w:r>
     </w:p>
     <w:p>
@@ -3905,7 +4148,7 @@
           <w:i/>
           <w:color w:val="595959"/>
         </w:rPr>
-        <w:t>983 palabras · 3.9 min</w:t>
+        <w:t>661 palabras · 2.6 min</w:t>
       </w:r>
     </w:p>
     <w:p>
@@ -3918,115 +4161,115 @@
           <w:i/>
           <w:color w:val="1F4E79"/>
         </w:rPr>
-        <w:t>[Pantalla: diapositiva con una fotografía de fluorescencia ampliada hasta mostrar los píxeles individuales como cuadritos con sus valores numéricos.]</w:t>
-      </w:r>
-    </w:p>
-    <w:p>
-      <w:r>
-        <w:rPr>
-          <w:b w:val="0"/>
-          <w:i w:val="0"/>
-        </w:rPr>
-        <w:t>Hasta aquí hablamos de redes neuronales en general. Ahora llego a la variante que las hace aptas para imágenes, la red neuronal convolucional. Primero hay que entender qué es una imagen para una computadora.</w:t>
-      </w:r>
-    </w:p>
-    <w:p>
-      <w:r>
-        <w:rPr>
-          <w:b w:val="0"/>
-          <w:i w:val="0"/>
-        </w:rPr>
-        <w:t>En pantalla tienen una porción de una fotografía de fluorescencia ampliada hasta distinguir los píxeles. Cada cuadrito es un píxel, y para la computadora no es un color sino un conjunto de números. En una imagen a color hay tres por píxel, que indican cuánta luz roja, verde y azul hay en ese punto, normalmente en una escala de cero a doscientos cincuenta y cinco. Una fotografía de 1792 píxeles de ancho por 1374 de alto contiene así más de siete millones de números. Para la computadora la imagen es una tabla enorme de valores. No hay células, ni colas, ni fondo: solo números en una cuadrícula.</w:t>
-      </w:r>
-    </w:p>
-    <w:p>
-      <w:r>
-        <w:rPr>
-          <w:b w:val="0"/>
-          <w:i w:val="0"/>
-        </w:rPr>
-        <w:t>Eso crea un problema práctico para usar redes sencillas con imágenes. Si cada píxel se conecta con cada neurona de la primera capa, como en el esquema anterior, el número de pesos se dispara. Con siete millones de entradas y apenas mil neuronas en esa capa, serían siete mil millones de pesos solo en el primer paso. Inviable.</w:t>
-      </w:r>
-    </w:p>
-    <w:p>
-      <w:r>
-        <w:rPr>
-          <w:b w:val="0"/>
-          <w:i w:val="0"/>
-        </w:rPr>
-        <w:t>Hay otro problema menos evidente: esa conexión total ignora la estructura de la imagen. Un píxel se relaciona con sus vecinos; un borde, una mancha o una línea son patrones locales, de unos pocos píxeles contiguos. Y un mismo patrón, por ejemplo el borde de una célula, puede aparecer en cualquier lugar. Una red que aprendiera a reconocer el borde en la esquina superior izquierda tendría que aprenderlo de nuevo en la inferior derecha, con otros pesos. Un desperdicio.</w:t>
-      </w:r>
-    </w:p>
-    <w:p>
-      <w:r>
-        <w:rPr>
-          <w:b w:val="0"/>
-          <w:i w:val="0"/>
-        </w:rPr>
-        <w:t>La convolución resuelve ambas cosas. En lugar de conectar cada neurona con toda la imagen, se usa un pequeño detector, de unos pocos píxeles de lado, que se desliza por la imagen y se aplica en cada posición.</w:t>
-      </w:r>
-    </w:p>
-    <w:p>
-      <w:r>
-        <w:rPr>
-          <w:b w:val="0"/>
-          <w:i w:val="0"/>
-        </w:rPr>
-        <w:t>A ese detector se le llama filtro o kernel. Un ejemplo: un filtro de tres por tres píxeles, es decir, nueve pesos. Lo coloco sobre la esquina superior izquierda de la imagen, multiplico cada uno de los nueve píxeles que quedan debajo por el peso correspondiente, sumo y anoto el número. Muevo el filtro un píxel a la derecha y repito. Al terminar la fila, bajo una y sigo. El resultado es una tabla nueva, el mapa de características, donde cada valor dice cuánto se parecía a lo que busca el filtro la zona de la imagen sobre la que estuvo.</w:t>
-      </w:r>
-    </w:p>
-    <w:p>
-      <w:r>
-        <w:rPr>
-          <w:b w:val="0"/>
-          <w:i w:val="0"/>
-        </w:rPr>
-        <w:t>Veamos qué puede buscar un filtro. Supongan uno con pesos negativos en la columna izquierda, ceros en la central y positivos en la derecha. Sobre una zona uniforme da casi cero, porque negativos y positivos se compensan. Pero sobre una zona oscura a la izquierda y brillante a la derecha, es decir, un borde vertical de oscuro a claro, da un número grande. Ese filtro detecta bordes verticales. Con otros pesos detectaría bordes horizontales, diagonales, esquinas o manchas pequeñas. Un filtro es, literalmente, una pregunta: ¿hay aquí algo parecido a este patrón?</w:t>
-      </w:r>
-    </w:p>
-    <w:p>
-      <w:r>
-        <w:rPr>
-          <w:b w:val="0"/>
-          <w:i w:val="0"/>
-        </w:rPr>
-        <w:t>Dos propiedades hacen eficiente a la convolución, y son la razón de ser de estas redes. La primera es la conexión local: cada valor del mapa depende solo de una pequeña vecindad de píxeles, no de toda la imagen, lo que reduce muchísimo el número de pesos. La segunda es el reparto de pesos: el mismo filtro, con los mismos nueve pesos, se usa en todas las posiciones. Si aprende a detectar un borde, lo detecta donde aparezca. Hacen falta nueve pesos, no millones.</w:t>
-      </w:r>
-    </w:p>
-    <w:p>
-      <w:r>
-        <w:rPr>
-          <w:b w:val="0"/>
-          <w:i w:val="0"/>
-        </w:rPr>
-        <w:t>Lo más importante es de dónde salen los pesos de los filtros. En el procesamiento de imágenes clásico, una persona diseñaba los filtros a mano; hay filtros famosos para bordes, suavizado o realce de contornos. En una red convolucional nadie los diseña: se aprenden durante el entrenamiento. La red empieza con filtros aleatorios y, con el ciclo que describí, los ajusta hasta que detectan los patrones útiles para la tarea. Si para contar espermatozoides conviene detectar cierto borde curvo, la red lo descubre por sí sola a partir de los ejemplos.</w:t>
-      </w:r>
-    </w:p>
-    <w:p>
-      <w:r>
-        <w:rPr>
-          <w:b w:val="0"/>
-          <w:i w:val="0"/>
-        </w:rPr>
-        <w:t>Una capa convolucional no tiene un filtro sino muchos, a veces decenas o cientos, y cada uno aprende un patrón distinto. La salida es un conjunto de mapas de características, uno por filtro, apilados como hojas de un libro. Con sesenta y cuatro filtros salen sesenta y cuatro mapas, cada uno señalando dónde apareció su patrón.</w:t>
-      </w:r>
-    </w:p>
-    <w:p>
-      <w:r>
-        <w:rPr>
-          <w:b w:val="0"/>
-          <w:i w:val="0"/>
-        </w:rPr>
-        <w:t>Casi todas las redes convolucionales incluyen dos operaciones más. Una es la activación, ya vista: tras cada convolución se apagan los valores negativos. La otra es la reducción, o pooling, que resume cada región pequeña del mapa en un solo número, por ejemplo el máximo de cada cuadro de dos por dos. El mapa se reduce a la mitad en ancho y en alto, y cada capa trabaja con una versión más pequeña y resumida de la anterior. Eso sirve por dos razones. El cálculo es más rápido. Y cada valor de las capas profundas abarca una zona cada vez mayor de la imagen original: una neurona de la tercera capa depende indirectamente de un área grande de píxeles. A esa zona se le llama campo receptivo, y su crecimiento a lo largo de las capas es lo que permite pasar de detectar bordes a detectar objetos completos.</w:t>
-      </w:r>
-    </w:p>
-    <w:p>
-      <w:r>
-        <w:rPr>
-          <w:b w:val="0"/>
-          <w:i w:val="0"/>
-        </w:rPr>
-        <w:t>Me parece una de las ideas más elegantes del tema, así que la comparto. Si se examinan los filtros de una red convolucional entrenada con millones de fotografías, los de las primeras capas son detectores de bordes, orientaciones y colores, justo lo que diseñaban a mano los especialistas. Los de las siguientes responden a combinaciones: texturas, esquinas, curvas. Y los de las capas profundas responden a formas completas de objetos. Nadie le dijo a la red que lo hiciera así. Esa jerarquía surge del entrenamiento y es lo que permite reutilizar una red ya entrenada.</w:t>
+        <w:t>[Pantalla: diapositiva con tres columnas: «Capas iniciales», «Capas intermedias», «Capas profundas», cada una con ejemplos de patrones.]</w:t>
+      </w:r>
+    </w:p>
+    <w:p>
+      <w:r>
+        <w:rPr>
+          <w:b w:val="0"/>
+          <w:i w:val="0"/>
+        </w:rPr>
+        <w:t>Vale la pena profundizar en esa jerarquía, porque une todo lo anterior con lo que viene. Piénsenla como una cadena de montaje del reconocimiento, con tres etapas.</w:t>
+      </w:r>
+    </w:p>
+    <w:p>
+      <w:r>
+        <w:rPr>
+          <w:b w:val="0"/>
+          <w:i w:val="0"/>
+        </w:rPr>
+        <w:t>En las capas iniciales la red trabaja con los píxeles crudos y aprende patrones muy simples y generales: bordes en distintas direcciones, cambios de brillo, transiciones de tono, manchas pequeñas. Son piezas que aparecen en cualquier imagen del mundo, sea una calle, un animal, una preparación de microscopio o un documento escaneado. Un borde es un borde en todas partes.</w:t>
+      </w:r>
+    </w:p>
+    <w:p>
+      <w:r>
+        <w:rPr>
+          <w:b w:val="0"/>
+          <w:i w:val="0"/>
+        </w:rPr>
+        <w:t>En las capas intermedias, la red combina esas piezas en patrones más complejos: curvas, esquinas, texturas, formas alargadas, contornos redondeados. Ya hay cierta especialización, porque las combinaciones útiles dependen del tipo de imágenes, pero los patrones siguen siendo bastante genéricos.</w:t>
+      </w:r>
+    </w:p>
+    <w:p>
+      <w:r>
+        <w:rPr>
+          <w:b w:val="0"/>
+          <w:i w:val="0"/>
+        </w:rPr>
+        <w:t>En las capas profundas, la red combina los patrones intermedios en conceptos propios de la tarea. Si se entrenó con rostros, responderán a ojos, narices y bocas. Si se entrenó con vehículos, a ruedas y carrocerías. Si se entrena con espermatozoides, a la forma característica de la célula.</w:t>
+      </w:r>
+    </w:p>
+    <w:p>
+      <w:r>
+        <w:rPr>
+          <w:b w:val="0"/>
+          <w:i w:val="0"/>
+        </w:rPr>
+        <w:t>La organización recuerda cómo describimos nuestra propia percepción: primero bordes y contrastes, luego formas, por último objetos y significado. Las primeras redes convolucionales se inspiraron en estudios de la corteza visual. Repito, eso sí, la cautela de antes: es una inspiración útil, no una equivalencia.</w:t>
+      </w:r>
+    </w:p>
+    <w:p>
+      <w:r>
+        <w:rPr>
+          <w:b w:val="0"/>
+          <w:i w:val="0"/>
+        </w:rPr>
+        <w:t>De esta jerarquía sale lo que sostiene este proyecto. Las capas iniciales e intermedias aprenden conocimiento general sobre cómo es una imagen. Solo las finales aprenden conocimiento específico de la tarea. Si ya existe una red entrenada con millones de imágenes variadas, sus primeras capas contienen un excelente vocabulario visual. Para usarla en una tarea nueva no hace falta empezar de cero: se conservan esas capas y se vuelven a entrenar solo las últimas con los ejemplos de la tarea nueva. Es el aprendizaje por transferencia, que desarrollo en unos minutos.</w:t>
+      </w:r>
+    </w:p>
+    <w:p>
+      <w:r>
+        <w:rPr>
+          <w:b w:val="0"/>
+          <w:i w:val="0"/>
+        </w:rPr>
+        <w:t>Antes, un resumen de los tipos de resultado que estas redes pueden dar, porque no todas devuelven lo mismo y la diferencia es clave para entender la nuestra.</w:t>
+      </w:r>
+    </w:p>
+    <w:p>
+      <w:r>
+        <w:rPr>
+          <w:b w:val="0"/>
+          <w:i w:val="0"/>
+        </w:rPr>
+        <w:t>La tarea más sencilla es la clasificación: dada una imagen completa, la red responde a qué categoría pertenece. Por ejemplo, fondo claro o fondo oscuro. La salida es una etiqueta para toda la imagen. Sirve, pero no dice dónde está cada cosa ni cuántas hay.</w:t>
+      </w:r>
+    </w:p>
+    <w:p>
+      <w:r>
+        <w:rPr>
+          <w:b w:val="0"/>
+          <w:i w:val="0"/>
+        </w:rPr>
+        <w:t>Un nivel arriba está la detección de objetos: la red encuentra cada objeto de interés y lo enmarca en un rectángulo, indicando su clase. Con ciento cuarenta espermatozoides devuelve ciento cuarenta rectángulos. Ya podemos contar y sabemos dónde está cada uno. Pero un rectángulo es una aproximación muy gruesa de una célula curva. Para medir área o largo con precisión no sirve: incluiría mucho fondo, y dos células encimadas darían rectángulos que se solapan.</w:t>
+      </w:r>
+    </w:p>
+    <w:p>
+      <w:r>
+        <w:rPr>
+          <w:b w:val="0"/>
+          <w:i w:val="0"/>
+        </w:rPr>
+        <w:t>Sigue la segmentación semántica, donde la red clasifica cada píxel: este es célula, este es fondo. Sale una máscara, una imagen en blanco y negro con las células en blanco. Aquí sí hay forma exacta, pero con una limitación: si dos células se tocan, sus máscaras se funden en una sola región y no hay manera de saber dónde termina una y empieza la otra. Para contar es un problema serio, y en nuestras imágenes las células encimadas son comunes.</w:t>
+      </w:r>
+    </w:p>
+    <w:p>
+      <w:r>
+        <w:rPr>
+          <w:b w:val="0"/>
+          <w:i w:val="0"/>
+        </w:rPr>
+        <w:t>Por último, la segmentación por instancias, la que usa este proyecto. Junta lo mejor de las dos anteriores: encuentra cada objeto individual, como la detección, y traza su contorno exacto, como la segmentación. Dos células que se tocan quedan como dos objetos, cada uno con su máscara. Eso permite contar, medir el área de cada una y medir su largo a lo largo de la curva. Por eso la elegimos.</w:t>
+      </w:r>
+    </w:p>
+    <w:p>
+      <w:r>
+        <w:rPr>
+          <w:b w:val="0"/>
+          <w:i w:val="0"/>
+        </w:rPr>
+        <w:t>Para fijar la diferencia, una pregunta por tipo. La clasificación responde «¿qué es esta imagen?». La detección, «¿qué objetos hay y dónde?». La segmentación semántica, «¿qué es cada píxel?». Y la segmentación por instancias, «¿cuántos objetos hay y cuál es la forma exacta de cada uno?». Esta última es la que nos interesa.</w:t>
       </w:r>
     </w:p>
     <w:p>
@@ -4034,7 +4277,7 @@
         <w:pStyle w:val="Heading2"/>
       </w:pPr>
       <w:r>
-        <w:t>3.7 Un ejemplo numérico: una convolución hecha a mano</w:t>
+        <w:t>3.9 Reutilizar una red ya entrenada: el aprendizaje por transferencia</w:t>
       </w:r>
     </w:p>
     <w:p>
@@ -4044,7 +4287,7 @@
           <w:i/>
           <w:color w:val="595959"/>
         </w:rPr>
-        <w:t>712 palabras · 2.8 min</w:t>
+        <w:t>942 palabras · 3.8 min</w:t>
       </w:r>
     </w:p>
     <w:p>
@@ -4057,106 +4300,142 @@
           <w:i/>
           <w:color w:val="1F4E79"/>
         </w:rPr>
-        <w:t>[Pantalla: diapositiva con una cuadrícula de tres por tres números a la izquierda, un filtro de tres por tres en el centro y el resultado a la derecha. Ir completando los números mientras se habla.]</w:t>
-      </w:r>
-    </w:p>
-    <w:p>
-      <w:r>
-        <w:rPr>
-          <w:b w:val="0"/>
-          <w:i w:val="0"/>
-        </w:rPr>
-        <w:t>Para que la convolución quede clara hagamos una cuenta completa con números pequeños. Es la única de toda la sesión y es sencilla.</w:t>
-      </w:r>
-    </w:p>
-    <w:p>
-      <w:r>
-        <w:rPr>
-          <w:b w:val="0"/>
-          <w:i w:val="0"/>
-        </w:rPr>
-        <w:t>Imaginen un pedazo de imagen en escala de grises, de tres por tres píxeles. En cada fila, los dos primeros píxeles son oscuros, con valor diez, y el tercero es muy brillante, con valor doscientos. Las tres filas dicen lo mismo: diez, diez, doscientos. A la vista, una zona oscura a la izquierda y una franja brillante a la derecha: un borde vertical de oscuro a brillante.</w:t>
-      </w:r>
-    </w:p>
-    <w:p>
-      <w:r>
-        <w:rPr>
-          <w:b w:val="0"/>
-          <w:i w:val="0"/>
-        </w:rPr>
-        <w:t>Tomemos un filtro de tres por tres con estos pesos en cada fila: menos uno, cero, uno. El filtro resta lo que hay a la izquierda, suma lo que hay a la derecha y no le importa el centro.</w:t>
-      </w:r>
-    </w:p>
-    <w:p>
-      <w:r>
-        <w:rPr>
-          <w:b w:val="0"/>
-          <w:i w:val="0"/>
-        </w:rPr>
-        <w:t>La operación es la que describí: multiplicar cada píxel por su peso y sumar. Primera fila. El primer píxel vale diez y su peso es menos uno: menos diez. El segundo vale diez y su peso es cero: cero. El tercero vale doscientos y su peso es uno: doscientos. La suma de la fila es menos diez más cero más doscientos, o sea ciento noventa. Las otras dos filas son idénticas y aportan también ciento noventa cada una. El total en esta posición es quinientos setenta.</w:t>
-      </w:r>
-    </w:p>
-    <w:p>
-      <w:r>
-        <w:rPr>
-          <w:b w:val="0"/>
-          <w:i w:val="0"/>
-        </w:rPr>
-        <w:t>Un número grande y positivo. El filtro dice: aquí encontré lo que busco.</w:t>
-      </w:r>
-    </w:p>
-    <w:p>
-      <w:r>
-        <w:rPr>
-          <w:b w:val="0"/>
-          <w:i w:val="0"/>
-        </w:rPr>
-        <w:t>Probemos con una zona uniforme: nueve píxeles que valen diez. En la primera fila, menos diez, cero y diez suman cero, y las tres filas suman cero. El filtro dice: aquí no hay ningún borde. No importa qué tan brillante sea la zona; con nueve píxeles de doscientos también daría cero, porque el filtro detecta el cambio, no el nivel.</w:t>
-      </w:r>
-    </w:p>
-    <w:p>
-      <w:r>
-        <w:rPr>
-          <w:b w:val="0"/>
-          <w:i w:val="0"/>
-        </w:rPr>
-        <w:t>Y con el borde invertido: doscientos a la izquierda y diez a la derecha. Primera fila: menos doscientos, cero y diez suman menos ciento noventa. Con las tres filas, menos quinientos setenta. Un resultado negativo. Entra la función de activación que apaga los negativos, y el resultado final es cero. Este filtro, tal como está, responde a los bordes que pasan de oscuro a brillante y se queda en silencio ante los que pasan de brillante a oscuro. Para detectar los otros, la red aprenderá otro filtro, o el mismo con los signos al revés.</w:t>
-      </w:r>
-    </w:p>
-    <w:p>
-      <w:r>
-        <w:rPr>
-          <w:b w:val="0"/>
-          <w:i w:val="0"/>
-        </w:rPr>
-        <w:t>Pensemos ahora en la imagen completa. Si mide cinco por cinco píxeles y deslizamos un filtro de tres por tres, el filtro cabe en tres posiciones a lo ancho y tres a lo alto, y el resultado es un mapa de tres por tres. Con una fotografía de 1792 por 1374 píxeles, el mapa resultante sería casi igual de grande, un poco menor en los bordes, y cada uno de sus más de dos millones de valores se calcula con esas mismas nueve multiplicaciones y los mismos nueve pesos. Esa es la economía de la convolución.</w:t>
-      </w:r>
-    </w:p>
-    <w:p>
-      <w:r>
-        <w:rPr>
-          <w:b w:val="0"/>
-          <w:i w:val="0"/>
-        </w:rPr>
-        <w:t>Ahora la reducción. Supongamos que en un mapa hay un cuadro de dos por dos con los valores tres, siete, dos y cinco. La reducción por máximo se queda con el siete. El mapa pierde precisión sobre dónde estaba exactamente el valor alto, pero conserva que en esa zona el patrón apareció con fuerza. Si se hace en todo el mapa, el tamaño se reduce a la mitad por lado, es decir, a la cuarta parte de los valores.</w:t>
-      </w:r>
-    </w:p>
-    <w:p>
-      <w:r>
-        <w:rPr>
-          <w:b w:val="0"/>
-          <w:i w:val="0"/>
-        </w:rPr>
-        <w:t>Y la imagen a color. Si en lugar de un canal hay tres, rojo, verde y azul, el filtro también tiene profundidad tres: son tres filtros de tres por tres, uno por canal, cuyos resultados se suman. Así un filtro puede mirar combinaciones entre canales. En capas más profundas la entrada ya no son tres canales sino los sesenta y cuatro, o los cientos, mapas de la capa anterior, y cada filtro tiene tantos canales como mapas reciba.</w:t>
-      </w:r>
-    </w:p>
-    <w:p>
-      <w:r>
-        <w:rPr>
-          <w:b w:val="0"/>
-          <w:i w:val="0"/>
-        </w:rPr>
-        <w:t>Con esto tenemos todo el vocabulario de la convolución. Un filtro es una pequeña tabla de pesos. Deslizarlo por la imagen produce un mapa donde los valores altos marcan dónde está el patrón. La activación apaga lo negativo. La reducción resume y agranda el campo receptivo. Apilar capas construye la jerarquía. Y lo que distingue a una red convolucional entrenada es que los pesos de esos filtros no los eligió ninguna persona: los encontró el entrenamiento.</w:t>
+        <w:t>[Pantalla: diapositiva con dos recorridos paralelos. A la izquierda: «Entrenar desde cero». A la derecha: «Partir de una red preentrenada».]</w:t>
+      </w:r>
+    </w:p>
+    <w:p>
+      <w:r>
+        <w:rPr>
+          <w:b w:val="0"/>
+          <w:i w:val="0"/>
+        </w:rPr>
+        <w:t>Llegamos a la idea que hace viable este proyecto. Recordemos dónde estamos: tenemos pocas fotografías etiquetadas, cuatro de fluorescencia y cuatro de fondo claro, con unos cientos de espermatozoides marcados en total. Y una red convolucional profunda tiene decenas de millones de pesos que ajustar. Entrenarla desde cero con tan pocos ejemplos es la receta casi segura del sobreajuste que describí: la red memorizaría las imágenes y no generalizaría a ninguna otra.</w:t>
+      </w:r>
+    </w:p>
+    <w:p>
+      <w:r>
+        <w:rPr>
+          <w:b w:val="0"/>
+          <w:i w:val="0"/>
+        </w:rPr>
+        <w:t>La salida es el aprendizaje por transferencia, o transfer learning. Antes de la definición técnica, una analogía.</w:t>
+      </w:r>
+    </w:p>
+    <w:p>
+      <w:r>
+        <w:rPr>
+          <w:b w:val="0"/>
+          <w:i w:val="0"/>
+        </w:rPr>
+        <w:t>Piensen en alguien que aprendió guitarra y quiere aprender ukulele. ¿Empieza de cero? No. Ya sabe leer partituras, tiene el oído entrenado, sabe colocar los dedos en un mástil y domina el ritmo. Le falta lo específico: la afinación distinta, menos cuerdas, otro tamaño de trastes. En unas semanas toca bien, en vez de los años que le tomó la guitarra. Su conocimiento previo se transfirió.</w:t>
+      </w:r>
+    </w:p>
+    <w:p>
+      <w:r>
+        <w:rPr>
+          <w:b w:val="0"/>
+          <w:i w:val="0"/>
+        </w:rPr>
+        <w:t>Con las redes pasa algo parecido. Como vimos en la jerarquía de características, las primeras capas de una red convolucional aprenden conocimiento general, bordes, texturas, curvas, formas, que no es exclusivo de ninguna tarea. Si alguien ya entrenó una red con una enorme colección de imágenes variadas, esa red posee un excelente vocabulario visual. Podemos tomarla prestada y enseñarle, con pocos ejemplos, lo específico de nuestra tarea.</w:t>
+      </w:r>
+    </w:p>
+    <w:p>
+      <w:r>
+        <w:rPr>
+          <w:b w:val="0"/>
+          <w:i w:val="0"/>
+        </w:rPr>
+        <w:t>En este proyecto la red de partida es una Mask R-CNN preentrenada con un conjunto de referencia llamado COCO, muy usado en investigación. Tiene más de trescientas mil fotografías con más de un millón de objetos anotados, de ochenta categorías cotidianas: personas, animales, vehículos, muebles, alimentos. Entre esas categorías no hay ninguna que se parezca, ni de lejos, a un espermatozoide. Y la red sirve. No se aprovechan las categorías sino la capacidad de ver bordes, formas y contornos que se desarrolló al aprender a distinguirlas.</w:t>
+      </w:r>
+    </w:p>
+    <w:p>
+      <w:r>
+        <w:rPr>
+          <w:b w:val="0"/>
+          <w:i w:val="0"/>
+        </w:rPr>
+        <w:t>Veamos qué se hace en concreto en el cuaderno de entrenamiento, porque ilustra muy bien todo lo anterior.</w:t>
+      </w:r>
+    </w:p>
+    <w:p>
+      <w:r>
+        <w:rPr>
+          <w:b w:val="0"/>
+          <w:i w:val="0"/>
+        </w:rPr>
+        <w:t>Paso uno: se carga la red con los pesos del preentrenamiento. Se empieza con todos los pesos ya ajustados, no con valores aleatorios. Esta red ya sabe segmentar objetos cotidianos.</w:t>
+      </w:r>
+    </w:p>
+    <w:p>
+      <w:r>
+        <w:rPr>
+          <w:b w:val="0"/>
+          <w:i w:val="0"/>
+        </w:rPr>
+        <w:t>Paso dos: se reemplaza la última parte. La red original responde entre ochenta categorías; la nuestra solo distingue entre fondo y espermatozoide, una clase. Se sustituyen las capas finales, las que producen la clasificación y las máscaras, por otras nuevas con pesos aleatorios, diseñadas para una clase. Son la parte más específica de la tarea y las únicas que de verdad hay que aprender desde cero.</w:t>
+      </w:r>
+    </w:p>
+    <w:p>
+      <w:r>
+        <w:rPr>
+          <w:b w:val="0"/>
+          <w:i w:val="0"/>
+        </w:rPr>
+        <w:t>Paso tres: decidir cuánto de la red puede ajustarse. Hay dos extremos. En uno se congela toda la red salvo las capas nuevas; los pesos del preentrenamiento no se tocan. Es rápido y funciona con muy pocos datos, pero es menos flexible. En el otro, todos los pesos cambian: más flexibilidad, pero más datos y más cuidado. En el cuaderno se eligió un punto intermedio: quedan libres las capas más profundas del bloque que extrae características, que son las más especializadas, y se mantienen fijas las primeras, que son las más generales. En la analogía musical, es conservar el oído y el ritmo y ajustar solo lo que depende del instrumento.</w:t>
+      </w:r>
+    </w:p>
+    <w:p>
+      <w:r>
+        <w:rPr>
+          <w:b w:val="0"/>
+          <w:i w:val="0"/>
+        </w:rPr>
+        <w:t>Paso cuatro: se entrena con nuestras imágenes, con el ciclo de predecir, medir el error y ajustar. Con dos precauciones. La tasa de aprendizaje es pequeña, porque no queremos que los ajustes borren lo que la red ya sabe. Y se usa un calentamiento, que sube la tasa poco a poco al comienzo para que los primeros pasos, cuando las capas nuevas aún son aleatorias, no provoquen cambios bruscos en las capas ya entrenadas.</w:t>
+      </w:r>
+    </w:p>
+    <w:p>
+      <w:r>
+        <w:rPr>
+          <w:b w:val="0"/>
+          <w:i w:val="0"/>
+        </w:rPr>
+        <w:t>Paso cinco: se evalúa con imágenes que la red no vio. Cada cierto número de épocas el cuaderno mide qué tan bien funciona sobre las zonas reservadas para validación y se queda con el modelo que mejor resultado obtuvo.</w:t>
+      </w:r>
+    </w:p>
+    <w:p>
+      <w:r>
+        <w:rPr>
+          <w:b w:val="0"/>
+          <w:i w:val="0"/>
+        </w:rPr>
+        <w:t>Así se consigue un modelo útil con ocho fotografías en total. Sin la transferencia, esas ocho no alcanzarían ni de lejos.</w:t>
+      </w:r>
+    </w:p>
+    <w:p>
+      <w:r>
+        <w:rPr>
+          <w:b w:val="0"/>
+          <w:i w:val="0"/>
+        </w:rPr>
+        <w:t>Ahora, algo que afecta las decisiones futuras del grupo. La transferencia reduce mucho la cantidad de datos necesaria, pero no la elimina. Permite pasar de millones de ejemplos a cientos. Aun así, el modelo depende de la calidad y variedad de los ejemplos con que se afina. Si las ocho fotografías son de la misma muestra, tomadas el mismo día y con la misma tinción, el modelo se especializará en ese caso. Con otra tinción, otra iluminación u otros artefactos, es posible que falle. Por eso la actualización de la red, con un lote de unas cincuenta imágenes en condiciones más variadas, no es un lujo: es lo que vuelve confiable al modelo.</w:t>
+      </w:r>
+    </w:p>
+    <w:p>
+      <w:r>
+        <w:rPr>
+          <w:b w:val="0"/>
+          <w:i w:val="0"/>
+        </w:rPr>
+        <w:t>Y una observación de otro tipo. Esta técnica funciona porque existe una red base de calidad y de acceso abierto. Para elegir la Mask R-CNN de la biblioteca torchvision, y no otras alternativas muy populares, pesó la licencia. Hay una familia de modelos muy conocida cuya licencia obliga a publicar el código de cualquier sitio que se sirva en línea con ellos; la de torchvision es permisiva y no impone esa condición. En proyectos como este la elección de la herramienta también tiene una dimensión legal, y conviene decidirla con conocimiento.</w:t>
+      </w:r>
+    </w:p>
+    <w:p>
+      <w:r>
+        <w:rPr>
+          <w:b w:val="0"/>
+          <w:i w:val="0"/>
+        </w:rPr>
+        <w:t>Para cerrar esta sección, un caso: si mañana el grupo quisiera detectar otro tipo de célula, ¿habría que empezar de cero? No. Tomaríamos como base la red que ya tenemos, o incluso la preentrenada original, la afinaríamos con ejemplos anotados del nuevo tipo y tendríamos un modelo nuevo. Por eso en las sesiones dos y cuatro dedicamos tanto tiempo a la anotación y al reentrenamiento: es el procedimiento que da independencia.</w:t>
       </w:r>
     </w:p>
     <w:p>
@@ -4164,7 +4443,7 @@
         <w:pStyle w:val="Heading2"/>
       </w:pPr>
       <w:r>
-        <w:t>3.8 La jerarquía de características</w:t>
+        <w:t>3.10 Qué ve realmente la red: brillo, aumento de datos y variaciones</w:t>
       </w:r>
     </w:p>
     <w:p>
@@ -4174,7 +4453,7 @@
           <w:i/>
           <w:color w:val="595959"/>
         </w:rPr>
-        <w:t>661 palabras · 2.6 min</w:t>
+        <w:t>437 palabras · 1.7 min</w:t>
       </w:r>
     </w:p>
     <w:p>
@@ -4187,115 +4466,70 @@
           <w:i/>
           <w:color w:val="1F4E79"/>
         </w:rPr>
-        <w:t>[Pantalla: diapositiva con tres columnas: «Capas iniciales», «Capas intermedias», «Capas profundas», cada una con ejemplos de patrones.]</w:t>
-      </w:r>
-    </w:p>
-    <w:p>
-      <w:r>
-        <w:rPr>
-          <w:b w:val="0"/>
-          <w:i w:val="0"/>
-        </w:rPr>
-        <w:t>Vale la pena profundizar en esa jerarquía, porque une todo lo anterior con lo que viene. Piénsenla como una cadena de montaje del reconocimiento, con tres etapas.</w:t>
-      </w:r>
-    </w:p>
-    <w:p>
-      <w:r>
-        <w:rPr>
-          <w:b w:val="0"/>
-          <w:i w:val="0"/>
-        </w:rPr>
-        <w:t>En las capas iniciales la red trabaja con los píxeles crudos y aprende patrones muy simples y generales: bordes en distintas direcciones, cambios de brillo, transiciones de tono, manchas pequeñas. Son piezas que aparecen en cualquier imagen del mundo, sea una calle, un animal, una preparación de microscopio o un documento escaneado. Un borde es un borde en todas partes.</w:t>
-      </w:r>
-    </w:p>
-    <w:p>
-      <w:r>
-        <w:rPr>
-          <w:b w:val="0"/>
-          <w:i w:val="0"/>
-        </w:rPr>
-        <w:t>En las capas intermedias, la red combina esas piezas en patrones más complejos: curvas, esquinas, texturas, formas alargadas, contornos redondeados. Ya hay cierta especialización, porque las combinaciones útiles dependen del tipo de imágenes, pero los patrones siguen siendo bastante genéricos.</w:t>
-      </w:r>
-    </w:p>
-    <w:p>
-      <w:r>
-        <w:rPr>
-          <w:b w:val="0"/>
-          <w:i w:val="0"/>
-        </w:rPr>
-        <w:t>En las capas profundas, la red combina los patrones intermedios en conceptos propios de la tarea. Si se entrenó con rostros, responderán a ojos, narices y bocas. Si se entrenó con vehículos, a ruedas y carrocerías. Si se entrena con espermatozoides, a la forma característica de la célula.</w:t>
-      </w:r>
-    </w:p>
-    <w:p>
-      <w:r>
-        <w:rPr>
-          <w:b w:val="0"/>
-          <w:i w:val="0"/>
-        </w:rPr>
-        <w:t>La organización recuerda cómo describimos nuestra propia percepción: primero bordes y contrastes, luego formas, por último objetos y significado. Las primeras redes convolucionales se inspiraron en estudios de la corteza visual. Repito, eso sí, la cautela de antes: es una inspiración útil, no una equivalencia.</w:t>
-      </w:r>
-    </w:p>
-    <w:p>
-      <w:r>
-        <w:rPr>
-          <w:b w:val="0"/>
-          <w:i w:val="0"/>
-        </w:rPr>
-        <w:t>De esta jerarquía sale lo que sostiene este proyecto. Las capas iniciales e intermedias aprenden conocimiento general sobre cómo es una imagen. Solo las finales aprenden conocimiento específico de la tarea. Si ya existe una red entrenada con millones de imágenes variadas, sus primeras capas contienen un excelente vocabulario visual. Para usarla en una tarea nueva no hace falta empezar de cero: se conservan esas capas y se vuelven a entrenar solo las últimas con los ejemplos de la tarea nueva. Es el aprendizaje por transferencia, que desarrollo en unos minutos.</w:t>
-      </w:r>
-    </w:p>
-    <w:p>
-      <w:r>
-        <w:rPr>
-          <w:b w:val="0"/>
-          <w:i w:val="0"/>
-        </w:rPr>
-        <w:t>Antes, un resumen de los tipos de resultado que estas redes pueden dar, porque no todas devuelven lo mismo y la diferencia es clave para entender la nuestra.</w:t>
-      </w:r>
-    </w:p>
-    <w:p>
-      <w:r>
-        <w:rPr>
-          <w:b w:val="0"/>
-          <w:i w:val="0"/>
-        </w:rPr>
-        <w:t>La tarea más sencilla es la clasificación: dada una imagen completa, la red responde a qué categoría pertenece. Por ejemplo, fondo claro o fondo oscuro. La salida es una etiqueta para toda la imagen. Sirve, pero no dice dónde está cada cosa ni cuántas hay.</w:t>
-      </w:r>
-    </w:p>
-    <w:p>
-      <w:r>
-        <w:rPr>
-          <w:b w:val="0"/>
-          <w:i w:val="0"/>
-        </w:rPr>
-        <w:t>Un nivel arriba está la detección de objetos: la red encuentra cada objeto de interés y lo enmarca en un rectángulo, indicando su clase. Con ciento cuarenta espermatozoides devuelve ciento cuarenta rectángulos. Ya podemos contar y sabemos dónde está cada uno. Pero un rectángulo es una aproximación muy gruesa de una célula curva. Para medir área o largo con precisión no sirve: incluiría mucho fondo, y dos células encimadas darían rectángulos que se solapan.</w:t>
-      </w:r>
-    </w:p>
-    <w:p>
-      <w:r>
-        <w:rPr>
-          <w:b w:val="0"/>
-          <w:i w:val="0"/>
-        </w:rPr>
-        <w:t>Sigue la segmentación semántica, donde la red clasifica cada píxel: este es célula, este es fondo. Sale una máscara, una imagen en blanco y negro con las células en blanco. Aquí sí hay forma exacta, pero con una limitación: si dos células se tocan, sus máscaras se funden en una sola región y no hay manera de saber dónde termina una y empieza la otra. Para contar es un problema serio, y en nuestras imágenes las células encimadas son comunes.</w:t>
-      </w:r>
-    </w:p>
-    <w:p>
-      <w:r>
-        <w:rPr>
-          <w:b w:val="0"/>
-          <w:i w:val="0"/>
-        </w:rPr>
-        <w:t>Por último, la segmentación por instancias, la que usa este proyecto. Junta lo mejor de las dos anteriores: encuentra cada objeto individual, como la detección, y traza su contorno exacto, como la segmentación. Dos células que se tocan quedan como dos objetos, cada uno con su máscara. Eso permite contar, medir el área de cada una y medir su largo a lo largo de la curva. Por eso la elegimos.</w:t>
-      </w:r>
-    </w:p>
-    <w:p>
-      <w:r>
-        <w:rPr>
-          <w:b w:val="0"/>
-          <w:i w:val="0"/>
-        </w:rPr>
-        <w:t>Para fijar la diferencia, una pregunta por tipo. La clasificación responde «¿qué es esta imagen?». La detección, «¿qué objetos hay y dónde?». La segmentación semántica, «¿qué es cada píxel?». Y la segmentación por instancias, «¿cuántos objetos hay y cuál es la forma exacta de cada uno?». Esta última es la que nos interesa.</w:t>
+        <w:t>[Pantalla: diapositiva con una misma tesela mostrada seis veces: original, girada, volteada, más brillante, con ruido y con zoom.]</w:t>
+      </w:r>
+    </w:p>
+    <w:p>
+      <w:r>
+        <w:rPr>
+          <w:b w:val="0"/>
+          <w:i w:val="0"/>
+        </w:rPr>
+        <w:t>Un par de detalles del cuaderno de entrenamiento conectan directamente con lo que acabamos de ver, y ayudan a imaginar qué recibe la red.</w:t>
+      </w:r>
+    </w:p>
+    <w:p>
+      <w:r>
+        <w:rPr>
+          <w:b w:val="0"/>
+          <w:i w:val="0"/>
+        </w:rPr>
+        <w:t>El primero: la red no ve colores. El cuaderno convierte cada fotografía a un solo canal de brillo, tomando el valor más alto entre rojo, verde y azul de cada píxel. Por eso la red trabaja con una imagen de una sola capa de números y detecta formas por contraste. El sitio hace lo mismo al analizar una fotografía, para que la preparación sea idéntica a la del entrenamiento.</w:t>
+      </w:r>
+    </w:p>
+    <w:p>
+      <w:r>
+        <w:rPr>
+          <w:b w:val="0"/>
+          <w:i w:val="0"/>
+        </w:rPr>
+        <w:t>En las fotografías de fondo claro se invierte el brillo antes de pasarlas por la red, de modo que los espermatozoides oscuros sobre fondo claro se parezcan a los brillantes sobre fondo oscuro. Es un criterio de preparación que conviene confirmar con más imágenes de fondo claro, y así consta en el cuaderno.</w:t>
+      </w:r>
+    </w:p>
+    <w:p>
+      <w:r>
+        <w:rPr>
+          <w:b w:val="0"/>
+          <w:i w:val="0"/>
+        </w:rPr>
+        <w:t>El segundo detalle: el aumento de datos. Con pocas imágenes, el modelo corre el riesgo de memorizarlas. Una técnica barata contra eso es mostrarle, en cada época, versiones ligeramente distintas de los mismos recortes. El cuaderno aplica volteos y giros de noventa grados, un acercamiento o alejamiento de entre el ochenta por ciento y el ciento veinticinco por ciento, cambios de brillo y de contraste, y un poco de ruido. Todo al azar, en cada recorte.</w:t>
+      </w:r>
+    </w:p>
+    <w:p>
+      <w:r>
+        <w:rPr>
+          <w:b w:val="0"/>
+          <w:i w:val="0"/>
+        </w:rPr>
+        <w:t>La idea es que un espermatozoide girado noventa grados, o un poco más grande, o en una imagen un poco más oscura, sigue siendo un espermatozoide. Si el modelo ve esas variantes, aprende lo que no cambia y deja de apoyarse en detalles accidentales, como la orientación o el nivel exacto de iluminación. Con cuatro fotografías, el aumento de datos hace que el modelo vea miles de recortes distintos.</w:t>
+      </w:r>
+    </w:p>
+    <w:p>
+      <w:r>
+        <w:rPr>
+          <w:b w:val="0"/>
+          <w:i w:val="0"/>
+        </w:rPr>
+        <w:t>Tiene un límite: el aumento de datos genera variaciones de las imágenes que existen, pero no inventa situaciones nuevas. Si en ninguna de las fotografías hay un cierto tipo de aglomeración, ninguna rotación va a producirlo. Por eso, aunque ayuda mucho, no reemplaza a las imágenes nuevas.</w:t>
+      </w:r>
+    </w:p>
+    <w:p>
+      <w:r>
+        <w:rPr>
+          <w:b w:val="0"/>
+          <w:i w:val="0"/>
+        </w:rPr>
+        <w:t>Un tercer detalle, relacionado con el tamaño. Los recortes son de quinientos doce píxeles en fluorescencia y de seiscientos cuarenta en fondo claro, con las fotografías de fondo claro reducidas a la mitad antes de todo. Cada perfil tiene su propia configuración, y el archivo de cada modelo la guarda: tamaño de tesela, traslape, reducción de la foto, umbral de detección. Cuando el sitio carga un modelo, lee esos valores de ahí y los aplica, sin que nadie tenga que recordarlos. Es la razón por la que cambiar un modelo por otro no requiere tocar el código del sitio.</w:t>
       </w:r>
     </w:p>
     <w:p>
@@ -4303,7 +4537,7 @@
         <w:pStyle w:val="Heading2"/>
       </w:pPr>
       <w:r>
-        <w:t>3.9 Reutilizar una red ya entrenada: el aprendizaje por transferencia</w:t>
+        <w:t>3.11 De la red a la medición: cómo se reparten las tareas</w:t>
       </w:r>
     </w:p>
     <w:p>
@@ -4313,7 +4547,7 @@
           <w:i/>
           <w:color w:val="595959"/>
         </w:rPr>
-        <w:t>953 palabras · 3.8 min</w:t>
+        <w:t>596 palabras · 2.4 min</w:t>
       </w:r>
     </w:p>
     <w:p>
@@ -4326,142 +4560,88 @@
           <w:i/>
           <w:color w:val="1F4E79"/>
         </w:rPr>
-        <w:t>[Pantalla: diapositiva con dos recorridos paralelos. A la izquierda: «Entrenar desde cero». A la derecha: «Partir de una red preentrenada».]</w:t>
-      </w:r>
-    </w:p>
-    <w:p>
-      <w:r>
-        <w:rPr>
-          <w:b w:val="0"/>
-          <w:i w:val="0"/>
-        </w:rPr>
-        <w:t>Llegamos a la idea que hace viable este proyecto. Recordemos dónde estamos: tenemos pocas fotografías etiquetadas, cuatro de fluorescencia y cuatro de fondo claro, con unos cientos de espermatozoides marcados en total. Y una red convolucional profunda tiene decenas de millones de pesos que ajustar. Entrenarla desde cero con tan pocos ejemplos es la receta casi segura del sobreajuste que describí: la red memorizaría las imágenes y no generalizaría a ninguna otra.</w:t>
-      </w:r>
-    </w:p>
-    <w:p>
-      <w:r>
-        <w:rPr>
-          <w:b w:val="0"/>
-          <w:i w:val="0"/>
-        </w:rPr>
-        <w:t>La salida es el aprendizaje por transferencia, o transfer learning. Antes de la definición técnica, una analogía.</w:t>
-      </w:r>
-    </w:p>
-    <w:p>
-      <w:r>
-        <w:rPr>
-          <w:b w:val="0"/>
-          <w:i w:val="0"/>
-        </w:rPr>
-        <w:t>Piensen en alguien que aprendió guitarra y quiere aprender ukulele. ¿Empieza de cero? No. Ya sabe leer partituras, tiene el oído entrenado, sabe colocar los dedos en un mástil y domina el ritmo. Le falta lo específico: la afinación distinta, menos cuerdas, otro tamaño de trastes. En unas semanas toca bien, en vez de los años que le tomó la guitarra. Su conocimiento previo se transfirió.</w:t>
-      </w:r>
-    </w:p>
-    <w:p>
-      <w:r>
-        <w:rPr>
-          <w:b w:val="0"/>
-          <w:i w:val="0"/>
-        </w:rPr>
-        <w:t>Con las redes pasa algo parecido. Como vimos en la jerarquía de características, las primeras capas de una red convolucional aprenden conocimiento general, bordes, texturas, curvas, formas, que no es exclusivo de ninguna tarea. Si alguien ya entrenó una red con una enorme colección de imágenes variadas, esa red posee un excelente vocabulario visual. Podemos tomarla prestada y enseñarle, con pocos ejemplos, lo específico de nuestra tarea.</w:t>
-      </w:r>
-    </w:p>
-    <w:p>
-      <w:r>
-        <w:rPr>
-          <w:b w:val="0"/>
-          <w:i w:val="0"/>
-        </w:rPr>
-        <w:t>En este proyecto la red de partida es una Mask R-CNN preentrenada con un conjunto de referencia llamado COCO, muy usado en investigación. Tiene más de trescientas mil fotografías con más de un millón de objetos anotados, de ochenta categorías cotidianas: personas, animales, vehículos, muebles, alimentos. Entre esas categorías no hay ninguna que se parezca, ni de lejos, a un espermatozoide. Y la red sirve. No se aprovechan las categorías sino la capacidad de ver bordes, formas y contornos que se desarrolló al aprender a distinguirlas.</w:t>
-      </w:r>
-    </w:p>
-    <w:p>
-      <w:r>
-        <w:rPr>
-          <w:b w:val="0"/>
-          <w:i w:val="0"/>
-        </w:rPr>
-        <w:t>Veamos qué se hace en concreto en el cuaderno de entrenamiento, porque ilustra muy bien todo lo anterior.</w:t>
-      </w:r>
-    </w:p>
-    <w:p>
-      <w:r>
-        <w:rPr>
-          <w:b w:val="0"/>
-          <w:i w:val="0"/>
-        </w:rPr>
-        <w:t>Paso uno: se carga la red con los pesos del preentrenamiento. Se empieza con todos los pesos ya ajustados, no con valores aleatorios. Esta red ya sabe segmentar objetos cotidianos.</w:t>
-      </w:r>
-    </w:p>
-    <w:p>
-      <w:r>
-        <w:rPr>
-          <w:b w:val="0"/>
-          <w:i w:val="0"/>
-        </w:rPr>
-        <w:t>Paso dos: se reemplaza la última parte. La red original responde entre ochenta categorías; la nuestra solo distingue entre fondo y espermatozoide, una clase. Se sustituyen las capas finales, las que producen la clasificación y las máscaras, por otras nuevas con pesos aleatorios, diseñadas para una clase. Son la parte más específica de la tarea y las únicas que de verdad hay que aprender desde cero.</w:t>
-      </w:r>
-    </w:p>
-    <w:p>
-      <w:r>
-        <w:rPr>
-          <w:b w:val="0"/>
-          <w:i w:val="0"/>
-        </w:rPr>
-        <w:t>Paso tres: decidir cuánto de la red puede ajustarse. Hay dos extremos. En uno se congela toda la red salvo las capas nuevas; los pesos del preentrenamiento no se tocan. Es rápido y funciona con muy pocos datos, pero es menos flexible. En el otro, todos los pesos cambian: más flexibilidad, pero más datos y más cuidado. En el cuaderno se eligió un punto intermedio: quedan libres las capas más profundas del bloque que extrae características, que son las más especializadas, y se mantienen fijas las primeras, que son las más generales. En la analogía musical, es conservar el oído y el ritmo y ajustar solo lo que depende del instrumento.</w:t>
-      </w:r>
-    </w:p>
-    <w:p>
-      <w:r>
-        <w:rPr>
-          <w:b w:val="0"/>
-          <w:i w:val="0"/>
-        </w:rPr>
-        <w:t>Paso cuatro: se entrena con nuestras imágenes, con el ciclo de predecir, medir el error y ajustar. Con dos precauciones. La tasa de aprendizaje es pequeña, porque no queremos que los ajustes borren lo que la red ya sabe. Y se usa un calentamiento, que sube la tasa poco a poco al comienzo para que los primeros pasos, cuando las capas nuevas aún son aleatorias, no provoquen cambios bruscos en las capas ya entrenadas.</w:t>
-      </w:r>
-    </w:p>
-    <w:p>
-      <w:r>
-        <w:rPr>
-          <w:b w:val="0"/>
-          <w:i w:val="0"/>
-        </w:rPr>
-        <w:t>Paso cinco: se evalúa con imágenes que la red no vio. Cada cierto número de épocas el cuaderno mide qué tan bien funciona sobre las zonas reservadas para validación y se queda con el modelo que mejor resultado obtuvo.</w:t>
-      </w:r>
-    </w:p>
-    <w:p>
-      <w:r>
-        <w:rPr>
-          <w:b w:val="0"/>
-          <w:i w:val="0"/>
-        </w:rPr>
-        <w:t>Así se consigue un modelo útil con ocho fotografías en total. Sin la transferencia, esas ocho no alcanzarían ni de lejos.</w:t>
-      </w:r>
-    </w:p>
-    <w:p>
-      <w:r>
-        <w:rPr>
-          <w:b w:val="0"/>
-          <w:i w:val="0"/>
-        </w:rPr>
-        <w:t>Ahora algo que quiero que se lleven, porque afecta las decisiones futuras del grupo. La transferencia reduce mucho la cantidad de datos necesaria, pero no la elimina. Permite pasar de millones de ejemplos a cientos. Aun así, el modelo depende de la calidad y variedad de los ejemplos con que se afina. Si las ocho fotografías son de la misma muestra, tomadas el mismo día y con la misma tinción, el modelo se especializará en ese caso. Con otra tinción, otra iluminación u otros artefactos, es posible que falle. Por eso la actualización de la red, con un lote de unas cincuenta imágenes en condiciones más variadas, no es un lujo: es lo que vuelve confiable al modelo.</w:t>
-      </w:r>
-    </w:p>
-    <w:p>
-      <w:r>
-        <w:rPr>
-          <w:b w:val="0"/>
-          <w:i w:val="0"/>
-        </w:rPr>
-        <w:t>Y una observación de otro tipo. Esta técnica funciona porque existe una red base de calidad y de acceso abierto. Para elegir la Mask R-CNN de la biblioteca torchvision, y no otras alternativas muy populares, pesó la licencia. Hay una familia de modelos muy conocida cuya licencia obliga a publicar el código de cualquier sitio que se sirva en línea con ellos; la de torchvision es permisiva y no impone esa condición. En proyectos como este la elección de la herramienta también tiene una dimensión legal, y conviene decidirla con conocimiento.</w:t>
-      </w:r>
-    </w:p>
-    <w:p>
-      <w:r>
-        <w:rPr>
-          <w:b w:val="0"/>
-          <w:i w:val="0"/>
-        </w:rPr>
-        <w:t>Para cerrar esta sección, un ejercicio mental para comprobar que la idea quedó clara: si mañana el grupo quisiera detectar otro tipo de célula, ¿empezaríamos de cero? No. Tomaríamos como base la red que ya tenemos, o incluso la preentrenada original, la afinaríamos con ejemplos anotados del nuevo tipo y tendríamos un modelo nuevo. Por eso en las sesiones dos y cuatro dedicamos tanto tiempo a la anotación y al reentrenamiento: es el procedimiento que da independencia.</w:t>
+        <w:t>[Pantalla: diagrama de flujo con cinco cajas: imagen → red neuronal (contornos) → medición con código (área, largo) → estadística (media, desviación, histograma) → CSV y PDF.]</w:t>
+      </w:r>
+    </w:p>
+    <w:p>
+      <w:r>
+        <w:rPr>
+          <w:b w:val="0"/>
+          <w:i w:val="0"/>
+        </w:rPr>
+        <w:t>Con lo visto hasta ahora podemos leer el diagrama de pantalla, que resume cómo se reparten las tareas en el sistema. Ya lo mencioné de pasada; ahora que conocemos mejor la red, lo veo con más detalle.</w:t>
+      </w:r>
+    </w:p>
+    <w:p>
+      <w:r>
+        <w:rPr>
+          <w:b w:val="0"/>
+          <w:i w:val="0"/>
+        </w:rPr>
+        <w:t>La imagen entra por la izquierda. La red neuronal es la primera caja y produce un conjunto de contornos: por cada espermatozoide que encuentra, una forma cerrada que lo delimita. La red no produce medidas. No dice «esta célula tiene tanta área». Dice «esta es la forma de una célula».</w:t>
+      </w:r>
+    </w:p>
+    <w:p>
+      <w:r>
+        <w:rPr>
+          <w:b w:val="0"/>
+          <w:i w:val="0"/>
+        </w:rPr>
+        <w:t>Desde ahí el trabajo pasa a código convencional. Con la forma en la mano, es un problema geométrico: el área es el número de píxeles que quedan dentro y el largo es la longitud de la curva a lo largo de la forma. Esos cálculos usan OpenCV y numpy, bibliotecas conocidas y probadas, y son deterministas: repetir el cálculo con el mismo contorno da exactamente las mismas cifras. Después se resume con estadística elemental: media, desviación estándar, mínimo, máximo, histograma. Y al final se generan los archivos.</w:t>
+      </w:r>
+    </w:p>
+    <w:p>
+      <w:r>
+        <w:rPr>
+          <w:b w:val="0"/>
+          <w:i w:val="0"/>
+        </w:rPr>
+        <w:t>Esta división importa por al menos tres razones, y son el tipo de decisión que el grupo podría querer repetir en proyectos futuros.</w:t>
+      </w:r>
+    </w:p>
+    <w:p>
+      <w:r>
+        <w:rPr>
+          <w:b w:val="0"/>
+          <w:i w:val="0"/>
+        </w:rPr>
+        <w:t>La primera es la verificabilidad. Una red neuronal es una caja relativamente opaca; no es fácil explicar por qué produjo cierto contorno. Pero una vez que tenemos el contorno, todo lo demás es transparente. Cualquiera puede mirar la imagen marcada, juzgar si el contorno es correcto y recalcular la medida con otra herramienta. Si hubiéramos pedido a la red que predijera el tamaño directamente, el resultado no se podría auditar. Separar las responsabilidades concentra la incertidumbre en un solo lugar, el contorno, que es el que el usuario puede revisar a simple vista.</w:t>
+      </w:r>
+    </w:p>
+    <w:p>
+      <w:r>
+        <w:rPr>
+          <w:b w:val="0"/>
+          <w:i w:val="0"/>
+        </w:rPr>
+        <w:t>La segunda es la flexibilidad. Si el grupo decide cambiar la definición de lo que se mide, por ejemplo reportar el largo de otra manera o agregar el perímetro o la excentricidad, basta modificar el código de medición, sin reentrenar nada. Y al revés: si se mejora la red con más datos, la medición no cambia. Las dos partes evolucionan por separado.</w:t>
+      </w:r>
+    </w:p>
+    <w:p>
+      <w:r>
+        <w:rPr>
+          <w:b w:val="0"/>
+          <w:i w:val="0"/>
+        </w:rPr>
+        <w:t>La tercera es la economía de datos. Con pocos ejemplos es mucho más fácil enseñarle a una red una sola cosa bien, dónde está el espermatozoide, que pedirle además que aprenda a medir. Cada tarea adicional exige ejemplos adicionales.</w:t>
+      </w:r>
+    </w:p>
+    <w:p>
+      <w:r>
+        <w:rPr>
+          <w:b w:val="0"/>
+          <w:i w:val="0"/>
+        </w:rPr>
+        <w:t>Precisión sobre lo que significa que el modelo tenga una sola clase. La red se entrenó para distinguir dos cosas: espermatozoide y fondo. No distingue entre cabeza y cola, ni entre una célula y otra estructura que se le parezca. Marcará cualquier cosa que se parezca lo bastante a lo que vio en los ejemplos, y puede dejar pasar un espermatozoide inusual que no se parezca. Por eso conviene revisar la imagen marcada.</w:t>
+      </w:r>
+    </w:p>
+    <w:p>
+      <w:r>
+        <w:rPr>
+          <w:b w:val="0"/>
+          <w:i w:val="0"/>
+        </w:rPr>
+        <w:t>Esto conecta con algo que vimos en la demostración: los contornos cubren el espermatozoide visible completo y no solo la cabeza. No es un error del código sino un reflejo de cómo se etiquetaron las imágenes de entrenamiento. Por ahora, quienes anotaron marcaron la cabeza y el primer tramo de la cola, y la frontera entre ambas se define con el grupo. La red aprendió a reproducir esa decisión. Si el grupo define un criterio, por ejemplo el que se sugirió en una de las reuniones, tomar como cabeza lo que quede dentro de un radio fijo desde la punta, habría que reanotar las imágenes con ese criterio y reentrenar. Es un buen ejemplo de cómo una decisión de anotación se convierte, sin que nadie lo programe, en un comportamiento del modelo.</w:t>
       </w:r>
     </w:p>
     <w:p>
@@ -4469,7 +4649,7 @@
         <w:pStyle w:val="Heading2"/>
       </w:pPr>
       <w:r>
-        <w:t>3.10 Qué ve realmente la red: brillo, aumento de datos y variaciones</w:t>
+        <w:t>3.12 Los retos de un modelo entrenado con pocos ejemplos</w:t>
       </w:r>
     </w:p>
     <w:p>
@@ -4479,7 +4659,7 @@
           <w:i/>
           <w:color w:val="595959"/>
         </w:rPr>
-        <w:t>437 palabras · 1.7 min</w:t>
+        <w:t>685 palabras · 2.7 min</w:t>
       </w:r>
     </w:p>
     <w:p>
@@ -4492,70 +4672,97 @@
           <w:i/>
           <w:color w:val="1F4E79"/>
         </w:rPr>
-        <w:t>[Pantalla: diapositiva con una misma tesela mostrada seis veces: original, girada, volteada, más brillante, con ruido y con zoom.]</w:t>
-      </w:r>
-    </w:p>
-    <w:p>
-      <w:r>
-        <w:rPr>
-          <w:b w:val="0"/>
-          <w:i w:val="0"/>
-        </w:rPr>
-        <w:t>Un par de detalles del cuaderno de entrenamiento conectan directamente con lo que acabamos de ver, y ayudan a imaginar qué recibe la red.</w:t>
-      </w:r>
-    </w:p>
-    <w:p>
-      <w:r>
-        <w:rPr>
-          <w:b w:val="0"/>
-          <w:i w:val="0"/>
-        </w:rPr>
-        <w:t>El primero: la red no ve colores. El cuaderno convierte cada fotografía a un solo canal de brillo, tomando el valor más alto entre rojo, verde y azul de cada píxel. Por eso la red trabaja con una imagen de una sola capa de números y detecta formas por contraste. El sitio hace lo mismo al analizar una fotografía, para que la preparación sea idéntica a la del entrenamiento.</w:t>
-      </w:r>
-    </w:p>
-    <w:p>
-      <w:r>
-        <w:rPr>
-          <w:b w:val="0"/>
-          <w:i w:val="0"/>
-        </w:rPr>
-        <w:t>En las fotografías de fondo claro se invierte el brillo antes de pasarlas por la red, de modo que los espermatozoides oscuros sobre fondo claro se parezcan a los brillantes sobre fondo oscuro. Es una hipótesis de trabajo que aún no está comprobada del todo, y está anotada como tal en el cuaderno.</w:t>
-      </w:r>
-    </w:p>
-    <w:p>
-      <w:r>
-        <w:rPr>
-          <w:b w:val="0"/>
-          <w:i w:val="0"/>
-        </w:rPr>
-        <w:t>El segundo detalle: el aumento de datos. Con pocas imágenes, el modelo corre el riesgo de memorizarlas. Una técnica barata contra eso es mostrarle, en cada época, versiones ligeramente distintas de los mismos recortes. El cuaderno aplica volteos y giros de noventa grados, un acercamiento o alejamiento de entre el ochenta por ciento y el ciento veinticinco por ciento, cambios de brillo y de contraste, y un poco de ruido. Todo al azar, en cada recorte.</w:t>
-      </w:r>
-    </w:p>
-    <w:p>
-      <w:r>
-        <w:rPr>
-          <w:b w:val="0"/>
-          <w:i w:val="0"/>
-        </w:rPr>
-        <w:t>La idea es que un espermatozoide girado noventa grados, o un poco más grande, o en una imagen un poco más oscura, sigue siendo un espermatozoide. Si el modelo ve esas variantes, aprende lo que no cambia y deja de apoyarse en detalles accidentales, como la orientación o el nivel exacto de iluminación. Con cuatro fotografías, el aumento de datos hace que el modelo vea miles de recortes distintos.</w:t>
-      </w:r>
-    </w:p>
-    <w:p>
-      <w:r>
-        <w:rPr>
-          <w:b w:val="0"/>
-          <w:i w:val="0"/>
-        </w:rPr>
-        <w:t>Tiene un límite: el aumento de datos genera variaciones de las imágenes que existen, pero no inventa situaciones nuevas. Si en ninguna de las fotografías hay un cierto tipo de aglomeración, ninguna rotación va a producirlo. Por eso, aunque ayuda mucho, no reemplaza a las imágenes nuevas.</w:t>
-      </w:r>
-    </w:p>
-    <w:p>
-      <w:r>
-        <w:rPr>
-          <w:b w:val="0"/>
-          <w:i w:val="0"/>
-        </w:rPr>
-        <w:t>Un tercer detalle, relacionado con el tamaño. Los recortes son de quinientos doce píxeles en fluorescencia y de seiscientos cuarenta en fondo claro, con las fotografías de fondo claro reducidas a la mitad antes de todo. Cada perfil tiene su propia configuración, y el archivo de cada modelo la guarda: tamaño de tesela, traslape, reducción de la foto, umbral de detección. Cuando el sitio carga un modelo, lee esos valores de ahí y los aplica, sin que nadie tenga que recordarlos. Es la razón por la que cambiar un modelo por otro no requiere tocar el código del sitio.</w:t>
+        <w:t>[Pantalla: diapositiva con dos columnas: «Qué hace bien» y «Retos».]</w:t>
+      </w:r>
+    </w:p>
+    <w:p>
+      <w:r>
+        <w:rPr>
+          <w:b w:val="0"/>
+          <w:i w:val="0"/>
+        </w:rPr>
+        <w:t>Para completar la explicación, hablemos de expectativas, porque la forma más común de decepcionarse con un modelo así es esperar de él más de lo que sus datos pueden dar. Voy a ser concreto, con lo que sabemos de nuestros dos modelos.</w:t>
+      </w:r>
+    </w:p>
+    <w:p>
+      <w:r>
+        <w:rPr>
+          <w:b w:val="0"/>
+          <w:i w:val="0"/>
+        </w:rPr>
+        <w:t>Primero, lo que hace bien. En imágenes parecidas a las de su entrenamiento, el modelo localiza la mayoría de los espermatozoides y traza contornos razonables. Al verificar el sitio contra el cuaderno de entrenamiento, dio los mismos conteos en cinco fotografías de prueba: ciento catorce, nueve, dos, uno y cuarenta y tres contornos. Eso demuestra que el sitio aplica el modelo exactamente igual que en el entrenamiento, que no es poca cosa, porque una diferencia mínima en la preparación de la imagen basta para alterar los resultados. Es una comprobación de integración, no de calidad científica, y quiero ser claro en eso.</w:t>
+      </w:r>
+    </w:p>
+    <w:p>
+      <w:r>
+        <w:rPr>
+          <w:b w:val="0"/>
+          <w:i w:val="0"/>
+        </w:rPr>
+        <w:t>Los retos son cuatro.</w:t>
+      </w:r>
+    </w:p>
+    <w:p>
+      <w:r>
+        <w:rPr>
+          <w:b w:val="0"/>
+          <w:i w:val="0"/>
+        </w:rPr>
+        <w:t>La primera es la aglomeración. Donde hay muchos espermatozoides juntos, el modelo repite o parte contornos y no encuentra algunos. En las mediciones con el modelo de fluorescencia, en las zonas más amontonadas encontró unos ochenta y cinco de cada cien. Por eso ahí el conteo se lee como una estimación. Tiene explicación: cuando dos objetos se superponen, el límite entre ellos es ambiguo incluso para una persona, y con pocos ejemplos de ese caso, la red no tuvo oportunidades suficientes de aprender cómo resolverlo.</w:t>
+      </w:r>
+    </w:p>
+    <w:p>
+      <w:r>
+        <w:rPr>
+          <w:b w:val="0"/>
+          <w:i w:val="0"/>
+        </w:rPr>
+        <w:t>La segunda es la variedad. El modelo vio cuatro fotografías de cada tipo, todas de un mismo conjunto de escenas. No sabemos cómo se comportará con otras muestras, tinciones o intensidades de iluminación, ni con fotos que hayan pasado por compresión. Puede funcionar muy bien o tener dificultades que no anticipamos. La única forma de saberlo es probar con imágenes nuevas y comparar con un conteo hecho por una persona.</w:t>
+      </w:r>
+    </w:p>
+    <w:p>
+      <w:r>
+        <w:rPr>
+          <w:b w:val="0"/>
+          <w:i w:val="0"/>
+        </w:rPr>
+        <w:t>La tercera es lo que no es un espermatozoide. La red nunca vio ejemplos negativos de otro tipo de imagen, así que no puede decir «esto no es una muestra». Ante una fotografía de algo muy distinto lo más probable es que no encuentre nada y el sitio avise que no se puede analizar, pero no hay garantía: podría marcar manchas que se le parezcan. De ahí la utilidad de contar con imágenes de «basura» para reentrenar.</w:t>
+      </w:r>
+    </w:p>
+    <w:p>
+      <w:r>
+        <w:rPr>
+          <w:b w:val="0"/>
+          <w:i w:val="0"/>
+        </w:rPr>
+        <w:t>La cuarta tiene que ver con la medición y no con la red: calibrar la escala en micras y sumar las medidas de cabeza a cola. No dependen del modelo actual, y definen hasta dónde se puede afirmar algo en micras con los resultados.</w:t>
+      </w:r>
+    </w:p>
+    <w:p>
+      <w:r>
+        <w:rPr>
+          <w:b w:val="0"/>
+          <w:i w:val="0"/>
+        </w:rPr>
+        <w:t>¿Qué mejora un modelo así? La respuesta es sencilla y bastante general en aprendizaje automático: más datos, más variados y mejor etiquetados. Más, porque cada ejemplo aporta información. Más variados, porque los nuevos deben cubrir las condiciones en que el modelo se usará de verdad. Y mejor etiquetados, porque la calidad de las anotaciones fija el techo de lo que el modelo puede aprender. Por eso, cuando llegue el lote de cincuenta imágenes, el trabajo de calidad estará sobre todo en la anotación, no en el código.</w:t>
+      </w:r>
+    </w:p>
+    <w:p>
+      <w:r>
+        <w:rPr>
+          <w:b w:val="0"/>
+          <w:i w:val="0"/>
+        </w:rPr>
+        <w:t>La anotación es una tarea de expertos. Quien decide dónde empieza y termina un espermatozoide, qué cuenta como uno aunque esté parcialmente tapado y qué se descarta como ruido está definiendo el criterio científico que el modelo aplicará a miles de imágenes futuras. No es un trabajo mecánico que se pueda delegar sin supervisión. En el diseño del proyecto se previó que alguien del grupo valide las anotaciones, y no es una formalidad: es el control de calidad más importante del sistema.</w:t>
+      </w:r>
+    </w:p>
+    <w:p>
+      <w:r>
+        <w:rPr>
+          <w:b w:val="0"/>
+          <w:i w:val="0"/>
+        </w:rPr>
+        <w:t>También anticipo una pregunta frecuente: ¿el modelo mejora solo con el uso? No. Un modelo desplegado no aprende de las imágenes que analiza; sus pesos están fijos. Para que mejore hay que reunir imágenes nuevas, anotarlas, reentrenar en Colab y cambiar el archivo del modelo en el servidor. Es un proceso deliberado que el grupo controla. Y tiene una ventaja: el modelo no cambia de comportamiento sin que alguien lo decida, así que los resultados de hoy y los de dentro de un mes son comparables mientras no se sustituya el archivo.</w:t>
       </w:r>
     </w:p>
     <w:p>
@@ -4563,7 +4770,7 @@
         <w:pStyle w:val="Heading2"/>
       </w:pPr>
       <w:r>
-        <w:t>3.11 De la red a la medición: cómo se reparten las tareas</w:t>
+        <w:t>3.13 Un caso práctico: qué hacer ante una imagen mal analizada</w:t>
       </w:r>
     </w:p>
     <w:p>
@@ -4573,7 +4780,7 @@
           <w:i/>
           <w:color w:val="595959"/>
         </w:rPr>
-        <w:t>600 palabras · 2.4 min</w:t>
+        <w:t>685 palabras · 2.7 min</w:t>
       </w:r>
     </w:p>
     <w:p>
@@ -4586,88 +4793,79 @@
           <w:i/>
           <w:color w:val="1F4E79"/>
         </w:rPr>
-        <w:t>[Pantalla: diagrama de flujo con cinco cajas: imagen → red neuronal (contornos) → medición con código (área, largo) → estadística (media, desviación, histograma) → CSV y PDF.]</w:t>
-      </w:r>
-    </w:p>
-    <w:p>
-      <w:r>
-        <w:rPr>
-          <w:b w:val="0"/>
-          <w:i w:val="0"/>
-        </w:rPr>
-        <w:t>Con lo visto hasta ahora podemos leer el diagrama de pantalla, que resume cómo se reparten las tareas en el sistema. Ya lo mencioné de pasada; ahora que conocemos mejor la red, lo veo con más detalle.</w:t>
-      </w:r>
-    </w:p>
-    <w:p>
-      <w:r>
-        <w:rPr>
-          <w:b w:val="0"/>
-          <w:i w:val="0"/>
-        </w:rPr>
-        <w:t>La imagen entra por la izquierda. La red neuronal es la primera caja y produce un conjunto de contornos: por cada espermatozoide que encuentra, una forma cerrada que lo delimita. Noten que la red no produce medidas. No dice «esta célula tiene tanta área». Dice «esta es la forma de una célula».</w:t>
-      </w:r>
-    </w:p>
-    <w:p>
-      <w:r>
-        <w:rPr>
-          <w:b w:val="0"/>
-          <w:i w:val="0"/>
-        </w:rPr>
-        <w:t>Desde ahí el trabajo pasa a código convencional. Con la forma en la mano, es un problema geométrico: el área es el número de píxeles que quedan dentro y el largo es la longitud de la curva a lo largo de la forma. Esos cálculos usan OpenCV y numpy, bibliotecas conocidas y probadas, y son deterministas: repetir el cálculo con el mismo contorno da exactamente las mismas cifras. Después se resume con estadística elemental: media, desviación estándar, mínimo, máximo, histograma. Y al final se generan los archivos.</w:t>
-      </w:r>
-    </w:p>
-    <w:p>
-      <w:r>
-        <w:rPr>
-          <w:b w:val="0"/>
-          <w:i w:val="0"/>
-        </w:rPr>
-        <w:t>Esta división importa por al menos tres razones, y son el tipo de decisión que el grupo podría querer repetir en proyectos futuros.</w:t>
-      </w:r>
-    </w:p>
-    <w:p>
-      <w:r>
-        <w:rPr>
-          <w:b w:val="0"/>
-          <w:i w:val="0"/>
-        </w:rPr>
-        <w:t>La primera es la verificabilidad. Una red neuronal es una caja relativamente opaca; no es fácil explicar por qué produjo cierto contorno. Pero una vez que tenemos el contorno, todo lo demás es transparente. Cualquiera puede mirar la imagen marcada, juzgar si el contorno es correcto y recalcular la medida con otra herramienta. Si hubiéramos pedido a la red que predijera el tamaño directamente, el resultado no se podría auditar. Separar las responsabilidades concentra la incertidumbre en un solo lugar, el contorno, que es el que el usuario puede revisar a simple vista.</w:t>
-      </w:r>
-    </w:p>
-    <w:p>
-      <w:r>
-        <w:rPr>
-          <w:b w:val="0"/>
-          <w:i w:val="0"/>
-        </w:rPr>
-        <w:t>La segunda es la flexibilidad. Si el grupo decide cambiar la definición de lo que se mide, por ejemplo reportar el largo de otra manera o agregar el perímetro o la excentricidad, basta modificar el código de medición, sin reentrenar nada. Y al revés: si se mejora la red con más datos, la medición no cambia. Las dos partes evolucionan por separado.</w:t>
-      </w:r>
-    </w:p>
-    <w:p>
-      <w:r>
-        <w:rPr>
-          <w:b w:val="0"/>
-          <w:i w:val="0"/>
-        </w:rPr>
-        <w:t>La tercera es la economía de datos. Con pocos ejemplos es mucho más fácil enseñarle a una red una sola cosa bien, dónde está el espermatozoide, que pedirle además que aprenda a medir. Cada tarea adicional exige ejemplos adicionales.</w:t>
-      </w:r>
-    </w:p>
-    <w:p>
-      <w:r>
-        <w:rPr>
-          <w:b w:val="0"/>
-          <w:i w:val="0"/>
-        </w:rPr>
-        <w:t>Precisión sobre lo que significa que el modelo tenga una sola clase. La red se entrenó para distinguir dos cosas: espermatozoide y fondo. No distingue entre cabeza y cola, ni entre una célula y otra estructura que se le parezca. Marcará cualquier cosa que se parezca lo bastante a lo que vio en los ejemplos, y puede dejar pasar un espermatozoide inusual que no se parezca. Por eso los avisos de pantalla recomiendan revisar la imagen marcada.</w:t>
-      </w:r>
-    </w:p>
-    <w:p>
-      <w:r>
-        <w:rPr>
-          <w:b w:val="0"/>
-          <w:i w:val="0"/>
-        </w:rPr>
-        <w:t>Esto conecta con algo que vimos en la demostración: los contornos cubren el espermatozoide visible completo y no solo la cabeza. No es un error del código sino un reflejo de cómo se etiquetaron las imágenes de entrenamiento. Por ahora, quienes anotaron marcaron la cabeza y el primer tramo de la cola, y la frontera entre ambas está sin decidir. La red aprendió a reproducir esa decisión. Si el grupo define un criterio, por ejemplo el que se sugirió en una de las reuniones, tomar como cabeza lo que quede dentro de un radio fijo desde la punta, habría que reanotar las imágenes con ese criterio y reentrenar. Es un buen ejemplo de cómo una decisión de anotación se convierte, sin que nadie lo programe, en un comportamiento del modelo.</w:t>
+        <w:t>[Pantalla: diapositiva «Una imagen que sale mal». Un esquema de decisión con cuatro preguntas.]</w:t>
+      </w:r>
+    </w:p>
+    <w:p>
+      <w:r>
+        <w:rPr>
+          <w:b w:val="0"/>
+          <w:i w:val="0"/>
+        </w:rPr>
+        <w:t>Para llevar lo anterior a la práctica, un caso hipotético pero muy probable. Alguien del grupo sube una fotografía y, al revisar la imagen marcada, el resultado no lo convence: hay muchos contornos partidos, o hay un grupo de espermatozoides sin marcar. ¿Qué hace?</w:t>
+      </w:r>
+    </w:p>
+    <w:p>
+      <w:r>
+        <w:rPr>
+          <w:b w:val="0"/>
+          <w:i w:val="0"/>
+        </w:rPr>
+        <w:t>La primera pregunta es de diagnóstico: ¿qué tipo de error es? Conviene distinguir tres. Omisiones, es decir, espermatozoides sin marcar. Falsos positivos, es decir, marcas sobre algo que no es un espermatozoide, como una mancha o un resto. Y errores de forma: un contorno que une dos células en una o que parte una en dos. Cada tipo apunta a una causa distinta y ayuda a decidir qué hacer.</w:t>
+      </w:r>
+    </w:p>
+    <w:p>
+      <w:r>
+        <w:rPr>
+          <w:b w:val="0"/>
+          <w:i w:val="0"/>
+        </w:rPr>
+        <w:t>La segunda es sobre la imagen: ¿es del tipo para el que se entrenó el modelo? Hay varias comprobaciones sencillas. El formato: si la fotografía es un JPG o pasó por una aplicación de mensajería, la compresión pudo alterar los bordes. El sitio avisa cuando hay compresión, y si ese aviso aparece, lo primero es repetir el análisis con el archivo original. El tipo de fondo: el sitio decide el modelo por el brillo de la imagen, y una fotografía en el límite, ni claramente oscura ni claramente clara, podría recibir un modelo que no corresponde. La tinción, la iluminación y el aumento: si son muy distintos de los del entrenamiento, el modelo podría estar fuera de su zona de confianza. Recordemos que los modelos actuales se entrenaron con aumentos de cuarenta y con unas pocas escenas.</w:t>
+      </w:r>
+    </w:p>
+    <w:p>
+      <w:r>
+        <w:rPr>
+          <w:b w:val="0"/>
+          <w:i w:val="0"/>
+        </w:rPr>
+        <w:t>La tercera es sobre la densidad: ¿el error se concentra en las zonas más aglomeradas? Si es así, estamos ante uno de los retos conocidos del modelo, y el contexto del sitio ya lo señalaba. No es un problema de esa imagen sino de la etapa actual de la red. Lo recomendable es tomar nota y, si hace falta un conteo exacto, contar a mano la zona aglomerada con ayuda del zoom y usar el resultado del sitio como referencia.</w:t>
+      </w:r>
+    </w:p>
+    <w:p>
+      <w:r>
+        <w:rPr>
+          <w:b w:val="0"/>
+          <w:i w:val="0"/>
+        </w:rPr>
+        <w:t>La cuarta es sobre qué hacer con el resultado: ¿se corrige o se descarta? Recomiendo no modificar a mano el CSV sin dejar constancia. Es mejor conservar el resultado tal como lo entregó el sistema, anotar aparte la corrección y documentar la diferencia. Así se mantiene la trazabilidad, y la diferencia entre el conteo del modelo y el de una persona es un dato valioso en sí mismo: una estimación directa del error del modelo.</w:t>
+      </w:r>
+    </w:p>
+    <w:p>
+      <w:r>
+        <w:rPr>
+          <w:b w:val="0"/>
+          <w:i w:val="0"/>
+        </w:rPr>
+        <w:t>De ahí sale lo más útil de este caso, que es guardar la imagen. Si una fotografía da un mal resultado, es candidata para el siguiente lote de entrenamiento. Se sube a CVAT, se anota con cuidado y se agrega al conjunto de datos. En el siguiente reentrenamiento el modelo verá por primera vez un ejemplo de lo que antes no sabía resolver. El ciclo queda así: el sitio revela los errores, el grupo los anota, el entrenamiento los corrige y el sitio se actualiza con el modelo nuevo.</w:t>
+      </w:r>
+    </w:p>
+    <w:p>
+      <w:r>
+        <w:rPr>
+          <w:b w:val="0"/>
+          <w:i w:val="0"/>
+        </w:rPr>
+        <w:t>Si el error aparece en muchas imágenes y no en una sola, cambia el diagnóstico. Si el modelo omite de forma sistemática cierto tipo de espermatozoide o marca cierto tipo de estructura que no corresponde, el problema ya no es de la imagen sino del modelo o de las anotaciones. Habría que revisar los criterios con que se anotó el conjunto de entrenamiento y reunir más ejemplos de ese caso. A veces los criterios no eran los mismos entre quienes anotaron, y el modelo aprendió una mezcla.</w:t>
+      </w:r>
+    </w:p>
+    <w:p>
+      <w:r>
+        <w:rPr>
+          <w:b w:val="0"/>
+          <w:i w:val="0"/>
+        </w:rPr>
+        <w:t>Por último, una advertencia sobre la tentación de ajustar el modelo para que «salga bien» en las imágenes que se tienen a mano. Si se reentrena una y otra vez con las mismas imágenes hasta que todas se vean perfectas, el modelo habrá memorizado esas imágenes, y su desempeño con imágenes nuevas no habrá mejorado, o incluso habrá empeorado. Por eso la validación debe mantenerse separada, y por eso siempre hay que medir con material que el modelo no usó para aprender. Medir con imágenes no vistas es lo que distingue a un modelo que de verdad mejora de uno que solo lo parece.</w:t>
       </w:r>
     </w:p>
     <w:p>
@@ -4675,7 +4873,7 @@
         <w:pStyle w:val="Heading2"/>
       </w:pPr>
       <w:r>
-        <w:t>3.12 Qué esperar de un modelo entrenado con pocos ejemplos</w:t>
+        <w:t>3.14 Ideas que conviene matizar</w:t>
       </w:r>
     </w:p>
     <w:p>
@@ -4685,7 +4883,7 @@
           <w:i/>
           <w:color w:val="595959"/>
         </w:rPr>
-        <w:t>688 palabras · 2.8 min</w:t>
+        <w:t>706 palabras · 2.8 min</w:t>
       </w:r>
     </w:p>
     <w:p>
@@ -4698,97 +4896,88 @@
           <w:i/>
           <w:color w:val="1F4E79"/>
         </w:rPr>
-        <w:t>[Pantalla: diapositiva con dos columnas: «Qué hace bien» y «Dónde falla».]</w:t>
-      </w:r>
-    </w:p>
-    <w:p>
-      <w:r>
-        <w:rPr>
-          <w:b w:val="0"/>
-          <w:i w:val="0"/>
-        </w:rPr>
-        <w:t>Para completar la explicación, hablemos de expectativas, porque la forma más común de decepcionarse con un modelo así es esperar de él más de lo que sus datos pueden dar. Voy a ser concreto, con lo que sabemos de nuestros dos modelos.</w:t>
-      </w:r>
-    </w:p>
-    <w:p>
-      <w:r>
-        <w:rPr>
-          <w:b w:val="0"/>
-          <w:i w:val="0"/>
-        </w:rPr>
-        <w:t>Primero, lo que hace bien. En imágenes parecidas a las de su entrenamiento, el modelo localiza la mayoría de los espermatozoides y traza contornos razonables. Al verificar el sitio contra el cuaderno de entrenamiento, dio los mismos conteos en cinco fotografías de prueba: ciento catorce, nueve, dos, uno y cuarenta y tres contornos. Eso demuestra que el sitio aplica el modelo exactamente igual que en el entrenamiento, que no es poca cosa, porque una diferencia mínima en la preparación de la imagen basta para alterar los resultados. Es una comprobación de integración, no de calidad científica, y quiero ser claro en eso.</w:t>
-      </w:r>
-    </w:p>
-    <w:p>
-      <w:r>
-        <w:rPr>
-          <w:b w:val="0"/>
-          <w:i w:val="0"/>
-        </w:rPr>
-        <w:t>Dónde falla: hay cuatro limitaciones.</w:t>
-      </w:r>
-    </w:p>
-    <w:p>
-      <w:r>
-        <w:rPr>
-          <w:b w:val="0"/>
-          <w:i w:val="0"/>
-        </w:rPr>
-        <w:t>La primera es la aglomeración. Donde hay muchos espermatozoides juntos, el modelo repite o parte contornos y no encuentra algunos. En las mediciones con el modelo de fluorescencia, en las zonas más amontonadas encontró unos ochenta y cinco de cada cien. Por eso el aviso dice que ahí el conteo es aproximado. Tiene explicación: cuando dos objetos se superponen, el límite entre ellos es ambiguo incluso para una persona, y con pocos ejemplos de ese caso, la red no tuvo oportunidades suficientes de aprender cómo resolverlo.</w:t>
-      </w:r>
-    </w:p>
-    <w:p>
-      <w:r>
-        <w:rPr>
-          <w:b w:val="0"/>
-          <w:i w:val="0"/>
-        </w:rPr>
-        <w:t>La segunda es la variedad. El modelo vio cuatro fotografías de cada tipo, todas de un mismo conjunto de escenas. No sabemos cómo se comportará con otras muestras, tinciones o intensidades de iluminación, ni con fotos que hayan pasado por compresión. Puede funcionar muy bien o fallar de maneras que no anticipamos. La única forma de saberlo es probar con imágenes nuevas y comparar con un conteo hecho por una persona.</w:t>
-      </w:r>
-    </w:p>
-    <w:p>
-      <w:r>
-        <w:rPr>
-          <w:b w:val="0"/>
-          <w:i w:val="0"/>
-        </w:rPr>
-        <w:t>La tercera es lo que no es un espermatozoide. La red nunca vio ejemplos negativos de otro tipo de imagen, así que no puede decir «esto no es una muestra». Ante una fotografía de algo muy distinto lo más probable es que no encuentre nada y el sitio avise que no se puede analizar, pero no hay garantía: podría marcar manchas que se le parezcan. De ahí la utilidad de contar con imágenes de «basura» para reentrenar.</w:t>
-      </w:r>
-    </w:p>
-    <w:p>
-      <w:r>
-        <w:rPr>
-          <w:b w:val="0"/>
-          <w:i w:val="0"/>
-        </w:rPr>
-        <w:t>La cuarta tiene que ver con la medición y no con la red. La escala en micras es provisional y las medidas de cabeza a cola no están implementadas. No son fallas del modelo, pero limitan lo que se puede afirmar con los resultados.</w:t>
-      </w:r>
-    </w:p>
-    <w:p>
-      <w:r>
-        <w:rPr>
-          <w:b w:val="0"/>
-          <w:i w:val="0"/>
-        </w:rPr>
-        <w:t>¿Qué mejora un modelo así? La respuesta es sencilla y bastante general en aprendizaje automático: más datos, más variados y mejor etiquetados. Más, porque cada ejemplo aporta información. Más variados, porque los nuevos deben cubrir las condiciones en que el modelo se usará de verdad. Y mejor etiquetados, porque la calidad de las anotaciones fija el techo de lo que el modelo puede aprender. Por eso, cuando llegue el lote de cincuenta imágenes, el trabajo de calidad estará sobre todo en la anotación, no en el código.</w:t>
-      </w:r>
-    </w:p>
-    <w:p>
-      <w:r>
-        <w:rPr>
-          <w:b w:val="0"/>
-          <w:i w:val="0"/>
-        </w:rPr>
-        <w:t>La anotación es una tarea de expertos. Quien decide dónde empieza y termina un espermatozoide, qué cuenta como uno aunque esté parcialmente tapado y qué se descarta como ruido está definiendo el criterio científico que el modelo aplicará a miles de imágenes futuras. No es un trabajo mecánico que se pueda delegar sin supervisión. En el diseño del proyecto se previó que alguien del grupo valide las anotaciones, y no es una formalidad: es el control de calidad más importante del sistema.</w:t>
-      </w:r>
-    </w:p>
-    <w:p>
-      <w:r>
-        <w:rPr>
-          <w:b w:val="0"/>
-          <w:i w:val="0"/>
-        </w:rPr>
-        <w:t>También anticipo una pregunta frecuente: ¿el modelo mejora solo con el uso? No. Un modelo desplegado no aprende de las imágenes que analiza; sus pesos están fijos. Para que mejore hay que reunir imágenes nuevas, anotarlas, reentrenar en Colab y cambiar el archivo del modelo en el servidor. Es un proceso deliberado que el grupo controla. Y tiene una ventaja: el modelo no cambia de comportamiento sin que alguien lo decida, así que los resultados de hoy y los de dentro de un mes son comparables mientras no se sustituya el archivo.</w:t>
+        <w:t>[Pantalla: diapositiva «Seis ideas que conviene matizar». Cada una se presenta con una frase corta y se desarrolla de palabra.]</w:t>
+      </w:r>
+    </w:p>
+    <w:p>
+      <w:r>
+        <w:rPr>
+          <w:b w:val="0"/>
+          <w:i w:val="0"/>
+        </w:rPr>
+        <w:t>Antes de repasar el vocabulario, comento seis ideas que circulan mucho cuando se habla de redes neuronales y que influyen en cómo interpretamos los resultados del sitio. No las traigo porque crea que el grupo las comparte, sino porque son las que más aparecen cuando el tema llega a personas ajenas al proyecto, y es probable que haya que explicarlas.</w:t>
+      </w:r>
+    </w:p>
+    <w:p>
+      <w:r>
+        <w:rPr>
+          <w:b w:val="0"/>
+          <w:i w:val="0"/>
+        </w:rPr>
+        <w:t>La primera: que la red entiende lo que ve. Lo dije al comienzo, pero es la más persistente. La red calcula. Encontró una combinación de pesos que, ante ciertos patrones de píxeles, produce ciertas salidas. En la práctica eso significa que ante una situación que nunca vio no razona por analogía ni pide ayuda: produce la salida que sus pesos dictan, con la misma seguridad de siempre.</w:t>
+      </w:r>
+    </w:p>
+    <w:p>
+      <w:r>
+        <w:rPr>
+          <w:b w:val="0"/>
+          <w:i w:val="0"/>
+        </w:rPr>
+        <w:t>La segunda: que una red más grande siempre es mejor. No. Más capas y más pesos dan más capacidad, pero también más facilidad para memorizar, y exigen más datos para aprovecharse. Con pocas imágenes, una red enorme no necesariamente supera a una modesta. Elegir arquitectura es buscar un equilibrio entre capacidad, datos disponibles y cómputo. En nuestro caso hay además una restricción práctica: el servidor trabaja solo con procesador, y una red demasiado pesada haría que cada análisis tardara de más.</w:t>
+      </w:r>
+    </w:p>
+    <w:p>
+      <w:r>
+        <w:rPr>
+          <w:b w:val="0"/>
+          <w:i w:val="0"/>
+        </w:rPr>
+        <w:t>La tercera: que el modelo es objetivo porque es una máquina. Es cierto que aplica el mismo criterio a todas las imágenes, sin cansancio ni cambios de ánimo, y eso es una ventaja real frente al conteo manual. Pero ese criterio no es neutral: es el de las anotaciones con que se entrenó. Si quienes anotaron tendían a omitir células parcialmente tapadas, el modelo también las omitirá. No elimina el sesgo de las anotaciones; lo vuelve consistente. De ahí que insista en que anotar es un acto científico y no una tarea mecánica.</w:t>
+      </w:r>
+    </w:p>
+    <w:p>
+      <w:r>
+        <w:rPr>
+          <w:b w:val="0"/>
+          <w:i w:val="0"/>
+        </w:rPr>
+        <w:t>La cuarta: que un buen resultado en un conjunto de imágenes garantiza uno bueno en otro. Lo que el modelo logra con las imágenes de validación, que son del mismo origen que las de entrenamiento, es una estimación optimista de lo que logrará con imágenes realmente nuevas. Si las condiciones cambian, el desempeño puede cambiar. Para estar seguros hay que probar con imágenes de las nuevas condiciones y comparar con un conteo manual, trabajo que el grupo está en la mejor posición de hacer y que conviene planear cuando llegue el lote de cincuenta imágenes.</w:t>
+      </w:r>
+    </w:p>
+    <w:p>
+      <w:r>
+        <w:rPr>
+          <w:b w:val="0"/>
+          <w:i w:val="0"/>
+        </w:rPr>
+        <w:t>La quinta: que si el resultado se ve bien, es correcto. Una imagen con contornos limpios transmite mucha confianza, y puede engañar. Un modelo puede marcar con cuidado una estructura que no es un espermatozoide, o dejar sin marcar uno que sí lo es, y el resultado visual seguirá siendo agradable. La revisión visual es indispensable, pero con la pregunta correcta: no «¿se ve bien?», sino «¿están todas las células que hay, y solo ellas?». Para eso sirve el zoom del visor.</w:t>
+      </w:r>
+    </w:p>
+    <w:p>
+      <w:r>
+        <w:rPr>
+          <w:b w:val="0"/>
+          <w:i w:val="0"/>
+        </w:rPr>
+        <w:t>La sexta: que la meta es el cien por ciento de exactitud. En un problema como este rara vez se alcanza, y no hace falta. Hace falta conocer el error. Si sabemos que, en promedio, el modelo encuentra ochenta y cinco de cada cien células en las zonas más amontonadas, podemos interpretar los conteos con criterio, corregir el sesgo o decidir en qué condiciones el sistema es suficientemente bueno para el propósito. Un error conocido se maneja; uno desconocido es un riesgo. Y para conocerlo se usan las medidas de calidad de la cuarta sesión: precisión, exhaustividad, F1 y AP50.</w:t>
+      </w:r>
+    </w:p>
+    <w:p>
+      <w:r>
+        <w:rPr>
+          <w:b w:val="0"/>
+          <w:i w:val="0"/>
+        </w:rPr>
+        <w:t>Les adelanto el sentido de las dos primeras, que son intuitivas. La precisión responde: de todo lo que el modelo marcó como espermatozoide, ¿qué proporción realmente lo era? La exhaustividad, recall en inglés, responde: de todos los espermatozoides que había, ¿qué proporción encontró? Un modelo muy prudente, que marca poco, tendrá precisión alta y exhaustividad baja. Uno muy generoso, que marca todo lo que se le parezca, tendrá lo contrario. El equilibrio entre ambas se mide con las otras dos cifras, y es el tema de la cuarta sesión.</w:t>
+      </w:r>
+    </w:p>
+    <w:p>
+      <w:r>
+        <w:rPr>
+          <w:b w:val="0"/>
+          <w:i w:val="0"/>
+        </w:rPr>
+        <w:t>Las seis ideas tienen un punto en común: el valor de una red depende de cómo se entrena, se evalúa y se interpreta. Es una herramienta de medición, y como toda herramienta de medición hay que conocer su error.</w:t>
       </w:r>
     </w:p>
     <w:p>
@@ -4796,7 +4985,7 @@
         <w:pStyle w:val="Heading2"/>
       </w:pPr>
       <w:r>
-        <w:t>3.13 Un caso práctico: qué hacer ante una imagen mal analizada</w:t>
+        <w:t>3.15 Preguntas frecuentes sobre redes neuronales</w:t>
       </w:r>
     </w:p>
     <w:p>
@@ -4806,7 +4995,7 @@
           <w:i/>
           <w:color w:val="595959"/>
         </w:rPr>
-        <w:t>680 palabras · 2.7 min</w:t>
+        <w:t>452 palabras · 1.8 min</w:t>
       </w:r>
     </w:p>
     <w:p>
@@ -4819,79 +5008,70 @@
           <w:i/>
           <w:color w:val="1F4E79"/>
         </w:rPr>
-        <w:t>[Pantalla: diapositiva «Una imagen que sale mal». Un esquema de decisión con cuatro preguntas.]</w:t>
-      </w:r>
-    </w:p>
-    <w:p>
-      <w:r>
-        <w:rPr>
-          <w:b w:val="0"/>
-          <w:i w:val="0"/>
-        </w:rPr>
-        <w:t>Para llevar lo anterior a la práctica, un caso hipotético pero muy probable. Alguien del grupo sube una fotografía y, al revisar la imagen marcada, el resultado no lo convence: hay muchos contornos partidos, o falta un grupo de espermatozoides. ¿Qué hace?</w:t>
-      </w:r>
-    </w:p>
-    <w:p>
-      <w:r>
-        <w:rPr>
-          <w:b w:val="0"/>
-          <w:i w:val="0"/>
-        </w:rPr>
-        <w:t>La primera pregunta es de diagnóstico: ¿qué tipo de error es? Conviene distinguir tres. Omisiones, es decir, espermatozoides sin marcar. Falsos positivos, es decir, marcas sobre algo que no es un espermatozoide, como una mancha o un resto. Y errores de forma: un contorno que une dos células en una o que parte una en dos. Cada tipo apunta a una causa distinta y ayuda a decidir qué hacer.</w:t>
-      </w:r>
-    </w:p>
-    <w:p>
-      <w:r>
-        <w:rPr>
-          <w:b w:val="0"/>
-          <w:i w:val="0"/>
-        </w:rPr>
-        <w:t>La segunda es sobre la imagen: ¿es del tipo para el que se entrenó el modelo? Hay varias comprobaciones sencillas. El formato: si la fotografía es un JPG o pasó por una aplicación de mensajería, la compresión pudo alterar los bordes. El sitio avisa cuando hay compresión, y si ese aviso aparece, lo primero es repetir el análisis con el archivo original. El tipo de fondo: el sitio decide el modelo por el brillo de la imagen, y una fotografía en el límite, ni claramente oscura ni claramente clara, podría recibir un modelo que no corresponde. La tinción, la iluminación y el aumento: si son muy distintos de los del entrenamiento, el modelo podría estar fuera de su zona de confianza. Recordemos que los modelos actuales se entrenaron con aumentos de cuarenta y con unas pocas escenas.</w:t>
-      </w:r>
-    </w:p>
-    <w:p>
-      <w:r>
-        <w:rPr>
-          <w:b w:val="0"/>
-          <w:i w:val="0"/>
-        </w:rPr>
-        <w:t>La tercera es sobre la densidad: ¿el error se concentra en las zonas más aglomeradas? Si es así, estamos ante la limitación conocida del modelo, y el aviso del sitio ya la anticipaba. No es una falla de esa imagen sino del estado actual de la red. Lo recomendable es tomar nota y, si hace falta un conteo exacto, contar a mano la zona aglomerada con ayuda del zoom y usar el resultado del sitio como referencia.</w:t>
-      </w:r>
-    </w:p>
-    <w:p>
-      <w:r>
-        <w:rPr>
-          <w:b w:val="0"/>
-          <w:i w:val="0"/>
-        </w:rPr>
-        <w:t>La cuarta es sobre qué hacer con el resultado: ¿se corrige o se descarta? Recomiendo no modificar a mano el CSV sin dejar constancia. Es mejor conservar el resultado tal como lo entregó el sistema, anotar aparte la corrección y documentar la diferencia. Así se mantiene la trazabilidad, y la diferencia entre el conteo del modelo y el de una persona es un dato valioso en sí mismo: una estimación directa del error del modelo.</w:t>
-      </w:r>
-    </w:p>
-    <w:p>
-      <w:r>
-        <w:rPr>
-          <w:b w:val="0"/>
-          <w:i w:val="0"/>
-        </w:rPr>
-        <w:t>De ahí sale lo más útil de este caso, que es guardar la imagen. Si una fotografía da un mal resultado, es candidata para el siguiente lote de entrenamiento. Se sube a CVAT, se anota con cuidado y se agrega al conjunto de datos. En el siguiente reentrenamiento el modelo verá por primera vez un ejemplo de lo que antes no sabía resolver. El ciclo queda así: el sitio revela los errores, el grupo los anota, el entrenamiento los corrige y el sitio se actualiza con el modelo nuevo.</w:t>
-      </w:r>
-    </w:p>
-    <w:p>
-      <w:r>
-        <w:rPr>
-          <w:b w:val="0"/>
-          <w:i w:val="0"/>
-        </w:rPr>
-        <w:t>Si el error aparece en muchas imágenes y no en una sola, cambia el diagnóstico. Si el modelo omite de forma sistemática cierto tipo de espermatozoide o marca cierto tipo de estructura que no corresponde, el problema ya no es de la imagen sino del modelo o de las anotaciones. Habría que revisar los criterios con que se anotó el conjunto de entrenamiento y reunir más ejemplos de ese caso. A veces los criterios no eran los mismos entre quienes anotaron, y el modelo aprendió una mezcla.</w:t>
-      </w:r>
-    </w:p>
-    <w:p>
-      <w:r>
-        <w:rPr>
-          <w:b w:val="0"/>
-          <w:i w:val="0"/>
-        </w:rPr>
-        <w:t>Por último, una advertencia sobre la tentación de ajustar el modelo para que «salga bien» en las imágenes que se tienen a mano. Si se reentrena una y otra vez con las mismas imágenes hasta que todas se vean perfectas, el modelo habrá memorizado esas imágenes, y su desempeño con imágenes nuevas no habrá mejorado, o incluso habrá empeorado. Por eso la validación debe mantenerse separada, y por eso siempre hay que medir con material que el modelo no usó para aprender. Medir con imágenes no vistas es lo que distingue a un modelo que de verdad mejora de uno que solo lo parece.</w:t>
+        <w:t>[Pantalla: diapositiva «Preguntas frecuentes». Cinco preguntas con respuesta corta.]</w:t>
+      </w:r>
+    </w:p>
+    <w:p>
+      <w:r>
+        <w:rPr>
+          <w:b w:val="0"/>
+          <w:i w:val="0"/>
+        </w:rPr>
+        <w:t>Para cerrar el bloque conceptual, respondo las preguntas que suelen aparecer en este punto.</w:t>
+      </w:r>
+    </w:p>
+    <w:p>
+      <w:r>
+        <w:rPr>
+          <w:b w:val="0"/>
+          <w:i w:val="0"/>
+        </w:rPr>
+        <w:t>¿Por qué se entrena en Colab y no en el servidor del sitio? Entrenar una red de este tamaño exige una tarjeta gráfica potente, y Colab presta una por sesiones. Usar la red ya entrenada, en cambio, es mucho menos exigente, y basta un procesador común. Por eso el servidor solo hace inferencia, en procesador, y tarda de decenas de segundos a unos minutos por imagen. El entrenamiento, en cambio, hace ese mismo cálculo miles de veces y además ajusta los pesos, y sin tarjeta gráfica sería desesperadamente lento.</w:t>
+      </w:r>
+    </w:p>
+    <w:p>
+      <w:r>
+        <w:rPr>
+          <w:b w:val="0"/>
+          <w:i w:val="0"/>
+        </w:rPr>
+        <w:t>¿Qué es una tarjeta gráfica y por qué ayuda? Es un procesador diseñado para hacer muchas operaciones sencillas a la vez. Una convolución es justamente una cantidad enorme de multiplicaciones y sumas independientes, que una tarjeta gráfica reparte entre miles de núcleos pequeños. Un procesador común hace menos operaciones en paralelo, por eso es varias veces más lento en esta tarea.</w:t>
+      </w:r>
+    </w:p>
+    <w:p>
+      <w:r>
+        <w:rPr>
+          <w:b w:val="0"/>
+          <w:i w:val="0"/>
+        </w:rPr>
+        <w:t>¿Cuántas imágenes hacen falta? No hay un número mágico. Depende de la variedad de las condiciones y de la dificultad del problema. Con transferencia y unos cientos de ejemplos se obtiene un modelo utilizable, como el nuestro. Para uno confiable en condiciones variadas se necesitan más imágenes, de más fuentes. Contar espermatozoides, donde cada fotografía aporta muchos ejemplos, es más generoso que otras tareas: cada imagen tiene del orden de ciento cincuenta cabezas, así que diez imágenes ya dan más de mil ejemplos anotados.</w:t>
+      </w:r>
+    </w:p>
+    <w:p>
+      <w:r>
+        <w:rPr>
+          <w:b w:val="0"/>
+          <w:i w:val="0"/>
+        </w:rPr>
+        <w:t>¿Por qué Python y PyTorch? Python es el lenguaje dominante en ciencia de datos, con bibliotecas para casi todo, y PyTorch es una de las dos bibliotecas principales para redes neuronales. Es la biblioteca en la que viene la Mask R-CNN que elegimos, con sus pesos preentrenados, y su código es legible, lo cual importa para una capacitación. El resto de las herramientas, OpenCV, numpy, Flask y las demás, son de código abierto y de uso muy extendido.</w:t>
+      </w:r>
+    </w:p>
+    <w:p>
+      <w:r>
+        <w:rPr>
+          <w:b w:val="0"/>
+          <w:i w:val="0"/>
+        </w:rPr>
+        <w:t>¿Se puede explicar por qué la red marcó algo? Solo de forma parcial. Existen técnicas para visualizar en qué zonas de la imagen se fijó la red, pero no dan una explicación completa como la de una regla escrita a mano. Por eso insisto en que la medición es aparte y verificable: no necesitamos explicar la red para confiar en el número, porque el contorno se puede revisar a simple vista.</w:t>
+      </w:r>
+    </w:p>
+    <w:p>
+      <w:r>
+        <w:rPr>
+          <w:b w:val="0"/>
+          <w:i w:val="0"/>
+        </w:rPr>
+        <w:t>¿Qué pasa si salen versiones nuevas de PyTorch? El archivo de cada modelo guarda con qué versión se entrenó, y el servidor debe usar versiones compatibles. Si en el futuro se actualiza PyTorch, hay que probar que los modelos sigan dando los mismos resultados. Lo mencionaré en la guía de despliegue, en la tercera sesión.</w:t>
       </w:r>
     </w:p>
     <w:p>
@@ -4899,7 +5079,7 @@
         <w:pStyle w:val="Heading2"/>
       </w:pPr>
       <w:r>
-        <w:t>3.14 Ideas que conviene matizar</w:t>
+        <w:t>3.16 Tres casos para ilustrar lo visto</w:t>
       </w:r>
     </w:p>
     <w:p>
@@ -4909,7 +5089,7 @@
           <w:i/>
           <w:color w:val="595959"/>
         </w:rPr>
-        <w:t>707 palabras · 2.8 min</w:t>
+        <w:t>297 palabras · 1.2 min</w:t>
       </w:r>
     </w:p>
     <w:p>
@@ -4922,88 +5102,52 @@
           <w:i/>
           <w:color w:val="1F4E79"/>
         </w:rPr>
-        <w:t>[Pantalla: diapositiva «Seis ideas que conviene matizar». Cada una se presenta con una frase corta y se desarrolla de palabra.]</w:t>
-      </w:r>
-    </w:p>
-    <w:p>
-      <w:r>
-        <w:rPr>
-          <w:b w:val="0"/>
-          <w:i w:val="0"/>
-        </w:rPr>
-        <w:t>Antes de repasar el vocabulario, comento seis ideas que circulan mucho cuando se habla de redes neuronales y que influyen en cómo interpretamos los resultados del sitio. No las traigo porque crea que el grupo las comparte, sino porque son las que más aparecen cuando el tema llega a personas ajenas al proyecto, y es probable que ustedes tengan que explicarlas.</w:t>
-      </w:r>
-    </w:p>
-    <w:p>
-      <w:r>
-        <w:rPr>
-          <w:b w:val="0"/>
-          <w:i w:val="0"/>
-        </w:rPr>
-        <w:t>La primera: que la red entiende lo que ve. Lo dije al comienzo, pero es la más persistente. La red calcula. Encontró una combinación de pesos que, ante ciertos patrones de píxeles, produce ciertas salidas. En la práctica eso significa que ante una situación que nunca vio no razona por analogía ni pide ayuda: produce la salida que sus pesos dictan, con la misma seguridad de siempre.</w:t>
-      </w:r>
-    </w:p>
-    <w:p>
-      <w:r>
-        <w:rPr>
-          <w:b w:val="0"/>
-          <w:i w:val="0"/>
-        </w:rPr>
-        <w:t>La segunda: que una red más grande siempre es mejor. No. Más capas y más pesos dan más capacidad, pero también más facilidad para memorizar, y exigen más datos para aprovecharse. Con pocas imágenes, una red enorme no necesariamente supera a una modesta. Elegir arquitectura es buscar un equilibrio entre capacidad, datos disponibles y cómputo. En nuestro caso hay además una restricción práctica: el servidor trabaja solo con procesador, y una red demasiado pesada haría que cada análisis tardara de más.</w:t>
-      </w:r>
-    </w:p>
-    <w:p>
-      <w:r>
-        <w:rPr>
-          <w:b w:val="0"/>
-          <w:i w:val="0"/>
-        </w:rPr>
-        <w:t>La tercera: que el modelo es objetivo porque es una máquina. Es cierto que aplica el mismo criterio a todas las imágenes, sin cansancio ni cambios de ánimo, y eso es una ventaja real frente al conteo manual. Pero ese criterio no es neutral: es el de las anotaciones con que se entrenó. Si quienes anotaron tendían a omitir células parcialmente tapadas, el modelo también las omitirá. No elimina el sesgo de las anotaciones; lo vuelve consistente. De ahí que insista en que anotar es un acto científico y no una tarea mecánica.</w:t>
-      </w:r>
-    </w:p>
-    <w:p>
-      <w:r>
-        <w:rPr>
-          <w:b w:val="0"/>
-          <w:i w:val="0"/>
-        </w:rPr>
-        <w:t>La cuarta: que un buen resultado en un conjunto de imágenes garantiza uno bueno en otro. Lo que el modelo logra con las imágenes de validación, que son del mismo origen que las de entrenamiento, es una estimación optimista de lo que logrará con imágenes realmente nuevas. Si las condiciones cambian, el desempeño puede cambiar. Para estar seguros hay que probar con imágenes de las nuevas condiciones y comparar con un conteo manual, trabajo que el grupo está en la mejor posición de hacer y que conviene planear cuando llegue el lote de cincuenta imágenes.</w:t>
-      </w:r>
-    </w:p>
-    <w:p>
-      <w:r>
-        <w:rPr>
-          <w:b w:val="0"/>
-          <w:i w:val="0"/>
-        </w:rPr>
-        <w:t>La quinta: que si el resultado se ve bien, es correcto. Una imagen con contornos limpios transmite mucha confianza, y puede engañar. Un modelo puede marcar con cuidado una estructura que no es un espermatozoide, o dejar sin marcar uno que sí lo es, y el resultado visual seguirá siendo agradable. La revisión visual es indispensable, pero con la pregunta correcta: no «¿se ve bien?», sino «¿están todas las células que hay, y solo ellas?». Para eso sirve el zoom del visor.</w:t>
-      </w:r>
-    </w:p>
-    <w:p>
-      <w:r>
-        <w:rPr>
-          <w:b w:val="0"/>
-          <w:i w:val="0"/>
-        </w:rPr>
-        <w:t>La sexta: que la meta es el cien por ciento de exactitud. En un problema como este rara vez se alcanza, y no hace falta. Hace falta conocer el error. Si sabemos que, en promedio, el modelo encuentra ochenta y cinco de cada cien células en las zonas más amontonadas, podemos interpretar los conteos con criterio, corregir el sesgo o decidir en qué condiciones el sistema es suficientemente bueno para el propósito. Un error conocido se maneja; uno desconocido es un riesgo. Y para conocerlo se usan las medidas de calidad de la cuarta sesión: precisión, exhaustividad, F1 y AP50.</w:t>
-      </w:r>
-    </w:p>
-    <w:p>
-      <w:r>
-        <w:rPr>
-          <w:b w:val="0"/>
-          <w:i w:val="0"/>
-        </w:rPr>
-        <w:t>Les adelanto el sentido de las dos primeras, que son intuitivas. La precisión responde: de todo lo que el modelo marcó como espermatozoide, ¿qué proporción realmente lo era? La exhaustividad, recall en inglés, responde: de todos los espermatozoides que había, ¿qué proporción encontró? Un modelo muy prudente, que marca poco, tendrá precisión alta y exhaustividad baja. Uno muy generoso, que marca todo lo que se le parezca, tendrá lo contrario. El equilibrio entre ambas se mide con las otras dos cifras, y es el tema de la cuarta sesión.</w:t>
-      </w:r>
-    </w:p>
-    <w:p>
-      <w:r>
-        <w:rPr>
-          <w:b w:val="0"/>
-          <w:i w:val="0"/>
-        </w:rPr>
-        <w:t>Las seis ideas tienen un punto en común: el valor de una red depende de cómo se entrena, se evalúa y se interpreta. Es una herramienta de medición, y como toda herramienta de medición hay que conocer su error.</w:t>
+        <w:t>[Pantalla: diapositiva «Tres casos». Presentar un caso a la vez y dar enseguida su resolución.]</w:t>
+      </w:r>
+    </w:p>
+    <w:p>
+      <w:r>
+        <w:rPr>
+          <w:b w:val="0"/>
+          <w:i w:val="0"/>
+        </w:rPr>
+        <w:t>Antes de pasar al vocabulario, tres casos breves que reúnen lo que acabamos de ver. Cada uno se plantea y se resuelve.</w:t>
+      </w:r>
+    </w:p>
+    <w:p>
+      <w:r>
+        <w:rPr>
+          <w:b w:val="0"/>
+          <w:i w:val="0"/>
+        </w:rPr>
+        <w:t>Primer caso. Una red aprende a detectar espermatozoides con cuatro fotografías en las que todos los espermatozoides miran hacia la derecha. Se le muestra una fotografía nueva donde miran hacia la izquierda, y no la reconoce bien. ¿Qué pasó? Un sobreajuste a un detalle accidental: la orientación. Se evita con más variedad en los datos y con aumento de datos, en este caso girando y volteando los recortes durante el entrenamiento. Es justo lo que hace el cuaderno.</w:t>
+      </w:r>
+    </w:p>
+    <w:p>
+      <w:r>
+        <w:rPr>
+          <w:b w:val="0"/>
+          <w:i w:val="0"/>
+        </w:rPr>
+        <w:t>Segundo caso. El sitio informa un conteo de ciento catorce espermatozoides, pero una persona cuenta ciento treinta a simple vista. ¿Cuál es el siguiente paso? Primero, abrir la imagen marcada y localizar dónde están los que faltan. Si están en una zona muy aglomerada, es uno de los retos conocidos del modelo y no un problema de esa imagen. Si están dispersos y sin marcar, es una señal de que la imagen se parece poco a las del entrenamiento, y vale la pena conservarla como candidata para el próximo lote de anotación. En ninguno de los dos casos se corrige el CSV a mano sin dejar constancia.</w:t>
+      </w:r>
+    </w:p>
+    <w:p>
+      <w:r>
+        <w:rPr>
+          <w:b w:val="0"/>
+          <w:i w:val="0"/>
+        </w:rPr>
+        <w:t>Tercer caso. Alguien propone: «para mejorar el modelo, sigamos entrenándolo con las mismas ocho fotografías hasta que la pérdida llegue a cero». ¿Funcionaría? La pérdida de entrenamiento puede llegar a cero por memorización, sin que el modelo mejore con imágenes nuevas, y la medida que importa es la de validación. Lo que mejoraría el modelo son imágenes nuevas, variadas y bien anotadas.</w:t>
+      </w:r>
+    </w:p>
+    <w:p>
+      <w:r>
+        <w:rPr>
+          <w:b w:val="0"/>
+          <w:i w:val="0"/>
+        </w:rPr>
+        <w:t>Los tres casos apuntan a lo mismo: lo que el modelo aprende depende de los datos, y lo que se afirma sobre él depende de cómo se mida.</w:t>
       </w:r>
     </w:p>
     <w:p>
@@ -5011,7 +5155,7 @@
         <w:pStyle w:val="Heading2"/>
       </w:pPr>
       <w:r>
-        <w:t>3.15 Preguntas frecuentes sobre redes neuronales</w:t>
+        <w:t>3.17 Repaso del vocabulario</w:t>
       </w:r>
     </w:p>
     <w:p>
@@ -5021,7 +5165,7 @@
           <w:i/>
           <w:color w:val="595959"/>
         </w:rPr>
-        <w:t>452 palabras · 1.8 min</w:t>
+        <w:t>597 palabras · 2.4 min</w:t>
       </w:r>
     </w:p>
     <w:p>
@@ -5034,70 +5178,115 @@
           <w:i/>
           <w:color w:val="1F4E79"/>
         </w:rPr>
-        <w:t>[Pantalla: diapositiva «Preguntas frecuentes». Cinco preguntas con respuesta corta.]</w:t>
-      </w:r>
-    </w:p>
-    <w:p>
-      <w:r>
-        <w:rPr>
-          <w:b w:val="0"/>
-          <w:i w:val="0"/>
-        </w:rPr>
-        <w:t>Para cerrar el bloque conceptual, respondo las preguntas que suelen aparecer en este punto.</w:t>
-      </w:r>
-    </w:p>
-    <w:p>
-      <w:r>
-        <w:rPr>
-          <w:b w:val="0"/>
-          <w:i w:val="0"/>
-        </w:rPr>
-        <w:t>¿Por qué se entrena en Colab y no en el servidor del sitio? Entrenar una red de este tamaño exige una tarjeta gráfica potente, y Colab presta una por sesiones. Usar la red ya entrenada, en cambio, es mucho menos exigente, y basta un procesador común. Por eso el servidor solo hace inferencia, en procesador, y tarda de decenas de segundos a unos minutos por imagen. El entrenamiento, en cambio, hace ese mismo cálculo miles de veces y además ajusta los pesos, y sin tarjeta gráfica sería desesperadamente lento.</w:t>
-      </w:r>
-    </w:p>
-    <w:p>
-      <w:r>
-        <w:rPr>
-          <w:b w:val="0"/>
-          <w:i w:val="0"/>
-        </w:rPr>
-        <w:t>¿Qué es una tarjeta gráfica y por qué ayuda? Es un procesador diseñado para hacer muchas operaciones sencillas a la vez. Una convolución es justamente una cantidad enorme de multiplicaciones y sumas independientes, que una tarjeta gráfica reparte entre miles de núcleos pequeños. Un procesador común hace menos operaciones en paralelo, por eso es varias veces más lento en esta tarea.</w:t>
-      </w:r>
-    </w:p>
-    <w:p>
-      <w:r>
-        <w:rPr>
-          <w:b w:val="0"/>
-          <w:i w:val="0"/>
-        </w:rPr>
-        <w:t>¿Cuántas imágenes hacen falta? No hay un número mágico. Depende de la variedad de las condiciones y de la dificultad del problema. Con transferencia y unos cientos de ejemplos se obtiene un modelo utilizable, como el nuestro. Para uno confiable en condiciones variadas se necesitan más imágenes, de más fuentes. Contar espermatozoides, donde cada fotografía aporta muchos ejemplos, es más generoso que otras tareas: cada imagen tiene del orden de ciento cincuenta cabezas, así que diez imágenes ya dan más de mil ejemplos anotados.</w:t>
-      </w:r>
-    </w:p>
-    <w:p>
-      <w:r>
-        <w:rPr>
-          <w:b w:val="0"/>
-          <w:i w:val="0"/>
-        </w:rPr>
-        <w:t>¿Por qué Python y PyTorch? Python es el lenguaje dominante en ciencia de datos, con bibliotecas para casi todo, y PyTorch es una de las dos bibliotecas principales para redes neuronales. Es la biblioteca en la que viene la Mask R-CNN que elegimos, con sus pesos preentrenados, y su código es legible, lo cual importa para una capacitación. El resto de las herramientas, OpenCV, numpy, Flask y las demás, son de código abierto y de uso muy extendido.</w:t>
-      </w:r>
-    </w:p>
-    <w:p>
-      <w:r>
-        <w:rPr>
-          <w:b w:val="0"/>
-          <w:i w:val="0"/>
-        </w:rPr>
-        <w:t>¿Se puede explicar por qué la red marcó algo? Solo de forma parcial. Existen técnicas para visualizar en qué zonas de la imagen se fijó la red, pero no dan una explicación completa como la de una regla escrita a mano. Por eso insisto en que la medición es aparte y verificable: no necesitamos explicar la red para confiar en el número, porque el contorno se puede revisar a simple vista.</w:t>
-      </w:r>
-    </w:p>
-    <w:p>
-      <w:r>
-        <w:rPr>
-          <w:b w:val="0"/>
-          <w:i w:val="0"/>
-        </w:rPr>
-        <w:t>¿Qué pasa si salen versiones nuevas de PyTorch? El archivo de cada modelo guarda con qué versión se entrenó, y el servidor debe usar versiones compatibles. Si en el futuro se actualiza PyTorch, hay que probar que los modelos sigan dando los mismos resultados. Lo mencionaré en la guía de despliegue, en la tercera sesión.</w:t>
+        <w:t>[Pantalla: diapositiva «Vocabulario de la sesión», con una lista de términos. Recorrerla de arriba hacia abajo sin prisa.]</w:t>
+      </w:r>
+    </w:p>
+    <w:p>
+      <w:r>
+        <w:rPr>
+          <w:b w:val="0"/>
+          <w:i w:val="0"/>
+        </w:rPr>
+        <w:t>Repasemos rápido el vocabulario, porque va a aparecer constantemente y conviene que todos tengamos la misma definición.</w:t>
+      </w:r>
+    </w:p>
+    <w:p>
+      <w:r>
+        <w:rPr>
+          <w:b w:val="0"/>
+          <w:i w:val="0"/>
+        </w:rPr>
+        <w:t>Una neurona artificial es una operación pequeña que multiplica sus entradas por pesos, las suma y aplica una función de activación. Una capa es un conjunto de neuronas que miran las mismas entradas. Una red es una cadena de capas, y se llama profunda cuando tiene muchas.</w:t>
+      </w:r>
+    </w:p>
+    <w:p>
+      <w:r>
+        <w:rPr>
+          <w:b w:val="0"/>
+          <w:i w:val="0"/>
+        </w:rPr>
+        <w:t>Los pesos son los números que la red ajusta al aprender; son lo que la red sabe. Un modelo entrenado es una arquitectura más la lista de sus pesos, y por eso un archivo de modelo es en gran parte una lista de números.</w:t>
+      </w:r>
+    </w:p>
+    <w:p>
+      <w:r>
+        <w:rPr>
+          <w:b w:val="0"/>
+          <w:i w:val="0"/>
+        </w:rPr>
+        <w:t>Un filtro, o kernel, es un pequeño detector de patrones, de pocos píxeles de lado, que se desliza por la imagen. La convolución es esa operación de deslizar el filtro y calcular, en cada posición, cuánto se parece la zona al patrón. El resultado es un mapa de características. Una red convolucional usa capas de este tipo. El campo receptivo es la zona de la imagen original de la que depende un valor de una capa profunda; crece capa tras capa y permite pasar de bordes a formas completas.</w:t>
+      </w:r>
+    </w:p>
+    <w:p>
+      <w:r>
+        <w:rPr>
+          <w:b w:val="0"/>
+          <w:i w:val="0"/>
+        </w:rPr>
+        <w:t>La función de pérdida es el número que mide cuánto se equivocó la red. El descenso del gradiente es el procedimiento de ajustar los pesos paso a paso en la dirección que reduce la pérdida, y la tasa de aprendizaje es el tamaño del paso. La retropropagación es el método eficiente para calcular cuánto influyó cada peso en el error.</w:t>
+      </w:r>
+    </w:p>
+    <w:p>
+      <w:r>
+        <w:rPr>
+          <w:b w:val="0"/>
+          <w:i w:val="0"/>
+        </w:rPr>
+        <w:t>Un lote es el grupo de ejemplos que se procesan juntos antes de cada ajuste. Una iteración es un ajuste. Una época es una pasada completa por los ejemplos de entrenamiento.</w:t>
+      </w:r>
+    </w:p>
+    <w:p>
+      <w:r>
+        <w:rPr>
+          <w:b w:val="0"/>
+          <w:i w:val="0"/>
+        </w:rPr>
+        <w:t>La anotación, o etiquetado, es el trabajo humano de marcar las respuestas correctas sobre las imágenes de entrenamiento. El conjunto de entrenamiento es el que la red usa para ajustar sus pesos, y el de validación se reserva para medir cuánto generaliza. El sobreajuste ocurre cuando el modelo funciona bien con los ejemplos de entrenamiento y mal con los nuevos, porque memorizó en lugar de aprender.</w:t>
+      </w:r>
+    </w:p>
+    <w:p>
+      <w:r>
+        <w:rPr>
+          <w:b w:val="0"/>
+          <w:i w:val="0"/>
+        </w:rPr>
+        <w:t>El preentrenamiento es el entrenamiento previo de una red con una colección grande de imágenes de propósito general. El aprendizaje por transferencia consiste en partir de esa red y afinarla con nuestros ejemplos; afinar, o fine-tuning, es ese ajuste adicional.</w:t>
+      </w:r>
+    </w:p>
+    <w:p>
+      <w:r>
+        <w:rPr>
+          <w:b w:val="0"/>
+          <w:i w:val="0"/>
+        </w:rPr>
+        <w:t>La clasificación asigna una etiqueta a toda la imagen. La detección localiza objetos con rectángulos. La segmentación semántica clasifica cada píxel. La segmentación por instancias separa cada objeto individual y traza su contorno; es la que usamos, con la arquitectura Mask R-CNN.</w:t>
+      </w:r>
+    </w:p>
+    <w:p>
+      <w:r>
+        <w:rPr>
+          <w:b w:val="0"/>
+          <w:i w:val="0"/>
+        </w:rPr>
+        <w:t>La inferencia es el uso de un modelo ya entrenado para analizar una imagen nueva: lo que hace el servidor, en procesador y sin entrenar nada. La tesela es cada uno de los recortes pequeños, con un traslape entre ellos, en que se divide una fotografía grande para pasarla por la red.</w:t>
+      </w:r>
+    </w:p>
+    <w:p>
+      <w:r>
+        <w:rPr>
+          <w:b w:val="0"/>
+          <w:i w:val="0"/>
+        </w:rPr>
+        <w:t>Y tres términos que no son de la red pero que ya usamos: el contorno, la forma cerrada que delimita a un espermatozoide; la imagen marcada, la fotografía con los contornos dibujados y numerados; y la escala, la equivalencia entre píxeles y micras.</w:t>
+      </w:r>
+    </w:p>
+    <w:p>
+      <w:r>
+        <w:rPr>
+          <w:b w:val="0"/>
+          <w:i w:val="0"/>
+        </w:rPr>
+        <w:t>No tienen que memorizar la lista. Quedará en el material de apoyo, y el repositorio tiene además un glosario que se irá ampliando. Cuando oigan alguno de estos términos en las próximas sesiones, sirve recordar la imagen que lo acompañaba: el filtro que se desliza, el paso en la montaña con niebla, el estudiante que memoriza el examen de práctica, el músico que cambia de instrumento.</w:t>
       </w:r>
     </w:p>
     <w:p>
@@ -5105,7 +5294,7 @@
         <w:pStyle w:val="Heading2"/>
       </w:pPr>
       <w:r>
-        <w:t>3.16 Preguntas de comprobación para el grupo</w:t>
+        <w:t>3.18 Lo que viene en la siguiente sesión</w:t>
       </w:r>
     </w:p>
     <w:p>
@@ -5115,7 +5304,7 @@
           <w:i/>
           <w:color w:val="595959"/>
         </w:rPr>
-        <w:t>319 palabras · 1.3 min</w:t>
+        <w:t>372 palabras · 1.5 min</w:t>
       </w:r>
     </w:p>
     <w:p>
@@ -5128,52 +5317,61 @@
           <w:i/>
           <w:color w:val="1F4E79"/>
         </w:rPr>
-        <w:t>[Pantalla: diapositiva «Para pensar». Una pregunta a la vez. Dejar entre veinte y treinta segundos de silencio antes de responder, y aceptar respuestas por voz o por el chat.]</w:t>
-      </w:r>
-    </w:p>
-    <w:p>
-      <w:r>
-        <w:rPr>
-          <w:b w:val="0"/>
-          <w:i w:val="0"/>
-        </w:rPr>
-        <w:t>Antes de pasar al vocabulario, tres preguntas rápidas para comprobar que las ideas quedaron claras. No son un examen; sirven para ver si hay algo que conviene repetir.</w:t>
-      </w:r>
-    </w:p>
-    <w:p>
-      <w:r>
-        <w:rPr>
-          <w:b w:val="0"/>
-          <w:i w:val="0"/>
-        </w:rPr>
-        <w:t>Primera pregunta. Una red aprende a detectar espermatozoides con cuatro fotografías en las que todos los espermatozoides miran hacia la derecha. Se le muestra una fotografía nueva donde miran hacia la izquierda, y falla. ¿Qué pasó y cómo se evita? La respuesta es sobreajuste a un detalle accidental: la orientación. Se evita con más variedad en los datos y con aumento de datos, en este caso girando y volteando los recortes durante el entrenamiento. Es justo lo que hace el cuaderno.</w:t>
-      </w:r>
-    </w:p>
-    <w:p>
-      <w:r>
-        <w:rPr>
-          <w:b w:val="0"/>
-          <w:i w:val="0"/>
-        </w:rPr>
-        <w:t>Segunda pregunta. El sitio informa un conteo de ciento catorce espermatozoides, pero una persona cuenta ciento treinta a simple vista. ¿Cuál es el siguiente paso? Primero, abrir la imagen marcada y localizar dónde están los que faltan. Si están en una zona muy aglomerada, es la limitación conocida del modelo y no una falla de esa imagen. Si están dispersos y sin marcar, es una señal de que la imagen se parece poco a las del entrenamiento, y vale la pena conservarla como candidata para el próximo lote de anotación. En ninguno de los dos casos se corrige el CSV a mano sin dejar constancia.</w:t>
-      </w:r>
-    </w:p>
-    <w:p>
-      <w:r>
-        <w:rPr>
-          <w:b w:val="0"/>
-          <w:i w:val="0"/>
-        </w:rPr>
-        <w:t>Tercera pregunta. Un colega propone: «para mejorar el modelo, sigamos entrenándolo con las mismas ocho fotografías hasta que la pérdida llegue a cero». ¿Qué le responderían? Que la pérdida de entrenamiento puede llegar a cero por memorización, sin que el modelo mejore con imágenes nuevas, y que la medida que importa es la de validación. Lo que mejoraría el modelo son imágenes nuevas, variadas y bien anotadas.</w:t>
-      </w:r>
-    </w:p>
-    <w:p>
-      <w:r>
-        <w:rPr>
-          <w:b w:val="0"/>
-          <w:i w:val="0"/>
-        </w:rPr>
-        <w:t>Si alguna de las respuestas no les salió, o si les salió pero no estaban seguros, nos sirve para saber qué repasar. Pueden dejar su duda en el chat o plantearla en el espacio de preguntas al final.</w:t>
+        <w:t>[Pantalla: diapositiva «Sesión 2: la red y sus datos», con tres puntos.]</w:t>
+      </w:r>
+    </w:p>
+    <w:p>
+      <w:r>
+        <w:rPr>
+          <w:b w:val="0"/>
+          <w:i w:val="0"/>
+        </w:rPr>
+        <w:t>Para cerrar esta parte, cómo se conecta lo de hoy con la sesión siguiente.</w:t>
+      </w:r>
+    </w:p>
+    <w:p>
+      <w:r>
+        <w:rPr>
+          <w:b w:val="0"/>
+          <w:i w:val="0"/>
+        </w:rPr>
+        <w:t>En la segunda veremos la red concreta del proyecto, la Mask R-CNN, y todo lo explicado hoy se aplicará ahí. Qué recibe: una imagen preparada de una manera específica. Qué devuelve: por cada objeto que detecta, un cuadro, una puntuación de confianza y una máscara con su contorno. Y ejemplos con imágenes reales, para ver con nuestros propios ojos qué tan bien funciona y dónde menos.</w:t>
+      </w:r>
+    </w:p>
+    <w:p>
+      <w:r>
+        <w:rPr>
+          <w:b w:val="0"/>
+          <w:i w:val="0"/>
+        </w:rPr>
+        <w:t>Veremos también un problema práctico que mencioné de pasada en la demostración: cómo se analiza una fotografía grande. Una imagen de 1792 píxeles de ancho es demasiado grande para pasarla entera por la red, tanto por la memoria que pediría como por el tamaño de los espermatozoides frente a las imágenes con que se afinó. La solución es cortarla en teselas con traslape, analizar cada una y juntar los resultados. Eso genera un problema nuevo, los contornos duplicados en las zonas de traslape, y veremos cómo se resuelve.</w:t>
+      </w:r>
+    </w:p>
+    <w:p>
+      <w:r>
+        <w:rPr>
+          <w:b w:val="0"/>
+          <w:i w:val="0"/>
+        </w:rPr>
+        <w:t>La segunda parte de esa sesión es de datos y entrenamiento. Cómo se anotan las imágenes en CVAT, una herramienta de anotación que corre en una computadora local, de modo que las imágenes no salen de ella. Qué es el formato COCO, la manera estandarizada de guardar anotaciones, y cómo el cuaderno de Colab lee ese archivo y revisa que todo cuadre con las fotografías. Y el entrenamiento paso a paso, con las mismas ideas de hoy: la pérdida, las épocas, la validación.</w:t>
+      </w:r>
+    </w:p>
+    <w:p>
+      <w:r>
+        <w:rPr>
+          <w:b w:val="0"/>
+          <w:i w:val="0"/>
+        </w:rPr>
+        <w:t>Para prepararse piden poco. Con una cuenta de Google tienen lo necesario para abrir el cuaderno de Colab; los enlaces se comparten antes de la sesión y no hay que instalar nada. Una pregunta que conviene tener presente de cara a esa sesión: ¿qué criterio decide si algo en una imagen cuenta como espermatozoide? Es la pregunta de fondo de la anotación, y se retoma ahí.</w:t>
+      </w:r>
+    </w:p>
+    <w:p>
+      <w:r>
+        <w:rPr>
+          <w:b w:val="0"/>
+          <w:i w:val="0"/>
+        </w:rPr>
+        <w:t>Recordemos el panorama de las cinco sesiones. Hoy vimos el sitio y la idea de red neuronal. En la segunda, la red y sus datos. En la tercera, cómo está construido el sitio por dentro. En la cuarta, cómo se ajusta y se evalúa el modelo. Y en la quinta recorremos el código y cerramos.</w:t>
       </w:r>
     </w:p>
     <w:p>
@@ -5181,7 +5379,7 @@
         <w:pStyle w:val="Heading2"/>
       </w:pPr>
       <w:r>
-        <w:t>3.17 Repaso del vocabulario</w:t>
+        <w:t>3.19 Cierre de la sesión</w:t>
       </w:r>
     </w:p>
     <w:p>
@@ -5191,7 +5389,7 @@
           <w:i/>
           <w:color w:val="595959"/>
         </w:rPr>
-        <w:t>596 palabras · 2.4 min</w:t>
+        <w:t>323 palabras · 1.3 min</w:t>
       </w:r>
     </w:p>
     <w:p>
@@ -5204,230 +5402,6 @@
           <w:i/>
           <w:color w:val="1F4E79"/>
         </w:rPr>
-        <w:t>[Pantalla: diapositiva «Vocabulario de la sesión», con una lista de términos. Recorrerla de arriba hacia abajo sin prisa.]</w:t>
-      </w:r>
-    </w:p>
-    <w:p>
-      <w:r>
-        <w:rPr>
-          <w:b w:val="0"/>
-          <w:i w:val="0"/>
-        </w:rPr>
-        <w:t>Repasemos rápido el vocabulario, porque va a aparecer constantemente y conviene que todos tengamos la misma definición.</w:t>
-      </w:r>
-    </w:p>
-    <w:p>
-      <w:r>
-        <w:rPr>
-          <w:b w:val="0"/>
-          <w:i w:val="0"/>
-        </w:rPr>
-        <w:t>Una neurona artificial es una operación pequeña que multiplica sus entradas por pesos, las suma y aplica una función de activación. Una capa es un conjunto de neuronas que miran las mismas entradas. Una red es una cadena de capas, y se llama profunda cuando tiene muchas.</w:t>
-      </w:r>
-    </w:p>
-    <w:p>
-      <w:r>
-        <w:rPr>
-          <w:b w:val="0"/>
-          <w:i w:val="0"/>
-        </w:rPr>
-        <w:t>Los pesos son los números que la red ajusta al aprender; son lo que la red sabe. Un modelo entrenado es una arquitectura más la lista de sus pesos, y por eso un archivo de modelo es en gran parte una lista de números.</w:t>
-      </w:r>
-    </w:p>
-    <w:p>
-      <w:r>
-        <w:rPr>
-          <w:b w:val="0"/>
-          <w:i w:val="0"/>
-        </w:rPr>
-        <w:t>Un filtro, o kernel, es un pequeño detector de patrones, de pocos píxeles de lado, que se desliza por la imagen. La convolución es esa operación de deslizar el filtro y calcular, en cada posición, cuánto se parece la zona al patrón. El resultado es un mapa de características. Una red convolucional usa capas de este tipo. El campo receptivo es la zona de la imagen original de la que depende un valor de una capa profunda; crece capa tras capa y permite pasar de bordes a formas completas.</w:t>
-      </w:r>
-    </w:p>
-    <w:p>
-      <w:r>
-        <w:rPr>
-          <w:b w:val="0"/>
-          <w:i w:val="0"/>
-        </w:rPr>
-        <w:t>La función de pérdida es el número que mide cuánto se equivocó la red. El descenso del gradiente es el procedimiento de ajustar los pesos paso a paso en la dirección que reduce la pérdida, y la tasa de aprendizaje es el tamaño del paso. La retropropagación es el método eficiente para calcular cuánto influyó cada peso en el error.</w:t>
-      </w:r>
-    </w:p>
-    <w:p>
-      <w:r>
-        <w:rPr>
-          <w:b w:val="0"/>
-          <w:i w:val="0"/>
-        </w:rPr>
-        <w:t>Un lote es el grupo de ejemplos que se procesan juntos antes de cada ajuste. Una iteración es un ajuste. Una época es una pasada completa por los ejemplos de entrenamiento.</w:t>
-      </w:r>
-    </w:p>
-    <w:p>
-      <w:r>
-        <w:rPr>
-          <w:b w:val="0"/>
-          <w:i w:val="0"/>
-        </w:rPr>
-        <w:t>La anotación, o etiquetado, es el trabajo humano de marcar las respuestas correctas sobre las imágenes de entrenamiento. El conjunto de entrenamiento es el que la red usa para ajustar sus pesos, y el de validación se reserva para medir cuánto generaliza. El sobreajuste ocurre cuando el modelo funciona bien con los ejemplos de entrenamiento y mal con los nuevos, porque memorizó en lugar de aprender.</w:t>
-      </w:r>
-    </w:p>
-    <w:p>
-      <w:r>
-        <w:rPr>
-          <w:b w:val="0"/>
-          <w:i w:val="0"/>
-        </w:rPr>
-        <w:t>El preentrenamiento es el entrenamiento previo de una red con una colección grande de imágenes de propósito general. El aprendizaje por transferencia consiste en partir de esa red y afinarla con nuestros ejemplos; afinar, o fine-tuning, es ese ajuste adicional.</w:t>
-      </w:r>
-    </w:p>
-    <w:p>
-      <w:r>
-        <w:rPr>
-          <w:b w:val="0"/>
-          <w:i w:val="0"/>
-        </w:rPr>
-        <w:t>La clasificación asigna una etiqueta a toda la imagen. La detección localiza objetos con rectángulos. La segmentación semántica clasifica cada píxel. La segmentación por instancias separa cada objeto individual y traza su contorno; es la que usamos, con la arquitectura Mask R-CNN.</w:t>
-      </w:r>
-    </w:p>
-    <w:p>
-      <w:r>
-        <w:rPr>
-          <w:b w:val="0"/>
-          <w:i w:val="0"/>
-        </w:rPr>
-        <w:t>La inferencia es el uso de un modelo ya entrenado para analizar una imagen nueva: lo que hace el servidor, en procesador y sin entrenar nada. La tesela es cada uno de los recortes pequeños, con un traslape entre ellos, en que se divide una fotografía grande para pasarla por la red.</w:t>
-      </w:r>
-    </w:p>
-    <w:p>
-      <w:r>
-        <w:rPr>
-          <w:b w:val="0"/>
-          <w:i w:val="0"/>
-        </w:rPr>
-        <w:t>Y tres términos que no son de la red pero que ya usamos: el contorno, la forma cerrada que delimita a un espermatozoide; la imagen marcada, la fotografía con los contornos dibujados y numerados; y la escala, la equivalencia entre píxeles y micras.</w:t>
-      </w:r>
-    </w:p>
-    <w:p>
-      <w:r>
-        <w:rPr>
-          <w:b w:val="0"/>
-          <w:i w:val="0"/>
-        </w:rPr>
-        <w:t>No tienen que memorizar la lista. Quedará en el material de apoyo, y el repositorio tiene además un glosario que se irá ampliando. Cuando oigan alguno de estos términos en las próximas sesiones, recuerden la imagen que lo acompañaba: el filtro que se desliza, el paso en la montaña con niebla, el estudiante que memoriza el examen de práctica, el músico que cambia de instrumento.</w:t>
-      </w:r>
-    </w:p>
-    <w:p>
-      <w:pPr>
-        <w:pStyle w:val="Heading2"/>
-      </w:pPr>
-      <w:r>
-        <w:t>3.18 Lo que viene en la siguiente sesión</w:t>
-      </w:r>
-    </w:p>
-    <w:p>
-      <w:r>
-        <w:rPr>
-          <w:b w:val="0"/>
-          <w:i/>
-          <w:color w:val="595959"/>
-        </w:rPr>
-        <w:t>374 palabras · 1.5 min</w:t>
-      </w:r>
-    </w:p>
-    <w:p>
-      <w:pPr>
-        <w:ind w:left="340"/>
-      </w:pPr>
-      <w:r>
-        <w:rPr>
-          <w:b w:val="0"/>
-          <w:i/>
-          <w:color w:val="1F4E79"/>
-        </w:rPr>
-        <w:t>[Pantalla: diapositiva «Sesión 2: la red y sus datos», con tres puntos.]</w:t>
-      </w:r>
-    </w:p>
-    <w:p>
-      <w:r>
-        <w:rPr>
-          <w:b w:val="0"/>
-          <w:i w:val="0"/>
-        </w:rPr>
-        <w:t>Para cerrar esta parte, cómo se conecta lo de hoy con la sesión siguiente.</w:t>
-      </w:r>
-    </w:p>
-    <w:p>
-      <w:r>
-        <w:rPr>
-          <w:b w:val="0"/>
-          <w:i w:val="0"/>
-        </w:rPr>
-        <w:t>En la segunda veremos la red concreta del proyecto, la Mask R-CNN, y todo lo explicado hoy se aplicará ahí. Qué recibe: una imagen preparada de una manera específica. Qué devuelve: por cada objeto que detecta, un cuadro, una puntuación de confianza y una máscara con su contorno. Y ejemplos con imágenes reales, para ver con nuestros propios ojos qué tan bien funciona y dónde menos.</w:t>
-      </w:r>
-    </w:p>
-    <w:p>
-      <w:r>
-        <w:rPr>
-          <w:b w:val="0"/>
-          <w:i w:val="0"/>
-        </w:rPr>
-        <w:t>Veremos también un problema práctico que mencioné de pasada en la demostración: cómo se analiza una fotografía grande. Una imagen de 1792 píxeles de ancho es demasiado grande para pasarla entera por la red, tanto por la memoria que pediría como por el tamaño de los espermatozoides frente a las imágenes con que se afinó. La solución es cortarla en teselas con traslape, analizar cada una y juntar los resultados. Eso genera un problema nuevo, los contornos duplicados en las zonas de traslape, y veremos cómo se resuelve.</w:t>
-      </w:r>
-    </w:p>
-    <w:p>
-      <w:r>
-        <w:rPr>
-          <w:b w:val="0"/>
-          <w:i w:val="0"/>
-        </w:rPr>
-        <w:t>La segunda parte de esa sesión es de datos y entrenamiento. Cómo se anotan las imágenes en CVAT, una herramienta de anotación que corre en una computadora local, de modo que las imágenes no salen de ella. Qué es el formato COCO, la manera estandarizada de guardar anotaciones, y cómo el cuaderno de Colab lee ese archivo y revisa que todo cuadre con las fotografías. Y el entrenamiento paso a paso, con las mismas ideas de hoy: la pérdida, las épocas, la validación.</w:t>
-      </w:r>
-    </w:p>
-    <w:p>
-      <w:r>
-        <w:rPr>
-          <w:b w:val="0"/>
-          <w:i w:val="0"/>
-        </w:rPr>
-        <w:t>Para prepararse piden poco. Con una cuenta de Google tienen lo necesario para abrir el cuaderno de Colab; los enlaces se comparten antes de la sesión y no hay que instalar nada. Si quieren llegar con una pregunta lista, les sugiero esta: ¿qué criterio usarían para decidir si algo en una imagen cuenta como espermatozoide? Es la pregunta de fondo de la anotación, y habrá tiempo para discutirla.</w:t>
-      </w:r>
-    </w:p>
-    <w:p>
-      <w:r>
-        <w:rPr>
-          <w:b w:val="0"/>
-          <w:i w:val="0"/>
-        </w:rPr>
-        <w:t>Recordemos el panorama de las cinco sesiones. Hoy vimos el sitio y la idea de red neuronal. En la segunda, la red y sus datos. En la tercera, cómo está construido el sitio por dentro. En la cuarta, cómo se ajusta y se evalúa el modelo. Y en la quinta recorremos el código y cerramos.</w:t>
-      </w:r>
-    </w:p>
-    <w:p>
-      <w:pPr>
-        <w:pStyle w:val="Heading2"/>
-      </w:pPr>
-      <w:r>
-        <w:t>3.19 Cierre de la sesión</w:t>
-      </w:r>
-    </w:p>
-    <w:p>
-      <w:r>
-        <w:rPr>
-          <w:b w:val="0"/>
-          <w:i/>
-          <w:color w:val="595959"/>
-        </w:rPr>
-        <w:t>317 palabras · 1.3 min</w:t>
-      </w:r>
-    </w:p>
-    <w:p>
-      <w:pPr>
-        <w:ind w:left="340"/>
-      </w:pPr>
-      <w:r>
-        <w:rPr>
-          <w:b w:val="0"/>
-          <w:i/>
-          <w:color w:val="1F4E79"/>
-        </w:rPr>
         <w:t>[Pantalla: diapositiva final «Gracias». Con el correo de contacto del desarrollador.]</w:t>
       </w:r>
     </w:p>
@@ -5446,7 +5420,7 @@
           <w:b w:val="0"/>
           <w:i w:val="0"/>
         </w:rPr>
-        <w:t>Hoy vimos tres cosas. El objetivo y el alcance de Image Bio Pro: un sitio que analiza imágenes de fluorescencia de espermatozoides, los cuenta, mide su área y su largo, muestra la distribución de tamaños y exporta los resultados. El sitio en funcionamiento: la cuenta, la carga de imágenes, la lectura de resultados, el zoom, la escala provisional, los avisos, el CSV, el PDF y el historial. Y la idea de red neuronal: una cadena de capas con pesos ajustables que aprende de ejemplos anotados, ve las imágenes mediante filtros que se aprenden, no empieza de cero gracias al aprendizaje por transferencia y debe evaluarse siempre con imágenes que no vio.</w:t>
+        <w:t>Hoy vimos tres cosas. El objetivo y el alcance de Image Bio Pro: un sitio que analiza imágenes de fluorescencia de espermatozoides, los cuenta, mide su área y su largo, muestra la distribución de tamaños y exporta los resultados. El sitio en funcionamiento: la cuenta, la carga de imágenes, la lectura de resultados, el zoom, la escala de referencia, los avisos de contexto, el CSV, el PDF y el historial. Y la idea de red neuronal: una cadena de capas con pesos ajustables que aprende de ejemplos anotados, ve las imágenes mediante filtros que se aprenden, no empieza de cero gracias al aprendizaje por transferencia y debe evaluarse siempre con imágenes que no vio.</w:t>
       </w:r>
     </w:p>
     <w:p>
@@ -5464,16 +5438,16 @@
           <w:b w:val="0"/>
           <w:i w:val="0"/>
         </w:rPr>
-        <w:t>Antes de las preguntas, lo que queda pendiente y depende de ustedes. Primero, los datos para calibrar la escala: la cámara y el programa con que toman las fotografías, si cuentan con una regla de calibración y si las fotografías de los dos tamaños son del mismo campo. Segundo, el correo al que deben llegar los mensajes del formulario de contacto. Tercero, los contenidos del sitio: textos, fotografías, infografías, videos, logotipo y aviso de privacidad. Cuarto, la confirmación de las fechas y los datos prácticos de las siguientes sesiones.</w:t>
-      </w:r>
-    </w:p>
-    <w:p>
-      <w:r>
-        <w:rPr>
-          <w:b w:val="0"/>
-          <w:i w:val="0"/>
-        </w:rPr>
-        <w:t>También agradezco de antemano sus comentarios sobre esta presentación. Por ser la primera sesión, me interesa saber si el nivel de profundidad fue el adecuado, si hubo partes demasiado rápidas o demasiado lentas y si hay temas que quisieran ver con más detalle en las siguientes. Pueden decírmelo ahora, en el chat, o por correo.</w:t>
+        <w:t>Antes de las preguntas, lo que se resuelve en conjunto con el grupo. Primero, los datos para calibrar la escala: la cámara y el programa con que toman las fotografías, si cuentan con una regla de calibración y si las fotografías de los dos tamaños son del mismo campo. Segundo, el correo al que deben llegar los mensajes del formulario de contacto. Tercero, los contenidos del sitio: textos, fotografías, infografías, videos, logotipo y aviso de privacidad. Cuarto, la confirmación de las fechas y los datos prácticos de las siguientes sesiones.</w:t>
+      </w:r>
+    </w:p>
+    <w:p>
+      <w:r>
+        <w:rPr>
+          <w:b w:val="0"/>
+          <w:i w:val="0"/>
+        </w:rPr>
+        <w:t>También agradezco de antemano sus comentarios sobre esta presentación. Por ser la primera sesión, me interesa saber si el nivel de profundidad fue el adecuado, si hubo partes demasiado rápidas o demasiado lentas y si hay temas que quisieran ver con más detalle en las siguientes. Pueden hacérmelo llegar en el espacio de preguntas o por correo.</w:t>
       </w:r>
     </w:p>
     <w:p>

</xml_diff>

<commit_message>
Escribe el texto completo de la sesion 1 y recalcula los tiempos con el ritmo medido
Cada bloque pasa a tener el hilo y el texto para decir. Los tiempos salen de las palabras escritas a 185 palabras por minuto: unos 64 minutos de habla, 32 de pantalla y pausas, y 24 de margen. Se actualiza el documento de Word.
</commit_message>
<xml_diff>
--- a/docs/capacitacion/guion-sesion-1.docx
+++ b/docs/capacitacion/guion-sesion-1.docx
@@ -33,7 +33,7 @@
     <w:p>
       <w:r>
         <w:rPr/>
-        <w:t>No es un texto para leer. Cada bloque tiene tres partes:</w:t>
+        <w:t>Cada bloque tiene cuatro partes:</w:t>
       </w:r>
     </w:p>
     <w:p>
@@ -51,7 +51,7 @@
       </w:pPr>
       <w:r>
         <w:rPr/>
-        <w:t>Ideas, en orden: lo que hay que tocar, contado con palabras propias.</w:t>
+        <w:t>Ideas, en orden: el hilo del bloque en pocas líneas. Sirve para estudiar y para no perderse; si sabes el hilo, el texto sale solo.</w:t>
       </w:r>
     </w:p>
     <w:p>
@@ -60,7 +60,7 @@
       </w:pPr>
       <w:r>
         <w:rPr/>
-        <w:t>Frases ancla: aparecen resaltadas en amarillo. Son aperturas, definiciones y transiciones, y se dicen casi literales. Lo demás se cuenta hablando.</w:t>
+        <w:t>Texto para decir: el texto completo del bloque. Las frases en recuadro amarillo son las frases ancla: aperturas, definiciones y transiciones, que se dicen casi literales. El resto se puede leer, pero conviene decirlo con palabras propias mirando el hilo.</w:t>
       </w:r>
     </w:p>
     <w:p>
@@ -69,13 +69,19 @@
       </w:pPr>
       <w:r>
         <w:rPr/>
+        <w:t>Indicaciones entre corchetes: en rojo las de pantalla y acciones, en azul las diapositivas. No se dicen en voz alta.</w:t>
+      </w:r>
+    </w:p>
+    <w:p>
+      <w:r>
+        <w:rPr/>
         <w:t>Las muletillas («eh», «este», «bueno», «o sea») y los puntos suspensivos de las frases ancla marcan el tono platicado, con algo de nervio al inicio. Se dicen como salgan; no hay que repetirlos al pie de la letra.</w:t>
       </w:r>
     </w:p>
     <w:p>
       <w:r>
         <w:rPr/>
-        <w:t>Ritmo considerado: 170 palabras por minuto. El tope de cada bloque es lo máximo que cabe en los minutos que se hablan (los minutos de pantalla y demostración no cuentan). Es un máximo y no hace falta llenarlo. Las indicaciones entre corchetes (en rojo las de pantalla y acciones; en azul las diapositivas) no se cuentan.</w:t>
+        <w:t>Ritmo medido: el 22 de octubre se cronometró el bloque 1 (108 palabras en 35 segundos), que da 185 palabras por minuto. Los tiempos de este guion usan ese ritmo con el texto completo de cada bloque.</w:t>
       </w:r>
     </w:p>
     <w:p>
@@ -177,7 +183,7 @@
                 <w:b/>
                 <w:sz w:val="20"/>
               </w:rPr>
-              <w:t>Min hablados</w:t>
+              <w:t>Palabras</w:t>
             </w:r>
           </w:p>
         </w:tc>
@@ -197,7 +203,7 @@
                 <w:b/>
                 <w:sz w:val="20"/>
               </w:rPr>
-              <w:t>Tope (palabras)</w:t>
+              <w:t>Habla (min)</w:t>
             </w:r>
           </w:p>
         </w:tc>
@@ -290,7 +296,7 @@
               <w:rPr>
                 <w:sz w:val="20"/>
               </w:rPr>
-              <w:t>5</w:t>
+              <w:t>659</w:t>
             </w:r>
           </w:p>
         </w:tc>
@@ -308,7 +314,7 @@
               <w:rPr>
                 <w:sz w:val="20"/>
               </w:rPr>
-              <w:t>850</w:t>
+              <w:t>3.6</w:t>
             </w:r>
           </w:p>
         </w:tc>
@@ -363,7 +369,7 @@
               <w:rPr>
                 <w:sz w:val="20"/>
               </w:rPr>
-              <w:t>0:05-0:22</w:t>
+              <w:t>0:05-0:19</w:t>
             </w:r>
           </w:p>
         </w:tc>
@@ -381,7 +387,7 @@
               <w:rPr>
                 <w:sz w:val="20"/>
               </w:rPr>
-              <w:t>17</w:t>
+              <w:t>14</w:t>
             </w:r>
           </w:p>
         </w:tc>
@@ -399,7 +405,7 @@
               <w:rPr>
                 <w:sz w:val="20"/>
               </w:rPr>
-              <w:t>17</w:t>
+              <w:t>2,315</w:t>
             </w:r>
           </w:p>
         </w:tc>
@@ -417,7 +423,7 @@
               <w:rPr>
                 <w:sz w:val="20"/>
               </w:rPr>
-              <w:t>2,890</w:t>
+              <w:t>12.5</w:t>
             </w:r>
           </w:p>
         </w:tc>
@@ -472,7 +478,7 @@
               <w:rPr>
                 <w:sz w:val="20"/>
               </w:rPr>
-              <w:t>0:22-0:31</w:t>
+              <w:t>0:19-0:27</w:t>
             </w:r>
           </w:p>
         </w:tc>
@@ -490,7 +496,7 @@
               <w:rPr>
                 <w:sz w:val="20"/>
               </w:rPr>
-              <w:t>9</w:t>
+              <w:t>8</w:t>
             </w:r>
           </w:p>
         </w:tc>
@@ -508,7 +514,7 @@
               <w:rPr>
                 <w:sz w:val="20"/>
               </w:rPr>
-              <w:t>9</w:t>
+              <w:t>1,149</w:t>
             </w:r>
           </w:p>
         </w:tc>
@@ -526,7 +532,7 @@
               <w:rPr>
                 <w:sz w:val="20"/>
               </w:rPr>
-              <w:t>1,530</w:t>
+              <w:t>6.2</w:t>
             </w:r>
           </w:p>
         </w:tc>
@@ -581,7 +587,7 @@
               <w:rPr>
                 <w:sz w:val="20"/>
               </w:rPr>
-              <w:t>0:31-0:42</w:t>
+              <w:t>0:27-0:36</w:t>
             </w:r>
           </w:p>
         </w:tc>
@@ -599,7 +605,7 @@
               <w:rPr>
                 <w:sz w:val="20"/>
               </w:rPr>
-              <w:t>11</w:t>
+              <w:t>9</w:t>
             </w:r>
           </w:p>
         </w:tc>
@@ -617,7 +623,7 @@
               <w:rPr>
                 <w:sz w:val="20"/>
               </w:rPr>
-              <w:t>10</w:t>
+              <w:t>1,292</w:t>
             </w:r>
           </w:p>
         </w:tc>
@@ -635,7 +641,7 @@
               <w:rPr>
                 <w:sz w:val="20"/>
               </w:rPr>
-              <w:t>1,700</w:t>
+              <w:t>7.0</w:t>
             </w:r>
           </w:p>
         </w:tc>
@@ -653,7 +659,7 @@
               <w:rPr>
                 <w:sz w:val="20"/>
               </w:rPr>
-              <w:t>149</w:t>
+              <w:t>150</w:t>
             </w:r>
           </w:p>
         </w:tc>
@@ -690,7 +696,7 @@
               <w:rPr>
                 <w:sz w:val="20"/>
               </w:rPr>
-              <w:t>0:42-0:53</w:t>
+              <w:t>0:36-0:46</w:t>
             </w:r>
           </w:p>
         </w:tc>
@@ -708,7 +714,7 @@
               <w:rPr>
                 <w:sz w:val="20"/>
               </w:rPr>
-              <w:t>11</w:t>
+              <w:t>10</w:t>
             </w:r>
           </w:p>
         </w:tc>
@@ -726,7 +732,7 @@
               <w:rPr>
                 <w:sz w:val="20"/>
               </w:rPr>
-              <w:t>8</w:t>
+              <w:t>871</w:t>
             </w:r>
           </w:p>
         </w:tc>
@@ -744,7 +750,7 @@
               <w:rPr>
                 <w:sz w:val="20"/>
               </w:rPr>
-              <w:t>1,360</w:t>
+              <w:t>4.7</w:t>
             </w:r>
           </w:p>
         </w:tc>
@@ -799,7 +805,7 @@
               <w:rPr>
                 <w:sz w:val="20"/>
               </w:rPr>
-              <w:t>0:53-0:59</w:t>
+              <w:t>0:46-0:52</w:t>
             </w:r>
           </w:p>
         </w:tc>
@@ -835,7 +841,7 @@
               <w:rPr>
                 <w:sz w:val="20"/>
               </w:rPr>
-              <w:t>4</w:t>
+              <w:t>503</w:t>
             </w:r>
           </w:p>
         </w:tc>
@@ -853,7 +859,7 @@
               <w:rPr>
                 <w:sz w:val="20"/>
               </w:rPr>
-              <w:t>680</w:t>
+              <w:t>2.7</w:t>
             </w:r>
           </w:p>
         </w:tc>
@@ -908,7 +914,7 @@
               <w:rPr>
                 <w:sz w:val="20"/>
               </w:rPr>
-              <w:t>0:59-1:12</w:t>
+              <w:t>0:52-1:01</w:t>
             </w:r>
           </w:p>
         </w:tc>
@@ -926,7 +932,7 @@
               <w:rPr>
                 <w:sz w:val="20"/>
               </w:rPr>
-              <w:t>13</w:t>
+              <w:t>9</w:t>
             </w:r>
           </w:p>
         </w:tc>
@@ -944,7 +950,7 @@
               <w:rPr>
                 <w:sz w:val="20"/>
               </w:rPr>
-              <w:t>8</w:t>
+              <w:t>1,015</w:t>
             </w:r>
           </w:p>
         </w:tc>
@@ -962,7 +968,7 @@
               <w:rPr>
                 <w:sz w:val="20"/>
               </w:rPr>
-              <w:t>1,360</w:t>
+              <w:t>5.5</w:t>
             </w:r>
           </w:p>
         </w:tc>
@@ -980,7 +986,7 @@
               <w:rPr>
                 <w:sz w:val="20"/>
               </w:rPr>
-              <w:t>90</w:t>
+              <w:t>51</w:t>
             </w:r>
           </w:p>
         </w:tc>
@@ -1017,7 +1023,7 @@
               <w:rPr>
                 <w:sz w:val="20"/>
               </w:rPr>
-              <w:t>1:12-1:29</w:t>
+              <w:t>1:01-1:15</w:t>
             </w:r>
           </w:p>
         </w:tc>
@@ -1035,7 +1041,7 @@
               <w:rPr>
                 <w:sz w:val="20"/>
               </w:rPr>
-              <w:t>17</w:t>
+              <w:t>14</w:t>
             </w:r>
           </w:p>
         </w:tc>
@@ -1053,7 +1059,7 @@
               <w:rPr>
                 <w:sz w:val="20"/>
               </w:rPr>
-              <w:t>14</w:t>
+              <w:t>1,681</w:t>
             </w:r>
           </w:p>
         </w:tc>
@@ -1071,7 +1077,7 @@
               <w:rPr>
                 <w:sz w:val="20"/>
               </w:rPr>
-              <w:t>2,380</w:t>
+              <w:t>9.1</w:t>
             </w:r>
           </w:p>
         </w:tc>
@@ -1126,7 +1132,7 @@
               <w:rPr>
                 <w:sz w:val="20"/>
               </w:rPr>
-              <w:t>1:29-1:38</w:t>
+              <w:t>1:15-1:26</w:t>
             </w:r>
           </w:p>
         </w:tc>
@@ -1144,7 +1150,7 @@
               <w:rPr>
                 <w:sz w:val="20"/>
               </w:rPr>
-              <w:t>9</w:t>
+              <w:t>11</w:t>
             </w:r>
           </w:p>
         </w:tc>
@@ -1162,7 +1168,7 @@
               <w:rPr>
                 <w:sz w:val="20"/>
               </w:rPr>
-              <w:t>7</w:t>
+              <w:t>1,156</w:t>
             </w:r>
           </w:p>
         </w:tc>
@@ -1180,7 +1186,7 @@
               <w:rPr>
                 <w:sz w:val="20"/>
               </w:rPr>
-              <w:t>1,190</w:t>
+              <w:t>6.2</w:t>
             </w:r>
           </w:p>
         </w:tc>
@@ -1235,7 +1241,7 @@
               <w:rPr>
                 <w:sz w:val="20"/>
               </w:rPr>
-              <w:t>1:38-1:46</w:t>
+              <w:t>1:26-1:32</w:t>
             </w:r>
           </w:p>
         </w:tc>
@@ -1253,7 +1259,7 @@
               <w:rPr>
                 <w:sz w:val="20"/>
               </w:rPr>
-              <w:t>8</w:t>
+              <w:t>6</w:t>
             </w:r>
           </w:p>
         </w:tc>
@@ -1271,7 +1277,7 @@
               <w:rPr>
                 <w:sz w:val="20"/>
               </w:rPr>
-              <w:t>6</w:t>
+              <w:t>661</w:t>
             </w:r>
           </w:p>
         </w:tc>
@@ -1289,7 +1295,7 @@
               <w:rPr>
                 <w:sz w:val="20"/>
               </w:rPr>
-              <w:t>1,020</w:t>
+              <w:t>3.6</w:t>
             </w:r>
           </w:p>
         </w:tc>
@@ -1307,7 +1313,7 @@
               <w:rPr>
                 <w:sz w:val="20"/>
               </w:rPr>
-              <w:t>88</w:t>
+              <w:t>62</w:t>
             </w:r>
           </w:p>
         </w:tc>
@@ -1344,7 +1350,7 @@
               <w:rPr>
                 <w:sz w:val="20"/>
               </w:rPr>
-              <w:t>1:46-1:51</w:t>
+              <w:t>1:32-1:36</w:t>
             </w:r>
           </w:p>
         </w:tc>
@@ -1362,7 +1368,7 @@
               <w:rPr>
                 <w:sz w:val="20"/>
               </w:rPr>
-              <w:t>5</w:t>
+              <w:t>4</w:t>
             </w:r>
           </w:p>
         </w:tc>
@@ -1380,7 +1386,7 @@
               <w:rPr>
                 <w:sz w:val="20"/>
               </w:rPr>
-              <w:t>5</w:t>
+              <w:t>464</w:t>
             </w:r>
           </w:p>
         </w:tc>
@@ -1398,7 +1404,7 @@
               <w:rPr>
                 <w:sz w:val="20"/>
               </w:rPr>
-              <w:t>850</w:t>
+              <w:t>2.5</w:t>
             </w:r>
           </w:p>
         </w:tc>
@@ -1453,7 +1459,7 @@
               <w:rPr>
                 <w:sz w:val="20"/>
               </w:rPr>
-              <w:t>1:51-2:00</w:t>
+              <w:t>1:36-2:00</w:t>
             </w:r>
           </w:p>
         </w:tc>
@@ -1471,7 +1477,7 @@
               <w:rPr>
                 <w:sz w:val="20"/>
               </w:rPr>
-              <w:t>9</w:t>
+              <w:t>24</w:t>
             </w:r>
           </w:p>
         </w:tc>
@@ -1591,7 +1597,7 @@
                 <w:b/>
                 <w:sz w:val="20"/>
               </w:rPr>
-              <w:t>93</w:t>
+              <w:t>11,766</w:t>
             </w:r>
           </w:p>
         </w:tc>
@@ -1609,7 +1615,7 @@
                 <w:b/>
                 <w:sz w:val="20"/>
               </w:rPr>
-              <w:t>15,810</w:t>
+              <w:t>63.6</w:t>
             </w:r>
           </w:p>
         </w:tc>
@@ -1627,7 +1633,7 @@
                 <w:b/>
                 <w:sz w:val="20"/>
               </w:rPr>
-              <w:t>1,331</w:t>
+              <w:t>1,267</w:t>
             </w:r>
           </w:p>
         </w:tc>
@@ -1641,7 +1647,7 @@
     <w:p>
       <w:r>
         <w:rPr/>
-        <w:t>Las dos horas son seguidas. De los 120 minutos, unos 93 se hablan, unos 18 son pantalla y demostración y 9 quedan de margen. El margen no se llena: sirve para preguntas, para una demostración que se alargue o para terminar a tiempo.</w:t>
+        <w:t>Las dos horas son seguidas. De los 120 minutos, unos 64 son de habla, unos 32 son pantalla, demostración y pausas entre diapositivas, y 24 quedan de margen. El margen no se llena: sirve para preguntas, para una demostración que se alargue o para terminar a tiempo. La columna «Habla» es el texto escrito de cada bloque dicho a 185 palabras por minuto; «Min» es el tiempo del bloque con la pantalla incluida.</w:t>
       </w:r>
     </w:p>
     <w:p>
@@ -1902,6 +1908,15 @@
     </w:p>
     <w:p>
       <w:pPr>
+        <w:pStyle w:val="ListNumber"/>
+      </w:pPr>
+      <w:r>
+        <w:rPr/>
+        <w:t>Tiempos. La primera versión de este guion calculaba los tiempos con topes de palabras y no con el texto escrito, y prometía mucho más tiempo del que el texto cubría. Esta versión suma el texto real de cada bloque. Si en el ensayo un bloque sale más largo o más corto, ajustar la hora en la tabla de tiempos.</w:t>
+      </w:r>
+    </w:p>
+    <w:p>
+      <w:pPr>
         <w:pStyle w:val="Heading1"/>
       </w:pPr>
       <w:r>
@@ -1913,7 +1928,7 @@
         <w:rPr>
           <w:i/>
         </w:rPr>
-        <w:t>0:00-0:05 · 5 min · tope 850 palabras</w:t>
+        <w:t>0:00-0:05 · 5 min · 659 palabras, unos 3.6 min de habla</w:t>
       </w:r>
     </w:p>
     <w:p>
@@ -1926,6 +1941,76 @@
       <w:r>
         <w:rPr/>
         <w:t xml:space="preserve"> son cuatro sesiones, hoy vemos el problema y el sitio, y pueden preguntar cuando quieran.</w:t>
+      </w:r>
+    </w:p>
+    <w:p>
+      <w:r>
+        <w:rPr>
+          <w:b/>
+        </w:rPr>
+        <w:t>Ideas, en orden:</w:t>
+      </w:r>
+    </w:p>
+    <w:p>
+      <w:pPr>
+        <w:pStyle w:val="ListBullet"/>
+      </w:pPr>
+      <w:r>
+        <w:rPr/>
+        <w:t>Saludo y presentación: nombre y qué hace.</w:t>
+      </w:r>
+    </w:p>
+    <w:p>
+      <w:pPr>
+        <w:pStyle w:val="ListBullet"/>
+      </w:pPr>
+      <w:r>
+        <w:rPr/>
+        <w:t>Qué es este curso y cómo se va a contar: un solo proyecto, desde adentro.</w:t>
+      </w:r>
+    </w:p>
+    <w:p>
+      <w:pPr>
+        <w:pStyle w:val="ListBullet"/>
+      </w:pPr>
+      <w:r>
+        <w:rPr/>
+        <w:t>La sesión queda grabada.</w:t>
+      </w:r>
+    </w:p>
+    <w:p>
+      <w:pPr>
+        <w:pStyle w:val="ListBullet"/>
+      </w:pPr>
+      <w:r>
+        <w:rPr/>
+        <w:t>Cómo preguntar: en cualquier momento; lo muy técnico se deja para el final.</w:t>
+      </w:r>
+    </w:p>
+    <w:p>
+      <w:pPr>
+        <w:pStyle w:val="ListBullet"/>
+      </w:pPr>
+      <w:r>
+        <w:rPr/>
+        <w:t>Las cuatro sesiones y sus enfoques.</w:t>
+      </w:r>
+    </w:p>
+    <w:p>
+      <w:pPr>
+        <w:pStyle w:val="ListBullet"/>
+      </w:pPr>
+      <w:r>
+        <w:rPr/>
+        <w:t>La agenda de hoy y el tono: dos horas seguidas, cada término técnico se explica.</w:t>
+      </w:r>
+    </w:p>
+    <w:p>
+      <w:r>
+        <w:rPr>
+          <w:b/>
+        </w:rPr>
+        <w:t>Texto para decir:</w:t>
       </w:r>
     </w:p>
     <w:p>
@@ -1938,59 +2023,6 @@
           <w:color w:val="1F4E79"/>
         </w:rPr>
         <w:t>[Diapositiva · Image Bio Pro]</w:t>
-      </w:r>
-    </w:p>
-    <w:p>
-      <w:r>
-        <w:rPr>
-          <w:b/>
-        </w:rPr>
-        <w:t>Ideas, en orden:</w:t>
-      </w:r>
-    </w:p>
-    <w:p>
-      <w:pPr>
-        <w:pStyle w:val="ListBullet"/>
-      </w:pPr>
-      <w:r>
-        <w:rPr/>
-        <w:t>Saludo y presentación: nombre y qué hace.</w:t>
-      </w:r>
-    </w:p>
-    <w:p>
-      <w:pPr>
-        <w:pStyle w:val="ListBullet"/>
-      </w:pPr>
-      <w:r>
-        <w:rPr/>
-        <w:t>La sesión queda grabada.</w:t>
-      </w:r>
-    </w:p>
-    <w:p>
-      <w:pPr>
-        <w:pStyle w:val="ListBullet"/>
-      </w:pPr>
-      <w:r>
-        <w:rPr/>
-        <w:t>Cómo preguntar: en cualquier momento; lo muy técnico se deja para el final.</w:t>
-      </w:r>
-    </w:p>
-    <w:p>
-      <w:pPr>
-        <w:pStyle w:val="ListBullet"/>
-      </w:pPr>
-      <w:r>
-        <w:rPr/>
-        <w:t>El mapa de las cuatro sesiones.</w:t>
-      </w:r>
-    </w:p>
-    <w:p>
-      <w:pPr>
-        <w:pStyle w:val="ListBullet"/>
-      </w:pPr>
-      <w:r>
-        <w:rPr/>
-        <w:t>La agenda de hoy: el problema, la imagen digital, el sitio y un análisis en vivo.</w:t>
       </w:r>
     </w:p>
     <w:p>
@@ -2008,6 +2040,18 @@
       </w:r>
     </w:p>
     <w:p>
+      <w:r>
+        <w:rPr/>
+        <w:t>Les agradezco que estén aquí, sobre todo un viernes por la tarde. Antes de entrar en materia, les cuento rápido de qué se trata esto. Es la primera de cuatro sesiones del curso BIOIMAGE 2026, y todo el curso gira alrededor de un solo proyecto: un sitio web que cuenta y mide espermatozoides en fotografías de microscopio, usando inteligencia artificial.</w:t>
+      </w:r>
+    </w:p>
+    <w:p>
+      <w:r>
+        <w:rPr/>
+        <w:t>Yo fui quien desarrolló ese sitio, así que lo que les voy a contar no sale de un libro. Es lo que fui viendo mientras lo construía, con lo que funcionó y con lo que costó trabajo. Por eso van a escucharme explicar tanto el sitio como las decisiones que hay detrás.</w:t>
+      </w:r>
+    </w:p>
+    <w:p>
       <w:pPr>
         <w:pBdr>
           <w:left w:val="single" w:sz="24" w:space="8" w:color="BF9000"/>
@@ -2022,6 +2066,12 @@
       </w:r>
     </w:p>
     <w:p>
+      <w:r>
+        <w:rPr/>
+        <w:t>Lo digo desde ahora para que nadie se sorprenda después. La grabación se comparte más adelante y se puede editar si hace falta. Y sobre las preguntas: esto es una charla, no un examen. Yo no les voy a hacer preguntas a ustedes. Quien quiera preguntar, lo hace en el momento que le surja la duda, por el chat o con la voz, como prefiera. Voy a tratar de responder breve y concreto. Si la pregunta es muy técnica, les voy a decir que la vemos al final de la sesión, o en la sesión que corresponda, para no perder el hilo de lo que estamos viendo.</w:t>
+      </w:r>
+    </w:p>
+    <w:p>
       <w:pPr>
         <w:spacing w:before="200"/>
       </w:pPr>
@@ -2048,6 +2098,18 @@
       </w:r>
     </w:p>
     <w:p>
+      <w:r>
+        <w:rPr/>
+        <w:t>Cada sesión es de dos horas, por Zoom, y cada una se enfoca en una parte distinta de cómo se hace un sistema como este. Hoy, viernes, vemos la parte de adelante: lo que ve y usa una persona cuando entra al sitio. En programación a eso se le llama frontend. Mañana, sábado por la mañana, vemos cómo aprende la computadora, y ahí entran las redes neuronales convolucionales, que son las que saben mirar imágenes.</w:t>
+      </w:r>
+    </w:p>
+    <w:p>
+      <w:r>
+        <w:rPr/>
+        <w:t>El lunes vemos la parte de atrás, lo que pasa dentro del sistema cuando alguien sube una imagen. A eso se le llama backend. Y el martes cerramos con los datos, con cómo se vuelve a entrenar el modelo cuando llegan imágenes nuevas, y con cloud computing, que quiere decir usar una computadora en internet, en lugar de la nuestra, para que el sitio esté disponible para todos. Ese día les voy a enseñar cómo subimos este sitio a un servidor de verdad.</w:t>
+      </w:r>
+    </w:p>
+    <w:p>
       <w:pPr>
         <w:spacing w:before="200"/>
       </w:pPr>
@@ -2074,6 +2136,18 @@
       </w:r>
     </w:p>
     <w:p>
+      <w:r>
+        <w:rPr/>
+        <w:t>Les detallo un poco más. Primero voy a plantear el problema que vamos a resolver, y por qué conviene hacerlo con una página web en lugar de un programa suelto. Después vamos a ver qué es una imagen digital para una computadora, porque de ahí sale todo lo que se mide. Luego pasamos al sitio funcionando, en el navegador: cómo se crea una cuenta, cómo se sube una imagen, cómo se leen los resultados y cómo se descargan. Y casi al final vemos qué pasa cuando la imagen no es de espermatozoides, porque ahí se entiende bien hasta dónde llega el modelo.</w:t>
+      </w:r>
+    </w:p>
+    <w:p>
+      <w:r>
+        <w:rPr/>
+        <w:t>Son dos horas seguidas, así que si alguien necesita pararse un momento, lo puede hacer con toda confianza, que la grabación queda. Y una última cosa sobre el tono: este curso es para una comunidad universitaria con perfiles distintos, algunos con más programación, otros con más biología. Por eso cada término técnico lo voy a explicar en una frase la primera vez que aparezca. Si se me pasa alguno, pregúntenme sin pena.</w:t>
+      </w:r>
+    </w:p>
+    <w:p>
       <w:pPr>
         <w:pStyle w:val="Heading1"/>
       </w:pPr>
@@ -2086,7 +2160,7 @@
         <w:rPr>
           <w:i/>
         </w:rPr>
-        <w:t>0:05-0:22 · 17 min · tope 2,890 palabras</w:t>
+        <w:t>0:05-0:19 · 14 min · 2,315 palabras, unos 12.5 min de habla</w:t>
       </w:r>
     </w:p>
     <w:p>
@@ -2099,6 +2173,94 @@
       <w:r>
         <w:rPr/>
         <w:t xml:space="preserve"> vamos a aprender cómo se usa la inteligencia artificial resolviendo un problema concreto, contar y medir espermatozoides en fotografías, y la clave es repartir el trabajo entre la red y el código.</w:t>
+      </w:r>
+    </w:p>
+    <w:p>
+      <w:r>
+        <w:rPr>
+          <w:b/>
+        </w:rPr>
+        <w:t>Ideas, en orden:</w:t>
+      </w:r>
+    </w:p>
+    <w:p>
+      <w:pPr>
+        <w:pStyle w:val="ListBullet"/>
+      </w:pPr>
+      <w:r>
+        <w:rPr/>
+        <w:t>Para qué sirve la inteligencia artificial en la educación y la investigación; una aplicación es analizar imágenes.</w:t>
+      </w:r>
+    </w:p>
+    <w:p>
+      <w:pPr>
+        <w:pStyle w:val="ListBullet"/>
+      </w:pPr>
+      <w:r>
+        <w:rPr/>
+        <w:t>La microscopía como fuente de imágenes y el objetivo del curso.</w:t>
+      </w:r>
+    </w:p>
+    <w:p>
+      <w:pPr>
+        <w:pStyle w:val="ListBullet"/>
+      </w:pPr>
+      <w:r>
+        <w:rPr/>
+        <w:t>Aprender con un caso de estudio; no hace falta venir de la programación ni de la biología.</w:t>
+      </w:r>
+    </w:p>
+    <w:p>
+      <w:pPr>
+        <w:pStyle w:val="ListBullet"/>
+      </w:pPr>
+      <w:r>
+        <w:rPr/>
+        <w:t>La foto de ejemplo y el problema de contar y medir a mano.</w:t>
+      </w:r>
+    </w:p>
+    <w:p>
+      <w:pPr>
+        <w:pStyle w:val="ListBullet"/>
+      </w:pPr>
+      <w:r>
+        <w:rPr/>
+        <w:t>Dos tipos de foto, con un modelo para cada una.</w:t>
+      </w:r>
+    </w:p>
+    <w:p>
+      <w:pPr>
+        <w:pStyle w:val="ListBullet"/>
+      </w:pPr>
+      <w:r>
+        <w:rPr/>
+        <w:t>La red localiza y el código mide; por qué se reparte así.</w:t>
+      </w:r>
+    </w:p>
+    <w:p>
+      <w:pPr>
+        <w:pStyle w:val="ListBullet"/>
+      </w:pPr>
+      <w:r>
+        <w:rPr/>
+        <w:t>Tres principios: no suponer, separar, reproducir.</w:t>
+      </w:r>
+    </w:p>
+    <w:p>
+      <w:pPr>
+        <w:pStyle w:val="ListBullet"/>
+      </w:pPr>
+      <w:r>
+        <w:rPr/>
+        <w:t>Funciona y se puede mejorar; los retos se cuentan al final.</w:t>
+      </w:r>
+    </w:p>
+    <w:p>
+      <w:r>
+        <w:rPr>
+          <w:b/>
+        </w:rPr>
+        <w:t>Texto para decir:</w:t>
       </w:r>
     </w:p>
     <w:p>
@@ -2115,55 +2277,44 @@
     </w:p>
     <w:p>
       <w:r>
-        <w:rPr>
-          <w:b/>
-        </w:rPr>
-        <w:t>Ideas, en orden:</w:t>
-      </w:r>
-    </w:p>
-    <w:p>
-      <w:pPr>
-        <w:pStyle w:val="ListBullet"/>
-      </w:pPr>
-      <w:r>
-        <w:rPr/>
-        <w:t>Abrir con una pregunta: ¿para qué sirve la inteligencia artificial en la educación y en la investigación? Una de sus aplicaciones es analizar imágenes.</w:t>
-      </w:r>
-    </w:p>
-    <w:p>
-      <w:pPr>
-        <w:pStyle w:val="ListBullet"/>
-      </w:pPr>
-      <w:r>
-        <w:rPr/>
-        <w:t>Las imágenes vienen de muchas fuentes. Una es la microscopía: permite ver células, por ejemplo los espermatozoides, y ver cómo cambian de tamaño y de forma bajo ciertas condiciones.</w:t>
-      </w:r>
-    </w:p>
-    <w:p>
-      <w:pPr>
-        <w:pStyle w:val="ListBullet"/>
-      </w:pPr>
-      <w:r>
-        <w:rPr/>
-        <w:t>El objetivo de esta capacitación: acercar a la comunidad universitaria, de distintas áreas, a lo que es la inteligencia artificial y a cómo se aplica a un problema técnico-científico real, en este caso de biología de la reproducción.</w:t>
-      </w:r>
-    </w:p>
-    <w:p>
-      <w:pPr>
-        <w:pStyle w:val="ListBullet"/>
-      </w:pPr>
-      <w:r>
-        <w:rPr/>
-        <w:t>Cómo lo hacemos: con un caso de estudio. Aprendemos a través de un ejemplo.</w:t>
-      </w:r>
-    </w:p>
-    <w:p>
-      <w:pPr>
-        <w:pStyle w:val="ListBullet"/>
-      </w:pPr>
-      <w:r>
-        <w:rPr/>
-        <w:t>Aclarar que no hace falta venir de la programación ni de la biología: cada término técnico se explica la primera vez que aparece.</w:t>
+        <w:rPr/>
+        <w:t>Empiezo con una pregunta, y no hace falta que la contesten en voz alta: ¿para qué sirve la inteligencia artificial en la educación y en la investigación? Hay muchas respuestas, y una de ellas, que es la que nos interesa hoy, es analizar imágenes. Una persona mira una foto y reconoce lo que hay en ella. Un programa que aprendió de muchos ejemplos puede hacer algo parecido, y puede hacerlo muchas veces seguidas sin cansarse.</w:t>
+      </w:r>
+    </w:p>
+    <w:p>
+      <w:r>
+        <w:rPr/>
+        <w:t>Vale la pena detenernos un momento en qué quiere decir aprender de ejemplos, porque es la idea que sostiene todo el curso. Tradicionalmente, cuando uno quiere que una computadora haga algo, le escribe reglas: si pasa esto, haz aquello. Eso funciona muy bien para una calculadora o para una hoja de cálculo, donde las reglas son exactas. Pero para reconocer un espermatozoide en una foto, escribir las reglas es casi imposible. ¿Cómo describirían ustedes, con reglas exactas, la forma de una cabeza, con todas sus variaciones de tamaño, de orientación y de brillo? Cada vez que escribieran una regla, aparecería una foto que la rompe.</w:t>
+      </w:r>
+    </w:p>
+    <w:p>
+      <w:r>
+        <w:rPr/>
+        <w:t>En lugar de escribir las reglas, se le muestran a la computadora muchos ejemplos ya resueltos. Es decir, fotos donde una persona marcó a mano dónde están los espermatozoides. El programa ajusta por sí mismo lo que necesita para reproducir esas marcas. A eso se le llama aprender de ejemplos, y a lo que resulta de ese proceso se le llama modelo. Cómo sucede ese ajuste lo vemos mañana con calma; hoy solo necesitamos quedarnos con la idea de que el modelo no recibió reglas, recibió ejemplos.</w:t>
+      </w:r>
+    </w:p>
+    <w:p>
+      <w:r>
+        <w:rPr/>
+        <w:t>Las imágenes vienen de muchas fuentes, y una de las más importantes en las ciencias de la vida es la microscopía. Con un microscopio podemos ver células, por ejemplo espermatozoides, y podemos ver cómo cambian de tamaño y de forma bajo ciertas condiciones. Cuando se estudia eso, cada foto trae información, pero alguien tiene que sacarla: contar, medir, comparar.</w:t>
+      </w:r>
+    </w:p>
+    <w:p>
+      <w:r>
+        <w:rPr/>
+        <w:t>Para quienes no han trabajado con fluorescencia, una explicación breve. En esta técnica las células se tiñen con un colorante que, al recibir cierta luz, la devuelve en otro color. Por eso en la foto la célula brilla y el fondo queda oscuro: lo único que vemos es lo que está teñido. Esto tiene una consecuencia útil para lo que vamos a hacer, y es que hay mucho contraste entre la célula y el fondo. Más adelante, cuando veamos cómo se ve una imagen para una computadora, esto va a tener mucho sentido.</w:t>
+      </w:r>
+    </w:p>
+    <w:p>
+      <w:r>
+        <w:rPr/>
+        <w:t>También conviene decir qué tipo de preguntas se contestan con estas fotos. Quien estudia espermatozoides puede querer saber cuántos hay en una muestra, qué tan grandes son, si ese tamaño cambia cuando cambia una condición, y qué tanto varían unos de otros. Todas esas preguntas se contestan midiendo, y medir a mano, uno por uno, es justo lo que vamos a ver que se vuelve un problema.</w:t>
+      </w:r>
+    </w:p>
+    <w:p>
+      <w:r>
+        <w:rPr/>
+        <w:t>El objetivo de esta capacitación es acercar a la comunidad universitaria, de distintas áreas, a lo que es la inteligencia artificial y a cómo se aplica a un problema técnico y científico real. En este caso, un problema de biología de la reproducción. No estamos hablando de teoría en el aire: vamos a seguir un problema concreto de principio a fin.</w:t>
       </w:r>
     </w:p>
     <w:p>
@@ -2195,6 +2346,12 @@
       </w:r>
     </w:p>
     <w:p>
+      <w:r>
+        <w:rPr/>
+        <w:t>Quiero que quede claro que no hace falta venir de la programación ni de la biología. Si saben programar, van a ver cómo se arma el sistema. Si vienen de biología, van a ver cómo se mide lo que ustedes ya conocen. Y si vienen de otra área, van a ver cómo se aplica la inteligencia artificial a un problema que se puede entender. Aprendemos a través de un ejemplo, y el ejemplo es este.</w:t>
+      </w:r>
+    </w:p>
+    <w:p>
       <w:pPr>
         <w:spacing w:before="200"/>
       </w:pPr>
@@ -2207,21 +2364,15 @@
       </w:r>
     </w:p>
     <w:p>
-      <w:pPr>
-        <w:pStyle w:val="ListBullet"/>
-      </w:pPr>
-      <w:r>
-        <w:rPr/>
-        <w:t>Presentar la foto de ejemplo: células brillantes sobre un fondo oscuro. Cada punto brillante es una cabeza de espermatozoide con su cola.</w:t>
-      </w:r>
-    </w:p>
-    <w:p>
-      <w:pPr>
-        <w:pStyle w:val="ListBullet"/>
-      </w:pPr>
-      <w:r>
-        <w:rPr/>
-        <w:t>Preguntar sin esperar respuesta: ¿cuántas hay aquí? Es lo primero que haría cualquier persona: contar.</w:t>
+      <w:r>
+        <w:rPr/>
+        <w:t>Les muestro cómo se ve el problema. Esta es una foto de fluorescencia, que es una técnica de microscopía donde las células se tiñen y brillan. Lo que ven son manchas de colores brillantes sobre un fondo oscuro. Cada mancha es la cabeza de un espermatozoide, y a veces se alcanza a ver una línea que sale de ella, que es la cola.</w:t>
+      </w:r>
+    </w:p>
+    <w:p>
+      <w:r>
+        <w:rPr/>
+        <w:t>Ahora pregunto, sin esperar respuesta: ¿cuántos hay en esta foto? Lo primero que haría cualquiera es contarlos con la vista, uno por uno. Y luego, si además hay que medir cada uno, ya no basta con mirar.</w:t>
       </w:r>
     </w:p>
     <w:p>
@@ -2237,39 +2388,27 @@
       </w:r>
     </w:p>
     <w:p>
-      <w:pPr>
-        <w:pStyle w:val="ListBullet"/>
-      </w:pPr>
-      <w:r>
-        <w:rPr/>
-        <w:t>El problema: contar y medir a mano es lento, repetitivo y cambia según quién lo haga. Una foto tiene decenas o cientos de células, muchas encimadas o pegadas. Si hay que comparar muchas imágenes, el trabajo manual se vuelve difícil de sostener.</w:t>
-      </w:r>
-    </w:p>
-    <w:p>
-      <w:pPr>
-        <w:pStyle w:val="ListBullet"/>
-      </w:pPr>
-      <w:r>
-        <w:rPr/>
-        <w:t>Decir qué se ve en una foto de fluorescencia: las células salen brillantes sobre fondo oscuro.</w:t>
-      </w:r>
-    </w:p>
-    <w:p>
-      <w:pPr>
-        <w:pStyle w:val="ListBullet"/>
-      </w:pPr>
-      <w:r>
-        <w:rPr/>
-        <w:t>Cuando las células están pegadas, dos personas pueden decidir distinto cuántas hay. No es falta de cuidado: el ojo no tiene una regla fija.</w:t>
-      </w:r>
-    </w:p>
-    <w:p>
-      <w:pPr>
-        <w:pStyle w:val="ListBullet"/>
-      </w:pPr>
-      <w:r>
-        <w:rPr/>
-        <w:t>El sitio atiende dos tipos de foto: fluorescencia y fondo claro. Hay un modelo para cada una, y más adelante se ve cómo el sitio elige.</w:t>
+      <w:r>
+        <w:rPr/>
+        <w:t>El problema es este: contar y medir a mano es lento, es repetitivo y cambia según quién lo haga. Una sola foto puede traer decenas o cientos de células. Muchas están encimadas o pegadas unas a otras, y ahí es donde cada persona decide distinto dónde termina una y empieza la otra. No es falta de cuidado. Es que el ojo no tiene una regla fija.</w:t>
+      </w:r>
+    </w:p>
+    <w:p>
+      <w:r>
+        <w:rPr/>
+        <w:t>En la diapositiva puse tres conteos distintos de la misma foto, de tres personas distintas. Son números de ejemplo, no de una medición real, pero la idea es esa: tres personas cuidadosas pueden llegar a tres resultados distintos. Y si además hay que comparar muchas imágenes, el trabajo manual se vuelve muy difícil de sostener.</w:t>
+      </w:r>
+    </w:p>
+    <w:p>
+      <w:r>
+        <w:rPr/>
+        <w:t>Además de contar, muchas veces lo que importa para la investigación es el tamaño: cuánto mide cada célula, cuánto varía de una a otra y cómo cambia ese tamaño entre una condición y otra. Medir cada célula a mano exige trazar su contorno con cuidado y leer el resultado, una y otra vez. Multipliquen eso por cientos de células en una foto y por muchas fotos. Un sistema que haga ese trabajo siempre de la misma manera deja de ser un lujo y se vuelve algo que de verdad hace falta.</w:t>
+      </w:r>
+    </w:p>
+    <w:p>
+      <w:r>
+        <w:rPr/>
+        <w:t>Hay otra consecuencia que a veces se pasa por alto: el cansancio. Una persona que lleva una hora contando no mide igual que cuando empezó. Un programa no se cansa, y esa regularidad, para comparar fotos entre sí, vale mucho.</w:t>
       </w:r>
     </w:p>
     <w:p>
@@ -2287,6 +2426,12 @@
       </w:r>
     </w:p>
     <w:p>
+      <w:r>
+        <w:rPr/>
+        <w:t>Una cosa más sobre las fotos. En este proyecto trabajamos con dos tipos. Las de fluorescencia, que ya les mostré, con las células brillando sobre un fondo oscuro. Y las de fondo claro, que se ven distinto porque el fondo ya no es oscuro. Para cada tipo tenemos un modelo distinto, y más adelante vamos a ver cómo el sitio elige el que corresponde.</w:t>
+      </w:r>
+    </w:p>
+    <w:p>
       <w:pPr>
         <w:pBdr>
           <w:left w:val="single" w:sz="24" w:space="8" w:color="BF9000"/>
@@ -2313,39 +2458,21 @@
       </w:r>
     </w:p>
     <w:p>
-      <w:pPr>
-        <w:pStyle w:val="ListBullet"/>
-      </w:pPr>
-      <w:r>
-        <w:rPr/>
-        <w:t>La idea central es repartir el trabajo. Una red neuronal, que es un programa que aprende de ejemplos, hace una sola cosa: decidir dónde hay un espermatozoide y trazar su contorno.</w:t>
-      </w:r>
-    </w:p>
-    <w:p>
-      <w:pPr>
-        <w:pStyle w:val="ListBullet"/>
-      </w:pPr>
-      <w:r>
-        <w:rPr/>
-        <w:t>Todo lo demás lo hace código convencional: cuántos son, cuánto mide cada uno, la media y la desviación estándar. Son procedimientos explícitos y estandarizados que cualquiera puede verificar.</w:t>
-      </w:r>
-    </w:p>
-    <w:p>
-      <w:pPr>
-        <w:pStyle w:val="ListBullet"/>
-      </w:pPr>
-      <w:r>
-        <w:rPr/>
-        <w:t>En la práctica: se abre la imagen marcada, se mira el contorno que trazó la red y se recalcula la medida. La red propone y la medición se puede auditar.</w:t>
-      </w:r>
-    </w:p>
-    <w:p>
-      <w:pPr>
-        <w:pStyle w:val="ListBullet"/>
-      </w:pPr>
-      <w:r>
-        <w:rPr/>
-        <w:t>Por qué importa repartirlo así: si la red hiciera todo, cada número saldría de una caja cerrada. Con el reparto, el único paso que no se puede explicar paso a paso es dónde está el contorno, y ese se ve a simple vista.</w:t>
+      <w:r>
+        <w:rPr/>
+        <w:t>Aquí está la idea central del proyecto, la que más quiero que se lleven hoy: repartir el trabajo. Una red neuronal, que es un programa que aprende de ejemplos, hace una sola cosa. Decide dónde hay un espermatozoide y traza su contorno. Nada más.</w:t>
+      </w:r>
+    </w:p>
+    <w:p>
+      <w:r>
+        <w:rPr/>
+        <w:t>Todo lo demás lo hace código convencional, el que se escribe paso a paso. Cuántos hay, cuánto mide cada uno, cuál es la media y cuál es la desviación estándar. Son procedimientos explícitos y estandarizados, que cualquiera puede revisar y repetir.</w:t>
+      </w:r>
+    </w:p>
+    <w:p>
+      <w:r>
+        <w:rPr/>
+        <w:t>Piénsenlo como un asistente que señala y una calculadora que mide. El asistente puede equivocarse al señalar, pero lo que señaló se puede ver. La calculadora siempre hace la misma cuenta con lo que le dan.</w:t>
       </w:r>
     </w:p>
     <w:p>
@@ -2363,6 +2490,24 @@
       </w:r>
     </w:p>
     <w:p>
+      <w:r>
+        <w:rPr/>
+        <w:t>¿Por qué conviene repartirlo así? Porque si la red hiciera todo, cada número saldría de una caja cerrada y no habría cómo comprobarlo. Con el reparto, lo único que no se puede explicar paso a paso es dónde está el contorno, y eso se ve a simple vista. En la práctica, uno abre la imagen marcada, mira el contorno que trazó la red y recalcula la medida. La red propone, y la medición se puede auditar.</w:t>
+      </w:r>
+    </w:p>
+    <w:p>
+      <w:r>
+        <w:rPr/>
+        <w:t>Les doy un ejemplo de qué quiere decir que sea verificable. Supongamos que el sitio dice que una célula tiene cierta área. Ustedes abren la imagen marcada, ven el contorno que se trazó alrededor de esa célula y se preguntan: ¿ese contorno está bien? Si está bien, el área que se calculó dentro de él es simplemente un conteo de píxeles, una operación que cualquiera puede repetir con una regla de tres. Si no está bien, el problema está en el contorno, que es lo único que decidió la red, y eso se ve a simple vista en la imagen.</w:t>
+      </w:r>
+    </w:p>
+    <w:p>
+      <w:r>
+        <w:rPr/>
+        <w:t>Dividir el trabajo así tiene una ventaja que me parece muy valiosa para la ciencia: acota dónde puede estar un error y lo hace visible. Si el programa completo fuera una caja negra que recibe una foto y devuelve una cifra, un error podría estar en cualquier parte y nadie lo vería. Con el reparto, el único punto que no se explica paso a paso es la ubicación del contorno, y ese punto se puede comprobar con los ojos.</w:t>
+      </w:r>
+    </w:p>
+    <w:p>
       <w:pPr>
         <w:spacing w:before="200"/>
       </w:pPr>
@@ -2375,30 +2520,9 @@
       </w:r>
     </w:p>
     <w:p>
-      <w:pPr>
-        <w:pStyle w:val="ListBullet"/>
-      </w:pPr>
-      <w:r>
-        <w:rPr/>
-        <w:t>Hay tres principios que explican lo que vamos a ver. El primero es no suponer: cuando falta un dato, como la escala o lo que marca cada tinción, el sitio no lo inventa y lo indica en pantalla. Por eso cada resultado muestra la escala que se usó. Prefiere un aviso claro a un número que parezca más seguro de lo que es.</w:t>
-      </w:r>
-    </w:p>
-    <w:p>
-      <w:pPr>
-        <w:pStyle w:val="ListBullet"/>
-      </w:pPr>
-      <w:r>
-        <w:rPr/>
-        <w:t>El segundo es separar lo que decide la red de lo que se mide. La red localiza y el código mide, así que cualquier medida se verifica sin abrir la red.</w:t>
-      </w:r>
-    </w:p>
-    <w:p>
-      <w:pPr>
-        <w:pStyle w:val="ListBullet"/>
-      </w:pPr>
-      <w:r>
-        <w:rPr/>
-        <w:t>El tercero es la reproducibilidad. El entrenamiento está en un cuaderno de Colab, que es un entorno para programar en la nube, y cualquiera puede abrirlo y ejecutarlo. Además, el modelo guarda dentro de su archivo la configuración con la que se entrenó. Si hay que repetir un resultado o reconstruir el entorno, no depende de la memoria de nadie.</w:t>
+      <w:r>
+        <w:rPr/>
+        <w:t>Hay tres principios que explican lo que vamos a ver en estas sesiones, y se los dejo desde ahora para que los vayan reconociendo.</w:t>
       </w:r>
     </w:p>
     <w:p>
@@ -2416,6 +2540,18 @@
       </w:r>
     </w:p>
     <w:p>
+      <w:r>
+        <w:rPr/>
+        <w:t>El primero es no suponer. Cuando falta un dato, como la escala de la imagen o lo que marca cada tinción, el sitio no lo inventa: lo indica en pantalla. Por eso cada resultado muestra la escala que se usó. Prefiere un aviso claro a un número que parezca más seguro de lo que es.</w:t>
+      </w:r>
+    </w:p>
+    <w:p>
+      <w:r>
+        <w:rPr/>
+        <w:t>Les pongo un ejemplo concreto de este principio. Las imágenes del microscopio no traen escrito cuánto mide cada píxel. El sitio podría simplemente suponer un valor y no decir nada. En lugar de eso, usa una escala que declara abiertamente, la repite en cada resultado y la imprime en el informe. Quien lee un número sabe con qué escala se calculó. Es más incómodo decirlo que callarlo, pero es más honesto, y en ciencia eso pesa.</w:t>
+      </w:r>
+    </w:p>
+    <w:p>
       <w:pPr>
         <w:pBdr>
           <w:left w:val="single" w:sz="24" w:space="8" w:color="BF9000"/>
@@ -2430,6 +2566,30 @@
       </w:r>
     </w:p>
     <w:p>
+      <w:r>
+        <w:rPr/>
+        <w:t>El segundo es separar lo que decide la red de lo que se mide. Eso ya lo vimos: la red localiza y el código mide, así que cualquier medida se verifica sin abrir la red.</w:t>
+      </w:r>
+    </w:p>
+    <w:p>
+      <w:r>
+        <w:rPr/>
+        <w:t>El tercero es la reproducibilidad. El entrenamiento está en un cuaderno de Colab, que es un entorno para programar en la nube, y cualquiera puede abrirlo y ejecutarlo. Además, el modelo guarda dentro de su propio archivo la configuración con la que se entrenó. Si hay que repetir un resultado o reconstruir el entorno, no depende de la memoria de nadie.</w:t>
+      </w:r>
+    </w:p>
+    <w:p>
+      <w:r>
+        <w:rPr/>
+        <w:t>Esto importa en ciencia más de lo que parece. Un resultado que no se puede repetir es muy difícil de defender, y lo mismo pasa con un modelo del que nadie recuerda cómo se hizo. Por eso el entrenamiento no es una caja negra que solo yo sé operar: está en un cuaderno abierto, con los pasos escritos en orden, y el modelo carga dentro de sí la configuración con la que se entrenó. Si dentro de un año alguien quiere repetirlo, o mejorarlo, tiene de dónde partir. El martes vamos a abrir ese cuaderno y a verlo por dentro.</w:t>
+      </w:r>
+    </w:p>
+    <w:p>
+      <w:r>
+        <w:rPr/>
+        <w:t>Los tres principios se pueden resumir en una sola actitud: decir siempre qué se sabe, qué se supone y cómo se obtuvo cada número. Si en algún momento de estas sesiones algo les parece raro, vuelvan a estos tres principios, porque casi siempre explican por qué el sitio se comporta como lo hace.</w:t>
+      </w:r>
+    </w:p>
+    <w:p>
       <w:pPr>
         <w:spacing w:before="200"/>
       </w:pPr>
@@ -2442,30 +2602,33 @@
       </w:r>
     </w:p>
     <w:p>
-      <w:pPr>
-        <w:pStyle w:val="ListBullet"/>
-      </w:pPr>
-      <w:r>
-        <w:rPr/>
-        <w:t>Un modelo así no aprende solo cuando ya está en línea. Si llegan imágenes nuevas, otras tinciones u otro tipo de célula, se reentrena aparte y se cambia el archivo del modelo. Eso lo vemos el martes.</w:t>
-      </w:r>
-    </w:p>
-    <w:p>
-      <w:pPr>
-        <w:pStyle w:val="ListBullet"/>
-      </w:pPr>
-      <w:r>
-        <w:rPr/>
-        <w:t>Estado del modelo, en general: funciona, está dando buenos resultados y, como cualquier modelo, se puede mejorar. Sin entrar en detalle.</w:t>
-      </w:r>
-    </w:p>
-    <w:p>
-      <w:pPr>
-        <w:pStyle w:val="ListBullet"/>
-      </w:pPr>
-      <w:r>
-        <w:rPr/>
-        <w:t>Anticipar los retos: más adelante les cuento qué dificultades tuvo el proyecto y cómo las resolvimos, por ejemplo cuando las células se empalman. Contarlas como cosas que se resolvieron, con una estrategia computacional para contarlas mejor.</w:t>
+      <w:r>
+        <w:rPr/>
+        <w:t>Sobre el estado del modelo, lo digo en general y sin entrar en detalle: funciona, está dando buenos resultados y, como cualquier modelo, se puede mejorar. Tiene pruebas hechas, y mejora con más imágenes.</w:t>
+      </w:r>
+    </w:p>
+    <w:p>
+      <w:r>
+        <w:rPr/>
+        <w:t>Algo importante: un modelo así no aprende solo mientras está en línea. Si llegan imágenes nuevas, otras tinciones u otro tipo de célula, se vuelve a entrenar aparte y se cambia el archivo del modelo. Eso lo vemos el martes, con detalle.</w:t>
+      </w:r>
+    </w:p>
+    <w:p>
+      <w:r>
+        <w:rPr/>
+        <w:t>También quiero adelantarles que el proyecto tuvo retos, y que los voy a contar como lo que fueron: dificultades que se resolvieron. Les doy un ejemplo. Cuando muchas células se empalman en un mismo punto, contarlas es muy difícil, y se creó una estrategia computacional para contarlas mejor.</w:t>
+      </w:r>
+    </w:p>
+    <w:p>
+      <w:r>
+        <w:rPr/>
+        <w:t>Sobre las limitaciones, prefiero ser directo desde ahora, para que no haya sorpresas después. Es un modelo que se entrenó con un conjunto limitado de imágenes. En imágenes que se parecen a las de su entrenamiento, funciona bien. En imágenes muy distintas puede equivocarse, y por eso el sitio tiene avisos y por eso cada resultado se puede revisar. Esa franqueza es parte de cómo se usa bien una herramienta así. Lo que hace el sitio es dar números y mostrar cómo se obtuvieron. La interpretación científica de esos números le corresponde al grupo, y el sitio no la sustituye.</w:t>
+      </w:r>
+    </w:p>
+    <w:p>
+      <w:r>
+        <w:rPr/>
+        <w:t>Si me permiten una comparación, es como un instrumento de laboratorio. Una balanza no decide si el resultado de un experimento es bueno o malo, solo da el peso. Este sistema cuenta y mide, y lo hace de forma consistente y revisable. Qué significan esas cuentas y esas medidas es una pregunta de ustedes, que son quienes conocen la biología detrás.</w:t>
       </w:r>
     </w:p>
     <w:p>
@@ -2495,7 +2658,7 @@
         <w:rPr>
           <w:i/>
         </w:rPr>
-        <w:t>0:22-0:31 · 9 min · tope 1,530 palabras</w:t>
+        <w:t>0:19-0:27 · 8 min · 1,149 palabras, unos 6.2 min de habla</w:t>
       </w:r>
     </w:p>
     <w:p>
@@ -2508,6 +2671,76 @@
       <w:r>
         <w:rPr/>
         <w:t xml:space="preserve"> el modelo entrenado, solo, no hace nada. La plataforma web es lo que permite que cualquier persona de la universidad lo use, con una cuenta propia y sin programar.</w:t>
+      </w:r>
+    </w:p>
+    <w:p>
+      <w:r>
+        <w:rPr>
+          <w:b/>
+        </w:rPr>
+        <w:t>Ideas, en orden:</w:t>
+      </w:r>
+    </w:p>
+    <w:p>
+      <w:pPr>
+        <w:pStyle w:val="ListBullet"/>
+      </w:pPr>
+      <w:r>
+        <w:rPr/>
+        <w:t>La pregunta del ensayo: si ya existe la red, ¿por qué una página web y no correrla desde Colab?</w:t>
+      </w:r>
+    </w:p>
+    <w:p>
+      <w:pPr>
+        <w:pStyle w:val="ListBullet"/>
+      </w:pPr>
+      <w:r>
+        <w:rPr/>
+        <w:t>Qué es Colab y qué produce el entrenamiento: un archivo .pt que, solo, no hace nada.</w:t>
+      </w:r>
+    </w:p>
+    <w:p>
+      <w:pPr>
+        <w:pStyle w:val="ListBullet"/>
+      </w:pPr>
+      <w:r>
+        <w:rPr/>
+        <w:t>La plataforma le pone una interfaz; el acceso es con cuenta personal y privada.</w:t>
+      </w:r>
+    </w:p>
+    <w:p>
+      <w:pPr>
+        <w:pStyle w:val="ListBullet"/>
+      </w:pPr>
+      <w:r>
+        <w:rPr/>
+        <w:t>Palabras que van a salir: red neuronal, Colab, Python, Flask, modelo, servidor.</w:t>
+      </w:r>
+    </w:p>
+    <w:p>
+      <w:pPr>
+        <w:pStyle w:val="ListBullet"/>
+      </w:pPr>
+      <w:r>
+        <w:rPr/>
+        <w:t>Dos etapas: entrenamiento en Colab e inferencia en el servidor.</w:t>
+      </w:r>
+    </w:p>
+    <w:p>
+      <w:pPr>
+        <w:pStyle w:val="ListBullet"/>
+      </w:pPr>
+      <w:r>
+        <w:rPr/>
+        <w:t>El sitio como entorno educativo con seis secciones.</w:t>
+      </w:r>
+    </w:p>
+    <w:p>
+      <w:r>
+        <w:rPr>
+          <w:b/>
+        </w:rPr>
+        <w:t>Texto para decir:</w:t>
       </w:r>
     </w:p>
     <w:p>
@@ -2524,66 +2757,14 @@
     </w:p>
     <w:p>
       <w:r>
-        <w:rPr>
-          <w:b/>
-        </w:rPr>
-        <w:t>Ideas, en orden:</w:t>
-      </w:r>
-    </w:p>
-    <w:p>
-      <w:pPr>
-        <w:pStyle w:val="ListBullet"/>
-      </w:pPr>
-      <w:r>
-        <w:rPr/>
-        <w:t>Plantear la pregunta que se hizo en el ensayo: si ya existe la red, ¿por qué una página web y no correrla desde Google Colab?</w:t>
-      </w:r>
-    </w:p>
-    <w:p>
-      <w:pPr>
-        <w:pStyle w:val="ListBullet"/>
-      </w:pPr>
-      <w:r>
-        <w:rPr/>
-        <w:t xml:space="preserve">Colab es un cuaderno en la nube, un entorno donde se escribe código y se entrena el modelo. Entrenar produce un archivo (con extensión </w:t>
-      </w:r>
-      <w:r>
-        <w:rPr>
-          <w:rFonts w:ascii="Consolas" w:hAnsi="Consolas"/>
-          <w:sz w:val="21"/>
-        </w:rPr>
-        <w:t>.pt</w:t>
-      </w:r>
-      <w:r>
-        <w:rPr/>
-        <w:t>) que guarda lo que la red aprendió. Ese archivo, por sí solo, no hace nada.</w:t>
-      </w:r>
-    </w:p>
-    <w:p>
-      <w:pPr>
-        <w:pStyle w:val="ListBullet"/>
-      </w:pPr>
-      <w:r>
-        <w:rPr/>
-        <w:t>La plataforma lo carga y le pone una interfaz: botones para subir fotos y pantallas para ver resultados. Así cualquiera puede usarlo, sin instalar nada ni saber programar.</w:t>
-      </w:r>
-    </w:p>
-    <w:p>
-      <w:pPr>
-        <w:pStyle w:val="ListBullet"/>
-      </w:pPr>
-      <w:r>
-        <w:rPr/>
-        <w:t>El acceso al análisis es con una cuenta personal y privada.</w:t>
-      </w:r>
-    </w:p>
-    <w:p>
-      <w:pPr>
-        <w:pStyle w:val="ListBullet"/>
-      </w:pPr>
-      <w:r>
-        <w:rPr/>
-        <w:t>Imaginar el caso contrario: para usar el modelo desde Colab habría que abrir un cuaderno, entender el código y ejecutarlo celda por celda. Para quien investiga con células, eso es una barrera que no tiene por qué existir.</w:t>
+        <w:rPr/>
+        <w:t>Ahora, una pregunta que salió cuando ensayamos esta presentación y que me parece muy buena: si ya tenemos la red neuronal que encuentra los espermatozoides, ¿para qué hacer además una página web? ¿No bastaría con correr la red directamente desde Google Colab?</w:t>
+      </w:r>
+    </w:p>
+    <w:p>
+      <w:r>
+        <w:rPr/>
+        <w:t>Les explico qué es Colab, porque lo voy a mencionar varias veces. Google Colab es un cuaderno en la nube, un entorno donde se escribe código y se ejecuta sin instalar nada en la computadora. Ahí es donde se entrena el modelo. Y cuando termina el entrenamiento, lo que sale es un archivo, con extensión punto pt, que guarda lo que la red aprendió.</w:t>
       </w:r>
     </w:p>
     <w:p>
@@ -2601,6 +2782,30 @@
       </w:r>
     </w:p>
     <w:p>
+      <w:r>
+        <w:rPr/>
+        <w:t>Eso es lo que quiero que se lleven de este bloque. Ese archivo, por sí solo, es como un libro cerrado: tiene todo adentro, pero nadie lo puede leer. Necesitamos un sistema que lo abra, lo cargue y lo use. Eso es lo que hace la plataforma. Le pone una interfaz: botones para subir fotos y pantallas para ver los resultados.</w:t>
+      </w:r>
+    </w:p>
+    <w:p>
+      <w:r>
+        <w:rPr/>
+        <w:t>Imaginen el caso contrario. Para usar el modelo desde Colab, cada persona tendría que abrir un cuaderno, entender el código y ejecutarlo celda por celda. Para alguien que investiga con células, eso es una barrera que no tiene por qué existir. Con la plataforma, cualquiera entra desde un navegador, sin instalar nada y sin saber programar. Y el acceso al análisis es con una cuenta personal y privada, algo que vamos a ver cuando lleguemos al sitio.</w:t>
+      </w:r>
+    </w:p>
+    <w:p>
+      <w:r>
+        <w:rPr/>
+        <w:t>Hay otra razón práctica para preferir una página web a un programa que cada quien instale. Un programa instalado hay que mantenerlo al día en cada computadora: cada persona con su versión, cada una con sus dependencias, y cuando el modelo mejora hay que repartir el archivo nuevo a todos. En una plataforma web, el modelo vive en un solo lugar, que es el servidor. Cuando mejora, se cambia ahí, y desde ese momento todas las personas que entran usan la versión nueva sin hacer nada. Además, todas usan exactamente el mismo modelo, y eso es lo que permite comparar resultados entre personas.</w:t>
+      </w:r>
+    </w:p>
+    <w:p>
+      <w:r>
+        <w:rPr/>
+        <w:t>Para entender cómo funciona una página web, una idea sencilla basta por ahora. Hay dos lados. De su lado está el navegador, que es el programa que usan para ver páginas. Del otro lado está el servidor, una computadora que está siempre encendida, conectada a internet, esperando peticiones. Cuando ustedes hacen clic en un botón, el navegador le manda una petición al servidor, el servidor hace el trabajo que corresponda y devuelve una respuesta, que el navegador dibuja en la pantalla. Así funciona desde la página de un periódico hasta este sitio. La diferencia es que, aquí, el trabajo del servidor incluye correr un modelo de inteligencia artificial sobre una imagen. El lunes vemos con detalle qué hace el servidor, y el martes vemos cómo se pone ese servidor en internet.</w:t>
+      </w:r>
+    </w:p>
+    <w:p>
       <w:pPr>
         <w:spacing w:before="200"/>
       </w:pPr>
@@ -2613,21 +2818,15 @@
       </w:r>
     </w:p>
     <w:p>
-      <w:pPr>
-        <w:pStyle w:val="ListBullet"/>
-      </w:pPr>
-      <w:r>
-        <w:rPr/>
-        <w:t>Explicar en una frase los términos que van a salir: red neuronal (un programa que aprende de ejemplos), Google Colab (un entorno para programar en la nube), Python (un lenguaje de programación), Flask (una herramienta para hacer sitios web con Python), modelo (el archivo que guarda lo que la red aprendió) y servidor (la computadora donde el sitio está en línea).</w:t>
-      </w:r>
-    </w:p>
-    <w:p>
-      <w:pPr>
-        <w:pStyle w:val="ListBullet"/>
-      </w:pPr>
-      <w:r>
-        <w:rPr/>
-        <w:t>No leer la diapositiva completa: señalar las que aparecen en esta sesión. Entrenamiento e inferencia se definen en la siguiente diapositiva.</w:t>
+      <w:r>
+        <w:rPr/>
+        <w:t>Antes de seguir, les dejo en pantalla unas palabras que van a escuchar durante las cuatro sesiones. No las voy a leer todas, solo las que salen hoy.</w:t>
+      </w:r>
+    </w:p>
+    <w:p>
+      <w:r>
+        <w:rPr/>
+        <w:t xml:space="preserve">Una red neuronal es un programa que aprende de ejemplos. Google Colab, como ya dije, es un entorno para programar en la nube. </w:t>
       </w:r>
     </w:p>
     <w:p>
@@ -2645,6 +2844,18 @@
       </w:r>
     </w:p>
     <w:p>
+      <w:r>
+        <w:rPr/>
+        <w:t>El modelo es el archivo que guarda lo que la red aprendió. Y el servidor es la computadora donde el sitio está en línea, la que responde cuando alguien entra.</w:t>
+      </w:r>
+    </w:p>
+    <w:p>
+      <w:r>
+        <w:rPr/>
+        <w:t>También aparecen dos palabras que explico en la siguiente diapositiva, entrenamiento e inferencia, porque son las que más confunden y las que más importa distinguir.</w:t>
+      </w:r>
+    </w:p>
+    <w:p>
       <w:pPr>
         <w:spacing w:before="200"/>
       </w:pPr>
@@ -2657,30 +2868,9 @@
       </w:r>
     </w:p>
     <w:p>
-      <w:pPr>
-        <w:pStyle w:val="ListBullet"/>
-      </w:pPr>
-      <w:r>
-        <w:rPr/>
-        <w:t>Definir las dos etapas del desarrollo de la red: el entrenamiento, que se hace en Colab, y la inferencia, que se hace en el servidor. Inferencia es usar el modelo ya entrenado para analizar fotos nuevas; se hace en el procesador del servidor.</w:t>
-      </w:r>
-    </w:p>
-    <w:p>
-      <w:pPr>
-        <w:pStyle w:val="ListBullet"/>
-      </w:pPr>
-      <w:r>
-        <w:rPr/>
-        <w:t>Dos partes con cuidados distintos: la parte web, que se mantiene como cualquier sitio, y la parte de aprendizaje automático, que se mejora con datos.</w:t>
-      </w:r>
-    </w:p>
-    <w:p>
-      <w:pPr>
-        <w:pStyle w:val="ListBullet"/>
-      </w:pPr>
-      <w:r>
-        <w:rPr/>
-        <w:t>Una consecuencia práctica: para mejorar el modelo no se toca el sitio. Se entrena aparte y se cambia el archivo del modelo.</w:t>
+      <w:r>
+        <w:rPr/>
+        <w:t>El desarrollo de la red neuronal ocurre en dos etapas, y están separadas a propósito.</w:t>
       </w:r>
     </w:p>
     <w:p>
@@ -2698,6 +2888,30 @@
       </w:r>
     </w:p>
     <w:p>
+      <w:r>
+        <w:rPr/>
+        <w:t>La primera etapa es el entrenamiento. Se hace en Colab, con imágenes que las personas ya marcaron a mano, y de ahí sale el archivo del modelo. La segunda etapa es la inferencia, que es usar el modelo ya entrenado para analizar fotos nuevas. Eso se hace en el servidor, en el procesador de la computadora donde está el sitio.</w:t>
+      </w:r>
+    </w:p>
+    <w:p>
+      <w:r>
+        <w:rPr/>
+        <w:t>Esto tiene una consecuencia práctica que vale la pena entender. Para mejorar el modelo no se toca el sitio. Se entrena aparte, se obtiene un archivo nuevo y se cambia ese archivo en el servidor. Son dos partes con cuidados distintos: la parte web se mantiene como cualquier sitio, y la parte de aprendizaje automático se mejora con datos.</w:t>
+      </w:r>
+    </w:p>
+    <w:p>
+      <w:r>
+        <w:rPr/>
+        <w:t>Una comparación que ayuda: el entrenamiento es como aprender una receta, y la inferencia es como cocinarla las veces que haga falta. Aprender la receta lleva tiempo y esfuerzo, con muchos intentos y correcciones, y se hace una vez, o cada vez que se quiere mejorar. Cocinar con la receta ya aprendida es mucho más rápido y se repite todos los días. Con el sitio pasa igual: entrenar el modelo es lo pesado, y por eso se hace aparte, en Colab, donde hay más capacidad de cálculo. Usarlo para analizar una foto es lo ligero, y por eso puede hacerse en el procesador del servidor del sitio.</w:t>
+      </w:r>
+    </w:p>
+    <w:p>
+      <w:r>
+        <w:rPr/>
+        <w:t>Esta separación tiene una ventaja más. El sitio no necesita saber cómo se entrenó el modelo, solo necesita el archivo. Si mañana se entrena una versión mejor, se reemplaza el archivo y el sitio sigue funcionando igual.</w:t>
+      </w:r>
+    </w:p>
+    <w:p>
       <w:pPr>
         <w:spacing w:before="200"/>
       </w:pPr>
@@ -2710,21 +2924,9 @@
       </w:r>
     </w:p>
     <w:p>
-      <w:pPr>
-        <w:pStyle w:val="ListBullet"/>
-      </w:pPr>
-      <w:r>
-        <w:rPr/>
-        <w:t>Presentar el sitio en general como un entorno educativo con seis secciones: Inicio, Nosotros, Aliados, Infografías y videos, Inteligencia Artificial y Contacto. Más adelante se recorre cada una.</w:t>
-      </w:r>
-    </w:p>
-    <w:p>
-      <w:pPr>
-        <w:pStyle w:val="ListBullet"/>
-      </w:pPr>
-      <w:r>
-        <w:rPr/>
-        <w:t>Además de la red neuronal, el sitio presenta a los colaboradores y temas de biología de la reproducción. Es un sitio informativo con una sección que analiza imágenes.</w:t>
+      <w:r>
+        <w:rPr/>
+        <w:t>Para terminar este bloque, una mirada general al sitio. Lo pensamos como un entorno educativo, con la herramienta de análisis como una de sus partes. Además de la red neuronal, el sitio presenta a las personas que colaboran y temas de biología de la reproducción. Es un sitio informativo que tiene una sección donde se analizan imágenes.</w:t>
       </w:r>
     </w:p>
     <w:p>
@@ -2742,6 +2944,18 @@
       </w:r>
     </w:p>
     <w:p>
+      <w:r>
+        <w:rPr/>
+        <w:t>Las seis secciones son: Inicio, Nosotros, Aliados, Infografías y videos, Inteligencia Artificial y Contacto. En la diapositiva las ven con una frase corta cada una. La que nos importa para el análisis es Inteligencia Artificial, y es la que necesita cuenta. Las demás se pueden recorrer sin iniciar sesión. Más adelante entramos al sitio y las vemos funcionando.</w:t>
+      </w:r>
+    </w:p>
+    <w:p>
+      <w:r>
+        <w:rPr/>
+        <w:t>Las seis secciones están pensadas para que el sitio sirva también a quien llega sin ninguna intención de analizar una imagen: puede leer una infografía, ver un video o conocer a quienes colaboran. La sección de análisis es el corazón técnico, pero el sitio quiere ser también un lugar donde se aprende.</w:t>
+      </w:r>
+    </w:p>
+    <w:p>
       <w:pPr>
         <w:pStyle w:val="Heading1"/>
       </w:pPr>
@@ -2754,7 +2968,7 @@
         <w:rPr>
           <w:i/>
         </w:rPr>
-        <w:t>0:31-0:42 · 11 min (10 hablados) · tope 1,700 palabras</w:t>
+        <w:t>0:27-0:36 · 9 min · 1,292 palabras, unos 7.0 min de habla</w:t>
       </w:r>
     </w:p>
     <w:p>
@@ -2767,6 +2981,67 @@
       <w:r>
         <w:rPr/>
         <w:t xml:space="preserve"> para la computadora una fotografía es una tabla de números, y eso explica todo lo que vamos a medir.</w:t>
+      </w:r>
+    </w:p>
+    <w:p>
+      <w:r>
+        <w:rPr>
+          <w:b/>
+        </w:rPr>
+        <w:t>Ideas, en orden:</w:t>
+      </w:r>
+    </w:p>
+    <w:p>
+      <w:pPr>
+        <w:pStyle w:val="ListBullet"/>
+      </w:pPr>
+      <w:r>
+        <w:rPr/>
+        <w:t>¿Qué es una fotografía para una computadora? Una cuadrícula de píxeles, cada uno con un número.</w:t>
+      </w:r>
+    </w:p>
+    <w:p>
+      <w:pPr>
+        <w:pStyle w:val="ListBullet"/>
+      </w:pPr>
+      <w:r>
+        <w:rPr/>
+        <w:t>Brillo de 0 a 255 en gris; en color, tres números. Una foto grande tiene millones de píxeles.</w:t>
+      </w:r>
+    </w:p>
+    <w:p>
+      <w:pPr>
+        <w:pStyle w:val="ListBullet"/>
+      </w:pPr>
+      <w:r>
+        <w:rPr/>
+        <w:t>Una célula brillante es una zona de números altos; medir el área es contar píxeles.</w:t>
+      </w:r>
+    </w:p>
+    <w:p>
+      <w:pPr>
+        <w:pStyle w:val="ListBullet"/>
+      </w:pPr>
+      <w:r>
+        <w:rPr/>
+        <w:t>Formatos: BMP, PNG y TIFF conservan la imagen; JPG la comprime y mueve los bordes.</w:t>
+      </w:r>
+    </w:p>
+    <w:p>
+      <w:pPr>
+        <w:pStyle w:val="ListBullet"/>
+      </w:pPr>
+      <w:r>
+        <w:rPr/>
+        <w:t>La imagen no sabe cuánto mide un píxel; el sitio usa la misma escala, 60 píxeles por micra.</w:t>
+      </w:r>
+    </w:p>
+    <w:p>
+      <w:r>
+        <w:rPr>
+          <w:b/>
+        </w:rPr>
+        <w:t>Texto para decir:</w:t>
       </w:r>
     </w:p>
     <w:p>
@@ -2783,46 +3058,8 @@
     </w:p>
     <w:p>
       <w:r>
-        <w:rPr>
-          <w:b/>
-        </w:rPr>
-        <w:t>Ideas, en orden:</w:t>
-      </w:r>
-    </w:p>
-    <w:p>
-      <w:pPr>
-        <w:pStyle w:val="ListBullet"/>
-      </w:pPr>
-      <w:r>
-        <w:rPr/>
-        <w:t>Pregunta: ¿qué es una fotografía para una computadora?</w:t>
-      </w:r>
-    </w:p>
-    <w:p>
-      <w:pPr>
-        <w:pStyle w:val="ListBullet"/>
-      </w:pPr>
-      <w:r>
-        <w:rPr/>
-        <w:t>Una cuadrícula de cuadritos. Cada cuadrito es un píxel y guarda un número. En una imagen en tonos de gris, el número es el brillo, de 0 (negro) a 255 (blanco). En color son tres números, uno por rojo, verde y azul.</w:t>
-      </w:r>
-    </w:p>
-    <w:p>
-      <w:pPr>
-        <w:pStyle w:val="ListBullet"/>
-      </w:pPr>
-      <w:r>
-        <w:rPr/>
-        <w:t>Mostrar una zona de la foto muy ampliada hasta que se vean los cuadritos. En la diapositiva, una zona pequeña con números bajos casi en todos lados y altos en el centro.</w:t>
-      </w:r>
-    </w:p>
-    <w:p>
-      <w:pPr>
-        <w:pStyle w:val="ListBullet"/>
-      </w:pPr>
-      <w:r>
-        <w:rPr/>
-        <w:t>Una foto grande puede tener 1,792 por 1,374 píxeles: casi dos millones y medio de cuadritos, cada uno con su número.</w:t>
+        <w:rPr/>
+        <w:t>Vamos con algo que parece muy básico y de lo que depende todo lo demás. La pregunta es: ¿qué es una fotografía para una computadora?</w:t>
       </w:r>
     </w:p>
     <w:p>
@@ -2840,6 +3077,18 @@
       </w:r>
     </w:p>
     <w:p>
+      <w:r>
+        <w:rPr/>
+        <w:t>Una fotografía digital es una cuadrícula de cuadritos. Cada cuadrito es un píxel, y cada píxel guarda un número. En una imagen en tonos de gris, ese número es el brillo, y va de cero, que es negro, a doscientos cincuenta y cinco, que es blanco. Los números intermedios son los grises. En una imagen a color no es un número sino tres, uno para el rojo, otro para el verde y otro para el azul, y con la mezcla de los tres sale el color de ese cuadrito.</w:t>
+      </w:r>
+    </w:p>
+    <w:p>
+      <w:r>
+        <w:rPr/>
+        <w:t>En la diapositiva tengo a la izquierda una foto pequeña con un cuadro azul marcado, y a la derecha lo que hay dentro de ese cuadro, ampliado hasta que se ven los números. Son treinta y cinco cuadritos, siete por cinco. Fíjense en la parte de afuera: números bajos, casi negros. Y en el centro, números altos, hasta un doscientos cincuenta y cinco. Eso es lo que la computadora tiene delante cuando mira una foto.</w:t>
+      </w:r>
+    </w:p>
+    <w:p>
       <w:pPr>
         <w:pBdr>
           <w:left w:val="single" w:sz="24" w:space="8" w:color="BF9000"/>
@@ -2850,7 +3099,25 @@
       </w:pPr>
       <w:r>
         <w:rPr/>
-        <w:t>Una foto grande tiene, por ejemplo, mil setecientos noventa y dos píxeles de ancho por mil trescientos setenta y cuatro de alto. Son más de dos millones de números.</w:t>
+        <w:t>Una foto grande tiene, por ejemplo, mil setecientos noventa y dos píxeles de ancho por mil trescientos setenta y cuatro de alto. Son casi dos millones y medio de números.</w:t>
+      </w:r>
+    </w:p>
+    <w:p>
+      <w:r>
+        <w:rPr/>
+        <w:t>Hagan la cuenta: casi dos millones y medio de cuadritos, cada uno con su número. La computadora los maneja todos a la vez sin problema, pero a un ojo humano eso no le dice nada. Lo que vemos como células, la computadora lo ve como un mar de números.</w:t>
+      </w:r>
+    </w:p>
+    <w:p>
+      <w:r>
+        <w:rPr/>
+        <w:t>Un detalle sobre esos números del cero al doscientos cincuenta y cinco: tienen una razón. Cada píxel guarda su valor en un byte, que son ocho bits, y con ocho bits se pueden representar doscientos cincuenta y seis valores distintos. Por eso el rango empieza en cero y termina en doscientos cincuenta y cinco. Con esos doscientos cincuenta y seis niveles el ojo ve un degradado suave de negro a blanco, sin escalones. En una imagen a color son tres bytes por píxel, uno por cada color.</w:t>
+      </w:r>
+    </w:p>
+    <w:p>
+      <w:r>
+        <w:rPr/>
+        <w:t>Y una idea más, la de resolución. Cuantos más píxeles tiene una foto, más detalle puede guardar, porque cada cuadrito representa una zona más pequeña de lo que se fotografió. Una foto con pocos píxeles se ve pixelada cuando se amplía, justamente porque los cuadritos ya no alcanzan a describir la forma. Por eso a las fotos del microscopio les conviene tener muchos píxeles: para que la forma de cada célula quede descrita con detalle.</w:t>
       </w:r>
     </w:p>
     <w:p>
@@ -2866,30 +3133,9 @@
       </w:r>
     </w:p>
     <w:p>
-      <w:pPr>
-        <w:pStyle w:val="ListBullet"/>
-      </w:pPr>
-      <w:r>
-        <w:rPr/>
-        <w:t>En una foto de fluorescencia, una célula es una zona de números altos sobre un fondo de números bajos. La computadora no ve una célula; ve números.</w:t>
-      </w:r>
-    </w:p>
-    <w:p>
-      <w:pPr>
-        <w:pStyle w:val="ListBullet"/>
-      </w:pPr>
-      <w:r>
-        <w:rPr/>
-        <w:t>Medir el área de una célula es contar cuántos píxeles ocupa. En el ejemplo de la diapositiva, la célula ocupa doce cuadritos: su área es de doce píxeles.</w:t>
-      </w:r>
-    </w:p>
-    <w:p>
-      <w:pPr>
-        <w:pStyle w:val="ListBullet"/>
-      </w:pPr>
-      <w:r>
-        <w:rPr/>
-        <w:t>Con la escala del sitio, esos píxeles se convierten en micras. Eso se ve en un momento.</w:t>
+      <w:r>
+        <w:rPr/>
+        <w:t>Ahora pensemos en una foto de fluorescencia. ¿Cómo se ve una célula dentro de esa tabla de números? Como una zona de números altos sobre un fondo de números bajos. La célula brilla, así que sus píxeles tienen valores grandes, y el fondo oscuro tiene valores pequeños.</w:t>
       </w:r>
     </w:p>
     <w:p>
@@ -2907,6 +3153,18 @@
       </w:r>
     </w:p>
     <w:p>
+      <w:r>
+        <w:rPr/>
+        <w:t>Esto cambia la forma de plantear el problema.</w:t>
+      </w:r>
+    </w:p>
+    <w:p>
+      <w:r>
+        <w:rPr/>
+        <w:t>Y esto también nos dice cómo se mide el tamaño. En la diapositiva les muestro una célula pequeñita dibujada con números. Los doce cuadritos más brillantes, los que tienen el borde marcado, son la célula.</w:t>
+      </w:r>
+    </w:p>
+    <w:p>
       <w:pPr>
         <w:pBdr>
           <w:left w:val="single" w:sz="24" w:space="8" w:color="BF9000"/>
@@ -2921,6 +3179,18 @@
       </w:r>
     </w:p>
     <w:p>
+      <w:r>
+        <w:rPr/>
+        <w:t>Medir el área de una célula es contar cuántos píxeles ocupa. En una foto real serán cientos de píxeles por célula, pero la idea es exactamente la misma. Más adelante, con la escala del sitio, esos píxeles se convierten en micras.</w:t>
+      </w:r>
+    </w:p>
+    <w:p>
+      <w:r>
+        <w:rPr/>
+        <w:t>Una pregunta que seguramente se están haciendo: ¿y no bastaría con decir que todo píxel por encima de cierto valor es célula? Es una idea natural y es, de hecho, el primer intento que se suele hacer. Se llama umbralización: se elige un umbral y todo lo que lo supera se considera objeto. Funciona razonablemente cuando las células están separadas y bien iluminadas, pero falla cuando se tocan, cuando hay manchas brillantes que no son células, o cuando el brillo cambia de una foto a otra. Mañana vemos por qué no basta y cómo una red neuronal retoma esa idea y suma otros factores. Hoy les dejo solo la intuición de que la computadora, en el fondo, está comparando números.</w:t>
+      </w:r>
+    </w:p>
+    <w:p>
       <w:pPr>
         <w:spacing w:before="200"/>
       </w:pPr>
@@ -2933,30 +3203,9 @@
       </w:r>
     </w:p>
     <w:p>
-      <w:pPr>
-        <w:pStyle w:val="ListBullet"/>
-      </w:pPr>
-      <w:r>
-        <w:rPr/>
-        <w:t>Formatos: BMP, PNG y TIFF conservan la imagen tal cual. JPG la comprime y puede alterar los bordes de las células, y con ellos los contornos y las medidas.</w:t>
-      </w:r>
-    </w:p>
-    <w:p>
-      <w:pPr>
-        <w:pStyle w:val="ListBullet"/>
-      </w:pPr>
-      <w:r>
-        <w:rPr/>
-        <w:t>Recomendación: trabajar con los archivos originales del microscopio y evitar que pasen por aplicaciones de mensajería, que los comprimen.</w:t>
-      </w:r>
-    </w:p>
-    <w:p>
-      <w:pPr>
-        <w:pStyle w:val="ListBullet"/>
-      </w:pPr>
-      <w:r>
-        <w:rPr/>
-        <w:t>Por qué importa: si el borde se difumina, el contorno cambia, y si el contorno cambia, cambia el área. El sitio acepta JPG, pero avisa.</w:t>
+      <w:r>
+        <w:rPr/>
+        <w:t>Un tema práctico: los formatos de archivo. No todos guardan la imagen igual.</w:t>
       </w:r>
     </w:p>
     <w:p>
@@ -2974,6 +3223,24 @@
       </w:r>
     </w:p>
     <w:p>
+      <w:r>
+        <w:rPr/>
+        <w:t>JPG, en cambio, comprime la imagen para que pese menos. En la diapositiva tengo la misma célula dos veces: a la izquierda con el borde nítido y a la derecha con el borde difuminado y con bloques raros, que es lo que pasa con la compresión.</w:t>
+      </w:r>
+    </w:p>
+    <w:p>
+      <w:r>
+        <w:rPr/>
+        <w:t>¿Por qué importa? Porque si el borde se difumina, el contorno cambia, y si el contorno cambia, cambia el área, y entonces cambian los números que nos interesan. El sitio acepta JPG, pero lo avisa. La recomendación es trabajar con los archivos originales del microscopio y evitar que pasen por aplicaciones de mensajería, que suelen comprimirlos sin que nos demos cuenta.</w:t>
+      </w:r>
+    </w:p>
+    <w:p>
+      <w:r>
+        <w:rPr/>
+        <w:t>Un dato que ayuda a entender la diferencia: una foto de las que usamos, guardada como BMP, pesa alrededor de siete megabytes, porque guarda todos sus píxeles sin comprimir. El mismo contenido en JPG puede pesar una fracción de eso, y ahí está el atractivo del JPG: ocupa menos. Pero ese ahorro de espacio se paga con fidelidad, y para medir, la fidelidad es justo lo que necesitamos.</w:t>
+      </w:r>
+    </w:p>
+    <w:p>
       <w:pPr>
         <w:spacing w:before="200"/>
       </w:pPr>
@@ -2986,21 +3253,15 @@
       </w:r>
     </w:p>
     <w:p>
-      <w:pPr>
-        <w:pStyle w:val="ListBullet"/>
-      </w:pPr>
-      <w:r>
-        <w:rPr/>
-        <w:t>Una foto sabe cuántos píxeles mide, pero no cuántas micras es cada uno. Los archivos no guardan esa información.</w:t>
-      </w:r>
-    </w:p>
-    <w:p>
-      <w:pPr>
-        <w:pStyle w:val="ListBullet"/>
-      </w:pPr>
-      <w:r>
-        <w:rPr/>
-        <w:t>Las imágenes vienen de distintos aumentos, por ejemplo 40X y 100X. Por eso el sitio usa la misma escala en todas las imágenes, 60 píxeles por micra, para estandarizar su tamaño y poder compararlas entre sí. Cada resultado dice qué escala se usó. No entrar en más detalle; el método se ve en la sesión 3.</w:t>
+      <w:r>
+        <w:rPr/>
+        <w:t>La última idea de este bloque es la escala. Una foto sabe cuántos píxeles mide, pero no sabe cuántas micras es cada píxel, es decir, cuánto mide en la realidad. Los archivos no guardan esa información.</w:t>
+      </w:r>
+    </w:p>
+    <w:p>
+      <w:r>
+        <w:rPr/>
+        <w:t>Además, las imágenes pueden venir de distintos aumentos, por ejemplo de cuarenta X y de cien X, y cada aumento cambia lo que representa un píxel. Si queremos comparar fotos entre sí, necesitamos una forma de ponerlas en la misma medida.</w:t>
       </w:r>
     </w:p>
     <w:p>
@@ -3018,6 +3279,24 @@
       </w:r>
     </w:p>
     <w:p>
+      <w:r>
+        <w:rPr/>
+        <w:t>Por eso el sitio usa la misma escala en todas las imágenes: sesenta píxeles por micra. Es una forma de estandarizar su tamaño y poder compararlas entre sí. Cada resultado dice qué escala se usó, y la imagen marcada trae una regla de trescientos píxeles que equivalen a cinco micras. No voy a entrar hoy en cómo se define esa escala; eso lo vemos el lunes, cuando hablemos de cómo funciona el sistema por dentro.</w:t>
+      </w:r>
+    </w:p>
+    <w:p>
+      <w:r>
+        <w:rPr/>
+        <w:t>Les doy dos conversiones concretas, para que la escala no se quede en abstracto. Si sesenta píxeles son una micra, entonces un largo de sesenta píxeles es una micra de largo, y un largo de trescientos píxeles son cinco micras, que es justo la regla que va dibujada en la imagen. Con las áreas hay un paso más. Un área se mide en unidades cuadradas, así que una micra cuadrada son sesenta por sesenta píxeles, es decir, tres mil seiscientos píxeles. Si una célula ocupa tres mil seiscientos píxeles, su área es de una micra cuadrada; si ocupa la mitad, de media micra cuadrada. Por eso, en el sitio, las áreas en micras cuadradas pueden salir como números pequeños.</w:t>
+      </w:r>
+    </w:p>
+    <w:p>
+      <w:r>
+        <w:rPr/>
+        <w:t>Y para ubicarnos en la unidad: una micra es la milésima parte de un milímetro. Es la medida natural para hablar de células, porque a esa escala los milímetros resultan demasiado grandes.</w:t>
+      </w:r>
+    </w:p>
+    <w:p>
       <w:pPr>
         <w:pStyle w:val="Heading1"/>
       </w:pPr>
@@ -3030,7 +3309,7 @@
         <w:rPr>
           <w:i/>
         </w:rPr>
-        <w:t>0:42-0:53 · 11 min (8 hablados) · tope 1,360 palabras</w:t>
+        <w:t>0:36-0:46 · 10 min · 871 palabras, unos 4.7 min de habla</w:t>
       </w:r>
     </w:p>
     <w:p>
@@ -3043,6 +3322,76 @@
       <w:r>
         <w:rPr/>
         <w:t xml:space="preserve"> cualquier persona puede recorrer el sitio sin cuenta, y es sencillo, bilingüe y se adapta a la pantalla.</w:t>
+      </w:r>
+    </w:p>
+    <w:p>
+      <w:r>
+        <w:rPr>
+          <w:b/>
+        </w:rPr>
+        <w:t>Ideas, en orden:</w:t>
+      </w:r>
+    </w:p>
+    <w:p>
+      <w:pPr>
+        <w:pStyle w:val="ListBullet"/>
+      </w:pPr>
+      <w:r>
+        <w:rPr/>
+        <w:t>Inicio: nombre, lema, botón para analizar y espacio para la imagen principal.</w:t>
+      </w:r>
+    </w:p>
+    <w:p>
+      <w:pPr>
+        <w:pStyle w:val="ListBullet"/>
+      </w:pPr>
+      <w:r>
+        <w:rPr/>
+        <w:t>El menú con las seis secciones, el selector de idioma y el acceso para iniciar sesión.</w:t>
+      </w:r>
+    </w:p>
+    <w:p>
+      <w:pPr>
+        <w:pStyle w:val="ListBullet"/>
+      </w:pPr>
+      <w:r>
+        <w:rPr/>
+        <w:t>Nosotros, Aliados, Infografías y videos, y Contacto.</w:t>
+      </w:r>
+    </w:p>
+    <w:p>
+      <w:pPr>
+        <w:pStyle w:val="ListBullet"/>
+      </w:pPr>
+      <w:r>
+        <w:rPr/>
+        <w:t>Idioma: EN traduce todo el sitio con el servicio de Google.</w:t>
+      </w:r>
+    </w:p>
+    <w:p>
+      <w:pPr>
+        <w:pStyle w:val="ListBullet"/>
+      </w:pPr>
+      <w:r>
+        <w:rPr/>
+        <w:t>Pie de página: privacidad, licencia, enlaces.</w:t>
+      </w:r>
+    </w:p>
+    <w:p>
+      <w:pPr>
+        <w:pStyle w:val="ListBullet"/>
+      </w:pPr>
+      <w:r>
+        <w:rPr/>
+        <w:t>Para analizar imágenes hace falta una cuenta.</w:t>
+      </w:r>
+    </w:p>
+    <w:p>
+      <w:r>
+        <w:rPr>
+          <w:b/>
+        </w:rPr>
+        <w:t>Texto para decir:</w:t>
       </w:r>
     </w:p>
     <w:p>
@@ -3081,28 +3430,26 @@
     </w:p>
     <w:p>
       <w:r>
-        <w:rPr>
-          <w:b/>
-        </w:rPr>
-        <w:t>Ideas, en orden:</w:t>
-      </w:r>
-    </w:p>
-    <w:p>
-      <w:pPr>
-        <w:pStyle w:val="ListBullet"/>
-      </w:pPr>
-      <w:r>
-        <w:rPr/>
-        <w:t>Inicio: el nombre del proyecto con su lema, «Análisis de imágenes de microscopio», un espacio para una imagen principal y un botón para analizar una imagen.</w:t>
-      </w:r>
-    </w:p>
-    <w:p>
-      <w:pPr>
-        <w:pStyle w:val="ListBullet"/>
-      </w:pPr>
-      <w:r>
-        <w:rPr/>
-        <w:t>El menú de hamburguesa despliega las seis secciones. A la derecha, el selector de idioma (ES y EN) y el acceso para iniciar sesión.</w:t>
+        <w:rPr/>
+        <w:t>Estoy compartiendo el navegador. Lo primero que ven es la página de inicio. Arriba, centrado, está el logotipo con el nombre del proyecto y su lema: «Análisis de imágenes de microscopio». Debajo hay una barra con el botón de menú a la izquierda, y a la derecha el selector de idioma y el acceso para iniciar sesión.</w:t>
+      </w:r>
+    </w:p>
+    <w:p>
+      <w:r>
+        <w:rPr/>
+        <w:t>En el cuerpo de la página está el título, una frase que resume lo que hace el sitio y un botón verde que dice «Analizar una imagen». A la derecha hay un recuadro punteado que está reservado para una imagen principal, que se va a poner cuando la tengamos. Más abajo hay tres tarjetas que cuentan el problema, el recorrido y los resultados, en el mismo orden en que lo estamos viendo hoy.</w:t>
+      </w:r>
+    </w:p>
+    <w:p>
+      <w:r>
+        <w:rPr/>
+        <w:t>Quiero decir algo sobre el diseño: la interfaz ya es funcional, ya se puede usar completa, pero el diseño se sigue afinando. Lo que ven hoy no es la versión final de cómo se ve.</w:t>
+      </w:r>
+    </w:p>
+    <w:p>
+      <w:r>
+        <w:rPr/>
+        <w:t>Algo que cuidamos desde el principio es que la página se lea bien en cualquier pantalla. Si abren este mismo sitio en un teléfono, el menú se acomoda y el contenido se reordena, y no hace falta acercar con los dedos para leer. También es una página sobria a propósito: pocos colores, letra legible, nada que distraiga. Un sitio científico no necesita impresionar, necesita que cualquiera encuentre rápido lo que busca.</w:t>
       </w:r>
     </w:p>
     <w:p>
@@ -3114,30 +3461,15 @@
       </w:r>
     </w:p>
     <w:p>
-      <w:pPr>
-        <w:pStyle w:val="ListBullet"/>
-      </w:pPr>
-      <w:r>
-        <w:rPr/>
-        <w:t>Decir que la interfaz ya es funcional y que el diseño se sigue mejorando.</w:t>
-      </w:r>
-    </w:p>
-    <w:p>
-      <w:pPr>
-        <w:pStyle w:val="ListBullet"/>
-      </w:pPr>
-      <w:r>
-        <w:rPr/>
-        <w:t>Nosotros: qué es Image Bio Pro.</w:t>
-      </w:r>
-    </w:p>
-    <w:p>
-      <w:pPr>
-        <w:pStyle w:val="ListBullet"/>
-      </w:pPr>
-      <w:r>
-        <w:rPr/>
-        <w:t>Aliados: una tarjeta por persona, con nombre, fotografía y lo que estudió. Quien quiera aparecer solo tiene que mandar sus datos.</w:t>
+      <w:r>
+        <w:rPr/>
+        <w:t>Si abro el menú, aparecen las seis secciones de las que hablamos hace un rato, una debajo de otra: Inicio, Nosotros, Aliados, Infografías y videos, Inteligencia Artificial y Contacto. Voy a recorrerlas rápido, una por una.</w:t>
+      </w:r>
+    </w:p>
+    <w:p>
+      <w:r>
+        <w:rPr/>
+        <w:t>Nosotros es la sección que cuenta qué es Image Bio Pro. Es texto, y se va a cargar con el contenido real del grupo. Ahí se explica, con palabras sencillas, de qué trata el proyecto y para qué sirve.</w:t>
       </w:r>
     </w:p>
     <w:p>
@@ -3150,40 +3482,6 @@
       <w:r>
         <w:rPr/>
         <w:t>» y un texto de relleno).]</w:t>
-      </w:r>
-    </w:p>
-    <w:p>
-      <w:pPr>
-        <w:pStyle w:val="ListBullet"/>
-      </w:pPr>
-      <w:r>
-        <w:rPr/>
-        <w:t>Infografías y videos: las infografías se abren en una ventana grande, con la imagen y su texto, como un blog. El título va fuera de la imagen. Abajo hay videos de YouTube dentro de la misma página.</w:t>
-      </w:r>
-    </w:p>
-    <w:p>
-      <w:r>
-        <w:rPr>
-          <w:color w:val="C00000"/>
-        </w:rPr>
-        <w:t>[Acción: abrir Infografías y videos. Arriba, el bloque «Infografías», con tarjetas; al hacer clic en una se abre una ventana grande, centrada, con el título, la imagen y el texto, y se cierra con la X. Más abajo, el bloque «Videos»: reproductores de YouTube de dos en dos, cada uno con su título debajo.]</w:t>
-      </w:r>
-    </w:p>
-    <w:p>
-      <w:pPr>
-        <w:pStyle w:val="ListBullet"/>
-      </w:pPr>
-      <w:r>
-        <w:rPr/>
-        <w:t>Contacto: formulario con nombre, correo y mensaje, y los datos de contacto.</w:t>
-      </w:r>
-    </w:p>
-    <w:p>
-      <w:r>
-        <w:rPr>
-          <w:color w:val="C00000"/>
-        </w:rPr>
-        <w:t>[Acción: abrir Contacto, cuyo título es «Haz contacto». A la izquierda, los datos de contacto (correo, teléfono y dirección, de ejemplo) y un recuadro reservado para un mapa. A la derecha, «Envíanos un mensaje»: campos de nombre, correo y mensaje, y el botón «Enviar».]</w:t>
       </w:r>
     </w:p>
     <w:p>
@@ -3201,6 +3499,20 @@
       </w:r>
     </w:p>
     <w:p>
+      <w:r>
+        <w:rPr/>
+        <w:t>Es una cuadrícula de tarjetas, cuatro por fila, y todas se ven igual: el nombre arriba, la fotografía en el centro y debajo un texto breve. Me gusta que esta sección ponga caras y nombres. Un sistema de inteligencia artificial puede parecer algo abstracto y sin dueño, y aquí se ve que detrás hay personas, cada una con su formación y sus intereses.</w:t>
+      </w:r>
+    </w:p>
+    <w:p>
+      <w:r>
+        <w:rPr>
+          <w:color w:val="C00000"/>
+        </w:rPr>
+        <w:t>[Acción: abrir Infografías y videos. Arriba, el bloque «Infografías», con tarjetas; al hacer clic en una se abre una ventana grande, centrada, con el título, la imagen y el texto, y se cierra con la X. Más abajo, el bloque «Videos»: reproductores de YouTube de dos en dos, cada uno con su título debajo.]</w:t>
+      </w:r>
+    </w:p>
+    <w:p>
       <w:pPr>
         <w:pBdr>
           <w:left w:val="single" w:sz="24" w:space="8" w:color="BF9000"/>
@@ -3215,12 +3527,23 @@
       </w:r>
     </w:p>
     <w:p>
-      <w:pPr>
-        <w:pStyle w:val="ListBullet"/>
-      </w:pPr>
-      <w:r>
-        <w:rPr/>
-        <w:t>Idioma: al elegir EN, el sitio se traduce completo con el servicio de Google integrado, sin dos versiones del sitio. A cambio, la calidad es la de un traductor automático; los nombres propios y los nombres de archivo están marcados para que no se traduzcan.</w:t>
+      <w:r>
+        <w:rPr/>
+        <w:t>Cada infografía es una tarjeta, y el título va fuera de la imagen para que se lea bien. Los videos se reproducen sin que tengan que salir del sitio. Las infografías son una forma de explicar ideas difíciles con una imagen y un texto corto, y por eso las pusimos como complemento del análisis: en la propia pantalla de análisis aparecen unas recientes, para que quien está esperando o explorando pueda leer algo útil.</w:t>
+      </w:r>
+    </w:p>
+    <w:p>
+      <w:r>
+        <w:rPr>
+          <w:color w:val="C00000"/>
+        </w:rPr>
+        <w:t>[Acción: abrir Contacto, cuyo título es «Haz contacto». A la izquierda, los datos de contacto (correo, teléfono y dirección, de ejemplo) y un recuadro reservado para un mapa. A la derecha, «Envíanos un mensaje»: campos de nombre, correo y mensaje, y el botón «Enviar».]</w:t>
+      </w:r>
+    </w:p>
+    <w:p>
+      <w:r>
+        <w:rPr/>
+        <w:t>Contacto es la sección más sencilla. A la izquierda están los datos de contacto y un espacio para un mapa, y a la derecha un formulario con nombre, correo y mensaje. Lo que se escribe aquí queda guardado para el equipo. Si alguien del curso encuentra un error en el sitio, un texto que no se entiende o tiene una sugerencia, este es el canal.</w:t>
       </w:r>
     </w:p>
     <w:p>
@@ -3229,6 +3552,12 @@
           <w:color w:val="C00000"/>
         </w:rPr>
         <w:t>[Acción: clic en «EN», arriba a la derecha. Menú, títulos, botones y textos cambian a inglés en pantalla, mientras que los nombres propios (como Image Bio Pro) quedan igual. Volver a «ES» al terminar.]</w:t>
+      </w:r>
+    </w:p>
+    <w:p>
+      <w:r>
+        <w:rPr/>
+        <w:t>Ahora algo que a veces sorprende. Arriba a la derecha hay un selector de idioma. Si elijo EN, el sitio completo se traduce al inglés.</w:t>
       </w:r>
     </w:p>
     <w:p>
@@ -3246,21 +3575,9 @@
       </w:r>
     </w:p>
     <w:p>
-      <w:pPr>
-        <w:pStyle w:val="ListBullet"/>
-      </w:pPr>
-      <w:r>
-        <w:rPr/>
-        <w:t>Pie de página: nombre del proyecto, institución, contacto de ejemplo, enlaces del menú, aviso de privacidad 2026 y mención de la licencia Creative Commons Atribución-No Comercial (verificar la versión).</w:t>
-      </w:r>
-    </w:p>
-    <w:p>
-      <w:pPr>
-        <w:pStyle w:val="ListBullet"/>
-      </w:pPr>
-      <w:r>
-        <w:rPr/>
-        <w:t>Estilo sobrio, con pocos colores, que se adapta a distintos tamaños de pantalla.</w:t>
+      <w:r>
+        <w:rPr/>
+        <w:t>Eso tiene una ventaja, que es que todo el sitio queda traducido sin trabajo extra, y una desventaja, que es que la calidad es la de un traductor automático. Para cuidar eso, los nombres propios y los nombres de archivo están marcados para que no se traduzcan. Vuelvo a español. La ventaja práctica es que si un colega de otro país quiere usarlo, o si alguien prefiere leer en inglés, puede hacerlo sin que tengamos que mantener dos sitios distintos.</w:t>
       </w:r>
     </w:p>
     <w:p>
@@ -3269,6 +3586,12 @@
           <w:color w:val="C00000"/>
         </w:rPr>
         <w:t>[Acción: bajar hasta el final de la página. Una franja azul oscura con el nombre «Image Bio Pro» y la institución a la izquierda, el contacto y el año a la derecha, los enlaces del menú en una fila y, al final, una línea con el aviso de privacidad 2026 y la licencia Creative Commons.]</w:t>
+      </w:r>
+    </w:p>
+    <w:p>
+      <w:r>
+        <w:rPr/>
+        <w:t>Si bajo hasta el final de la página, está el pie. Tiene el nombre del proyecto y la institución, un contacto de ejemplo, los mismos enlaces del menú, y abajo dos cosas que pidió el grupo: el aviso de privacidad 2026 y la mención de la licencia Creative Commons, Atribución y No Comercial. El estilo es sobrio, con pocos colores, y se adapta a distintos tamaños de pantalla, así que también se puede ver desde un teléfono.</w:t>
       </w:r>
     </w:p>
     <w:p>
@@ -3286,6 +3609,12 @@
       </w:r>
     </w:p>
     <w:p>
+      <w:r>
+        <w:rPr/>
+        <w:t>Hasta aquí todo se puede recorrer sin cuenta. Pero la sección que justifica el proyecto es la de Inteligencia Artificial, la que analiza imágenes, y esa sí necesita que alguien inicie sesión. Vamos a crear una cuenta.</w:t>
+      </w:r>
+    </w:p>
+    <w:p>
       <w:pPr>
         <w:pStyle w:val="Heading1"/>
       </w:pPr>
@@ -3298,7 +3627,7 @@
         <w:rPr>
           <w:i/>
         </w:rPr>
-        <w:t>0:53-0:59 · 6 min (4 hablados) · tope 680 palabras</w:t>
+        <w:t>0:46-0:52 · 6 min · 503 palabras, unos 2.7 min de habla</w:t>
       </w:r>
     </w:p>
     <w:p>
@@ -3316,6 +3645,67 @@
     <w:p>
       <w:r>
         <w:rPr>
+          <w:b/>
+        </w:rPr>
+        <w:t>Ideas, en orden:</w:t>
+      </w:r>
+    </w:p>
+    <w:p>
+      <w:pPr>
+        <w:pStyle w:val="ListBullet"/>
+      </w:pPr>
+      <w:r>
+        <w:rPr/>
+        <w:t>«Mi cuenta» tiene dos columnas: entrar y crear cuenta.</w:t>
+      </w:r>
+    </w:p>
+    <w:p>
+      <w:pPr>
+        <w:pStyle w:val="ListBullet"/>
+      </w:pPr>
+      <w:r>
+        <w:rPr/>
+        <w:t>Tres datos: nombre, correo y contraseña de al menos ocho caracteres.</w:t>
+      </w:r>
+    </w:p>
+    <w:p>
+      <w:pPr>
+        <w:pStyle w:val="ListBullet"/>
+      </w:pPr>
+      <w:r>
+        <w:rPr/>
+        <w:t>Al registrarse, la sesión inicia en el acto y el sitio lleva a «Analizar imagen».</w:t>
+      </w:r>
+    </w:p>
+    <w:p>
+      <w:pPr>
+        <w:pStyle w:val="ListBullet"/>
+      </w:pPr>
+      <w:r>
+        <w:rPr/>
+        <w:t>Salir y volver a entrar; «Recordarme en este equipo».</w:t>
+      </w:r>
+    </w:p>
+    <w:p>
+      <w:pPr>
+        <w:pStyle w:val="ListBullet"/>
+      </w:pPr>
+      <w:r>
+        <w:rPr/>
+        <w:t>La contraseña se guarda cifrada; el acceso a la red es privado.</w:t>
+      </w:r>
+    </w:p>
+    <w:p>
+      <w:r>
+        <w:rPr>
+          <w:b/>
+        </w:rPr>
+        <w:t>Texto para decir:</w:t>
+      </w:r>
+    </w:p>
+    <w:p>
+      <w:r>
+        <w:rPr>
           <w:color w:val="C00000"/>
         </w:rPr>
         <w:t>[Pantalla: hacer clic en «Iniciar sesión», arriba a la derecha. Se abre «Mi cuenta», con dos columnas bajo el título. A la izquierda, «Iniciar sesión»: correo electrónico, contraseña, la casilla «Recordarme en este equipo» y el botón «Entrar». A la derecha, «Crear cuenta»: nombre, correo electrónico, contraseña (con la nota «Al menos 8 caracteres») y el botón «Registrarme».]</w:t>
@@ -3323,34 +3713,17 @@
     </w:p>
     <w:p>
       <w:r>
-        <w:rPr>
-          <w:b/>
-        </w:rPr>
-        <w:t>Ideas, en orden:</w:t>
-      </w:r>
-    </w:p>
-    <w:p>
-      <w:pPr>
-        <w:pStyle w:val="ListBullet"/>
-      </w:pPr>
-      <w:r>
-        <w:rPr/>
-        <w:t>La página «Mi cuenta» tiene dos columnas: a la izquierda, quien ya tiene cuenta; a la derecha, la cuenta nueva.</w:t>
-      </w:r>
-    </w:p>
-    <w:p>
-      <w:pPr>
-        <w:pStyle w:val="ListBullet"/>
-      </w:pPr>
-      <w:r>
-        <w:rPr/>
-        <w:t>Tres datos: el nombre (aparece en los informes y en la parte superior del sitio), el correo (es el identificador para entrar; no tiene que ser de Gmail ni está ligado a ningún servicio externo) y una contraseña de al menos ocho caracteres.</w:t>
-      </w:r>
-    </w:p>
-    <w:p>
-      <w:pPr>
-        <w:pStyle w:val="ListBullet"/>
-      </w:pPr>
+        <w:rPr/>
+        <w:t>Voy a hacer clic en «Iniciar sesión». Se abre una página que se llama «Mi cuenta» y que tiene dos columnas. A la izquierda está quien ya tiene cuenta: pone su correo y su contraseña y entra. A la derecha está quien todavía no: la cuenta nueva.</w:t>
+      </w:r>
+    </w:p>
+    <w:p>
+      <w:r>
+        <w:rPr/>
+        <w:t>Para crear una cuenta se piden tres datos. El nombre, que es el que aparece en los informes y arriba en el sitio. El correo, que es con lo que se entra: no tiene que ser de Gmail ni está ligado a ningún servicio externo, sirve cualquier correo. Y una contraseña de al menos ocho caracteres.</w:t>
+      </w:r>
+    </w:p>
+    <w:p>
       <w:r>
         <w:rPr>
           <w:color w:val="C00000"/>
@@ -3377,12 +3750,9 @@
       </w:r>
     </w:p>
     <w:p>
-      <w:pPr>
-        <w:pStyle w:val="ListBullet"/>
-      </w:pPr>
-      <w:r>
-        <w:rPr/>
-        <w:t>Mostrar «Salir» y volver a entrar. Hay una casilla «Recordarme en este equipo»: cómoda en un equipo personal, poco recomendable en uno compartido.</w:t>
+      <w:r>
+        <w:rPr/>
+        <w:t>Fíjense: no tuve que confirmar nada por correo ni esperar a que alguien me aprobara. Me registré y ya estoy dentro, y el sitio me llevó a la pantalla donde se suben las imágenes.</w:t>
       </w:r>
     </w:p>
     <w:p>
@@ -3394,21 +3764,27 @@
       </w:r>
     </w:p>
     <w:p>
-      <w:pPr>
-        <w:pStyle w:val="ListBullet"/>
-      </w:pPr>
-      <w:r>
-        <w:rPr/>
-        <w:t>La contraseña no se guarda tal cual: se guarda una versión cifrada que no se puede invertir.</w:t>
-      </w:r>
-    </w:p>
-    <w:p>
-      <w:pPr>
-        <w:pStyle w:val="ListBullet"/>
-      </w:pPr>
-      <w:r>
-        <w:rPr/>
-        <w:t>Subrayar que el acceso a la red neuronal es privado y se hace con un usuario. Es una de las cosas que el revisor pidió destacar.</w:t>
+      <w:r>
+        <w:rPr/>
+        <w:t>Voy a salir y a volver a entrar para que vean las dos cosas. Hay una casilla que dice «Recordarme en este equipo». Es cómoda si es una computadora personal, porque no hay que escribir la contraseña cada vez, pero no la recomiendo en una computadora compartida.</w:t>
+      </w:r>
+    </w:p>
+    <w:p>
+      <w:r>
+        <w:rPr/>
+        <w:t>Sobre la contraseña: el sitio no la guarda tal cual. Guarda una versión cifrada que no se puede revertir, así que ni siquiera quien administra el sitio puede ver cuál es. Una recomendación general, que sirve en cualquier sitio: no usen aquí una contraseña que ya usan en otro servicio.</w:t>
+      </w:r>
+    </w:p>
+    <w:p>
+      <w:r>
+        <w:rPr/>
+        <w:t>Y una cosa que a veces intriga: ¿cómo sabe el sitio que soy yo mientras navego? Cuando inicio sesión, el sitio le da a mi navegador una especie de pase, que se llama cookie, y mi navegador lo manda en cada petición. Por eso el sitio sabe quién soy mientras me muevo de una pantalla a otra. La casilla de «Recordarme en este equipo» hace que ese pase dure más tiempo, y por eso conviene dejarla marcada solo en una computadora propia.</w:t>
+      </w:r>
+    </w:p>
+    <w:p>
+      <w:r>
+        <w:rPr/>
+        <w:t>Si alguien escribe mal su contraseña, el sitio dice que el correo o la contraseña son incorrectos, sin precisar cuál de los dos. Es a propósito: así nadie puede averiguar qué correos están registrados probando uno por uno.</w:t>
       </w:r>
     </w:p>
     <w:p>
@@ -3427,30 +3803,24 @@
     </w:p>
     <w:p>
       <w:r>
+        <w:rPr/>
+        <w:t>Quiero subrayar esto porque lo pidió el equipo que revisó la presentación: el acceso a la red neuronal es privado y se hace con un usuario. Cada análisis es de quien lo hizo, y nadie más puede verlo. Incluso si dos personas analizan exactamente la misma imagen, cada una tiene su propio análisis, con su nombre y su fecha, y ninguna ve el de la otra.</w:t>
+      </w:r>
+    </w:p>
+    <w:p>
+      <w:pPr>
+        <w:pStyle w:val="Heading1"/>
+      </w:pPr>
+      <w:r>
+        <w:t>Bloque 7. Analizar una imagen y esperar</w:t>
+      </w:r>
+    </w:p>
+    <w:p>
+      <w:r>
         <w:rPr>
           <w:i/>
         </w:rPr>
-        <w:t>Si preguntan por qué el error de contraseña es vago:</w:t>
-      </w:r>
-      <w:r>
-        <w:rPr/>
-        <w:t xml:space="preserve"> para que nadie pueda averiguar qué correos están registrados.</w:t>
-      </w:r>
-    </w:p>
-    <w:p>
-      <w:pPr>
-        <w:pStyle w:val="Heading1"/>
-      </w:pPr>
-      <w:r>
-        <w:t>Bloque 7. Analizar una imagen y esperar</w:t>
-      </w:r>
-    </w:p>
-    <w:p>
-      <w:r>
-        <w:rPr>
-          <w:i/>
-        </w:rPr>
-        <w:t>0:59-1:12 · 13 min (8 hablados) · tope 1,360 palabras</w:t>
+        <w:t>0:52-1:01 · 9 min · 1,015 palabras, unos 5.5 min de habla</w:t>
       </w:r>
     </w:p>
     <w:p>
@@ -3468,6 +3838,67 @@
     <w:p>
       <w:r>
         <w:rPr>
+          <w:b/>
+        </w:rPr>
+        <w:t>Ideas, en orden:</w:t>
+      </w:r>
+    </w:p>
+    <w:p>
+      <w:pPr>
+        <w:pStyle w:val="ListBullet"/>
+      </w:pPr>
+      <w:r>
+        <w:rPr/>
+        <w:t>El recuadro tiene solo lo necesario; no hay parámetros, a propósito.</w:t>
+      </w:r>
+    </w:p>
+    <w:p>
+      <w:pPr>
+        <w:pStyle w:val="ListBullet"/>
+      </w:pPr>
+      <w:r>
+        <w:rPr/>
+        <w:t>De una a diez imágenes, hasta 300 MB; formatos y advertencia del JPG.</w:t>
+      </w:r>
+    </w:p>
+    <w:p>
+      <w:pPr>
+        <w:pStyle w:val="ListBullet"/>
+      </w:pPr>
+      <w:r>
+        <w:rPr/>
+        <w:t>La imagen de ejemplo: sintética, para ver el flujo completo.</w:t>
+      </w:r>
+    </w:p>
+    <w:p>
+      <w:pPr>
+        <w:pStyle w:val="ListBullet"/>
+      </w:pPr>
+      <w:r>
+        <w:rPr/>
+        <w:t>La cubierta de espera; es normal que tarde y el aviso al minuto.</w:t>
+      </w:r>
+    </w:p>
+    <w:p>
+      <w:pPr>
+        <w:pStyle w:val="ListBullet"/>
+      </w:pPr>
+      <w:r>
+        <w:rPr/>
+        <w:t>Tiempos y qué pasa del otro lado mientras se espera.</w:t>
+      </w:r>
+    </w:p>
+    <w:p>
+      <w:r>
+        <w:rPr>
+          <w:b/>
+        </w:rPr>
+        <w:t>Texto para decir:</w:t>
+      </w:r>
+    </w:p>
+    <w:p>
+      <w:r>
+        <w:rPr>
           <w:color w:val="C00000"/>
         </w:rPr>
         <w:t>[Pantalla: página «Inteligencia Artificial», con el título «Analizar imagen». Una franja con una caja blanca en el centro: la etiqueta «Sube tus imágenes (hasta 10)», el selector de archivos, la nota «Formatos: BMP, PNG o TIFF. JPG se acepta, pero pierde calidad», el aviso de que el análisis puede tardar y no hay que cerrar la página, el botón verde «Analizar» y, justo debajo, el botón «Probar con la imagen de ejemplo». Más abajo, «Infografías recientes» y un enlace para ver todas.]</w:t>
@@ -3475,37 +3906,8 @@
     </w:p>
     <w:p>
       <w:r>
-        <w:rPr>
-          <w:b/>
-        </w:rPr>
-        <w:t>Ideas, en orden:</w:t>
-      </w:r>
-    </w:p>
-    <w:p>
-      <w:pPr>
-        <w:pStyle w:val="ListBullet"/>
-      </w:pPr>
-      <w:r>
-        <w:rPr/>
-        <w:t>El recuadro tiene solo lo necesario: elegir archivos, «Analizar» y «Probar con la imagen de ejemplo». No hay parámetros ajustables ni opciones avanzadas, a propósito.</w:t>
-      </w:r>
-    </w:p>
-    <w:p>
-      <w:pPr>
-        <w:pStyle w:val="ListBullet"/>
-      </w:pPr>
-      <w:r>
-        <w:rPr/>
-        <w:t>Subir de una a diez imágenes, hasta 300 MB por envío. Formatos: BMP, PNG o TIFF; JPG con una advertencia, porque pierde calidad al comprimirse.</w:t>
-      </w:r>
-    </w:p>
-    <w:p>
-      <w:pPr>
-        <w:pStyle w:val="ListBullet"/>
-      </w:pPr>
-      <w:r>
-        <w:rPr/>
-        <w:t>Agrupar las fotos por tipo y condición antes de subirlas facilita comparar después.</w:t>
+        <w:rPr/>
+        <w:t>Esta es la sección de Inteligencia Artificial, la pantalla «Analizar imagen». Quiero que se fijen en lo poco que hay. Una caja con un selector de archivos para subir las imágenes, una nota con los formatos, un botón verde que dice «Analizar» y debajo otro que dice «Probar con la imagen de ejemplo». Eso es todo.</w:t>
       </w:r>
     </w:p>
     <w:p>
@@ -3523,9 +3925,36 @@
       </w:r>
     </w:p>
     <w:p>
-      <w:pPr>
-        <w:pStyle w:val="ListBullet"/>
-      </w:pPr>
+      <w:r>
+        <w:rPr/>
+        <w:t>Es una decisión de diseño. Podríamos haber puesto controles para ajustar el análisis, pero entonces cada persona lo ajustaría distinto y los resultados ya no se podrían comparar. Sin parámetros, la misma imagen da el mismo resultado, la analice quien la analice.</w:t>
+      </w:r>
+    </w:p>
+    <w:p>
+      <w:r>
+        <w:rPr/>
+        <w:t>Se pueden subir de una a diez imágenes por vez, hasta trescientos megabytes en total por envío. Los formatos son BMP, PNG o TIFF, y JPG se acepta pero con una advertencia, porque, como vimos, pierde calidad al comprimirse. Un consejo: si van a comparar condiciones, agrupen las fotos por tipo y condición antes de subirlas, porque eso facilita todo lo que viene después. Y pónganles nombres que digan algo, por ejemplo la condición y el número de muestra, porque ese nombre es el que aparece después en los resultados y en el archivo CSV.</w:t>
+      </w:r>
+    </w:p>
+    <w:p>
+      <w:r>
+        <w:rPr/>
+        <w:t>Hagamos una cuenta rápida para saber qué esperar. Si una foto grande de fluorescencia tarda unos cuarenta segundos y subo diez, el análisis completo tarda unos siete minutos, porque se hacen una tras otra. Es poco para lo que se está haciendo, pero es mucho para quedarse mirando una pantalla, y por eso conviene saberlo de antemano. Una buena práctica es subir lotes de tamaño razonable y aprovechar la espera para otra cosa, sin cerrar la página.</w:t>
+      </w:r>
+    </w:p>
+    <w:p>
+      <w:r>
+        <w:rPr/>
+        <w:t>Si algo sale mal, por ejemplo se sube un archivo que no es una imagen o un formato que el sitio no acepta, el sitio lo avisa con un mensaje claro en la misma pantalla, y no se pierde nada.</w:t>
+      </w:r>
+    </w:p>
+    <w:p>
+      <w:r>
+        <w:rPr/>
+        <w:t>Como no tengo aquí una foto propia para subir, voy a usar la imagen de ejemplo.</w:t>
+      </w:r>
+    </w:p>
+    <w:p>
       <w:r>
         <w:rPr>
           <w:color w:val="C00000"/>
@@ -3534,7 +3963,7 @@
       </w:r>
       <w:r>
         <w:rPr/>
-        <w:t xml:space="preserve"> Decir que es una imagen sintética, dibujada para la prueba: óvalos de colores, cada uno con una línea verde que hace de cola, sobre un fondo negro. Sirve para ver el flujo completo sin tener una foto propia.</w:t>
+        <w:t xml:space="preserve"> Es una imagen sintética, dibujada para la prueba: óvalos de colores, cada uno con una línea verde que hace de cola, sobre un fondo negro. Sirve para ver el flujo completo sin tener una foto propia. No es una foto de microscopio real, y se los aclaro para que no se confundan con los números que van a ver. Que el sitio tenga una imagen de ejemplo es útil en una clase como esta, o cuando alguien quiere comprobar que todo funciona sin gastar una foto propia. Las cifras que salgan no dicen nada biológico, solo muestran cómo se leen.</w:t>
       </w:r>
     </w:p>
     <w:p>
@@ -3546,30 +3975,9 @@
       </w:r>
     </w:p>
     <w:p>
-      <w:pPr>
-        <w:pStyle w:val="ListBullet"/>
-      </w:pPr>
-      <w:r>
-        <w:rPr/>
-        <w:t>Aparece una cubierta con una barra de progreso, el aviso «No cierres esta página» y un mensaje que dice que es normal que el análisis tarde. Es una barra de actividad: confirma que el sistema está trabajando. Si pasa un minuto, aparece otro aviso: «Tu análisis sigue en curso».</w:t>
-      </w:r>
-    </w:p>
-    <w:p>
-      <w:pPr>
-        <w:pStyle w:val="ListBullet"/>
-      </w:pPr>
-      <w:r>
-        <w:rPr/>
-        <w:t>Tiempos: una foto grande de fluorescencia tarda unos 40 segundos y una de fondo claro entre 10 y 20. Si se suben varias, se analizan una tras otra y los tiempos se suman. Por eso el sitio tiene tiempos de espera amplios.</w:t>
-      </w:r>
-    </w:p>
-    <w:p>
-      <w:pPr>
-        <w:pStyle w:val="ListBullet"/>
-      </w:pPr>
-      <w:r>
-        <w:rPr/>
-        <w:t>Presentar la espera como algo normal y explicado, no como un fallo. Si la gente no sabe por qué tarda, pensará que el sistema es lento o complicado.</w:t>
+      <w:r>
+        <w:rPr/>
+        <w:t>Apareció una cubierta con una barra verde que se mueve y un mensaje. Esa barra es solo de actividad: no marca cuánto falta, solo confirma que el sistema está trabajando. El mensaje dice que es normal que el análisis tarde y que no cierren la página. Piden no cerrarla porque es justo en esa pantalla donde el sitio va a entregar el resultado cuando termine. La barra no avanza de izquierda a derecha porque el sitio no puede saber de antemano cuánto va a tardar cada imagen; por eso es una barra de actividad y no una barra de progreso.</w:t>
       </w:r>
     </w:p>
     <w:p>
@@ -3587,21 +3995,15 @@
       </w:r>
     </w:p>
     <w:p>
-      <w:pPr>
-        <w:pStyle w:val="ListBullet"/>
-      </w:pPr>
-      <w:r>
-        <w:rPr/>
-        <w:t>Mientras esperamos, contar lo que pasa del otro lado: la imagen viaja al servidor, que revisa el formato, mide el brillo para saber si es de fondo oscuro o claro y elige uno de los dos modelos. Analiza la imagen por recortes pequeños, la red devuelve un contorno por cada espermatozoide, se juntan y se miden. Todo en el procesador del servidor.</w:t>
-      </w:r>
-    </w:p>
-    <w:p>
-      <w:pPr>
-        <w:pStyle w:val="ListBullet"/>
-      </w:pPr>
-      <w:r>
-        <w:rPr/>
-        <w:t>No entrar en el detalle de los recortes ni de cómo se juntan los resultados: eso es del lunes.</w:t>
+      <w:r>
+        <w:rPr/>
+        <w:t>Ese aviso lo agregamos por una sugerencia que salió en el ensayo. Si pasa un minuto y todavía no termina, aparece otra línea que dice «Tu análisis sigue en curso». La idea es que quien espera sepa que no se trabó, y que la tardanza se entienda como algo normal y explicado, no como un fallo. Si la gente no sabe por qué tarda, piensa que el sistema es lento o complicado.</w:t>
+      </w:r>
+    </w:p>
+    <w:p>
+      <w:r>
+        <w:rPr/>
+        <w:t>¿Cuánto tarda? En la computadora donde desarrollamos, una foto grande de fluorescencia tarda unos cuarenta segundos, y una de fondo claro entre diez y veinte. Si se suben varias, se analizan una tras otra y los tiempos se suman. Por eso el sitio tiene tiempos de espera amplios.</w:t>
       </w:r>
     </w:p>
     <w:p>
@@ -3615,7 +4017,31 @@
       </w:pPr>
       <w:r>
         <w:rPr/>
-        <w:t>Mientras esperamos, les cuento qué pasa del otro lado. La imagen viaja al servidor, que revisa el formato y mide el brillo para saber si es de fondo oscuro o de fondo claro. Con eso elige uno de los dos modelos y analiza la imagen por recortes pequeños.</w:t>
+        <w:t>Mientras esperamos, les cuento qué pasa del otro lado.</w:t>
+      </w:r>
+    </w:p>
+    <w:p>
+      <w:r>
+        <w:rPr/>
+        <w:t>Y mientras esperamos, aprovecho para contarles qué está pasando del otro lado. Primero, la imagen viaja a través de internet hasta el servidor. El servidor revisa el formato del archivo. Después mide el brillo de la imagen para saber si es de fondo oscuro o de fondo claro, y con eso elige cuál de los dos modelos va a usar. Luego analiza la imagen en recortes pequeños. La red devuelve un contorno por cada espermatozoide que encuentra, se juntan los resultados de todos los recortes y el código mide cada contorno. Todo eso ocurre en el procesador del servidor.</w:t>
+      </w:r>
+    </w:p>
+    <w:p>
+      <w:r>
+        <w:rPr/>
+        <w:t>Les explico por qué se analiza por recortes. Las fotos son muy grandes y los espermatozoides son pequeños comparados con ellas. Analizar toda la imagen de golpe exigiría mucha memoria al servidor, y el detalle exacto de por qué se hace así lo vemos el lunes. Por eso se corta la imagen en trozos, se analiza cada trozo y después se unen los resultados. Al unirlos puede pasar que una misma célula aparezca en dos trozos vecinos, y entonces hay que quitar el repetido para no contarla dos veces. Todo eso se resuelve dentro del sistema, y es parte de lo que vemos el lunes.</w:t>
+      </w:r>
+    </w:p>
+    <w:p>
+      <w:r>
+        <w:rPr/>
+        <w:t>Y el modelo se elige según el tipo de foto. Si la imagen tiene el fondo oscuro, como en fluorescencia, se usa el modelo de fluorescencia. Si el fondo es claro, se usa el de fondo claro. El sitio lo decide solo, midiendo el brillo, y la persona no tiene que elegir nada. Es otra decisión que se quitó de las manos de quien usa el sitio.</w:t>
+      </w:r>
+    </w:p>
+    <w:p>
+      <w:r>
+        <w:rPr/>
+        <w:t>No voy a entrar hoy en más detalle de los recortes ni de cómo se juntan los resultados. Eso es del lunes, que es cuando abrimos el sistema por dentro.</w:t>
       </w:r>
     </w:p>
     <w:p>
@@ -3627,6 +4053,12 @@
       </w:r>
     </w:p>
     <w:p>
+      <w:r>
+        <w:rPr/>
+        <w:t>Ya terminó, y el sitio me abrió solo la página de resultados. Vamos a verla con calma.</w:t>
+      </w:r>
+    </w:p>
+    <w:p>
       <w:pPr>
         <w:pStyle w:val="Heading1"/>
       </w:pPr>
@@ -3639,7 +4071,7 @@
         <w:rPr>
           <w:i/>
         </w:rPr>
-        <w:t>1:12-1:29 · 17 min (14 hablados) · tope 2,380 palabras</w:t>
+        <w:t>1:01-1:15 · 14 min · 1,681 palabras, unos 9.1 min de habla</w:t>
       </w:r>
     </w:p>
     <w:p>
@@ -3657,6 +4089,67 @@
     <w:p>
       <w:r>
         <w:rPr>
+          <w:b/>
+        </w:rPr>
+        <w:t>Ideas, en orden:</w:t>
+      </w:r>
+    </w:p>
+    <w:p>
+      <w:pPr>
+        <w:pStyle w:val="ListBullet"/>
+      </w:pPr>
+      <w:r>
+        <w:rPr/>
+        <w:t>Encabezado, aviso de escala, mensaje por imagen y datos del archivo.</w:t>
+      </w:r>
+    </w:p>
+    <w:p>
+      <w:pPr>
+        <w:pStyle w:val="ListBullet"/>
+      </w:pPr>
+      <w:r>
+        <w:rPr/>
+        <w:t>La imagen marcada y los tres datos principales; el largo y las cifras en píxeles.</w:t>
+      </w:r>
+    </w:p>
+    <w:p>
+      <w:pPr>
+        <w:pStyle w:val="ListBullet"/>
+      </w:pPr>
+      <w:r>
+        <w:rPr/>
+        <w:t>El histograma: cómo se construye y cómo se lee.</w:t>
+      </w:r>
+    </w:p>
+    <w:p>
+      <w:pPr>
+        <w:pStyle w:val="ListBullet"/>
+      </w:pPr>
+      <w:r>
+        <w:rPr/>
+        <w:t>El visor con zoom para revisar cada contorno.</w:t>
+      </w:r>
+    </w:p>
+    <w:p>
+      <w:pPr>
+        <w:pStyle w:val="ListBullet"/>
+      </w:pPr>
+      <w:r>
+        <w:rPr/>
+        <w:t>La tabla de detalle y la advertencia de leer los números con la imagen y la gráfica.</w:t>
+      </w:r>
+    </w:p>
+    <w:p>
+      <w:r>
+        <w:rPr>
+          <w:b/>
+        </w:rPr>
+        <w:t>Texto para decir:</w:t>
+      </w:r>
+    </w:p>
+    <w:p>
+      <w:r>
+        <w:rPr>
           <w:color w:val="C00000"/>
         </w:rPr>
         <w:t>[Pantalla: página «Resultados del análisis». De arriba hacia abajo: las migas de pan (Inicio › Inteligencia Artificial › Resultados), el título, una línea con el nombre de quien hizo el análisis y la fecha y hora, un recuadro azul con el aviso de escala y, enseguida, el nombre de la imagen con su mensaje en verde y una línea gris con el formato, las dimensiones, el modo de color y el peso. Recorrer sin prisa.]</w:t>
@@ -3664,46 +4157,20 @@
     </w:p>
     <w:p>
       <w:r>
-        <w:rPr>
-          <w:b/>
-        </w:rPr>
-        <w:t>Ideas, en orden:</w:t>
-      </w:r>
-    </w:p>
-    <w:p>
-      <w:pPr>
-        <w:pStyle w:val="ListBullet"/>
-      </w:pPr>
-      <w:r>
-        <w:rPr/>
-        <w:t>Encabezado: el nombre de quien hizo el análisis, con fecha y hora exactas. Sirve para distinguir muchos análisis.</w:t>
-      </w:r>
-    </w:p>
-    <w:p>
-      <w:pPr>
-        <w:pStyle w:val="ListBullet"/>
-      </w:pPr>
-      <w:r>
-        <w:rPr/>
-        <w:t>Aviso de escala: el sitio usa la misma escala en todas las imágenes para estandarizar su tamaño, 60 píxeles por micra. La imagen marcada trae una regla de 300 píxeles que equivalen a 5 micras.</w:t>
-      </w:r>
-    </w:p>
-    <w:p>
-      <w:pPr>
-        <w:pStyle w:val="ListBullet"/>
-      </w:pPr>
-      <w:r>
-        <w:rPr/>
-        <w:t>Mensajes por imagen: uno verde si se analizó con éxito. También puede avisar que hay compresión que altera los bordes, que se contaron muy pocos espermatozoides (menos de tres) y la distribución no es confiable, o que no se encontró nada y no se analizó. Entre un «no se pudo» honesto y un número dudoso, el sitio prefiere el primero.</w:t>
-      </w:r>
-    </w:p>
-    <w:p>
-      <w:pPr>
-        <w:pStyle w:val="ListBullet"/>
-      </w:pPr>
-      <w:r>
-        <w:rPr/>
-        <w:t>Datos de la imagen: formato, dimensiones en píxeles, modo de color y peso.</w:t>
+        <w:rPr/>
+        <w:t>Estamos en la página de resultados, y la voy a recorrer de arriba hacia abajo, porque cada cosa que aparece está ahí por una razón.</w:t>
+      </w:r>
+    </w:p>
+    <w:p>
+      <w:r>
+        <w:rPr/>
+        <w:t>Arriba está el título y, debajo, una línea con el nombre de quien hizo el análisis y la fecha y hora exactas, hasta el segundo. Parece un detalle menor, pero sirve para distinguir muchos análisis entre sí cuando uno acumula varios.</w:t>
+      </w:r>
+    </w:p>
+    <w:p>
+      <w:r>
+        <w:rPr/>
+        <w:t>Enseguida hay un recuadro azul con el aviso de escala. Dice que, para estandarizar el tamaño de las imágenes, se usa la misma escala en todas: sesenta píxeles es una micra. Y agrega que la regla de la imagen marcada mide trescientos píxeles, es decir, cinco micras. Más abajo vamos a ver esa regla dibujada en la imagen.</w:t>
       </w:r>
     </w:p>
     <w:p>
@@ -3721,6 +4188,12 @@
       </w:r>
     </w:p>
     <w:p>
+      <w:r>
+        <w:rPr/>
+        <w:t>Después viene el nombre del archivo, y debajo un mensaje. Este mensaje, en verde, dice que todo salió bien: «La imagen fue analizada con éxito».</w:t>
+      </w:r>
+    </w:p>
+    <w:p>
       <w:pPr>
         <w:pBdr>
           <w:left w:val="single" w:sz="24" w:space="8" w:color="BF9000"/>
@@ -3736,6 +4209,30 @@
     </w:p>
     <w:p>
       <w:r>
+        <w:rPr/>
+        <w:t>Ese mensaje puede cambiar. Si la imagen estaba en un formato con compresión, avisa que los bordes pueden haberse alterado. Si se contaron muy pocos espermatozoides, menos de tres, avisa que la distribución de tamaños no es confiable. Y si no se encontró nada, dice en rojo que no se analizó. Entre un «no se pudo» honesto y un número dudoso, el sitio prefiere el primero.</w:t>
+      </w:r>
+    </w:p>
+    <w:p>
+      <w:r>
+        <w:rPr/>
+        <w:t>Por ejemplo, si hoy subieran una foto en JPG, verían un aviso amarillo que dice que la imagen está en un formato con compresión y que los bordes pueden alterarse, y que recomienda usar BMP, PNG o TIFF. Es un aviso para que lo sepan, no un error: el análisis se hace igual.</w:t>
+      </w:r>
+    </w:p>
+    <w:p>
+      <w:r>
+        <w:rPr/>
+        <w:t>Cuando se suben varias imágenes, cada una trae su propio bloque, con su nombre, su mensaje, su imagen marcada, sus datos y su histograma, y al final de la página aparece una gráfica con el promedio de todas. Esa gráfica de promedios usa un rango común de tamaños para todas las imágenes, de modo que las barras se pueden comparar entre sí.</w:t>
+      </w:r>
+    </w:p>
+    <w:p>
+      <w:r>
+        <w:rPr/>
+        <w:t>Debajo hay una línea gris pequeña con los datos del archivo: el formato, las dimensiones en píxeles, el modo de color y el peso.</w:t>
+      </w:r>
+    </w:p>
+    <w:p>
+      <w:r>
         <w:rPr>
           <w:color w:val="C00000"/>
         </w:rPr>
@@ -3743,30 +4240,33 @@
       </w:r>
     </w:p>
     <w:p>
-      <w:pPr>
-        <w:pStyle w:val="ListBullet"/>
-      </w:pPr>
-      <w:r>
-        <w:rPr/>
-        <w:t>A la izquierda, la fotografía con cada espermatozoide marcado y numerado. A la derecha, tres recuadros: el conteo, el área media y la desviación estándar, en micras cuadradas. Debajo, el largo (media y desviación estándar en píxeles, con mínimo y máximo) y, aparte, las mismas cifras en píxeles y el largo en micras.</w:t>
-      </w:r>
-    </w:p>
-    <w:p>
-      <w:pPr>
-        <w:pStyle w:val="ListBullet"/>
-      </w:pPr>
-      <w:r>
-        <w:rPr/>
-        <w:t>Explicar la desviación estándar en una frase: cuánto se alejan, en promedio, las áreas de la media.</w:t>
-      </w:r>
-    </w:p>
-    <w:p>
-      <w:pPr>
-        <w:pStyle w:val="ListBullet"/>
-      </w:pPr>
-      <w:r>
-        <w:rPr/>
-        <w:t>Decir «largo» sin entrar al método; el detalle es de la sesión 3.</w:t>
+      <w:r>
+        <w:rPr/>
+        <w:t>Ahora sí, lo importante. A la izquierda está la fotografía, con cada espermatozoide rodeado por un contorno blanco y marcado con un número. Ahí, en la esquina de abajo, está la regla de trescientos píxeles, igual a cinco micras. Esa regla va dibujada en la misma imagen para que nadie tenga que adivinar la escala.</w:t>
+      </w:r>
+    </w:p>
+    <w:p>
+      <w:r>
+        <w:rPr/>
+        <w:t>A la derecha hay tres recuadros con números grandes. El primero es el conteo: cuántos espermatozoides se marcaron. El segundo es el área media, en micras cuadradas, y el tercero es la desviación estándar de esas áreas. Si la desviación estándar es un término nuevo, es una forma de medir cuánto se alejan, en promedio, las áreas de la media: si es chica, los tamaños son parecidos; si es grande, hay mucha variación.</w:t>
+      </w:r>
+    </w:p>
+    <w:p>
+      <w:r>
+        <w:rPr/>
+        <w:t>Les pongo un ejemplo con números inventados y muy sencillos para que se vea la diferencia. Imaginen cinco células con áreas de diez, doce, once, trece y catorce unidades. La media es doce, y las áreas se alejan muy poco de ella: la desviación estándar sale en alrededor de uno y medio. Ahora imaginen otras cinco con áreas de dos, seis, doce, dieciocho y veintidós. La media también es doce, pero ahora las áreas se alejan mucho de ella, y la desviación estándar sale entre siete y ocho. Las dos poblaciones tienen la misma media y son muy distintas. Por eso el sitio da siempre la media y la desviación estándar juntas, y por eso la gráfica importa tanto: la media sola no cuenta esa diferencia.</w:t>
+      </w:r>
+    </w:p>
+    <w:p>
+      <w:r>
+        <w:rPr/>
+        <w:t>Debajo hay dos párrafos pequeños. El primero habla del largo del espermatozoide, con su media y su desviación estándar y el mínimo y el máximo. El segundo repite las cifras en píxeles, como apoyo, y da el largo en micras. Digo simplemente «largo» sin entrar en cómo se calcula; eso lo vemos el lunes.</w:t>
+      </w:r>
+    </w:p>
+    <w:p>
+      <w:r>
+        <w:rPr/>
+        <w:t>Una pregunta natural es por qué el sitio muestra las dos unidades. Las micras son lo que se reporta, porque son una medida real, la que importa para el trabajo científico. Los píxeles se dejan como apoyo, porque son lo que la computadora mide directamente y permiten comprobar la conversión. Si dividen el área en píxeles entre tres mil seiscientos, deben obtener el área en micras cuadradas, y si dividen el largo en píxeles entre sesenta, el largo en micras. Pueden hacer la prueba con cualquier fila de la tabla, y es una buena manera de convencerse de que todo es consistente.</w:t>
       </w:r>
     </w:p>
     <w:p>
@@ -3785,6 +4285,12 @@
     </w:p>
     <w:p>
       <w:r>
+        <w:rPr/>
+        <w:t>Esto es lo que más quiero que se lleven de la pantalla: cada número tiene un contorno detrás. Si el conteo dice un número, hay exactamente esa cantidad de contornos en la imagen que se pueden revisar uno por uno. Nada sale de una caja cerrada.</w:t>
+      </w:r>
+    </w:p>
+    <w:p>
+      <w:r>
         <w:rPr>
           <w:color w:val="C00000"/>
         </w:rPr>
@@ -3792,30 +4298,9 @@
       </w:r>
     </w:p>
     <w:p>
-      <w:pPr>
-        <w:pStyle w:val="ListBullet"/>
-      </w:pPr>
-      <w:r>
-        <w:rPr/>
-        <w:t>El histograma: en el eje horizontal el área en píxeles, dividida en diez intervalos iguales entre el mínimo y el máximo de la imagen; en el vertical, cuántas células caen en cada uno. No supone ninguna forma: dibuja lo que se midió. Con varias imágenes se usa un rango común y aparece una gráfica de promedios.</w:t>
-      </w:r>
-    </w:p>
-    <w:p>
-      <w:pPr>
-        <w:pStyle w:val="ListBullet"/>
-      </w:pPr>
-      <w:r>
-        <w:rPr/>
-        <w:t>El sitio no interpreta los resultados ni los compara con valores de referencia; esa lectura corresponde al grupo.</w:t>
-      </w:r>
-    </w:p>
-    <w:p>
-      <w:pPr>
-        <w:pStyle w:val="ListBullet"/>
-      </w:pPr>
-      <w:r>
-        <w:rPr/>
-        <w:t>Explicar cómo se lee: una barra alta es un tamaño que se repite mucho; barras repartidas, tamaños muy distintos.</w:t>
+      <w:r>
+        <w:rPr/>
+        <w:t>Debajo está una gráfica que se llama «Distribución de tamaños». Es un histograma. Les explico cómo se construye. Se toma la célula más pequeña y la más grande de la imagen, y el rango entre las dos se divide en diez intervalos iguales. En el eje horizontal están esos intervalos, con el área en píxeles. En el eje vertical está cuántas células cayeron en cada uno.</w:t>
       </w:r>
     </w:p>
     <w:p>
@@ -3834,6 +4319,24 @@
     </w:p>
     <w:p>
       <w:r>
+        <w:rPr/>
+        <w:t>Una barra alta significa que hay muchas células con ese tamaño. Si las barras están repartidas parejo, los tamaños son muy variados. Algo importante: el histograma no supone ninguna forma. No asume que los tamaños se repartan de cierta manera. Dibuja lo que se midió y ya. Y si se suben varias imágenes, se usa un rango común para todas y aparece, además, una gráfica con los promedios.</w:t>
+      </w:r>
+    </w:p>
+    <w:p>
+      <w:r>
+        <w:rPr/>
+        <w:t>Les cuento cómo leerlo, con dos formas típicas. Si las barras forman una sola montaña, con un centro claro y colas hacia los lados, los tamaños se concentran alrededor de un valor. Si aparecen dos montañas separadas, podría ser que haya dos grupos de tamaños distintos, pero también podría ser un problema de las marcas, así que antes de concluir nada hay que mirar la imagen. Y una barra aislada en el extremo derecho suele ser una célula muy grande, o varias células pegadas que se contaron como una. Cualquiera de esas lecturas se comprueba en la imagen marcada, y ahí es donde el visor nos va a servir.</w:t>
+      </w:r>
+    </w:p>
+    <w:p>
+      <w:r>
+        <w:rPr/>
+        <w:t>Una aclaración: el sitio no interpreta los resultados ni los compara con valores de referencia. Eso lo hace el grupo. El sitio da los números y la gráfica; la lectura científica les corresponde a ustedes.</w:t>
+      </w:r>
+    </w:p>
+    <w:p>
+      <w:r>
         <w:rPr>
           <w:color w:val="C00000"/>
         </w:rPr>
@@ -3841,21 +4344,9 @@
       </w:r>
     </w:p>
     <w:p>
-      <w:pPr>
-        <w:pStyle w:val="ListBullet"/>
-      </w:pPr>
-      <w:r>
-        <w:rPr/>
-        <w:t>El visor sirve para revisar si un contorno corresponde de verdad a un espermatozoide. Al pasar el cursor sale su número, su área y su largo, en píxeles y en micras.</w:t>
-      </w:r>
-    </w:p>
-    <w:p>
-      <w:pPr>
-        <w:pStyle w:val="ListBullet"/>
-      </w:pPr>
-      <w:r>
-        <w:rPr/>
-        <w:t>Si en la imagen de ejemplo hay un contorno que no encierra una cabeza completa, usarlo como ejemplo de por qué conviene revisar.</w:t>
+      <w:r>
+        <w:rPr/>
+        <w:t>Y para comprobar que los contornos son los correctos, tenemos el visor. Si hago clic sobre la imagen, se abre una ventana a pantalla completa. Arriba hay botones para acercar y alejar, para ajustar la imagen a la pantalla y para verla a tamaño real. También puedo acercar con la rueda del mouse y arrastrar para moverme.</w:t>
       </w:r>
     </w:p>
     <w:p>
@@ -3874,6 +4365,18 @@
     </w:p>
     <w:p>
       <w:r>
+        <w:rPr/>
+        <w:t>Si paso el cursor por encima de un espermatozoide, aparece su número, su área y su largo, en píxeles y en micras. Si encuentran uno que no encierra una cabeza completa, ese es justo el tipo de cosa que conviene saber. Cierro el visor con la equis.</w:t>
+      </w:r>
+    </w:p>
+    <w:p>
+      <w:r>
+        <w:rPr/>
+        <w:t>Les propongo una forma práctica de auditar un resultado. Elijan cinco números al azar de la tabla, ubiquen cada uno en la imagen con el visor y comprueben que el contorno encierra una cabeza completa. Si en esos cinco todo está bien, tienen una buena señal de que el análisis es confiable. Si en esos cinco encuentran varios problemas, desconfíen del conteo y de las medidas y revisen con más cuidado, porque el modelo puede estar teniendo dificultades con ese tipo de imagen. Es una revisión de pocos minutos y vale la pena hacerla antes de usar los números.</w:t>
+      </w:r>
+    </w:p>
+    <w:p>
+      <w:r>
         <w:rPr>
           <w:color w:val="C00000"/>
         </w:rPr>
@@ -3881,21 +4384,15 @@
       </w:r>
     </w:p>
     <w:p>
-      <w:pPr>
-        <w:pStyle w:val="ListBullet"/>
-      </w:pPr>
-      <w:r>
-        <w:rPr/>
-        <w:t>Más abajo, la tabla con una fila por espermatozoide, con el área y el largo en píxeles y en micras. Es la misma información que el CSV.</w:t>
-      </w:r>
-    </w:p>
-    <w:p>
-      <w:pPr>
-        <w:pStyle w:val="ListBullet"/>
-      </w:pPr>
-      <w:r>
-        <w:rPr/>
-        <w:t>Leer los números siempre junto con la imagen y la gráfica. Un ejemplo con números inventados, dicho como tal: dos fotos con 120 y 80 células no significan que una muestra tenga más, porque cada foto cuenta lo que estaba en esa zona. Una diferencia de medias solo se puede afirmar con una prueba estadística, y eso lo decide el grupo con el CSV.</w:t>
+      <w:r>
+        <w:rPr/>
+        <w:t>Más abajo está el detalle por espermatozoide: una tabla con una fila por célula. Las columnas son el número, el área y el largo en píxeles, y el área y el largo en micras. El número es el mismo que aparece en la imagen, así que pueden ir de una fila de la tabla a su contorno en la fotografía. Es la misma información que trae el archivo CSV que vamos a descargar en un momento.</w:t>
+      </w:r>
+    </w:p>
+    <w:p>
+      <w:r>
+        <w:rPr/>
+        <w:t>Antes de pasar al siguiente bloque, una advertencia sobre cómo leer todo esto.</w:t>
       </w:r>
     </w:p>
     <w:p>
@@ -3927,6 +4424,12 @@
       </w:r>
     </w:p>
     <w:p>
+      <w:r>
+        <w:rPr/>
+        <w:t>Les pongo un ejemplo, y es con números inventados, para que no se confundan. Imaginen que una foto tiene ciento veinte células y otra tiene ochenta. Eso no significa que una muestra tenga más células que la otra, porque cada foto cuenta lo que había en esa zona del campo del microscopio, y esa zona puede ser distinta. Y si lo que se quiere es decir que el tamaño medio de dos grupos es distinto, eso solo se puede afirmar con una prueba estadística, y esa decisión la toma el grupo a partir de los datos del CSV. Los números del sitio son un punto de partida para ese análisis. No lo reemplazan.</w:t>
+      </w:r>
+    </w:p>
+    <w:p>
       <w:pPr>
         <w:pStyle w:val="Heading1"/>
       </w:pPr>
@@ -3939,7 +4442,7 @@
         <w:rPr>
           <w:i/>
         </w:rPr>
-        <w:t>1:29-1:38 · 9 min (7 hablados) · tope 1,190 palabras</w:t>
+        <w:t>1:15-1:26 · 11 min · 1,156 palabras, unos 6.2 min de habla</w:t>
       </w:r>
     </w:p>
     <w:p>
@@ -3952,6 +4455,67 @@
       <w:r>
         <w:rPr/>
         <w:t xml:space="preserve"> el modelo no es perfecto: puede equivocarse, el sitio avisa cuando no puede analizar, y la forma de mejorar es con más datos, más variados y mejor etiquetados.</w:t>
+      </w:r>
+    </w:p>
+    <w:p>
+      <w:r>
+        <w:rPr>
+          <w:b/>
+        </w:rPr>
+        <w:t>Ideas, en orden:</w:t>
+      </w:r>
+    </w:p>
+    <w:p>
+      <w:pPr>
+        <w:pStyle w:val="ListBullet"/>
+      </w:pPr>
+      <w:r>
+        <w:rPr/>
+        <w:t>¿Qué pasa si subo una imagen que no es de espermatozoides?</w:t>
+      </w:r>
+    </w:p>
+    <w:p>
+      <w:pPr>
+        <w:pStyle w:val="ListBullet"/>
+      </w:pPr>
+      <w:r>
+        <w:rPr/>
+        <w:t>El sitio prefiere no analizar a dar un número dudoso; aun así, no hay garantía.</w:t>
+      </w:r>
+    </w:p>
+    <w:p>
+      <w:pPr>
+        <w:pStyle w:val="ListBullet"/>
+      </w:pPr>
+      <w:r>
+        <w:rPr/>
+        <w:t>Falso positivo, en biología; alucinación, en programación.</w:t>
+      </w:r>
+    </w:p>
+    <w:p>
+      <w:pPr>
+        <w:pStyle w:val="ListBullet"/>
+      </w:pPr>
+      <w:r>
+        <w:rPr/>
+        <w:t>Por qué pasa: la red solo aprende de lo que vio.</w:t>
+      </w:r>
+    </w:p>
+    <w:p>
+      <w:pPr>
+        <w:pStyle w:val="ListBullet"/>
+      </w:pPr>
+      <w:r>
+        <w:rPr/>
+        <w:t>Cómo se mejora: más datos, más variados y mejor etiquetados; qué puede hacer cada persona.</w:t>
+      </w:r>
+    </w:p>
+    <w:p>
+      <w:r>
+        <w:rPr>
+          <w:b/>
+        </w:rPr>
+        <w:t>Texto para decir:</w:t>
       </w:r>
     </w:p>
     <w:p>
@@ -3968,25 +4532,11 @@
     </w:p>
     <w:p>
       <w:r>
-        <w:rPr>
-          <w:b/>
-        </w:rPr>
-        <w:t>Ideas, en orden:</w:t>
-      </w:r>
-    </w:p>
-    <w:p>
-      <w:pPr>
-        <w:pStyle w:val="ListBullet"/>
-      </w:pPr>
-      <w:r>
-        <w:rPr/>
-        <w:t>Plantear la pregunta: ¿qué pasa si subo una imagen que no es de espermatozoides?</w:t>
-      </w:r>
-    </w:p>
-    <w:p>
-      <w:pPr>
-        <w:pStyle w:val="ListBullet"/>
-      </w:pPr>
+        <w:rPr/>
+        <w:t>Hasta ahora todo salió bien, porque usamos una imagen pensada para que saliera bien. Ahora la pregunta incómoda: ¿qué pasa si subo una imagen que no es de espermatozoides? Preparé tres imágenes de libre uso, por ejemplo de células de hígado y de riñón, para probarlo en vivo.</w:t>
+      </w:r>
+    </w:p>
+    <w:p>
       <w:r>
         <w:rPr>
           <w:color w:val="C00000"/>
@@ -3995,25 +4545,13 @@
       </w:r>
       <w:r>
         <w:rPr/>
-        <w:t xml:space="preserve"> Mostrar lo que el sitio realmente responda: un mensaje en rojo sobre la imagen o, si marca algo, la imagen con sus contornos. Si responde «no se encontraron espermatozoides o la imagen es de mala calidad; no es factible analizarla», decirlo así: el sitio no entrega números dudosos.</w:t>
-      </w:r>
-    </w:p>
-    <w:p>
-      <w:pPr>
-        <w:pStyle w:val="ListBullet"/>
-      </w:pPr>
-      <w:r>
-        <w:rPr/>
-        <w:t>Aclarar que no hay garantía: la red aprendió de pocas imágenes y puede marcar manchas que se le parezcan.</w:t>
-      </w:r>
-    </w:p>
-    <w:p>
-      <w:pPr>
-        <w:pStyle w:val="ListBullet"/>
-      </w:pPr>
-      <w:r>
-        <w:rPr/>
-        <w:t>Insistir en que el aviso es parte del diseño: el sitio prefiere no analizar a inventar un resultado.</w:t>
+        <w:t xml:space="preserve"> Mostrar lo que el sitio realmente responda: un mensaje en rojo sobre la imagen o, si marca algo, la imagen con sus contornos.</w:t>
+      </w:r>
+    </w:p>
+    <w:p>
+      <w:r>
+        <w:rPr/>
+        <w:t>Voy a seleccionar las tres imágenes y a hacer clic en «Analizar». Les voy a mostrar lo que el sitio responda de verdad, sea lo que sea. No preparé el resultado de antemano, y no sé exactamente qué va a decir con cada una, así que lo vemos juntos. Mientras corre, recuerden lo que dijimos hace un rato: el modelo se entrenó con fotos de espermatozoides, y estas son de otro tipo de célula, así que se trata de una prueba justa de qué hace el sistema ante algo que no conoce. Lo que espero es que, en el mejor caso, el sitio me diga que no es factible analizarlas.</w:t>
       </w:r>
     </w:p>
     <w:p>
@@ -4031,6 +4569,36 @@
       </w:r>
     </w:p>
     <w:p>
+      <w:r>
+        <w:rPr/>
+        <w:t>Esa respuesta, que dice que no se encontraron espermatozoides o que la imagen es de mala calidad y que no es factible analizarla, es parte del diseño. El sitio prefiere no analizar a inventar un resultado. Y esto conecta con el primer principio de hace rato, el de no suponer.</w:t>
+      </w:r>
+    </w:p>
+    <w:p>
+      <w:r>
+        <w:rPr/>
+        <w:t>Si el sitio marcó algo en alguna de las tres imágenes, ese es un buen ejemplo de falso positivo, y no hay que esconderlo. Lo abrimos en el visor y vemos qué encerró el contorno: una zona más oscura, un borde, un trozo de algo que se parece a lo que el modelo aprendió. Un caso así enseña más que diez casos que salieron bien, porque muestra exactamente dónde está el límite de lo que el modelo sabe.</w:t>
+      </w:r>
+    </w:p>
+    <w:p>
+      <w:r>
+        <w:rPr/>
+        <w:t>Pero tengo que ser honesto con ustedes. Que el sitio avise en estos casos no es una garantía. La red aprendió de un conjunto limitado de imágenes, y puede marcar manchas que se le parezcan a lo que aprendió a reconocer. Nadie debería darle un resultado por bueno sin mirarlo.</w:t>
+      </w:r>
+    </w:p>
+    <w:p>
+      <w:r>
+        <w:rPr/>
+        <w:t>Para entender por qué pasa esto, hay una idea previa que condiciona cómo se escucha el resto del curso. Una red neuronal no entiende qué es un espermatozoide. No tiene el concepto, no sabe de biología, no sabe qué es una célula ni para qué sirve contarla. Lo que tiene es una enorme colección de números ajustados, de modo que ante ciertos patrones de píxeles produce una salida que coincide con lo que las personas marcaron en los ejemplos. Es un reconocedor de patrones muy sofisticado, y nada más. Eso no le quita mérito, y sirve para razonar sobre cuándo va a funcionar y cuándo no.</w:t>
+      </w:r>
+    </w:p>
+    <w:p>
+      <w:r>
+        <w:rPr/>
+        <w:t>Si le muestro una imagen parecida a las de su entrenamiento, va a funcionar. Si le muestro algo muy distinto, no tiene cómo saber que se equivoca, y va a producir una salida con la misma seguridad aparente. Esa es la parte que más cuidado exige: el modelo no duda. Puede marcar algo con el mismo aspecto de firmeza con el que marca un espermatozoide perfecto. Por eso la revisión de las personas no es opcional.</w:t>
+      </w:r>
+    </w:p>
+    <w:p>
       <w:pPr>
         <w:spacing w:before="200"/>
       </w:pPr>
@@ -4043,9 +4611,6 @@
       </w:r>
     </w:p>
     <w:p>
-      <w:pPr>
-        <w:pStyle w:val="ListBullet"/>
-      </w:pPr>
       <w:r>
         <w:rPr>
           <w:color w:val="C00000"/>
@@ -4054,34 +4619,7 @@
       </w:r>
       <w:r>
         <w:rPr/>
-        <w:t xml:space="preserve"> Un falso positivo es marcar como espermatozoide algo que no lo es, por ejemplo una sombra, una mancha o un trozo de cola. En programación a esto se le llama también alucinación.</w:t>
-      </w:r>
-    </w:p>
-    <w:p>
-      <w:pPr>
-        <w:pStyle w:val="ListBullet"/>
-      </w:pPr>
-      <w:r>
-        <w:rPr/>
-        <w:t>Por qué pasa: la red solo aprende de los ejemplos que vio. Con pocos ejemplos, hay casos que no aprendió a resolver.</w:t>
-      </w:r>
-    </w:p>
-    <w:p>
-      <w:pPr>
-        <w:pStyle w:val="ListBullet"/>
-      </w:pPr>
-      <w:r>
-        <w:rPr/>
-        <w:t>Cómo se mejora: más datos, más variados y mejor etiquetados. Si aun así no alcanza, habría que cambiar de arquitectura.</w:t>
-      </w:r>
-    </w:p>
-    <w:p>
-      <w:pPr>
-        <w:pStyle w:val="ListBullet"/>
-      </w:pPr>
-      <w:r>
-        <w:rPr/>
-        <w:t>Qué puede hacer cada persona: revisar la imagen marcada y guardar las imágenes que el modelo analiza con dificultad, porque son las más útiles para reentrenar.</w:t>
+        <w:t xml:space="preserve"> A veces el modelo marca como espermatozoide algo que no lo es: una sombra, una mancha o un trozo de cola. En la diapositiva lo ven dibujado: tres espermatozoides bien marcados y una mancha con un contorno naranja que dice «¿mancha o célula?».</w:t>
       </w:r>
     </w:p>
     <w:p>
@@ -4099,6 +4637,42 @@
       </w:r>
     </w:p>
     <w:p>
+      <w:r>
+        <w:rPr/>
+        <w:t>Un falso positivo es eso: el modelo dice que hay algo donde no lo hay. En programación y en inteligencia artificial a esto también se le llama alucinación. Es un fenómeno conocido, y se presenta en modelos de muchos tipos. Les pasa en general cuando se topan con algo que se parece a lo que aprendieron.</w:t>
+      </w:r>
+    </w:p>
+    <w:p>
+      <w:r>
+        <w:rPr/>
+        <w:t>¿Por qué pasa? Porque la red solo aprende de los ejemplos que vio. Si vio pocos ejemplos de un caso, o ninguno, no aprendió a resolverlo. Es como alguien que aprendió a reconocer un tipo de ave viendo cien fotos: si le muestran algo que se parece pero no es, puede equivocarse.</w:t>
+      </w:r>
+    </w:p>
+    <w:p>
+      <w:r>
+        <w:rPr/>
+        <w:t>Existe también el error contrario, que es menos visible. Un falso negativo es no marcar un espermatozoide que sí está. Cuando el modelo se salta una célula, no hay contorno que revisar, y por eso es más difícil de notar que un falso positivo. Es otra razón para mirar la imagen entera y no solo los contornos que sí aparecen. Si ven en la foto una cabeza brillante que no tiene número, ese es un falso negativo, y también es útil saberlo.</w:t>
+      </w:r>
+    </w:p>
+    <w:p>
+      <w:r>
+        <w:rPr/>
+        <w:t>Entre los dos tipos de error hay un equilibrio. Un modelo muy cuidadoso, que solo marca cuando está seguro, comete menos falsos positivos pero se salta más células. Uno muy generoso marca casi todo, pero se equivoca más seguido al marcar. Cómo se ajusta ese equilibrio es una decisión de diseño.</w:t>
+      </w:r>
+    </w:p>
+    <w:p>
+      <w:r>
+        <w:rPr/>
+        <w:t>Y si un resultado les parece raro, hay una pequeña lista de cosas que pueden revisar. Primero, el tipo de imagen: ¿se parece a las que el modelo conoce? Segundo, el formato: ¿es un archivo original o uno que pasó por compresión? Tercero, el aviso que muestra el sitio: ¿dice algo sobre la imagen? Cuarto, el visor: ¿los contornos encierran lo que deberían? Y quinto, un conteo manual de una zona pequeña, para comparar con lo que marcó el modelo. Con esas cinco comprobaciones se sabe, casi siempre, si el resultado se puede usar.</w:t>
+      </w:r>
+    </w:p>
+    <w:p>
+      <w:r>
+        <w:rPr/>
+        <w:t>¿Y cómo se mejora? Con más datos, más variados y mejor etiquetados. Es decir, con más imágenes, de más condiciones, y con las marcas hechas con cuidado. Si aun así no alcanzara, habría que cambiar de arquitectura, que es la forma en la que está construida la red, y eso es una decisión mayor.</w:t>
+      </w:r>
+    </w:p>
+    <w:p>
       <w:pPr>
         <w:pBdr>
           <w:left w:val="single" w:sz="24" w:space="8" w:color="BF9000"/>
@@ -4114,30 +4688,30 @@
     </w:p>
     <w:p>
       <w:r>
+        <w:rPr/>
+        <w:t>Y de ahí sale lo que me parece más importante de este bloque. Un hábito muy útil es revisar la imagen marcada y guardar las imágenes que el modelo analiza con dificultad. Esas son las más valiosas para volver a entrenar.</w:t>
+      </w:r>
+    </w:p>
+    <w:p>
+      <w:r>
+        <w:rPr/>
+        <w:t>Si alguien se pregunta si el modelo mejora solo con el uso, la respuesta es que no. Un modelo en línea no aprende de las imágenes que analiza. Para mejorarlo hay que reunir imágenes nuevas, etiquetarlas, entrenar otra vez en Colab y cambiar el archivo del modelo en el servidor. Eso es lo que vemos el martes.</w:t>
+      </w:r>
+    </w:p>
+    <w:p>
+      <w:pPr>
+        <w:pStyle w:val="Heading1"/>
+      </w:pPr>
+      <w:r>
+        <w:t>Bloque 10. Descargas, Mis análisis y privacidad</w:t>
+      </w:r>
+    </w:p>
+    <w:p>
+      <w:r>
         <w:rPr>
           <w:i/>
         </w:rPr>
-        <w:t>Si preguntan si el modelo mejora solo con el uso:</w:t>
-      </w:r>
-      <w:r>
-        <w:rPr/>
-        <w:t xml:space="preserve"> no. Un modelo en línea no aprende de las imágenes que analiza. Para mejorarlo hay que reunir imágenes nuevas, etiquetarlas, reentrenar en Colab y cambiar el archivo del modelo en el servidor. Eso se ve en la sesión 4.</w:t>
-      </w:r>
-    </w:p>
-    <w:p>
-      <w:pPr>
-        <w:pStyle w:val="Heading1"/>
-      </w:pPr>
-      <w:r>
-        <w:t>Bloque 10. Descargas, Mis análisis y privacidad</w:t>
-      </w:r>
-    </w:p>
-    <w:p>
-      <w:r>
-        <w:rPr>
-          <w:i/>
-        </w:rPr>
-        <w:t>1:38-1:46 · 8 min (6 hablados) · tope 1,020 palabras</w:t>
+        <w:t>1:26-1:32 · 6 min · 661 palabras, unos 3.6 min de habla</w:t>
       </w:r>
     </w:p>
     <w:p>
@@ -4155,6 +4729,67 @@
     <w:p>
       <w:r>
         <w:rPr>
+          <w:b/>
+        </w:rPr>
+        <w:t>Ideas, en orden:</w:t>
+      </w:r>
+    </w:p>
+    <w:p>
+      <w:pPr>
+        <w:pStyle w:val="ListBullet"/>
+      </w:pPr>
+      <w:r>
+        <w:rPr/>
+        <w:t>Al final de la página: Imprimir, Descargar PDF y Descargar CSV.</w:t>
+      </w:r>
+    </w:p>
+    <w:p>
+      <w:pPr>
+        <w:pStyle w:val="ListBullet"/>
+      </w:pPr>
+      <w:r>
+        <w:rPr/>
+        <w:t>CSV: una fila por espermatozoide, seis columnas, para seguir trabajando.</w:t>
+      </w:r>
+    </w:p>
+    <w:p>
+      <w:pPr>
+        <w:pStyle w:val="ListBullet"/>
+      </w:pPr>
+      <w:r>
+        <w:rPr/>
+        <w:t>PDF: informe con portada, una página por imagen y gráfica de promedios.</w:t>
+      </w:r>
+    </w:p>
+    <w:p>
+      <w:pPr>
+        <w:pStyle w:val="ListBullet"/>
+      </w:pPr>
+      <w:r>
+        <w:rPr/>
+        <w:t>«Mis análisis»: qué se guarda y qué no.</w:t>
+      </w:r>
+    </w:p>
+    <w:p>
+      <w:pPr>
+        <w:pStyle w:val="ListBullet"/>
+      </w:pPr>
+      <w:r>
+        <w:rPr/>
+        <w:t>Privacidad: cada análisis es de quien lo hizo; guardar los originales.</w:t>
+      </w:r>
+    </w:p>
+    <w:p>
+      <w:r>
+        <w:rPr>
+          <w:b/>
+        </w:rPr>
+        <w:t>Texto para decir:</w:t>
+      </w:r>
+    </w:p>
+    <w:p>
+      <w:r>
+        <w:rPr>
           <w:color w:val="C00000"/>
         </w:rPr>
         <w:t>[Pantalla: bajar al final de la página de resultados. Debajo de la tabla hay una fila de botones: «Imprimir» (verde), «Descargar PDF» y «Descargar CSV» (con borde) y el enlace «Analizar otras imágenes».]</w:t>
@@ -4162,37 +4797,26 @@
     </w:p>
     <w:p>
       <w:r>
-        <w:rPr>
-          <w:b/>
-        </w:rPr>
-        <w:t>Ideas, en orden:</w:t>
-      </w:r>
-    </w:p>
-    <w:p>
-      <w:pPr>
-        <w:pStyle w:val="ListBullet"/>
-      </w:pPr>
-      <w:r>
-        <w:rPr/>
-        <w:t>CSV: un archivo de texto, con una fila por espermatozoide y seis columnas (imagen, número, área y largo en píxeles, área y largo en micras). Se abre en una hoja de cálculo o con código. Sirve para seguir trabajando con los datos.</w:t>
-      </w:r>
-    </w:p>
-    <w:p>
-      <w:pPr>
-        <w:pStyle w:val="ListBullet"/>
-      </w:pPr>
-      <w:r>
-        <w:rPr/>
-        <w:t>PDF: un solo informe con todas las imágenes. Primera página con el encabezado, el usuario, la fecha y el número de imágenes; luego una página por imagen, con su marca, sus datos y su gráfica; y al final la gráfica de promedios. Las medidas van primero en micras y después en píxeles. Se genera una sola vez y no cambia después.</w:t>
-      </w:r>
-    </w:p>
-    <w:p>
-      <w:pPr>
-        <w:pStyle w:val="ListBullet"/>
-      </w:pPr>
-      <w:r>
-        <w:rPr/>
-        <w:t>Imprimir: oculta el menú y los botones; se imprime solo el análisis.</w:t>
+        <w:rPr/>
+        <w:t>Volvamos a la página de resultados de la imagen de ejemplo, y bajo hasta el final. Debajo de la tabla hay una fila de botones: Imprimir, Descargar PDF, Descargar CSV, y un enlace para analizar otras imágenes.</w:t>
+      </w:r>
+    </w:p>
+    <w:p>
+      <w:r>
+        <w:rPr/>
+        <w:t>El CSV es un archivo de texto con una fila por espermatozoide y seis columnas: la imagen de la que viene, el número del espermatozoide, el área y el largo en píxeles, y el área y el largo en micras. Se abre en una hoja de cálculo o con código, y sirve para seguir trabajando con los datos: hacer comparaciones, estadística, gráficas propias. Como la primera columna trae el nombre de la imagen, si subieron varias pueden separar los datos por imagen o por condición, ordenarlos, filtrarlos, calcular promedios por grupo y hacer sus propias gráficas con las herramientas que ya usan.</w:t>
+      </w:r>
+    </w:p>
+    <w:p>
+      <w:r>
+        <w:rPr/>
+        <w:t>Esta es la razón por la que dije que el sitio no interpreta los resultados. El sitio llega hasta los datos; lo que sigue, la comparación entre condiciones y las pruebas estadísticas, es trabajo del grupo, y el CSV es el punto de partida.</w:t>
+      </w:r>
+    </w:p>
+    <w:p>
+      <w:r>
+        <w:rPr/>
+        <w:t>El PDF es un solo informe con todas las imágenes del análisis. La primera página trae el encabezado, el usuario, la fecha y el número de imágenes. Luego hay una página por imagen, con la imagen marcada, sus datos y su gráfica. Y al final, si se subieron varias imágenes, la gráfica de promedios. Las medidas van primero en micras y después en píxeles. El PDF se genera una sola vez y no cambia después, así que sirve como constancia de ese análisis. Es el formato adecuado para adjuntar a un reporte, para compartir con alguien que no tiene cuenta, o para guardar como registro de lo que se midió y con qué escala.</w:t>
       </w:r>
     </w:p>
     <w:p>
@@ -4210,6 +4834,26 @@
       </w:r>
     </w:p>
     <w:p>
+      <w:r>
+        <w:rPr/>
+        <w:t>Y el botón de Imprimir oculta el menú y los botones, y deja solo el análisis, para imprimir limpio.</w:t>
+      </w:r>
+    </w:p>
+    <w:p>
+      <w:r>
+        <w:rPr>
+          <w:color w:val="C00000"/>
+        </w:rPr>
+        <w:t>[Acción: clic en el nombre de la persona, arriba a la derecha. Se abre el perfil: el nombre como título, el correo debajo y, bajo «Mis análisis», una tabla de tres columnas (fecha y hora, imágenes y descargas) con una fila por análisis. La fecha es un enlace al análisis, y en la última columna están los enlaces «PDF» y «CSV».]</w:t>
+      </w:r>
+    </w:p>
+    <w:p>
+      <w:r>
+        <w:rPr/>
+        <w:t>Si hago clic en mi nombre, arriba a la derecha, llego a mi perfil. Ahí está «Mis análisis»: una tabla con una fila por cada análisis que he hecho. Muestra la fecha y la hora, los nombres de las imágenes y los enlaces para descargar el PDF y el CSV. Si hago clic en la fecha, abro ese análisis, y se ve igual que cuando terminó. No se recalcula, solo se consulta.</w:t>
+      </w:r>
+    </w:p>
+    <w:p>
       <w:pPr>
         <w:pBdr>
           <w:left w:val="single" w:sz="24" w:space="8" w:color="BF9000"/>
@@ -4220,53 +4864,13 @@
       </w:pPr>
       <w:r>
         <w:rPr/>
-        <w:t>El PDF trae una página por imagen, con la imagen marcada, sus datos y su gráfica. Las medidas van primero en micras y después en píxeles.</w:t>
-      </w:r>
-    </w:p>
-    <w:p>
-      <w:r>
-        <w:rPr>
-          <w:color w:val="C00000"/>
-        </w:rPr>
-        <w:t>[Acción: clic en el nombre de la persona, arriba a la derecha. Se abre el perfil: el nombre como título, el correo debajo y, bajo «Mis análisis», una tabla de tres columnas (fecha y hora, imágenes y descargas) con una fila por análisis. La fecha es un enlace al análisis, y en la última columna están los enlaces «PDF» y «CSV».]</w:t>
-      </w:r>
-    </w:p>
-    <w:p>
-      <w:pPr>
-        <w:pStyle w:val="ListBullet"/>
-      </w:pPr>
-      <w:r>
-        <w:rPr/>
-        <w:t>«Mis análisis»: una tabla con una fila por análisis, con la fecha, las imágenes y los enlaces al PDF y al CSV. Al abrir uno se ve igual que cuando terminó; no se recalcula.</w:t>
-      </w:r>
-    </w:p>
-    <w:p>
-      <w:pPr>
-        <w:pStyle w:val="ListBullet"/>
-      </w:pPr>
-      <w:r>
-        <w:rPr/>
-        <w:t>Qué se guarda y qué no: se guardan los resultados, una copia reducida de la imagen marcada y el PDF. Las imágenes originales se borran del servidor al terminar el análisis. Hay que guardar los originales por cuenta propia.</w:t>
-      </w:r>
-    </w:p>
-    <w:p>
-      <w:pPr>
-        <w:pStyle w:val="ListBullet"/>
-      </w:pPr>
-      <w:r>
-        <w:rPr/>
-        <w:t>Privacidad: cada análisis es de quien lo hizo y solo esa persona puede verlo.</w:t>
-      </w:r>
-    </w:p>
-    <w:p>
-      <w:pPr>
-        <w:pStyle w:val="ListBullet"/>
-      </w:pPr>
-      <w:r>
-        <w:rPr>
-          <w:color w:val="C00000"/>
-        </w:rPr>
-        <w:t>[Acción: hacer clic en «Salir», arriba a la derecha; el sitio vuelve a mostrar «Iniciar sesión».]</w:t>
+        <w:t>En «Mis análisis» queda una fila por cada análisis, con sus enlaces al PDF y al CSV. Al abrirlo, se ve igual que cuando terminó.</w:t>
+      </w:r>
+    </w:p>
+    <w:p>
+      <w:r>
+        <w:rPr/>
+        <w:t>Hablemos de qué se guarda y qué no, porque es importante para la privacidad. El sitio guarda los resultados, una copia reducida de la imagen marcada y el PDF. Lo que no guarda son las imágenes originales: se borran del servidor en cuanto termina el análisis.</w:t>
       </w:r>
     </w:p>
     <w:p>
@@ -4280,7 +4884,132 @@
       </w:pPr>
       <w:r>
         <w:rPr/>
-        <w:t>En «Mis análisis» queda una fila por cada análisis, con sus enlaces al PDF y al CSV. Al abrirlo, se ve igual que cuando terminó.</w:t>
+        <w:t>Las imágenes que suben se borran del servidor cuando termina el análisis. Guarden sus originales en su propia computadora.</w:t>
+      </w:r>
+    </w:p>
+    <w:p>
+      <w:r>
+        <w:rPr/>
+        <w:t>Eso significa que si quieren volver a ver o volver a analizar una imagen, tienen que conservar su original en su propia computadora. El sitio no se las puede devolver.</w:t>
+      </w:r>
+    </w:p>
+    <w:p>
+      <w:r>
+        <w:rPr/>
+        <w:t>Esto tiene una consecuencia a favor de la privacidad: mientras menos material de las personas guarde el servidor, menos hay que proteger. Lo que sí se guarda es lo necesario para consultar el análisis después: los resultados, una copia reducida de la imagen marcada y el informe en PDF.</w:t>
+      </w:r>
+    </w:p>
+    <w:p>
+      <w:r>
+        <w:rPr/>
+        <w:t>Y una buena práctica de orden: guarden en una misma carpeta los originales, el CSV y el PDF de cada análisis, con el mismo nombre de condición. Dentro de unos meses, cuando alguien pregunte de dónde salió un número, esa carpeta va a contestar la pregunta.</w:t>
+      </w:r>
+    </w:p>
+    <w:p>
+      <w:r>
+        <w:rPr/>
+        <w:t>Y sobre la privacidad: cada análisis es de quien lo hizo, y solo esa persona puede verlo. Nadie más puede abrirlo.</w:t>
+      </w:r>
+    </w:p>
+    <w:p>
+      <w:r>
+        <w:rPr>
+          <w:color w:val="C00000"/>
+        </w:rPr>
+        <w:t>[Acción: hacer clic en «Salir», arriba a la derecha; el sitio vuelve a mostrar «Iniciar sesión».]</w:t>
+      </w:r>
+      <w:r>
+        <w:rPr/>
+        <w:t xml:space="preserve"> Hago clic en «Salir», y el sitio vuelve a mostrar «Iniciar sesión». Con esto cerramos el recorrido del sistema.</w:t>
+      </w:r>
+    </w:p>
+    <w:p>
+      <w:pPr>
+        <w:pStyle w:val="Heading1"/>
+      </w:pPr>
+      <w:r>
+        <w:t>Bloque 11. Cierre y adelanto de la sesión 2</w:t>
+      </w:r>
+    </w:p>
+    <w:p>
+      <w:r>
+        <w:rPr>
+          <w:i/>
+        </w:rPr>
+        <w:t>1:32-1:36 · 4 min · 464 palabras, unos 2.5 min de habla</w:t>
+      </w:r>
+    </w:p>
+    <w:p>
+      <w:r>
+        <w:rPr>
+          <w:b/>
+        </w:rPr>
+        <w:t>Idea que debe quedar:</w:t>
+      </w:r>
+      <w:r>
+        <w:rPr/>
+        <w:t xml:space="preserve"> el sitio convierte una fotografía en datos confiables y descargables, y la siguiente pregunta es cómo sabe la red dónde hay un espermatozoide.</w:t>
+      </w:r>
+    </w:p>
+    <w:p>
+      <w:r>
+        <w:rPr>
+          <w:b/>
+        </w:rPr>
+        <w:t>Ideas, en orden:</w:t>
+      </w:r>
+    </w:p>
+    <w:p>
+      <w:pPr>
+        <w:pStyle w:val="ListBullet"/>
+      </w:pPr>
+      <w:r>
+        <w:rPr/>
+        <w:t>Resumen en cuatro frases: el problema, la idea, el sitio y la privacidad.</w:t>
+      </w:r>
+    </w:p>
+    <w:p>
+      <w:pPr>
+        <w:pStyle w:val="ListBullet"/>
+      </w:pPr>
+      <w:r>
+        <w:rPr/>
+        <w:t>Cinco hábitos para usar el sitio.</w:t>
+      </w:r>
+    </w:p>
+    <w:p>
+      <w:pPr>
+        <w:pStyle w:val="ListBullet"/>
+      </w:pPr>
+      <w:r>
+        <w:rPr/>
+        <w:t>La pregunta de mañana y el adelanto del lunes.</w:t>
+      </w:r>
+    </w:p>
+    <w:p>
+      <w:r>
+        <w:rPr>
+          <w:b/>
+        </w:rPr>
+        <w:t>Texto para decir:</w:t>
+      </w:r>
+    </w:p>
+    <w:p>
+      <w:pPr>
+        <w:spacing w:before="200"/>
+      </w:pPr>
+      <w:r>
+        <w:rPr>
+          <w:b/>
+          <w:color w:val="1F4E79"/>
+        </w:rPr>
+        <w:t>[Diapositiva · Lo que vimos hoy]</w:t>
+      </w:r>
+    </w:p>
+    <w:p>
+      <w:r>
+        <w:rPr/>
+        <w:t>Para cerrar, un resumen de lo que vimos en dos horas, en cuatro frases.</w:t>
       </w:r>
     </w:p>
     <w:p>
@@ -4294,35 +5023,13 @@
       </w:pPr>
       <w:r>
         <w:rPr/>
-        <w:t>Las imágenes que suben se borran del servidor cuando termina el análisis. Guarden sus originales en su propia computadora.</w:t>
-      </w:r>
-    </w:p>
-    <w:p>
-      <w:pPr>
-        <w:pStyle w:val="Heading1"/>
-      </w:pPr>
-      <w:r>
-        <w:t>Bloque 11. Cierre y adelanto de la sesión 2</w:t>
-      </w:r>
-    </w:p>
-    <w:p>
-      <w:r>
-        <w:rPr>
-          <w:i/>
-        </w:rPr>
-        <w:t>1:46-1:51 · 5 min · tope 850 palabras</w:t>
-      </w:r>
-    </w:p>
-    <w:p>
-      <w:r>
-        <w:rPr>
-          <w:b/>
-        </w:rPr>
-        <w:t>Idea que debe quedar:</w:t>
-      </w:r>
-      <w:r>
-        <w:rPr/>
-        <w:t xml:space="preserve"> el sitio convierte una fotografía en datos confiables y descargables, y la siguiente pregunta es cómo sabe la red dónde hay un espermatozoide.</w:t>
+        <w:t>Para cerrar: el problema era contar y medir a mano; la idea, que la red localiza y el código mide; el sitio, que convierte una foto en datos que se pueden revisar y descargar; y cada análisis es de quien lo hizo.</w:t>
+      </w:r>
+    </w:p>
+    <w:p>
+      <w:r>
+        <w:rPr/>
+        <w:t>Si tuvieran que quedarse con una sola idea de hoy, que sea la segunda: la red localiza y el código mide. De ahí salen casi todas las decisiones que vieron en el sitio, desde los avisos hasta la escala declarada en cada resultado.</w:t>
       </w:r>
     </w:p>
     <w:p>
@@ -4334,24 +5041,13 @@
           <w:b/>
           <w:color w:val="1F4E79"/>
         </w:rPr>
-        <w:t>[Diapositiva · Lo que vimos hoy]</w:t>
-      </w:r>
-    </w:p>
-    <w:p>
-      <w:r>
-        <w:rPr>
-          <w:b/>
-        </w:rPr>
-        <w:t>Ideas, en orden:</w:t>
-      </w:r>
-    </w:p>
-    <w:p>
-      <w:pPr>
-        <w:pStyle w:val="ListBullet"/>
-      </w:pPr>
-      <w:r>
-        <w:rPr/>
-        <w:t>Resumir en cuatro frases: el problema (contar y medir a mano), la idea (la red localiza, el código mide), el sitio (cuenta, análisis, resultados, descargas) y la privacidad (cada análisis es de quien lo hizo).</w:t>
+        <w:t>[Diapositiva · Cinco hábitos para usar el sitio]</w:t>
+      </w:r>
+    </w:p>
+    <w:p>
+      <w:r>
+        <w:rPr/>
+        <w:t>Y les dejo cinco hábitos para usar el sitio de la mejor manera.</w:t>
       </w:r>
     </w:p>
     <w:p>
@@ -4365,7 +5061,13 @@
       </w:pPr>
       <w:r>
         <w:rPr/>
-        <w:t>Para cerrar: el problema era contar y medir a mano; la idea, que la red localiza y el código mide; el sitio, que convierte una foto en datos que se pueden revisar y descargar; y cada análisis es de quien lo hizo.</w:t>
+        <w:t>Cinco hábitos para llevarse: usar los archivos originales, agrupar las imágenes por tipo, revisar la imagen marcada antes de confiar en un número, guardar el CSV y guardar las imágenes difíciles.</w:t>
+      </w:r>
+    </w:p>
+    <w:p>
+      <w:r>
+        <w:rPr/>
+        <w:t>Los cinco tienen una razón de fondo parecida: cuidar lo que entra al sistema y lo que sale de él. Con originales y fotos agrupadas, los resultados se pueden comparar. Revisando la imagen marcada, no se confía a ciegas. El CSV es lo que permite seguir trabajando después. Y las imágenes difíciles son las que más enseñan al modelo cuando llegue el momento de volver a entrenarlo.</w:t>
       </w:r>
     </w:p>
     <w:p>
@@ -4377,16 +5079,13 @@
           <w:b/>
           <w:color w:val="1F4E79"/>
         </w:rPr>
-        <w:t>[Diapositiva · Cinco hábitos para usar el sitio]</w:t>
-      </w:r>
-    </w:p>
-    <w:p>
-      <w:pPr>
-        <w:pStyle w:val="ListBullet"/>
-      </w:pPr>
-      <w:r>
-        <w:rPr/>
-        <w:t>Cinco hábitos: trabajar con los archivos originales; agrupar las imágenes por tipo y condición; revisar la imagen marcada antes de confiar en los números; guardar el CSV; y guardar las imágenes que el modelo analiza con dificultad, porque son las más útiles para reentrenar.</w:t>
+        <w:t>[Diapositiva · ¿Cómo sabe el sistema dónde hay un espermatozoide?]</w:t>
+      </w:r>
+    </w:p>
+    <w:p>
+      <w:r>
+        <w:rPr/>
+        <w:t>Y termino con una pregunta que seguramente ya se hicieron varios.</w:t>
       </w:r>
     </w:p>
     <w:p>
@@ -4400,19 +5099,19 @@
       </w:pPr>
       <w:r>
         <w:rPr/>
-        <w:t>Cinco hábitos para llevarse: usar los archivos originales, agrupar las imágenes por tipo, revisar la imagen marcada antes de confiar en un número, guardar el CSV y guardar las imágenes difíciles.</w:t>
-      </w:r>
-    </w:p>
-    <w:p>
-      <w:pPr>
-        <w:spacing w:before="200"/>
-      </w:pPr>
-      <w:r>
-        <w:rPr>
-          <w:b/>
-          <w:color w:val="1F4E79"/>
-        </w:rPr>
-        <w:t>[Diapositiva · ¿Cómo sabe el sistema dónde hay un espermatozoide?]</w:t>
+        <w:t>Seguramente muchos se preguntan cómo sabe el sistema dónde hay un espermatozoide... bueno, esa es la pregunta de mañana: cómo aprende una computadora.</w:t>
+      </w:r>
+    </w:p>
+    <w:p>
+      <w:r>
+        <w:rPr/>
+        <w:t>Hoy vimos que la red localiza, pero no vimos cómo aprendió a hacerlo. Eso es lo que vamos a ver mañana, sábado a las nueve de la mañana: qué es una neurona, qué es una red, cómo mira una imagen una red convolucional y cómo aprende a partir de ejemplos. Es la sesión más pesada, así que los espero con ganas.</w:t>
+      </w:r>
+    </w:p>
+    <w:p>
+      <w:r>
+        <w:rPr/>
+        <w:t>Para ir calentando motores, un adelanto de cómo empieza. Vamos a retomar la idea que mencioné hoy de decir que todo lo que supere cierto brillo es célula, que se llama umbralización, y vamos a ver por qué no alcanza. De ahí partimos para entender qué hace distinto una red neuronal: cómo se construye desde su pieza más pequeña, la neurona, cómo se organiza en capas y cómo, a base de ejemplos, ajusta lo que necesita hasta acertar. No necesitan preparar nada. Si les quedó alguna duda de hoy, pueden traerla mañana.</w:t>
       </w:r>
     </w:p>
     <w:p>
@@ -4426,21 +5125,13 @@
       </w:pPr>
       <w:r>
         <w:rPr/>
-        <w:t>Seguramente muchos se preguntan cómo sabe el sistema dónde hay un espermatozoide... bueno, esa es la pregunta de mañana: cómo aprende una computadora.</w:t>
-      </w:r>
-    </w:p>
-    <w:p>
-      <w:pPr>
-        <w:pBdr>
-          <w:left w:val="single" w:sz="24" w:space="8" w:color="BF9000"/>
-        </w:pBdr>
-        <w:spacing w:before="80" w:after="160"/>
-        <w:ind w:left="397"/>
-        <w:shd w:val="clear" w:color="auto" w:fill="FFF2CC"/>
-      </w:pPr>
-      <w:r>
-        <w:rPr/>
         <w:t>El lunes vemos cómo funciona por dentro, y ahí les cuento los retos: las células empalmadas, los falsos positivos y la escala. Gracias por conectarse.</w:t>
+      </w:r>
+    </w:p>
+    <w:p>
+      <w:r>
+        <w:rPr/>
+        <w:t>Y el lunes abrimos el sistema por dentro: la parte de atrás, qué pasa cuando suben una imagen, y los retos que mencioné, como las células empalmadas, los falsos positivos y la escala. Gracias por conectarse, y quedo atento a las preguntas.</w:t>
       </w:r>
     </w:p>
     <w:p>

</xml_diff>

<commit_message>
Agrega la apertura, las versiones 3 a 5 del guion de la sesion 1, el guion dividido en seis videos con su version natural y las diapositivas y logos de apoyo
</commit_message>
<xml_diff>
--- a/docs/capacitacion/guion-sesion-1.docx
+++ b/docs/capacitacion/guion-sesion-1.docx
@@ -33,1886 +33,19 @@
     <w:p>
       <w:r>
         <w:rPr/>
-        <w:t>Cada bloque tiene cuatro partes:</w:t>
-      </w:r>
-    </w:p>
-    <w:p>
-      <w:pPr>
-        <w:pStyle w:val="ListBullet"/>
-      </w:pPr>
-      <w:r>
-        <w:rPr/>
-        <w:t>Idea que debe quedar: lo único que el público tiene que llevarse del bloque.</w:t>
-      </w:r>
-    </w:p>
-    <w:p>
-      <w:pPr>
-        <w:pStyle w:val="ListBullet"/>
-      </w:pPr>
-      <w:r>
-        <w:rPr/>
-        <w:t>Ideas, en orden: el hilo del bloque en pocas líneas. Sirve para estudiar y para no perderse; si sabes el hilo, el texto sale solo.</w:t>
-      </w:r>
-    </w:p>
-    <w:p>
-      <w:pPr>
-        <w:pStyle w:val="ListBullet"/>
-      </w:pPr>
-      <w:r>
-        <w:rPr/>
-        <w:t>Texto para decir: el texto completo del bloque. Las frases en recuadro amarillo son las frases ancla: aperturas, definiciones y transiciones, que se dicen casi literales. El resto se puede leer, pero conviene decirlo con palabras propias mirando el hilo.</w:t>
-      </w:r>
-    </w:p>
-    <w:p>
-      <w:pPr>
-        <w:pStyle w:val="ListBullet"/>
-      </w:pPr>
-      <w:r>
-        <w:rPr/>
-        <w:t>Indicaciones entre corchetes: en rojo las de pantalla y acciones, en azul las diapositivas. No se dicen en voz alta.</w:t>
+        <w:t>Todo lo que no va entre corchetes se dice tal cual está escrito, al pie de la letra. Las muletillas («eh», «este», «bueno», «o sea») y los puntos suspensivos del inicio son parte del texto: marcan el tono platicado, con algo de nervio al arrancar.</w:t>
       </w:r>
     </w:p>
     <w:p>
       <w:r>
         <w:rPr/>
-        <w:t>Las muletillas («eh», «este», «bueno», «o sea») y los puntos suspensivos de las frases ancla marcan el tono platicado, con algo de nervio al inicio. Se dicen como salgan; no hay que repetirlos al pie de la letra.</w:t>
+        <w:t>Entre corchetes van las indicaciones, que no se dicen en voz alta: en azul los cambios de diapositiva y en rojo lo que se ve en pantalla y lo que se hace en el navegador.</w:t>
       </w:r>
     </w:p>
     <w:p>
       <w:r>
         <w:rPr/>
-        <w:t>Ritmo medido: el 22 de octubre se cronometró el bloque 1 (108 palabras en 35 segundos), que da 185 palabras por minuto. Los tiempos de este guion usan ese ritmo con el texto completo de cada bloque.</w:t>
-      </w:r>
-    </w:p>
-    <w:p>
-      <w:pPr>
-        <w:pStyle w:val="Heading1"/>
-      </w:pPr>
-      <w:r>
-        <w:t>Resumen de tiempos</w:t>
-      </w:r>
-    </w:p>
-    <w:tbl>
-      <w:tblPr>
-        <w:tblStyle w:val="TableGrid"/>
-        <w:tblW w:type="auto" w:w="0"/>
-        <w:jc w:val="center"/>
-        <w:tblLook w:firstColumn="1" w:firstRow="1" w:lastColumn="0" w:lastRow="0" w:noHBand="0" w:noVBand="1" w:val="04A0"/>
-      </w:tblPr>
-      <w:tblGrid>
-        <w:gridCol w:w="1605"/>
-        <w:gridCol w:w="1605"/>
-        <w:gridCol w:w="1605"/>
-        <w:gridCol w:w="1605"/>
-        <w:gridCol w:w="1605"/>
-        <w:gridCol w:w="1605"/>
-      </w:tblGrid>
-      <w:tr>
-        <w:tc>
-          <w:tcPr>
-            <w:tcW w:type="dxa" w:w="3175"/>
-            <w:shd w:val="clear" w:color="auto" w:fill="D9E2F3"/>
-          </w:tcPr>
-          <w:p>
-            <w:pPr>
-              <w:keepNext/>
-              <w:spacing w:after="40"/>
-            </w:pPr>
-            <w:r>
-              <w:rPr>
-                <w:b/>
-                <w:sz w:val="20"/>
-              </w:rPr>
-              <w:t>Bloque</w:t>
-            </w:r>
-          </w:p>
-        </w:tc>
-        <w:tc>
-          <w:tcPr>
-            <w:tcW w:type="dxa" w:w="1361"/>
-            <w:shd w:val="clear" w:color="auto" w:fill="D9E2F3"/>
-          </w:tcPr>
-          <w:p>
-            <w:pPr>
-              <w:keepNext/>
-              <w:spacing w:after="40"/>
-              <w:jc w:val="center"/>
-            </w:pPr>
-            <w:r>
-              <w:rPr>
-                <w:b/>
-                <w:sz w:val="20"/>
-              </w:rPr>
-              <w:t>Hora</w:t>
-            </w:r>
-          </w:p>
-        </w:tc>
-        <w:tc>
-          <w:tcPr>
-            <w:tcW w:type="dxa" w:w="737"/>
-            <w:shd w:val="clear" w:color="auto" w:fill="D9E2F3"/>
-          </w:tcPr>
-          <w:p>
-            <w:pPr>
-              <w:keepNext/>
-              <w:spacing w:after="40"/>
-              <w:jc w:val="center"/>
-            </w:pPr>
-            <w:r>
-              <w:rPr>
-                <w:b/>
-                <w:sz w:val="20"/>
-              </w:rPr>
-              <w:t>Min</w:t>
-            </w:r>
-          </w:p>
-        </w:tc>
-        <w:tc>
-          <w:tcPr>
-            <w:tcW w:type="dxa" w:w="1247"/>
-            <w:shd w:val="clear" w:color="auto" w:fill="D9E2F3"/>
-          </w:tcPr>
-          <w:p>
-            <w:pPr>
-              <w:keepNext/>
-              <w:spacing w:after="40"/>
-              <w:jc w:val="center"/>
-            </w:pPr>
-            <w:r>
-              <w:rPr>
-                <w:b/>
-                <w:sz w:val="20"/>
-              </w:rPr>
-              <w:t>Palabras</w:t>
-            </w:r>
-          </w:p>
-        </w:tc>
-        <w:tc>
-          <w:tcPr>
-            <w:tcW w:type="dxa" w:w="1644"/>
-            <w:shd w:val="clear" w:color="auto" w:fill="D9E2F3"/>
-          </w:tcPr>
-          <w:p>
-            <w:pPr>
-              <w:keepNext/>
-              <w:spacing w:after="40"/>
-              <w:jc w:val="center"/>
-            </w:pPr>
-            <w:r>
-              <w:rPr>
-                <w:b/>
-                <w:sz w:val="20"/>
-              </w:rPr>
-              <w:t>Habla (min)</w:t>
-            </w:r>
-          </w:p>
-        </w:tc>
-        <w:tc>
-          <w:tcPr>
-            <w:tcW w:type="dxa" w:w="1417"/>
-            <w:shd w:val="clear" w:color="auto" w:fill="D9E2F3"/>
-          </w:tcPr>
-          <w:p>
-            <w:pPr>
-              <w:keepNext/>
-              <w:spacing w:after="40"/>
-              <w:jc w:val="center"/>
-            </w:pPr>
-            <w:r>
-              <w:rPr>
-                <w:b/>
-                <w:sz w:val="20"/>
-              </w:rPr>
-              <w:t>Palabras ancla</w:t>
-            </w:r>
-          </w:p>
-        </w:tc>
-      </w:tr>
-      <w:tr>
-        <w:tc>
-          <w:tcPr>
-            <w:tcW w:type="dxa" w:w="3175"/>
-          </w:tcPr>
-          <w:p>
-            <w:pPr>
-              <w:keepNext/>
-              <w:spacing w:after="40"/>
-            </w:pPr>
-            <w:r>
-              <w:rPr>
-                <w:sz w:val="20"/>
-              </w:rPr>
-              <w:t>1. Bienvenida y agenda</w:t>
-            </w:r>
-          </w:p>
-        </w:tc>
-        <w:tc>
-          <w:tcPr>
-            <w:tcW w:type="dxa" w:w="1361"/>
-          </w:tcPr>
-          <w:p>
-            <w:pPr>
-              <w:keepNext/>
-              <w:spacing w:after="40"/>
-              <w:jc w:val="center"/>
-            </w:pPr>
-            <w:r>
-              <w:rPr>
-                <w:sz w:val="20"/>
-              </w:rPr>
-              <w:t>0:00-0:05</w:t>
-            </w:r>
-          </w:p>
-        </w:tc>
-        <w:tc>
-          <w:tcPr>
-            <w:tcW w:type="dxa" w:w="737"/>
-          </w:tcPr>
-          <w:p>
-            <w:pPr>
-              <w:keepNext/>
-              <w:spacing w:after="40"/>
-              <w:jc w:val="center"/>
-            </w:pPr>
-            <w:r>
-              <w:rPr>
-                <w:sz w:val="20"/>
-              </w:rPr>
-              <w:t>5</w:t>
-            </w:r>
-          </w:p>
-        </w:tc>
-        <w:tc>
-          <w:tcPr>
-            <w:tcW w:type="dxa" w:w="1247"/>
-          </w:tcPr>
-          <w:p>
-            <w:pPr>
-              <w:keepNext/>
-              <w:spacing w:after="40"/>
-              <w:jc w:val="center"/>
-            </w:pPr>
-            <w:r>
-              <w:rPr>
-                <w:sz w:val="20"/>
-              </w:rPr>
-              <w:t>659</w:t>
-            </w:r>
-          </w:p>
-        </w:tc>
-        <w:tc>
-          <w:tcPr>
-            <w:tcW w:type="dxa" w:w="1644"/>
-          </w:tcPr>
-          <w:p>
-            <w:pPr>
-              <w:keepNext/>
-              <w:spacing w:after="40"/>
-              <w:jc w:val="center"/>
-            </w:pPr>
-            <w:r>
-              <w:rPr>
-                <w:sz w:val="20"/>
-              </w:rPr>
-              <w:t>3.6</w:t>
-            </w:r>
-          </w:p>
-        </w:tc>
-        <w:tc>
-          <w:tcPr>
-            <w:tcW w:type="dxa" w:w="1417"/>
-          </w:tcPr>
-          <w:p>
-            <w:pPr>
-              <w:keepNext/>
-              <w:spacing w:after="40"/>
-              <w:jc w:val="center"/>
-            </w:pPr>
-            <w:r>
-              <w:rPr>
-                <w:sz w:val="20"/>
-              </w:rPr>
-              <w:t>108</w:t>
-            </w:r>
-          </w:p>
-        </w:tc>
-      </w:tr>
-      <w:tr>
-        <w:tc>
-          <w:tcPr>
-            <w:tcW w:type="dxa" w:w="3175"/>
-          </w:tcPr>
-          <w:p>
-            <w:pPr>
-              <w:keepNext/>
-              <w:spacing w:after="40"/>
-            </w:pPr>
-            <w:r>
-              <w:rPr>
-                <w:sz w:val="20"/>
-              </w:rPr>
-              <w:t>2. El caso de estudio</w:t>
-            </w:r>
-          </w:p>
-        </w:tc>
-        <w:tc>
-          <w:tcPr>
-            <w:tcW w:type="dxa" w:w="1361"/>
-          </w:tcPr>
-          <w:p>
-            <w:pPr>
-              <w:keepNext/>
-              <w:spacing w:after="40"/>
-              <w:jc w:val="center"/>
-            </w:pPr>
-            <w:r>
-              <w:rPr>
-                <w:sz w:val="20"/>
-              </w:rPr>
-              <w:t>0:05-0:19</w:t>
-            </w:r>
-          </w:p>
-        </w:tc>
-        <w:tc>
-          <w:tcPr>
-            <w:tcW w:type="dxa" w:w="737"/>
-          </w:tcPr>
-          <w:p>
-            <w:pPr>
-              <w:keepNext/>
-              <w:spacing w:after="40"/>
-              <w:jc w:val="center"/>
-            </w:pPr>
-            <w:r>
-              <w:rPr>
-                <w:sz w:val="20"/>
-              </w:rPr>
-              <w:t>14</w:t>
-            </w:r>
-          </w:p>
-        </w:tc>
-        <w:tc>
-          <w:tcPr>
-            <w:tcW w:type="dxa" w:w="1247"/>
-          </w:tcPr>
-          <w:p>
-            <w:pPr>
-              <w:keepNext/>
-              <w:spacing w:after="40"/>
-              <w:jc w:val="center"/>
-            </w:pPr>
-            <w:r>
-              <w:rPr>
-                <w:sz w:val="20"/>
-              </w:rPr>
-              <w:t>2,315</w:t>
-            </w:r>
-          </w:p>
-        </w:tc>
-        <w:tc>
-          <w:tcPr>
-            <w:tcW w:type="dxa" w:w="1644"/>
-          </w:tcPr>
-          <w:p>
-            <w:pPr>
-              <w:keepNext/>
-              <w:spacing w:after="40"/>
-              <w:jc w:val="center"/>
-            </w:pPr>
-            <w:r>
-              <w:rPr>
-                <w:sz w:val="20"/>
-              </w:rPr>
-              <w:t>12.5</w:t>
-            </w:r>
-          </w:p>
-        </w:tc>
-        <w:tc>
-          <w:tcPr>
-            <w:tcW w:type="dxa" w:w="1417"/>
-          </w:tcPr>
-          <w:p>
-            <w:pPr>
-              <w:keepNext/>
-              <w:spacing w:after="40"/>
-              <w:jc w:val="center"/>
-            </w:pPr>
-            <w:r>
-              <w:rPr>
-                <w:sz w:val="20"/>
-              </w:rPr>
-              <w:t>212</w:t>
-            </w:r>
-          </w:p>
-        </w:tc>
-      </w:tr>
-      <w:tr>
-        <w:tc>
-          <w:tcPr>
-            <w:tcW w:type="dxa" w:w="3175"/>
-          </w:tcPr>
-          <w:p>
-            <w:pPr>
-              <w:keepNext/>
-              <w:spacing w:after="40"/>
-            </w:pPr>
-            <w:r>
-              <w:rPr>
-                <w:sz w:val="20"/>
-              </w:rPr>
-              <w:t>3. Por qué una plataforma web</w:t>
-            </w:r>
-          </w:p>
-        </w:tc>
-        <w:tc>
-          <w:tcPr>
-            <w:tcW w:type="dxa" w:w="1361"/>
-          </w:tcPr>
-          <w:p>
-            <w:pPr>
-              <w:keepNext/>
-              <w:spacing w:after="40"/>
-              <w:jc w:val="center"/>
-            </w:pPr>
-            <w:r>
-              <w:rPr>
-                <w:sz w:val="20"/>
-              </w:rPr>
-              <w:t>0:19-0:27</w:t>
-            </w:r>
-          </w:p>
-        </w:tc>
-        <w:tc>
-          <w:tcPr>
-            <w:tcW w:type="dxa" w:w="737"/>
-          </w:tcPr>
-          <w:p>
-            <w:pPr>
-              <w:keepNext/>
-              <w:spacing w:after="40"/>
-              <w:jc w:val="center"/>
-            </w:pPr>
-            <w:r>
-              <w:rPr>
-                <w:sz w:val="20"/>
-              </w:rPr>
-              <w:t>8</w:t>
-            </w:r>
-          </w:p>
-        </w:tc>
-        <w:tc>
-          <w:tcPr>
-            <w:tcW w:type="dxa" w:w="1247"/>
-          </w:tcPr>
-          <w:p>
-            <w:pPr>
-              <w:keepNext/>
-              <w:spacing w:after="40"/>
-              <w:jc w:val="center"/>
-            </w:pPr>
-            <w:r>
-              <w:rPr>
-                <w:sz w:val="20"/>
-              </w:rPr>
-              <w:t>1,149</w:t>
-            </w:r>
-          </w:p>
-        </w:tc>
-        <w:tc>
-          <w:tcPr>
-            <w:tcW w:type="dxa" w:w="1644"/>
-          </w:tcPr>
-          <w:p>
-            <w:pPr>
-              <w:keepNext/>
-              <w:spacing w:after="40"/>
-              <w:jc w:val="center"/>
-            </w:pPr>
-            <w:r>
-              <w:rPr>
-                <w:sz w:val="20"/>
-              </w:rPr>
-              <w:t>6.2</w:t>
-            </w:r>
-          </w:p>
-        </w:tc>
-        <w:tc>
-          <w:tcPr>
-            <w:tcW w:type="dxa" w:w="1417"/>
-          </w:tcPr>
-          <w:p>
-            <w:pPr>
-              <w:keepNext/>
-              <w:spacing w:after="40"/>
-              <w:jc w:val="center"/>
-            </w:pPr>
-            <w:r>
-              <w:rPr>
-                <w:sz w:val="20"/>
-              </w:rPr>
-              <w:t>120</w:t>
-            </w:r>
-          </w:p>
-        </w:tc>
-      </w:tr>
-      <w:tr>
-        <w:tc>
-          <w:tcPr>
-            <w:tcW w:type="dxa" w:w="3175"/>
-          </w:tcPr>
-          <w:p>
-            <w:pPr>
-              <w:keepNext/>
-              <w:spacing w:after="40"/>
-            </w:pPr>
-            <w:r>
-              <w:rPr>
-                <w:sz w:val="20"/>
-              </w:rPr>
-              <w:t>4. Qué es una imagen digital</w:t>
-            </w:r>
-          </w:p>
-        </w:tc>
-        <w:tc>
-          <w:tcPr>
-            <w:tcW w:type="dxa" w:w="1361"/>
-          </w:tcPr>
-          <w:p>
-            <w:pPr>
-              <w:keepNext/>
-              <w:spacing w:after="40"/>
-              <w:jc w:val="center"/>
-            </w:pPr>
-            <w:r>
-              <w:rPr>
-                <w:sz w:val="20"/>
-              </w:rPr>
-              <w:t>0:27-0:36</w:t>
-            </w:r>
-          </w:p>
-        </w:tc>
-        <w:tc>
-          <w:tcPr>
-            <w:tcW w:type="dxa" w:w="737"/>
-          </w:tcPr>
-          <w:p>
-            <w:pPr>
-              <w:keepNext/>
-              <w:spacing w:after="40"/>
-              <w:jc w:val="center"/>
-            </w:pPr>
-            <w:r>
-              <w:rPr>
-                <w:sz w:val="20"/>
-              </w:rPr>
-              <w:t>9</w:t>
-            </w:r>
-          </w:p>
-        </w:tc>
-        <w:tc>
-          <w:tcPr>
-            <w:tcW w:type="dxa" w:w="1247"/>
-          </w:tcPr>
-          <w:p>
-            <w:pPr>
-              <w:keepNext/>
-              <w:spacing w:after="40"/>
-              <w:jc w:val="center"/>
-            </w:pPr>
-            <w:r>
-              <w:rPr>
-                <w:sz w:val="20"/>
-              </w:rPr>
-              <w:t>1,292</w:t>
-            </w:r>
-          </w:p>
-        </w:tc>
-        <w:tc>
-          <w:tcPr>
-            <w:tcW w:type="dxa" w:w="1644"/>
-          </w:tcPr>
-          <w:p>
-            <w:pPr>
-              <w:keepNext/>
-              <w:spacing w:after="40"/>
-              <w:jc w:val="center"/>
-            </w:pPr>
-            <w:r>
-              <w:rPr>
-                <w:sz w:val="20"/>
-              </w:rPr>
-              <w:t>7.0</w:t>
-            </w:r>
-          </w:p>
-        </w:tc>
-        <w:tc>
-          <w:tcPr>
-            <w:tcW w:type="dxa" w:w="1417"/>
-          </w:tcPr>
-          <w:p>
-            <w:pPr>
-              <w:keepNext/>
-              <w:spacing w:after="40"/>
-              <w:jc w:val="center"/>
-            </w:pPr>
-            <w:r>
-              <w:rPr>
-                <w:sz w:val="20"/>
-              </w:rPr>
-              <w:t>150</w:t>
-            </w:r>
-          </w:p>
-        </w:tc>
-      </w:tr>
-      <w:tr>
-        <w:tc>
-          <w:tcPr>
-            <w:tcW w:type="dxa" w:w="3175"/>
-          </w:tcPr>
-          <w:p>
-            <w:pPr>
-              <w:keepNext/>
-              <w:spacing w:after="40"/>
-            </w:pPr>
-            <w:r>
-              <w:rPr>
-                <w:sz w:val="20"/>
-              </w:rPr>
-              <w:t>5. El sitio, visto como visitante</w:t>
-            </w:r>
-          </w:p>
-        </w:tc>
-        <w:tc>
-          <w:tcPr>
-            <w:tcW w:type="dxa" w:w="1361"/>
-          </w:tcPr>
-          <w:p>
-            <w:pPr>
-              <w:keepNext/>
-              <w:spacing w:after="40"/>
-              <w:jc w:val="center"/>
-            </w:pPr>
-            <w:r>
-              <w:rPr>
-                <w:sz w:val="20"/>
-              </w:rPr>
-              <w:t>0:36-0:46</w:t>
-            </w:r>
-          </w:p>
-        </w:tc>
-        <w:tc>
-          <w:tcPr>
-            <w:tcW w:type="dxa" w:w="737"/>
-          </w:tcPr>
-          <w:p>
-            <w:pPr>
-              <w:keepNext/>
-              <w:spacing w:after="40"/>
-              <w:jc w:val="center"/>
-            </w:pPr>
-            <w:r>
-              <w:rPr>
-                <w:sz w:val="20"/>
-              </w:rPr>
-              <w:t>10</w:t>
-            </w:r>
-          </w:p>
-        </w:tc>
-        <w:tc>
-          <w:tcPr>
-            <w:tcW w:type="dxa" w:w="1247"/>
-          </w:tcPr>
-          <w:p>
-            <w:pPr>
-              <w:keepNext/>
-              <w:spacing w:after="40"/>
-              <w:jc w:val="center"/>
-            </w:pPr>
-            <w:r>
-              <w:rPr>
-                <w:sz w:val="20"/>
-              </w:rPr>
-              <w:t>871</w:t>
-            </w:r>
-          </w:p>
-        </w:tc>
-        <w:tc>
-          <w:tcPr>
-            <w:tcW w:type="dxa" w:w="1644"/>
-          </w:tcPr>
-          <w:p>
-            <w:pPr>
-              <w:keepNext/>
-              <w:spacing w:after="40"/>
-              <w:jc w:val="center"/>
-            </w:pPr>
-            <w:r>
-              <w:rPr>
-                <w:sz w:val="20"/>
-              </w:rPr>
-              <w:t>4.7</w:t>
-            </w:r>
-          </w:p>
-        </w:tc>
-        <w:tc>
-          <w:tcPr>
-            <w:tcW w:type="dxa" w:w="1417"/>
-          </w:tcPr>
-          <w:p>
-            <w:pPr>
-              <w:keepNext/>
-              <w:spacing w:after="40"/>
-              <w:jc w:val="center"/>
-            </w:pPr>
-            <w:r>
-              <w:rPr>
-                <w:sz w:val="20"/>
-              </w:rPr>
-              <w:t>133</w:t>
-            </w:r>
-          </w:p>
-        </w:tc>
-      </w:tr>
-      <w:tr>
-        <w:tc>
-          <w:tcPr>
-            <w:tcW w:type="dxa" w:w="3175"/>
-          </w:tcPr>
-          <w:p>
-            <w:pPr>
-              <w:keepNext/>
-              <w:spacing w:after="40"/>
-            </w:pPr>
-            <w:r>
-              <w:rPr>
-                <w:sz w:val="20"/>
-              </w:rPr>
-              <w:t>6. Crear una cuenta</w:t>
-            </w:r>
-          </w:p>
-        </w:tc>
-        <w:tc>
-          <w:tcPr>
-            <w:tcW w:type="dxa" w:w="1361"/>
-          </w:tcPr>
-          <w:p>
-            <w:pPr>
-              <w:keepNext/>
-              <w:spacing w:after="40"/>
-              <w:jc w:val="center"/>
-            </w:pPr>
-            <w:r>
-              <w:rPr>
-                <w:sz w:val="20"/>
-              </w:rPr>
-              <w:t>0:46-0:52</w:t>
-            </w:r>
-          </w:p>
-        </w:tc>
-        <w:tc>
-          <w:tcPr>
-            <w:tcW w:type="dxa" w:w="737"/>
-          </w:tcPr>
-          <w:p>
-            <w:pPr>
-              <w:keepNext/>
-              <w:spacing w:after="40"/>
-              <w:jc w:val="center"/>
-            </w:pPr>
-            <w:r>
-              <w:rPr>
-                <w:sz w:val="20"/>
-              </w:rPr>
-              <w:t>6</w:t>
-            </w:r>
-          </w:p>
-        </w:tc>
-        <w:tc>
-          <w:tcPr>
-            <w:tcW w:type="dxa" w:w="1247"/>
-          </w:tcPr>
-          <w:p>
-            <w:pPr>
-              <w:keepNext/>
-              <w:spacing w:after="40"/>
-              <w:jc w:val="center"/>
-            </w:pPr>
-            <w:r>
-              <w:rPr>
-                <w:sz w:val="20"/>
-              </w:rPr>
-              <w:t>503</w:t>
-            </w:r>
-          </w:p>
-        </w:tc>
-        <w:tc>
-          <w:tcPr>
-            <w:tcW w:type="dxa" w:w="1644"/>
-          </w:tcPr>
-          <w:p>
-            <w:pPr>
-              <w:keepNext/>
-              <w:spacing w:after="40"/>
-              <w:jc w:val="center"/>
-            </w:pPr>
-            <w:r>
-              <w:rPr>
-                <w:sz w:val="20"/>
-              </w:rPr>
-              <w:t>2.7</w:t>
-            </w:r>
-          </w:p>
-        </w:tc>
-        <w:tc>
-          <w:tcPr>
-            <w:tcW w:type="dxa" w:w="1417"/>
-          </w:tcPr>
-          <w:p>
-            <w:pPr>
-              <w:keepNext/>
-              <w:spacing w:after="40"/>
-              <w:jc w:val="center"/>
-            </w:pPr>
-            <w:r>
-              <w:rPr>
-                <w:sz w:val="20"/>
-              </w:rPr>
-              <w:t>37</w:t>
-            </w:r>
-          </w:p>
-        </w:tc>
-      </w:tr>
-      <w:tr>
-        <w:tc>
-          <w:tcPr>
-            <w:tcW w:type="dxa" w:w="3175"/>
-          </w:tcPr>
-          <w:p>
-            <w:pPr>
-              <w:keepNext/>
-              <w:spacing w:after="40"/>
-            </w:pPr>
-            <w:r>
-              <w:rPr>
-                <w:sz w:val="20"/>
-              </w:rPr>
-              <w:t>7. Analizar una imagen y esperar</w:t>
-            </w:r>
-          </w:p>
-        </w:tc>
-        <w:tc>
-          <w:tcPr>
-            <w:tcW w:type="dxa" w:w="1361"/>
-          </w:tcPr>
-          <w:p>
-            <w:pPr>
-              <w:keepNext/>
-              <w:spacing w:after="40"/>
-              <w:jc w:val="center"/>
-            </w:pPr>
-            <w:r>
-              <w:rPr>
-                <w:sz w:val="20"/>
-              </w:rPr>
-              <w:t>0:52-1:01</w:t>
-            </w:r>
-          </w:p>
-        </w:tc>
-        <w:tc>
-          <w:tcPr>
-            <w:tcW w:type="dxa" w:w="737"/>
-          </w:tcPr>
-          <w:p>
-            <w:pPr>
-              <w:keepNext/>
-              <w:spacing w:after="40"/>
-              <w:jc w:val="center"/>
-            </w:pPr>
-            <w:r>
-              <w:rPr>
-                <w:sz w:val="20"/>
-              </w:rPr>
-              <w:t>9</w:t>
-            </w:r>
-          </w:p>
-        </w:tc>
-        <w:tc>
-          <w:tcPr>
-            <w:tcW w:type="dxa" w:w="1247"/>
-          </w:tcPr>
-          <w:p>
-            <w:pPr>
-              <w:keepNext/>
-              <w:spacing w:after="40"/>
-              <w:jc w:val="center"/>
-            </w:pPr>
-            <w:r>
-              <w:rPr>
-                <w:sz w:val="20"/>
-              </w:rPr>
-              <w:t>1,015</w:t>
-            </w:r>
-          </w:p>
-        </w:tc>
-        <w:tc>
-          <w:tcPr>
-            <w:tcW w:type="dxa" w:w="1644"/>
-          </w:tcPr>
-          <w:p>
-            <w:pPr>
-              <w:keepNext/>
-              <w:spacing w:after="40"/>
-              <w:jc w:val="center"/>
-            </w:pPr>
-            <w:r>
-              <w:rPr>
-                <w:sz w:val="20"/>
-              </w:rPr>
-              <w:t>5.5</w:t>
-            </w:r>
-          </w:p>
-        </w:tc>
-        <w:tc>
-          <w:tcPr>
-            <w:tcW w:type="dxa" w:w="1417"/>
-          </w:tcPr>
-          <w:p>
-            <w:pPr>
-              <w:keepNext/>
-              <w:spacing w:after="40"/>
-              <w:jc w:val="center"/>
-            </w:pPr>
-            <w:r>
-              <w:rPr>
-                <w:sz w:val="20"/>
-              </w:rPr>
-              <w:t>51</w:t>
-            </w:r>
-          </w:p>
-        </w:tc>
-      </w:tr>
-      <w:tr>
-        <w:tc>
-          <w:tcPr>
-            <w:tcW w:type="dxa" w:w="3175"/>
-          </w:tcPr>
-          <w:p>
-            <w:pPr>
-              <w:keepNext/>
-              <w:spacing w:after="40"/>
-            </w:pPr>
-            <w:r>
-              <w:rPr>
-                <w:sz w:val="20"/>
-              </w:rPr>
-              <w:t>8. Leer los resultados</w:t>
-            </w:r>
-          </w:p>
-        </w:tc>
-        <w:tc>
-          <w:tcPr>
-            <w:tcW w:type="dxa" w:w="1361"/>
-          </w:tcPr>
-          <w:p>
-            <w:pPr>
-              <w:keepNext/>
-              <w:spacing w:after="40"/>
-              <w:jc w:val="center"/>
-            </w:pPr>
-            <w:r>
-              <w:rPr>
-                <w:sz w:val="20"/>
-              </w:rPr>
-              <w:t>1:01-1:15</w:t>
-            </w:r>
-          </w:p>
-        </w:tc>
-        <w:tc>
-          <w:tcPr>
-            <w:tcW w:type="dxa" w:w="737"/>
-          </w:tcPr>
-          <w:p>
-            <w:pPr>
-              <w:keepNext/>
-              <w:spacing w:after="40"/>
-              <w:jc w:val="center"/>
-            </w:pPr>
-            <w:r>
-              <w:rPr>
-                <w:sz w:val="20"/>
-              </w:rPr>
-              <w:t>14</w:t>
-            </w:r>
-          </w:p>
-        </w:tc>
-        <w:tc>
-          <w:tcPr>
-            <w:tcW w:type="dxa" w:w="1247"/>
-          </w:tcPr>
-          <w:p>
-            <w:pPr>
-              <w:keepNext/>
-              <w:spacing w:after="40"/>
-              <w:jc w:val="center"/>
-            </w:pPr>
-            <w:r>
-              <w:rPr>
-                <w:sz w:val="20"/>
-              </w:rPr>
-              <w:t>1,681</w:t>
-            </w:r>
-          </w:p>
-        </w:tc>
-        <w:tc>
-          <w:tcPr>
-            <w:tcW w:type="dxa" w:w="1644"/>
-          </w:tcPr>
-          <w:p>
-            <w:pPr>
-              <w:keepNext/>
-              <w:spacing w:after="40"/>
-              <w:jc w:val="center"/>
-            </w:pPr>
-            <w:r>
-              <w:rPr>
-                <w:sz w:val="20"/>
-              </w:rPr>
-              <w:t>9.1</w:t>
-            </w:r>
-          </w:p>
-        </w:tc>
-        <w:tc>
-          <w:tcPr>
-            <w:tcW w:type="dxa" w:w="1417"/>
-          </w:tcPr>
-          <w:p>
-            <w:pPr>
-              <w:keepNext/>
-              <w:spacing w:after="40"/>
-              <w:jc w:val="center"/>
-            </w:pPr>
-            <w:r>
-              <w:rPr>
-                <w:sz w:val="20"/>
-              </w:rPr>
-              <w:t>188</w:t>
-            </w:r>
-          </w:p>
-        </w:tc>
-      </w:tr>
-      <w:tr>
-        <w:tc>
-          <w:tcPr>
-            <w:tcW w:type="dxa" w:w="3175"/>
-          </w:tcPr>
-          <w:p>
-            <w:pPr>
-              <w:keepNext/>
-              <w:spacing w:after="40"/>
-            </w:pPr>
-            <w:r>
-              <w:rPr>
-                <w:sz w:val="20"/>
-              </w:rPr>
-              <w:t>9. Lo que no es un espermatozoide</w:t>
-            </w:r>
-          </w:p>
-        </w:tc>
-        <w:tc>
-          <w:tcPr>
-            <w:tcW w:type="dxa" w:w="1361"/>
-          </w:tcPr>
-          <w:p>
-            <w:pPr>
-              <w:keepNext/>
-              <w:spacing w:after="40"/>
-              <w:jc w:val="center"/>
-            </w:pPr>
-            <w:r>
-              <w:rPr>
-                <w:sz w:val="20"/>
-              </w:rPr>
-              <w:t>1:15-1:26</w:t>
-            </w:r>
-          </w:p>
-        </w:tc>
-        <w:tc>
-          <w:tcPr>
-            <w:tcW w:type="dxa" w:w="737"/>
-          </w:tcPr>
-          <w:p>
-            <w:pPr>
-              <w:keepNext/>
-              <w:spacing w:after="40"/>
-              <w:jc w:val="center"/>
-            </w:pPr>
-            <w:r>
-              <w:rPr>
-                <w:sz w:val="20"/>
-              </w:rPr>
-              <w:t>11</w:t>
-            </w:r>
-          </w:p>
-        </w:tc>
-        <w:tc>
-          <w:tcPr>
-            <w:tcW w:type="dxa" w:w="1247"/>
-          </w:tcPr>
-          <w:p>
-            <w:pPr>
-              <w:keepNext/>
-              <w:spacing w:after="40"/>
-              <w:jc w:val="center"/>
-            </w:pPr>
-            <w:r>
-              <w:rPr>
-                <w:sz w:val="20"/>
-              </w:rPr>
-              <w:t>1,156</w:t>
-            </w:r>
-          </w:p>
-        </w:tc>
-        <w:tc>
-          <w:tcPr>
-            <w:tcW w:type="dxa" w:w="1644"/>
-          </w:tcPr>
-          <w:p>
-            <w:pPr>
-              <w:keepNext/>
-              <w:spacing w:after="40"/>
-              <w:jc w:val="center"/>
-            </w:pPr>
-            <w:r>
-              <w:rPr>
-                <w:sz w:val="20"/>
-              </w:rPr>
-              <w:t>6.2</w:t>
-            </w:r>
-          </w:p>
-        </w:tc>
-        <w:tc>
-          <w:tcPr>
-            <w:tcW w:type="dxa" w:w="1417"/>
-          </w:tcPr>
-          <w:p>
-            <w:pPr>
-              <w:keepNext/>
-              <w:spacing w:after="40"/>
-              <w:jc w:val="center"/>
-            </w:pPr>
-            <w:r>
-              <w:rPr>
-                <w:sz w:val="20"/>
-              </w:rPr>
-              <w:t>85</w:t>
-            </w:r>
-          </w:p>
-        </w:tc>
-      </w:tr>
-      <w:tr>
-        <w:tc>
-          <w:tcPr>
-            <w:tcW w:type="dxa" w:w="3175"/>
-          </w:tcPr>
-          <w:p>
-            <w:pPr>
-              <w:keepNext/>
-              <w:spacing w:after="40"/>
-            </w:pPr>
-            <w:r>
-              <w:rPr>
-                <w:sz w:val="20"/>
-              </w:rPr>
-              <w:t>10. Descargas, Mis análisis y privacidad</w:t>
-            </w:r>
-          </w:p>
-        </w:tc>
-        <w:tc>
-          <w:tcPr>
-            <w:tcW w:type="dxa" w:w="1361"/>
-          </w:tcPr>
-          <w:p>
-            <w:pPr>
-              <w:keepNext/>
-              <w:spacing w:after="40"/>
-              <w:jc w:val="center"/>
-            </w:pPr>
-            <w:r>
-              <w:rPr>
-                <w:sz w:val="20"/>
-              </w:rPr>
-              <w:t>1:26-1:32</w:t>
-            </w:r>
-          </w:p>
-        </w:tc>
-        <w:tc>
-          <w:tcPr>
-            <w:tcW w:type="dxa" w:w="737"/>
-          </w:tcPr>
-          <w:p>
-            <w:pPr>
-              <w:keepNext/>
-              <w:spacing w:after="40"/>
-              <w:jc w:val="center"/>
-            </w:pPr>
-            <w:r>
-              <w:rPr>
-                <w:sz w:val="20"/>
-              </w:rPr>
-              <w:t>6</w:t>
-            </w:r>
-          </w:p>
-        </w:tc>
-        <w:tc>
-          <w:tcPr>
-            <w:tcW w:type="dxa" w:w="1247"/>
-          </w:tcPr>
-          <w:p>
-            <w:pPr>
-              <w:keepNext/>
-              <w:spacing w:after="40"/>
-              <w:jc w:val="center"/>
-            </w:pPr>
-            <w:r>
-              <w:rPr>
-                <w:sz w:val="20"/>
-              </w:rPr>
-              <w:t>661</w:t>
-            </w:r>
-          </w:p>
-        </w:tc>
-        <w:tc>
-          <w:tcPr>
-            <w:tcW w:type="dxa" w:w="1644"/>
-          </w:tcPr>
-          <w:p>
-            <w:pPr>
-              <w:keepNext/>
-              <w:spacing w:after="40"/>
-              <w:jc w:val="center"/>
-            </w:pPr>
-            <w:r>
-              <w:rPr>
-                <w:sz w:val="20"/>
-              </w:rPr>
-              <w:t>3.6</w:t>
-            </w:r>
-          </w:p>
-        </w:tc>
-        <w:tc>
-          <w:tcPr>
-            <w:tcW w:type="dxa" w:w="1417"/>
-          </w:tcPr>
-          <w:p>
-            <w:pPr>
-              <w:keepNext/>
-              <w:spacing w:after="40"/>
-              <w:jc w:val="center"/>
-            </w:pPr>
-            <w:r>
-              <w:rPr>
-                <w:sz w:val="20"/>
-              </w:rPr>
-              <w:t>62</w:t>
-            </w:r>
-          </w:p>
-        </w:tc>
-      </w:tr>
-      <w:tr>
-        <w:tc>
-          <w:tcPr>
-            <w:tcW w:type="dxa" w:w="3175"/>
-          </w:tcPr>
-          <w:p>
-            <w:pPr>
-              <w:keepNext/>
-              <w:spacing w:after="40"/>
-            </w:pPr>
-            <w:r>
-              <w:rPr>
-                <w:sz w:val="20"/>
-              </w:rPr>
-              <w:t>11. Cierre y adelanto de la sesión 2</w:t>
-            </w:r>
-          </w:p>
-        </w:tc>
-        <w:tc>
-          <w:tcPr>
-            <w:tcW w:type="dxa" w:w="1361"/>
-          </w:tcPr>
-          <w:p>
-            <w:pPr>
-              <w:keepNext/>
-              <w:spacing w:after="40"/>
-              <w:jc w:val="center"/>
-            </w:pPr>
-            <w:r>
-              <w:rPr>
-                <w:sz w:val="20"/>
-              </w:rPr>
-              <w:t>1:32-1:36</w:t>
-            </w:r>
-          </w:p>
-        </w:tc>
-        <w:tc>
-          <w:tcPr>
-            <w:tcW w:type="dxa" w:w="737"/>
-          </w:tcPr>
-          <w:p>
-            <w:pPr>
-              <w:keepNext/>
-              <w:spacing w:after="40"/>
-              <w:jc w:val="center"/>
-            </w:pPr>
-            <w:r>
-              <w:rPr>
-                <w:sz w:val="20"/>
-              </w:rPr>
-              <w:t>4</w:t>
-            </w:r>
-          </w:p>
-        </w:tc>
-        <w:tc>
-          <w:tcPr>
-            <w:tcW w:type="dxa" w:w="1247"/>
-          </w:tcPr>
-          <w:p>
-            <w:pPr>
-              <w:keepNext/>
-              <w:spacing w:after="40"/>
-              <w:jc w:val="center"/>
-            </w:pPr>
-            <w:r>
-              <w:rPr>
-                <w:sz w:val="20"/>
-              </w:rPr>
-              <w:t>464</w:t>
-            </w:r>
-          </w:p>
-        </w:tc>
-        <w:tc>
-          <w:tcPr>
-            <w:tcW w:type="dxa" w:w="1644"/>
-          </w:tcPr>
-          <w:p>
-            <w:pPr>
-              <w:keepNext/>
-              <w:spacing w:after="40"/>
-              <w:jc w:val="center"/>
-            </w:pPr>
-            <w:r>
-              <w:rPr>
-                <w:sz w:val="20"/>
-              </w:rPr>
-              <w:t>2.5</w:t>
-            </w:r>
-          </w:p>
-        </w:tc>
-        <w:tc>
-          <w:tcPr>
-            <w:tcW w:type="dxa" w:w="1417"/>
-          </w:tcPr>
-          <w:p>
-            <w:pPr>
-              <w:keepNext/>
-              <w:spacing w:after="40"/>
-              <w:jc w:val="center"/>
-            </w:pPr>
-            <w:r>
-              <w:rPr>
-                <w:sz w:val="20"/>
-              </w:rPr>
-              <w:t>121</w:t>
-            </w:r>
-          </w:p>
-        </w:tc>
-      </w:tr>
-      <w:tr>
-        <w:tc>
-          <w:tcPr>
-            <w:tcW w:type="dxa" w:w="3175"/>
-          </w:tcPr>
-          <w:p>
-            <w:pPr>
-              <w:keepNext/>
-              <w:spacing w:after="40"/>
-            </w:pPr>
-            <w:r>
-              <w:rPr>
-                <w:sz w:val="20"/>
-              </w:rPr>
-              <w:t>Margen</w:t>
-            </w:r>
-          </w:p>
-        </w:tc>
-        <w:tc>
-          <w:tcPr>
-            <w:tcW w:type="dxa" w:w="1361"/>
-          </w:tcPr>
-          <w:p>
-            <w:pPr>
-              <w:keepNext/>
-              <w:spacing w:after="40"/>
-              <w:jc w:val="center"/>
-            </w:pPr>
-            <w:r>
-              <w:rPr>
-                <w:sz w:val="20"/>
-              </w:rPr>
-              <w:t>1:36-2:00</w:t>
-            </w:r>
-          </w:p>
-        </w:tc>
-        <w:tc>
-          <w:tcPr>
-            <w:tcW w:type="dxa" w:w="737"/>
-          </w:tcPr>
-          <w:p>
-            <w:pPr>
-              <w:keepNext/>
-              <w:spacing w:after="40"/>
-              <w:jc w:val="center"/>
-            </w:pPr>
-            <w:r>
-              <w:rPr>
-                <w:sz w:val="20"/>
-              </w:rPr>
-              <w:t>24</w:t>
-            </w:r>
-          </w:p>
-        </w:tc>
-        <w:tc>
-          <w:tcPr>
-            <w:tcW w:type="dxa" w:w="1247"/>
-          </w:tcPr>
-          <w:p>
-            <w:pPr>
-              <w:keepNext/>
-              <w:spacing w:after="40"/>
-              <w:jc w:val="center"/>
-            </w:pPr>
-            <w:r>
-              <w:rPr>
-                <w:sz w:val="20"/>
-              </w:rPr>
-              <w:t>-</w:t>
-            </w:r>
-          </w:p>
-        </w:tc>
-        <w:tc>
-          <w:tcPr>
-            <w:tcW w:type="dxa" w:w="1644"/>
-          </w:tcPr>
-          <w:p>
-            <w:pPr>
-              <w:keepNext/>
-              <w:spacing w:after="40"/>
-              <w:jc w:val="center"/>
-            </w:pPr>
-            <w:r>
-              <w:rPr>
-                <w:sz w:val="20"/>
-              </w:rPr>
-              <w:t>-</w:t>
-            </w:r>
-          </w:p>
-        </w:tc>
-        <w:tc>
-          <w:tcPr>
-            <w:tcW w:type="dxa" w:w="1417"/>
-          </w:tcPr>
-          <w:p>
-            <w:pPr>
-              <w:keepNext/>
-              <w:spacing w:after="40"/>
-              <w:jc w:val="center"/>
-            </w:pPr>
-            <w:r>
-              <w:rPr>
-                <w:sz w:val="20"/>
-              </w:rPr>
-              <w:t>-</w:t>
-            </w:r>
-          </w:p>
-        </w:tc>
-      </w:tr>
-      <w:tr>
-        <w:tc>
-          <w:tcPr>
-            <w:tcW w:type="dxa" w:w="3175"/>
-          </w:tcPr>
-          <w:p>
-            <w:pPr>
-              <w:spacing w:after="40"/>
-            </w:pPr>
-            <w:r>
-              <w:rPr>
-                <w:b/>
-                <w:sz w:val="20"/>
-              </w:rPr>
-              <w:t>Total</w:t>
-            </w:r>
-          </w:p>
-        </w:tc>
-        <w:tc>
-          <w:tcPr>
-            <w:tcW w:type="dxa" w:w="1361"/>
-          </w:tcPr>
-          <w:p>
-            <w:pPr>
-              <w:spacing w:after="40"/>
-              <w:jc w:val="center"/>
-            </w:pPr>
-          </w:p>
-        </w:tc>
-        <w:tc>
-          <w:tcPr>
-            <w:tcW w:type="dxa" w:w="737"/>
-          </w:tcPr>
-          <w:p>
-            <w:pPr>
-              <w:spacing w:after="40"/>
-              <w:jc w:val="center"/>
-            </w:pPr>
-            <w:r>
-              <w:rPr>
-                <w:b/>
-                <w:sz w:val="20"/>
-              </w:rPr>
-              <w:t>120</w:t>
-            </w:r>
-          </w:p>
-        </w:tc>
-        <w:tc>
-          <w:tcPr>
-            <w:tcW w:type="dxa" w:w="1247"/>
-          </w:tcPr>
-          <w:p>
-            <w:pPr>
-              <w:spacing w:after="40"/>
-              <w:jc w:val="center"/>
-            </w:pPr>
-            <w:r>
-              <w:rPr>
-                <w:b/>
-                <w:sz w:val="20"/>
-              </w:rPr>
-              <w:t>11,766</w:t>
-            </w:r>
-          </w:p>
-        </w:tc>
-        <w:tc>
-          <w:tcPr>
-            <w:tcW w:type="dxa" w:w="1644"/>
-          </w:tcPr>
-          <w:p>
-            <w:pPr>
-              <w:spacing w:after="40"/>
-              <w:jc w:val="center"/>
-            </w:pPr>
-            <w:r>
-              <w:rPr>
-                <w:b/>
-                <w:sz w:val="20"/>
-              </w:rPr>
-              <w:t>63.6</w:t>
-            </w:r>
-          </w:p>
-        </w:tc>
-        <w:tc>
-          <w:tcPr>
-            <w:tcW w:type="dxa" w:w="1417"/>
-          </w:tcPr>
-          <w:p>
-            <w:pPr>
-              <w:spacing w:after="40"/>
-              <w:jc w:val="center"/>
-            </w:pPr>
-            <w:r>
-              <w:rPr>
-                <w:b/>
-                <w:sz w:val="20"/>
-              </w:rPr>
-              <w:t>1,267</w:t>
-            </w:r>
-          </w:p>
-        </w:tc>
-      </w:tr>
-    </w:tbl>
-    <w:p>
-      <w:pPr>
-        <w:spacing w:after="40"/>
-      </w:pPr>
-    </w:p>
-    <w:p>
-      <w:r>
-        <w:rPr/>
-        <w:t>Las dos horas son seguidas. De los 120 minutos, unos 64 son de habla, unos 32 son pantalla, demostración y pausas entre diapositivas, y 24 quedan de margen. El margen no se llena: sirve para preguntas, para una demostración que se alargue o para terminar a tiempo. La columna «Habla» es el texto escrito de cada bloque dicho a 185 palabras por minuto; «Min» es el tiempo del bloque con la pantalla incluida.</w:t>
-      </w:r>
-    </w:p>
-    <w:p>
-      <w:pPr>
-        <w:pStyle w:val="Heading1"/>
-      </w:pPr>
-      <w:r>
-        <w:t>Notas para quien presenta</w:t>
-      </w:r>
-    </w:p>
-    <w:p>
-      <w:r>
-        <w:rPr/>
-        <w:t>Estas notas no se leen en voz alta. Son puntos que conviene resolver o comprobar antes de la sesión.</w:t>
-      </w:r>
-    </w:p>
-    <w:p>
-      <w:pPr>
-        <w:pStyle w:val="ListNumber"/>
-      </w:pPr>
-      <w:r>
-        <w:rPr/>
-        <w:t>Ensayo del 20 de octubre. El revisor notó que casi toda la presentación se leía, que había conceptos que aparecían tarde respecto a su explicación y que lo más importante era el orden y el tono platicado. Este guion sigue su orden: primero el contexto y el caso de estudio, después por qué una plataforma web, la imagen digital, y entonces el sitio funcionando. El revisor también pidió numerar las diapositivas.</w:t>
-      </w:r>
-    </w:p>
-    <w:p>
-      <w:pPr>
-        <w:pStyle w:val="ListNumber"/>
-      </w:pPr>
-      <w:r>
-        <w:rPr/>
-        <w:t>Preguntas del público. El público puede preguntar en cualquier momento; quien presenta no hace preguntas al público. Responder breve y concreto. Si la pregunta es muy técnica: «Buena pregunta, la vemos al final de la sesión» (o en la sesión que corresponda). Como respaldo, las preguntas que no alcancen a contestarse se pueden mandar por escrito (por ejemplo, por el chat de la videollamada); falta definir cuándo se responden.</w:t>
-      </w:r>
-    </w:p>
-    <w:p>
-      <w:pPr>
-        <w:pStyle w:val="ListNumber"/>
-      </w:pPr>
-      <w:r>
-        <w:rPr/>
-        <w:t>Grabación. Decirlo al inicio. Según el revisor, la grabación se sube a redes y se puede editar, incluida la voz, si no se quiere aparecer. Sin cámara, usar una foto de perfil. Confirmar con el revisor qué se dice sobre dónde se publica.</w:t>
-      </w:r>
-    </w:p>
-    <w:p>
-      <w:pPr>
-        <w:pStyle w:val="ListNumber"/>
-      </w:pPr>
-      <w:r>
-        <w:rPr/>
-        <w:t>Antes de empezar (15 minutos antes). Probar la videollamada y compartir pantalla. Abrir el sitio con el zoom del navegador al 125 %. Tener un análisis ya hecho en «Mis análisis».</w:t>
-      </w:r>
-    </w:p>
-    <w:p>
-      <w:pPr>
-        <w:pStyle w:val="ListNumber"/>
-      </w:pPr>
-      <w:r>
-        <w:rPr/>
-        <w:t>Tiempo de análisis. En la computadora de desarrollo, una foto grande de fluorescencia tarda unos 40 segundos y una de fondo claro entre 10 y 20. En el VPS no se ha medido. Si el análisis en vivo se alarga, abrir el que ya está hecho en «Mis análisis».</w:t>
-      </w:r>
-    </w:p>
-    <w:p>
-      <w:pPr>
-        <w:pStyle w:val="ListNumber"/>
-      </w:pPr>
-      <w:r>
-        <w:rPr/>
-        <w:t xml:space="preserve">Estado del sitio (revisado el 21 de octubre, después de los commits </w:t>
-      </w:r>
-      <w:r>
-        <w:rPr>
-          <w:rFonts w:ascii="Consolas" w:hAnsi="Consolas"/>
-          <w:sz w:val="21"/>
-        </w:rPr>
-        <w:t>fd13cba</w:t>
-      </w:r>
-      <w:r>
-        <w:rPr/>
-        <w:t xml:space="preserve"> y </w:t>
-      </w:r>
-      <w:r>
-        <w:rPr>
-          <w:rFonts w:ascii="Consolas" w:hAnsi="Consolas"/>
-          <w:sz w:val="21"/>
-        </w:rPr>
-        <w:t>6c2d5d7</w:t>
-      </w:r>
-      <w:r>
-        <w:rPr/>
-        <w:t>). Ya está hecho, y el guion lo describe así:</w:t>
-      </w:r>
-    </w:p>
-    <w:p>
-      <w:pPr>
-        <w:pStyle w:val="ListBullet2"/>
-      </w:pPr>
-      <w:r>
-        <w:rPr/>
-        <w:t>El aviso de espera: la cubierta dice que es normal que el análisis tarde y, pasado un minuto, avisa que sigue en curso (sugerencia de Isaac).</w:t>
-      </w:r>
-    </w:p>
-    <w:p>
-      <w:pPr>
-        <w:pStyle w:val="ListBullet2"/>
-      </w:pPr>
-      <w:r>
-        <w:rPr/>
-        <w:t>El texto de la escala: «Para estandarizar el tamaño de las imágenes se usa la misma escala en todas: 60 px = 1 µm», en pantalla, en el PDF y en la regla de la imagen marcada.</w:t>
-      </w:r>
-    </w:p>
-    <w:p>
-      <w:pPr>
-        <w:pStyle w:val="ListBullet2"/>
-      </w:pPr>
-      <w:r>
-        <w:rPr/>
-        <w:t>Los recuadros de «modelo preliminar» y de «escala provisional» ya no aparecen, ni en pantalla ni en el PDF.</w:t>
-      </w:r>
-    </w:p>
-    <w:p>
-      <w:pPr>
-        <w:pStyle w:val="ListBullet2"/>
-      </w:pPr>
-      <w:r>
-        <w:rPr/>
-        <w:t>Los datos principales (área media y desviación estándar) salen en µm², con los píxeles como apoyo, y el PDF también pone primero las micras.</w:t>
-      </w:r>
-    </w:p>
-    <w:p>
-      <w:pPr>
-        <w:ind w:left="720"/>
-      </w:pPr>
-      <w:r>
-        <w:rPr/>
-        <w:t>Por revisar antes del viernes:</w:t>
-      </w:r>
-    </w:p>
-    <w:p>
-      <w:pPr>
-        <w:pStyle w:val="ListBullet2"/>
-      </w:pPr>
-      <w:r>
-        <w:rPr/>
-        <w:t>Contenido real de Nosotros, Aliados e infografías. El texto y las fotos se envían a más tardar el jueves temprano.</w:t>
-      </w:r>
-    </w:p>
-    <w:p>
-      <w:pPr>
-        <w:pStyle w:val="ListBullet2"/>
-      </w:pPr>
-      <w:r>
-        <w:rPr/>
-        <w:t>El histograma todavía rotula el eje horizontal en píxeles («Área del espermatozoide (px)»), aunque los datos principales están en micras. Decidir si se cambia o si se explica al leerlo.</w:t>
-      </w:r>
-    </w:p>
-    <w:p>
-      <w:pPr>
-        <w:pStyle w:val="ListBullet2"/>
-      </w:pPr>
-      <w:r>
-        <w:rPr/>
-        <w:t>Que el PDF salga completo (en el ensayo se veía incompleto) y que la imagen de ejemplo no muestre ningún aviso extra (en el ensayo salía uno y se acordó quitarlo).</w:t>
-      </w:r>
-    </w:p>
-    <w:p>
-      <w:pPr>
-        <w:pStyle w:val="ListBullet2"/>
-      </w:pPr>
-      <w:r>
-        <w:rPr/>
-        <w:t>Que el sitio esté en línea, con el VPS, antes del viernes por la tarde.</w:t>
-      </w:r>
-    </w:p>
-    <w:p>
-      <w:pPr>
-        <w:pStyle w:val="ListNumber"/>
-      </w:pPr>
-      <w:r>
-        <w:rPr/>
-        <w:t>Tres imágenes que no son espermatozoides (bloque 9). Prepararlas con anticipación, de libre uso (el revisor sugirió células de hígado y de riñón). Probarlas antes: presentar solo lo que el sitio haga de verdad. Si el sitio marca algo en alguna, sirve para explicar el falso positivo.</w:t>
-      </w:r>
-    </w:p>
-    <w:p>
-      <w:pPr>
-        <w:pStyle w:val="ListNumber"/>
-      </w:pPr>
-      <w:r>
-        <w:rPr/>
-        <w:t>Escala. La escala se presenta como la presenta el sitio: se usa la misma en todas las imágenes para estandarizar su tamaño (60 px = 1 µm; la regla de la imagen marcada mide 300 px = 5 µm). No decir «imaginaria» ni entrar en el detalle de las medidas. Si preguntan cómo se sabe que es correcta: es una escala común para estandarizar el tamaño de las imágenes y poder compararlas entre sí, y cada resultado la declara.</w:t>
-      </w:r>
-    </w:p>
-    <w:p>
-      <w:pPr>
-        <w:pStyle w:val="ListNumber"/>
-      </w:pPr>
-      <w:r>
-        <w:rPr/>
-        <w:t>Largo. En el código, el largo es el lado mayor del rectángulo mínimo que encierra el contorno (</w:t>
-      </w:r>
-      <w:r>
-        <w:rPr>
-          <w:rFonts w:ascii="Consolas" w:hAnsi="Consolas"/>
-          <w:sz w:val="21"/>
-        </w:rPr>
-        <w:t>app/analisis/medicion.py</w:t>
-      </w:r>
-      <w:r>
-        <w:rPr/>
-        <w:t>), no la longitud a lo largo de la curva. Este guion solo dice «largo». El README y el guion anterior decían que se mide a lo largo de la forma; conviene corregirlos para que todo diga lo mismo. El detalle del método se ve en la sesión 3.</w:t>
-      </w:r>
-    </w:p>
-    <w:p>
-      <w:pPr>
-        <w:pStyle w:val="ListNumber"/>
-      </w:pPr>
-      <w:r>
-        <w:rPr/>
-        <w:t>Conocimiento general. Lo que se dice de píxeles, brillo de 0 a 255 y compresión del JPG es de conocimiento general, no del repositorio. Las cifras del sitio (hasta 10 imágenes, 300 MB por envío, 10 intervalos del histograma, contraseña de 8 caracteres) salen del código.</w:t>
-      </w:r>
-    </w:p>
-    <w:p>
-      <w:pPr>
-        <w:pStyle w:val="ListNumber"/>
-      </w:pPr>
-      <w:r>
-        <w:rPr/>
-        <w:t xml:space="preserve">Lo que ya no va en esta sesión. La red neuronal, el entrenamiento y las cifras de los modelos pasan a las sesiones 2 a 4. La versión anterior de este guion, con ese material completo, está en el historial de git: </w:t>
-      </w:r>
-      <w:r>
-        <w:rPr>
-          <w:rFonts w:ascii="Consolas" w:hAnsi="Consolas"/>
-          <w:sz w:val="21"/>
-        </w:rPr>
-        <w:t>git show faf9599:docs/capacitacion/guion-sesion-1.md</w:t>
-      </w:r>
-      <w:r>
-        <w:rPr/>
-        <w:t>.</w:t>
-      </w:r>
-    </w:p>
-    <w:p>
-      <w:pPr>
-        <w:pStyle w:val="ListNumber"/>
-      </w:pPr>
-      <w:r>
-        <w:rPr/>
-        <w:t>Tono. Lenguaje profesional pero platicado. Sin comentarios que sugieran que el grupo no sabe. Cada término técnico se explica en una frase la primera vez que aparece. Las muletillas y las pausas son bienvenidas, sobre todo en los primeros minutos; conforme avance la sesión, la voz se asienta sola.</w:t>
-      </w:r>
-    </w:p>
-    <w:p>
-      <w:pPr>
-        <w:pStyle w:val="ListNumber"/>
-      </w:pPr>
-      <w:r>
-        <w:rPr/>
-        <w:t>Presentación. Tiene 23 diapositivas numeradas. El sistema se presenta en el navegador: una sola diapositiva («Presentación del sistema», la 18) marca el cambio, y no hay diapositivas con capturas. Por eso los bloques 5 a 8 y 10 se cuentan hablando frente a la pantalla del sitio, y las indicaciones entre corchetes describen con detalle lo que se ve y lo que se hace en cada pantalla, sin imágenes.</w:t>
-      </w:r>
-    </w:p>
-    <w:p>
-      <w:pPr>
-        <w:pStyle w:val="ListNumber"/>
-      </w:pPr>
-      <w:r>
-        <w:rPr/>
-        <w:t>Tiempos. La primera versión de este guion calculaba los tiempos con topes de palabras y no con el texto escrito, y prometía mucho más tiempo del que el texto cubría. Esta versión suma el texto real de cada bloque. Si en el ensayo un bloque sale más largo o más corto, ajustar la hora en la tabla de tiempos.</w:t>
+        <w:t>Ritmo considerado: 175 palabras por minuto. Cada bloque trae su horario, su duración y las palabras que se dicen.</w:t>
       </w:r>
     </w:p>
     <w:p>
@@ -1928,89 +61,7 @@
         <w:rPr>
           <w:i/>
         </w:rPr>
-        <w:t>0:00-0:05 · 5 min · 659 palabras, unos 3.6 min de habla</w:t>
-      </w:r>
-    </w:p>
-    <w:p>
-      <w:r>
-        <w:rPr>
-          <w:b/>
-        </w:rPr>
-        <w:t>Idea que debe quedar:</w:t>
-      </w:r>
-      <w:r>
-        <w:rPr/>
-        <w:t xml:space="preserve"> son cuatro sesiones, hoy vemos el problema y el sitio, y pueden preguntar cuando quieran.</w:t>
-      </w:r>
-    </w:p>
-    <w:p>
-      <w:r>
-        <w:rPr>
-          <w:b/>
-        </w:rPr>
-        <w:t>Ideas, en orden:</w:t>
-      </w:r>
-    </w:p>
-    <w:p>
-      <w:pPr>
-        <w:pStyle w:val="ListBullet"/>
-      </w:pPr>
-      <w:r>
-        <w:rPr/>
-        <w:t>Saludo y presentación: nombre y qué hace.</w:t>
-      </w:r>
-    </w:p>
-    <w:p>
-      <w:pPr>
-        <w:pStyle w:val="ListBullet"/>
-      </w:pPr>
-      <w:r>
-        <w:rPr/>
-        <w:t>Qué es este curso y cómo se va a contar: un solo proyecto, desde adentro.</w:t>
-      </w:r>
-    </w:p>
-    <w:p>
-      <w:pPr>
-        <w:pStyle w:val="ListBullet"/>
-      </w:pPr>
-      <w:r>
-        <w:rPr/>
-        <w:t>La sesión queda grabada.</w:t>
-      </w:r>
-    </w:p>
-    <w:p>
-      <w:pPr>
-        <w:pStyle w:val="ListBullet"/>
-      </w:pPr>
-      <w:r>
-        <w:rPr/>
-        <w:t>Cómo preguntar: en cualquier momento; lo muy técnico se deja para el final.</w:t>
-      </w:r>
-    </w:p>
-    <w:p>
-      <w:pPr>
-        <w:pStyle w:val="ListBullet"/>
-      </w:pPr>
-      <w:r>
-        <w:rPr/>
-        <w:t>Las cuatro sesiones y sus enfoques.</w:t>
-      </w:r>
-    </w:p>
-    <w:p>
-      <w:pPr>
-        <w:pStyle w:val="ListBullet"/>
-      </w:pPr>
-      <w:r>
-        <w:rPr/>
-        <w:t>La agenda de hoy y el tono: dos horas seguidas, cada término técnico se explica.</w:t>
-      </w:r>
-    </w:p>
-    <w:p>
-      <w:r>
-        <w:rPr>
-          <w:b/>
-        </w:rPr>
-        <w:t>Texto para decir:</w:t>
+        <w:t>0:00-0:05 · 5 min · 557 palabras, unos 3.2 min de habla</w:t>
       </w:r>
     </w:p>
     <w:p>
@@ -2026,49 +77,21 @@
       </w:r>
     </w:p>
     <w:p>
-      <w:pPr>
-        <w:pBdr>
-          <w:left w:val="single" w:sz="24" w:space="8" w:color="BF9000"/>
-        </w:pBdr>
-        <w:spacing w:before="80" w:after="160"/>
-        <w:ind w:left="397"/>
-        <w:shd w:val="clear" w:color="auto" w:fill="FFF2CC"/>
-      </w:pPr>
       <w:r>
         <w:rPr/>
-        <w:t>Eh... buenas tardes a todos, y gracias por conectarse. Este... soy Angel Frausto Robles, desarrollador de Image Bio Pro.</w:t>
+        <w:t>Eh... buenas tardes a todos, y gracias por conectarse. Este... soy Angel Frausto Robles, desarrollador de Image Bio Pro. Les agradezco que estén aquí, sobre todo un viernes por la tarde.</w:t>
       </w:r>
     </w:p>
     <w:p>
       <w:r>
         <w:rPr/>
-        <w:t>Les agradezco que estén aquí, sobre todo un viernes por la tarde. Antes de entrar en materia, les cuento rápido de qué se trata esto. Es la primera de cuatro sesiones del curso BIOIMAGE 2026, y todo el curso gira alrededor de un solo proyecto: un sitio web que cuenta y mide espermatozoides en fotografías de microscopio, usando inteligencia artificial.</w:t>
+        <w:t>Antes de entrar en materia, les cuento de qué se trata esto. Esta es la primera de cuatro sesiones del curso BIOIMAGE 2026, y todo el curso gira alrededor de un solo proyecto: un sitio web que cuenta y mide espermatozoides en fotografías de microscopio, usando inteligencia artificial. Yo desarrollé el sitio, así que les voy a contar cómo se usa y también por qué quedó como quedó.</w:t>
       </w:r>
     </w:p>
     <w:p>
       <w:r>
         <w:rPr/>
-        <w:t>Yo fui quien desarrolló ese sitio, así que lo que les voy a contar no sale de un libro. Es lo que fui viendo mientras lo construía, con lo que funcionó y con lo que costó trabajo. Por eso van a escucharme explicar tanto el sitio como las decisiones que hay detrás.</w:t>
-      </w:r>
-    </w:p>
-    <w:p>
-      <w:pPr>
-        <w:pBdr>
-          <w:left w:val="single" w:sz="24" w:space="8" w:color="BF9000"/>
-        </w:pBdr>
-        <w:spacing w:before="80" w:after="160"/>
-        <w:ind w:left="397"/>
-        <w:shd w:val="clear" w:color="auto" w:fill="FFF2CC"/>
-      </w:pPr>
-      <w:r>
-        <w:rPr/>
-        <w:t>Bueno, primero... esta sesión queda grabada. Si tienen una duda, pregúntenme en cualquier momento, ¿va? Eh, las respuestas muy técnicas las dejamos para el final, para no perder el hilo.</w:t>
-      </w:r>
-    </w:p>
-    <w:p>
-      <w:r>
-        <w:rPr/>
-        <w:t>Lo digo desde ahora para que nadie se sorprenda después. La grabación se comparte más adelante y se puede editar si hace falta. Y sobre las preguntas: esto es una charla, no un examen. Yo no les voy a hacer preguntas a ustedes. Quien quiera preguntar, lo hace en el momento que le surja la duda, por el chat o con la voz, como prefiera. Voy a tratar de responder breve y concreto. Si la pregunta es muy técnica, les voy a decir que la vemos al final de la sesión, o en la sesión que corresponda, para no perder el hilo de lo que estamos viendo.</w:t>
+        <w:t>Bueno, primero... esta sesión queda grabada, y la grabación se comparte más adelante. Y si tienen una duda, pregúntenme en cualquier momento, ¿va? Por el chat o con la voz, como les acomode. Eh, si la respuesta se vuelve muy técnica, la dejamos para el final, para no perder el hilo.</w:t>
       </w:r>
     </w:p>
     <w:p>
@@ -2084,14 +107,6 @@
       </w:r>
     </w:p>
     <w:p>
-      <w:pPr>
-        <w:pBdr>
-          <w:left w:val="single" w:sz="24" w:space="8" w:color="BF9000"/>
-        </w:pBdr>
-        <w:spacing w:before="80" w:after="160"/>
-        <w:ind w:left="397"/>
-        <w:shd w:val="clear" w:color="auto" w:fill="FFF2CC"/>
-      </w:pPr>
       <w:r>
         <w:rPr/>
         <w:t>Son cuatro sesiones. Hoy vemos el problema y el sitio... mañana, cómo aprende la computadora; el lunes, cómo funciona el sistema por dentro; y el martes, este, los datos y cómo se reentrena el modelo.</w:t>
@@ -2100,13 +115,7 @@
     <w:p>
       <w:r>
         <w:rPr/>
-        <w:t>Cada sesión es de dos horas, por Zoom, y cada una se enfoca en una parte distinta de cómo se hace un sistema como este. Hoy, viernes, vemos la parte de adelante: lo que ve y usa una persona cuando entra al sitio. En programación a eso se le llama frontend. Mañana, sábado por la mañana, vemos cómo aprende la computadora, y ahí entran las redes neuronales convolucionales, que son las que saben mirar imágenes.</w:t>
-      </w:r>
-    </w:p>
-    <w:p>
-      <w:r>
-        <w:rPr/>
-        <w:t>El lunes vemos la parte de atrás, lo que pasa dentro del sistema cuando alguien sube una imagen. A eso se le llama backend. Y el martes cerramos con los datos, con cómo se vuelve a entrenar el modelo cuando llegan imágenes nuevas, y con cloud computing, que quiere decir usar una computadora en internet, en lugar de la nuestra, para que el sitio esté disponible para todos. Ese día les voy a enseñar cómo subimos este sitio a un servidor de verdad.</w:t>
+        <w:t>Cada sesión es de dos horas, por Zoom, y cada una se enfoca en una parte distinta de cómo se hace un sistema como este. Hoy, viernes, vemos la parte de adelante: lo que ve y usa una persona cuando entra al sitio. En programación a eso se le llama frontend. Mañana, sábado por la mañana, vemos cómo aprende la computadora, y ahí entran las redes neuronales convolucionales, que son las que saben mirar imágenes. El lunes vemos la parte de atrás, lo que pasa dentro del sistema cuando alguien sube una imagen, que es lo que se llama backend. Y el martes cerramos con los datos, con cómo se vuelve a entrenar el modelo cuando llegan imágenes nuevas, y con cloud computing, que quiere decir usar una computadora en internet, en lugar de la nuestra, para que el sitio esté disponible para todos. Ese día les voy a enseñar cómo se sube un sitio como este a un servidor de verdad.</w:t>
       </w:r>
     </w:p>
     <w:p>
@@ -2122,14 +131,6 @@
       </w:r>
     </w:p>
     <w:p>
-      <w:pPr>
-        <w:pBdr>
-          <w:left w:val="single" w:sz="24" w:space="8" w:color="BF9000"/>
-        </w:pBdr>
-        <w:spacing w:before="80" w:after="160"/>
-        <w:ind w:left="397"/>
-        <w:shd w:val="clear" w:color="auto" w:fill="FFF2CC"/>
-      </w:pPr>
       <w:r>
         <w:rPr/>
         <w:t>Hoy vamos a empezar por el problema, luego veremos qué es una imagen digital y después el sitio. Al final, un análisis en vivo.</w:t>
@@ -2138,13 +139,13 @@
     <w:p>
       <w:r>
         <w:rPr/>
-        <w:t>Les detallo un poco más. Primero voy a plantear el problema que vamos a resolver, y por qué conviene hacerlo con una página web en lugar de un programa suelto. Después vamos a ver qué es una imagen digital para una computadora, porque de ahí sale todo lo que se mide. Luego pasamos al sitio funcionando, en el navegador: cómo se crea una cuenta, cómo se sube una imagen, cómo se leen los resultados y cómo se descargan. Y casi al final vemos qué pasa cuando la imagen no es de espermatozoides, porque ahí se entiende bien hasta dónde llega el modelo.</w:t>
+        <w:t>Les detallo un poco más. Primero voy a plantear el problema que vamos a resolver, y por qué conviene hacerlo con una página web en lugar de un programa suelto. Después vamos a ver qué es una imagen digital para una computadora, porque de ahí sale todo lo que se mide. Luego pasamos al sitio funcionando, en el navegador: cómo se crea una cuenta, cómo se sube una imagen, cómo se leen los resultados y cómo se descargan. Y ya casi al final vemos qué pasa cuando la imagen no es de espermatozoides, porque ahí se entiende bien hasta dónde llega el modelo.</w:t>
       </w:r>
     </w:p>
     <w:p>
       <w:r>
         <w:rPr/>
-        <w:t>Son dos horas seguidas, así que si alguien necesita pararse un momento, lo puede hacer con toda confianza, que la grabación queda. Y una última cosa sobre el tono: este curso es para una comunidad universitaria con perfiles distintos, algunos con más programación, otros con más biología. Por eso cada término técnico lo voy a explicar en una frase la primera vez que aparezca. Si se me pasa alguno, pregúntenme sin pena.</w:t>
+        <w:t>Son dos horas seguidas, así que si alguien necesita pararse un momento, adelante. Y si en algún momento digo un término que no conocen, pregúntenme, que seguro alguien más tiene la misma duda. Lo que quiero es que al final de hoy tengan claro qué hace la red y qué hace el código en este proyecto, que puedan entrar al sitio y analizar una imagen, y que sepan cuándo desconfiar de un número. ¿Alguna duda hasta aquí? Si no, arrancamos con el problema.</w:t>
       </w:r>
     </w:p>
     <w:p>
@@ -2160,107 +161,7 @@
         <w:rPr>
           <w:i/>
         </w:rPr>
-        <w:t>0:05-0:19 · 14 min · 2,315 palabras, unos 12.5 min de habla</w:t>
-      </w:r>
-    </w:p>
-    <w:p>
-      <w:r>
-        <w:rPr>
-          <w:b/>
-        </w:rPr>
-        <w:t>Idea que debe quedar:</w:t>
-      </w:r>
-      <w:r>
-        <w:rPr/>
-        <w:t xml:space="preserve"> vamos a aprender cómo se usa la inteligencia artificial resolviendo un problema concreto, contar y medir espermatozoides en fotografías, y la clave es repartir el trabajo entre la red y el código.</w:t>
-      </w:r>
-    </w:p>
-    <w:p>
-      <w:r>
-        <w:rPr>
-          <w:b/>
-        </w:rPr>
-        <w:t>Ideas, en orden:</w:t>
-      </w:r>
-    </w:p>
-    <w:p>
-      <w:pPr>
-        <w:pStyle w:val="ListBullet"/>
-      </w:pPr>
-      <w:r>
-        <w:rPr/>
-        <w:t>Para qué sirve la inteligencia artificial en la educación y la investigación; una aplicación es analizar imágenes.</w:t>
-      </w:r>
-    </w:p>
-    <w:p>
-      <w:pPr>
-        <w:pStyle w:val="ListBullet"/>
-      </w:pPr>
-      <w:r>
-        <w:rPr/>
-        <w:t>La microscopía como fuente de imágenes y el objetivo del curso.</w:t>
-      </w:r>
-    </w:p>
-    <w:p>
-      <w:pPr>
-        <w:pStyle w:val="ListBullet"/>
-      </w:pPr>
-      <w:r>
-        <w:rPr/>
-        <w:t>Aprender con un caso de estudio; no hace falta venir de la programación ni de la biología.</w:t>
-      </w:r>
-    </w:p>
-    <w:p>
-      <w:pPr>
-        <w:pStyle w:val="ListBullet"/>
-      </w:pPr>
-      <w:r>
-        <w:rPr/>
-        <w:t>La foto de ejemplo y el problema de contar y medir a mano.</w:t>
-      </w:r>
-    </w:p>
-    <w:p>
-      <w:pPr>
-        <w:pStyle w:val="ListBullet"/>
-      </w:pPr>
-      <w:r>
-        <w:rPr/>
-        <w:t>Dos tipos de foto, con un modelo para cada una.</w:t>
-      </w:r>
-    </w:p>
-    <w:p>
-      <w:pPr>
-        <w:pStyle w:val="ListBullet"/>
-      </w:pPr>
-      <w:r>
-        <w:rPr/>
-        <w:t>La red localiza y el código mide; por qué se reparte así.</w:t>
-      </w:r>
-    </w:p>
-    <w:p>
-      <w:pPr>
-        <w:pStyle w:val="ListBullet"/>
-      </w:pPr>
-      <w:r>
-        <w:rPr/>
-        <w:t>Tres principios: no suponer, separar, reproducir.</w:t>
-      </w:r>
-    </w:p>
-    <w:p>
-      <w:pPr>
-        <w:pStyle w:val="ListBullet"/>
-      </w:pPr>
-      <w:r>
-        <w:rPr/>
-        <w:t>Funciona y se puede mejorar; los retos se cuentan al final.</w:t>
-      </w:r>
-    </w:p>
-    <w:p>
-      <w:r>
-        <w:rPr>
-          <w:b/>
-        </w:rPr>
-        <w:t>Texto para decir:</w:t>
+        <w:t>0:05-0:18 · 13 min · 1,827 palabras, unos 10.4 min de habla</w:t>
       </w:r>
     </w:p>
     <w:p>
@@ -2290,65 +191,37 @@
     <w:p>
       <w:r>
         <w:rPr/>
-        <w:t>En lugar de escribir las reglas, se le muestran a la computadora muchos ejemplos ya resueltos. Es decir, fotos donde una persona marcó a mano dónde están los espermatozoides. El programa ajusta por sí mismo lo que necesita para reproducir esas marcas. A eso se le llama aprender de ejemplos, y a lo que resulta de ese proceso se le llama modelo. Cómo sucede ese ajuste lo vemos mañana con calma; hoy solo necesitamos quedarnos con la idea de que el modelo no recibió reglas, recibió ejemplos.</w:t>
+        <w:t>En lugar de escribir las reglas, se le muestran a la computadora muchos ejemplos ya resueltos. Es decir, fotos donde una persona marcó a mano dónde están los espermatozoides. El programa ajusta por sí mismo lo que necesita para reproducir esas marcas. A eso se le llama aprender de ejemplos, y a lo que resulta de ese proceso se le llama modelo. Cómo sucede ese ajuste lo vemos mañana con calma. Hoy solo necesitamos quedarnos con la idea de que el modelo no recibió reglas, recibió ejemplos.</w:t>
       </w:r>
     </w:p>
     <w:p>
       <w:r>
         <w:rPr/>
-        <w:t>Las imágenes vienen de muchas fuentes, y una de las más importantes en las ciencias de la vida es la microscopía. Con un microscopio podemos ver células, por ejemplo espermatozoides, y podemos ver cómo cambian de tamaño y de forma bajo ciertas condiciones. Cuando se estudia eso, cada foto trae información, pero alguien tiene que sacarla: contar, medir, comparar.</w:t>
+        <w:t>Las imágenes vienen de muchas fuentes, y una de las más importantes en las ciencias de la vida es la microscopía. Con un microscopio podemos ver células, por ejemplo espermatozoides, y podemos ver cómo cambian de tamaño y de forma bajo ciertas condiciones. Cada foto trae información, pero alguien tiene que sacarla: contar, medir, comparar.</w:t>
       </w:r>
     </w:p>
     <w:p>
       <w:r>
         <w:rPr/>
-        <w:t>Para quienes no han trabajado con fluorescencia, una explicación breve. En esta técnica las células se tiñen con un colorante que, al recibir cierta luz, la devuelve en otro color. Por eso en la foto la célula brilla y el fondo queda oscuro: lo único que vemos es lo que está teñido. Esto tiene una consecuencia útil para lo que vamos a hacer, y es que hay mucho contraste entre la célula y el fondo. Más adelante, cuando veamos cómo se ve una imagen para una computadora, esto va a tener mucho sentido.</w:t>
+        <w:t>Para quienes no han trabajado con fluorescencia, una explicación breve. En esta técnica las células se tiñen con un colorante que, al recibir cierta luz, la devuelve en otro color. Por eso en la foto la célula brilla y el fondo queda oscuro: lo único que vemos es lo que está teñido. Eso nos conviene, porque hay mucho contraste entre la célula y el fondo. Más adelante, cuando veamos cómo mira una imagen la computadora, esto va a tener mucho sentido.</w:t>
       </w:r>
     </w:p>
     <w:p>
       <w:r>
         <w:rPr/>
-        <w:t>También conviene decir qué tipo de preguntas se contestan con estas fotos. Quien estudia espermatozoides puede querer saber cuántos hay en una muestra, qué tan grandes son, si ese tamaño cambia cuando cambia una condición, y qué tanto varían unos de otros. Todas esas preguntas se contestan midiendo, y medir a mano, uno por uno, es justo lo que vamos a ver que se vuelve un problema.</w:t>
+        <w:t>También conviene decir qué preguntas se contestan con estas fotos. Quien estudia espermatozoides puede querer saber cuántos hay en una muestra, qué tan grandes son, si ese tamaño cambia cuando cambia una condición, y qué tanto varían unos de otros. Todas esas preguntas se contestan midiendo, y medir a mano, uno por uno, es justo lo que vamos a ver que se vuelve un problema.</w:t>
       </w:r>
     </w:p>
     <w:p>
       <w:r>
         <w:rPr/>
-        <w:t>El objetivo de esta capacitación es acercar a la comunidad universitaria, de distintas áreas, a lo que es la inteligencia artificial y a cómo se aplica a un problema técnico y científico real. En este caso, un problema de biología de la reproducción. No estamos hablando de teoría en el aire: vamos a seguir un problema concreto de principio a fin.</w:t>
-      </w:r>
-    </w:p>
-    <w:p>
-      <w:pPr>
-        <w:pBdr>
-          <w:left w:val="single" w:sz="24" w:space="8" w:color="BF9000"/>
-        </w:pBdr>
-        <w:spacing w:before="80" w:after="160"/>
-        <w:ind w:left="397"/>
-        <w:shd w:val="clear" w:color="auto" w:fill="FFF2CC"/>
-      </w:pPr>
-      <w:r>
-        <w:rPr/>
-        <w:t>Entonces, eh, para entender cómo se aplica la inteligencia artificial, vamos a seguir un caso de estudio, o sea, un ejemplo concreto: contar y medir espermatozoides en fotografías de microscopio.</w:t>
-      </w:r>
-    </w:p>
-    <w:p>
-      <w:pPr>
-        <w:pBdr>
-          <w:left w:val="single" w:sz="24" w:space="8" w:color="BF9000"/>
-        </w:pBdr>
-        <w:spacing w:before="80" w:after="160"/>
-        <w:ind w:left="397"/>
-        <w:shd w:val="clear" w:color="auto" w:fill="FFF2CC"/>
-      </w:pPr>
-      <w:r>
-        <w:rPr/>
-        <w:t>Y no se preocupen si algún término no les suena: cada vez que aparezca uno nuevo, lo explico en una frase.</w:t>
+        <w:t>Lo que busco con este curso es que vean cómo se aplica la inteligencia artificial a un problema real, de biología de la reproducción, y no en teoría. Entonces, eh, para entender cómo se aplica la inteligencia artificial, vamos a seguir un caso de estudio, o sea, un ejemplo concreto: contar y medir espermatozoides en fotografías de microscopio.</w:t>
       </w:r>
     </w:p>
     <w:p>
       <w:r>
         <w:rPr/>
-        <w:t>Quiero que quede claro que no hace falta venir de la programación ni de la biología. Si saben programar, van a ver cómo se arma el sistema. Si vienen de biología, van a ver cómo se mide lo que ustedes ya conocen. Y si vienen de otra área, van a ver cómo se aplica la inteligencia artificial a un problema que se puede entender. Aprendemos a través de un ejemplo, y el ejemplo es este.</w:t>
+        <w:t>No hace falta ser experto en nada. Si saben programar, van a ver cómo se arma el sistema, y si vienen de biología, van a ver cómo se mide lo que ya conocen.</w:t>
       </w:r>
     </w:p>
     <w:p>
@@ -2366,13 +239,7 @@
     <w:p>
       <w:r>
         <w:rPr/>
-        <w:t>Les muestro cómo se ve el problema. Esta es una foto de fluorescencia, que es una técnica de microscopía donde las células se tiñen y brillan. Lo que ven son manchas de colores brillantes sobre un fondo oscuro. Cada mancha es la cabeza de un espermatozoide, y a veces se alcanza a ver una línea que sale de ella, que es la cola.</w:t>
-      </w:r>
-    </w:p>
-    <w:p>
-      <w:r>
-        <w:rPr/>
-        <w:t>Ahora pregunto, sin esperar respuesta: ¿cuántos hay en esta foto? Lo primero que haría cualquiera es contarlos con la vista, uno por uno. Y luego, si además hay que medir cada uno, ya no basta con mirar.</w:t>
+        <w:t>Les muestro cómo se ve el problema. Esta es una foto de fluorescencia. Lo que ven son manchas de colores brillantes sobre un fondo oscuro. Cada mancha es la cabeza de un espermatozoide, y a veces se alcanza a ver una línea que sale de ella, que es la cola. Ahora pregunto, sin esperar respuesta: ¿cuántos hay en esta foto? Lo primero que haría cualquiera es contarlos con la vista, uno por uno. Y si además hay que medir cada uno, ya no basta con mirar.</w:t>
       </w:r>
     </w:p>
     <w:p>
@@ -2390,19 +257,13 @@
     <w:p>
       <w:r>
         <w:rPr/>
-        <w:t>El problema es este: contar y medir a mano es lento, es repetitivo y cambia según quién lo haga. Una sola foto puede traer decenas o cientos de células. Muchas están encimadas o pegadas unas a otras, y ahí es donde cada persona decide distinto dónde termina una y empieza la otra. No es falta de cuidado. Es que el ojo no tiene una regla fija.</w:t>
+        <w:t>El problema es este: contar y medir a mano es lento, es repetitivo y cambia según quién lo haga. Una sola foto puede traer decenas o cientos de células. Muchas están encimadas o pegadas unas a otras, y ahí es donde cada persona decide distinto dónde termina una y empieza la otra. El ojo no tiene una regla fija, y por eso cada persona decide distinto. En la diapositiva puse tres conteos de la misma foto, de tres personas distintas. Son números de ejemplo, no de una medición real, pero la idea es esa: tres personas cuidadosas pueden llegar a tres resultados distintos.</w:t>
       </w:r>
     </w:p>
     <w:p>
       <w:r>
         <w:rPr/>
-        <w:t>En la diapositiva puse tres conteos distintos de la misma foto, de tres personas distintas. Son números de ejemplo, no de una medición real, pero la idea es esa: tres personas cuidadosas pueden llegar a tres resultados distintos. Y si además hay que comparar muchas imágenes, el trabajo manual se vuelve muy difícil de sostener.</w:t>
-      </w:r>
-    </w:p>
-    <w:p>
-      <w:r>
-        <w:rPr/>
-        <w:t>Además de contar, muchas veces lo que importa para la investigación es el tamaño: cuánto mide cada célula, cuánto varía de una a otra y cómo cambia ese tamaño entre una condición y otra. Medir cada célula a mano exige trazar su contorno con cuidado y leer el resultado, una y otra vez. Multipliquen eso por cientos de células en una foto y por muchas fotos. Un sistema que haga ese trabajo siempre de la misma manera deja de ser un lujo y se vuelve algo que de verdad hace falta.</w:t>
+        <w:t>Imaginen contar a mano cien células en una foto, y luego repetirlo con muchas fotos... este, cada persona contaría algo distinto, ¿no? Además, para la investigación muchas veces lo que importa es el tamaño: cuánto mide cada célula, cuánto varía de una a otra y cómo cambia ese tamaño entre una condición y otra. Medir cada célula a mano exige trazar su contorno con cuidado y leer el resultado, una y otra vez. Multipliquen eso por cientos de células en una foto y por muchas fotos. Un sistema que haga ese trabajo siempre de la misma manera deja de ser un lujo y se vuelve algo que de verdad hace falta.</w:t>
       </w:r>
     </w:p>
     <w:p>
@@ -2412,37 +273,9 @@
       </w:r>
     </w:p>
     <w:p>
-      <w:pPr>
-        <w:pBdr>
-          <w:left w:val="single" w:sz="24" w:space="8" w:color="BF9000"/>
-        </w:pBdr>
-        <w:spacing w:before="80" w:after="160"/>
-        <w:ind w:left="397"/>
-        <w:shd w:val="clear" w:color="auto" w:fill="FFF2CC"/>
-      </w:pPr>
       <w:r>
         <w:rPr/>
-        <w:t>Imaginen contar a mano cien células en una foto, y luego repetirlo con muchas fotos... este, cada persona contaría algo distinto, ¿no?</w:t>
-      </w:r>
-    </w:p>
-    <w:p>
-      <w:r>
-        <w:rPr/>
-        <w:t>Una cosa más sobre las fotos. En este proyecto trabajamos con dos tipos. Las de fluorescencia, que ya les mostré, con las células brillando sobre un fondo oscuro. Y las de fondo claro, que se ven distinto porque el fondo ya no es oscuro. Para cada tipo tenemos un modelo distinto, y más adelante vamos a ver cómo el sitio elige el que corresponde.</w:t>
-      </w:r>
-    </w:p>
-    <w:p>
-      <w:pPr>
-        <w:pBdr>
-          <w:left w:val="single" w:sz="24" w:space="8" w:color="BF9000"/>
-        </w:pBdr>
-        <w:spacing w:before="80" w:after="160"/>
-        <w:ind w:left="397"/>
-        <w:shd w:val="clear" w:color="auto" w:fill="FFF2CC"/>
-      </w:pPr>
-      <w:r>
-        <w:rPr/>
-        <w:t>Trabajamos con dos tipos de foto: las de fluorescencia, donde las células brillan sobre un fondo oscuro, y las de fondo claro. Para cada tipo tenemos un modelo distinto.</w:t>
+        <w:t>Una cosa más sobre las fotos. Trabajamos con dos tipos: las de fluorescencia, donde las células brillan sobre un fondo oscuro, y las de fondo claro, que se ven distinto porque el fondo ya no es oscuro. Para cada tipo tenemos un modelo distinto, y más adelante vamos a ver cómo el sitio elige el que corresponde.</w:t>
       </w:r>
     </w:p>
     <w:p>
@@ -2460,51 +293,25 @@
     <w:p>
       <w:r>
         <w:rPr/>
-        <w:t>Aquí está la idea central del proyecto, la que más quiero que se lleven hoy: repartir el trabajo. Una red neuronal, que es un programa que aprende de ejemplos, hace una sola cosa. Decide dónde hay un espermatozoide y traza su contorno. Nada más.</w:t>
+        <w:t>La idea central del proyecto es repartir el trabajo. Una red neuronal, que es un programa que aprende de ejemplos, hace una sola cosa. Decide dónde hay un espermatozoide y traza su contorno. Todo lo demás lo hace código convencional, el que se escribe paso a paso: cuántos hay, cuánto mide cada uno, cuál es la media y cuál es la desviación estándar. Son procedimientos explícitos y estandarizados, que cualquiera puede revisar y repetir.</w:t>
       </w:r>
     </w:p>
     <w:p>
       <w:r>
         <w:rPr/>
-        <w:t>Todo lo demás lo hace código convencional, el que se escribe paso a paso. Cuántos hay, cuánto mide cada uno, cuál es la media y cuál es la desviación estándar. Son procedimientos explícitos y estandarizados, que cualquiera puede revisar y repetir.</w:t>
+        <w:t>La red localiza y el código mide. Y bueno, esa división se repite en todo el proyecto. Piénsenlo como un asistente que señala y una calculadora que mide. El asistente puede equivocarse al señalar, pero lo que señaló se puede ver. La calculadora siempre hace la misma cuenta con lo que le dan.</w:t>
       </w:r>
     </w:p>
     <w:p>
       <w:r>
         <w:rPr/>
-        <w:t>Piénsenlo como un asistente que señala y una calculadora que mide. El asistente puede equivocarse al señalar, pero lo que señaló se puede ver. La calculadora siempre hace la misma cuenta con lo que le dan.</w:t>
-      </w:r>
-    </w:p>
-    <w:p>
-      <w:pPr>
-        <w:pBdr>
-          <w:left w:val="single" w:sz="24" w:space="8" w:color="BF9000"/>
-        </w:pBdr>
-        <w:spacing w:before="80" w:after="160"/>
-        <w:ind w:left="397"/>
-        <w:shd w:val="clear" w:color="auto" w:fill="FFF2CC"/>
-      </w:pPr>
-      <w:r>
-        <w:rPr/>
-        <w:t>La red localiza y el código mide. Y bueno, esa división se repite en todo el proyecto.</w:t>
+        <w:t>¿Por qué conviene repartirlo así? Porque si la red hiciera todo, cada número saldría de una caja cerrada y no habría cómo comprobarlo. Supongamos que el sitio dice que una célula tiene cierta área. Ustedes abren la imagen marcada, ven el contorno que se trazó alrededor de esa célula y se preguntan: ¿ese contorno está bien? Si está bien, el área que se calculó dentro de él es simplemente un conteo de píxeles, una operación que cualquiera puede repetir con una regla de tres. Si no está bien, el problema está en el contorno, que es lo único que decidió la red, y eso se ve a simple vista en la imagen.</w:t>
       </w:r>
     </w:p>
     <w:p>
       <w:r>
         <w:rPr/>
-        <w:t>¿Por qué conviene repartirlo así? Porque si la red hiciera todo, cada número saldría de una caja cerrada y no habría cómo comprobarlo. Con el reparto, lo único que no se puede explicar paso a paso es dónde está el contorno, y eso se ve a simple vista. En la práctica, uno abre la imagen marcada, mira el contorno que trazó la red y recalcula la medida. La red propone, y la medición se puede auditar.</w:t>
-      </w:r>
-    </w:p>
-    <w:p>
-      <w:r>
-        <w:rPr/>
-        <w:t>Les doy un ejemplo de qué quiere decir que sea verificable. Supongamos que el sitio dice que una célula tiene cierta área. Ustedes abren la imagen marcada, ven el contorno que se trazó alrededor de esa célula y se preguntan: ¿ese contorno está bien? Si está bien, el área que se calculó dentro de él es simplemente un conteo de píxeles, una operación que cualquiera puede repetir con una regla de tres. Si no está bien, el problema está en el contorno, que es lo único que decidió la red, y eso se ve a simple vista en la imagen.</w:t>
-      </w:r>
-    </w:p>
-    <w:p>
-      <w:r>
-        <w:rPr/>
-        <w:t>Dividir el trabajo así tiene una ventaja que me parece muy valiosa para la ciencia: acota dónde puede estar un error y lo hace visible. Si el programa completo fuera una caja negra que recibe una foto y devuelve una cifra, un error podría estar en cualquier parte y nadie lo vería. Con el reparto, el único punto que no se explica paso a paso es la ubicación del contorno, y ese punto se puede comprobar con los ojos.</w:t>
+        <w:t>Dividir el trabajo así acota dónde puede estar un error y lo hace visible. Si el programa completo fuera una caja negra que recibe una foto y devuelve una cifra, un error podría estar en cualquier parte y nadie lo vería. Con el reparto, el único punto que no se explica paso a paso es la ubicación del contorno, y ese punto se puede comprobar con los ojos. La red propone, y la medición se puede auditar.</w:t>
       </w:r>
     </w:p>
     <w:p>
@@ -2522,71 +329,25 @@
     <w:p>
       <w:r>
         <w:rPr/>
-        <w:t>Hay tres principios que explican lo que vamos a ver en estas sesiones, y se los dejo desde ahora para que los vayan reconociendo.</w:t>
-      </w:r>
-    </w:p>
-    <w:p>
-      <w:pPr>
-        <w:pBdr>
-          <w:left w:val="single" w:sz="24" w:space="8" w:color="BF9000"/>
-        </w:pBdr>
-        <w:spacing w:before="80" w:after="160"/>
-        <w:ind w:left="397"/>
-        <w:shd w:val="clear" w:color="auto" w:fill="FFF2CC"/>
-      </w:pPr>
-      <w:r>
-        <w:rPr/>
-        <w:t>Hay tres principios que explican lo que vamos a ver. El primero... no suponer. Cuando a un dato le falta información, el sitio no la inventa: la indica en pantalla.</w:t>
+        <w:t>Hay tres principios que explican casi todo lo que vamos a ver en estas sesiones. El primero... no suponer. Cuando a un dato le falta información, el sitio no la inventa: la indica en pantalla. Por ejemplo, las imágenes del microscopio no traen escrito cuánto mide cada píxel. El sitio podría suponer un valor y no decir nada. En lugar de eso, usa una escala que declara abiertamente, la repite en cada resultado y la imprime en el informe. Quien lee un número sabe con qué escala se calculó. Es más incómodo decirlo que callarlo, pero es más honesto, y en ciencia eso pesa. Prefiere un aviso claro a un número que parezca más seguro de lo que es.</w:t>
       </w:r>
     </w:p>
     <w:p>
       <w:r>
         <w:rPr/>
-        <w:t>El primero es no suponer. Cuando falta un dato, como la escala de la imagen o lo que marca cada tinción, el sitio no lo inventa: lo indica en pantalla. Por eso cada resultado muestra la escala que se usó. Prefiere un aviso claro a un número que parezca más seguro de lo que es.</w:t>
+        <w:t>El segundo, separar lo que decide la red de lo que se mide. Eso ya lo vimos: la red localiza y el código mide, así que cualquier medida se verifica sin abrir la red.</w:t>
       </w:r>
     </w:p>
     <w:p>
       <w:r>
         <w:rPr/>
-        <w:t>Les pongo un ejemplo concreto de este principio. Las imágenes del microscopio no traen escrito cuánto mide cada píxel. El sitio podría simplemente suponer un valor y no decir nada. En lugar de eso, usa una escala que declara abiertamente, la repite en cada resultado y la imprime en el informe. Quien lee un número sabe con qué escala se calculó. Es más incómodo decirlo que callarlo, pero es más honesto, y en ciencia eso pesa.</w:t>
-      </w:r>
-    </w:p>
-    <w:p>
-      <w:pPr>
-        <w:pBdr>
-          <w:left w:val="single" w:sz="24" w:space="8" w:color="BF9000"/>
-        </w:pBdr>
-        <w:spacing w:before="80" w:after="160"/>
-        <w:ind w:left="397"/>
-        <w:shd w:val="clear" w:color="auto" w:fill="FFF2CC"/>
-      </w:pPr>
-      <w:r>
-        <w:rPr/>
-        <w:t>El segundo, separar lo que decide la red de lo que se mide. Y el tercero, que todo se pueda repetir: el entrenamiento está en un cuaderno que cualquiera puede abrir y ejecutar.</w:t>
+        <w:t>Y el tercero, que todo se pueda repetir. El entrenamiento está en un cuaderno de Colab, que es un entorno para programar en la nube, y cualquiera puede abrirlo y ejecutarlo. Además, el modelo guarda dentro de su propio archivo la configuración con la que se entrenó. Un resultado que no se puede repetir es muy difícil de defender, y lo mismo pasa con un modelo del que nadie recuerda cómo se hizo. Si dentro de un año alguien quiere repetirlo, o mejorarlo, tiene de dónde partir. El martes vamos a abrir ese cuaderno y a verlo por dentro.</w:t>
       </w:r>
     </w:p>
     <w:p>
       <w:r>
         <w:rPr/>
-        <w:t>El segundo es separar lo que decide la red de lo que se mide. Eso ya lo vimos: la red localiza y el código mide, así que cualquier medida se verifica sin abrir la red.</w:t>
-      </w:r>
-    </w:p>
-    <w:p>
-      <w:r>
-        <w:rPr/>
-        <w:t>El tercero es la reproducibilidad. El entrenamiento está en un cuaderno de Colab, que es un entorno para programar en la nube, y cualquiera puede abrirlo y ejecutarlo. Además, el modelo guarda dentro de su propio archivo la configuración con la que se entrenó. Si hay que repetir un resultado o reconstruir el entorno, no depende de la memoria de nadie.</w:t>
-      </w:r>
-    </w:p>
-    <w:p>
-      <w:r>
-        <w:rPr/>
-        <w:t>Esto importa en ciencia más de lo que parece. Un resultado que no se puede repetir es muy difícil de defender, y lo mismo pasa con un modelo del que nadie recuerda cómo se hizo. Por eso el entrenamiento no es una caja negra que solo yo sé operar: está en un cuaderno abierto, con los pasos escritos en orden, y el modelo carga dentro de sí la configuración con la que se entrenó. Si dentro de un año alguien quiere repetirlo, o mejorarlo, tiene de dónde partir. El martes vamos a abrir ese cuaderno y a verlo por dentro.</w:t>
-      </w:r>
-    </w:p>
-    <w:p>
-      <w:r>
-        <w:rPr/>
-        <w:t>Los tres principios se pueden resumir en una sola actitud: decir siempre qué se sabe, qué se supone y cómo se obtuvo cada número. Si en algún momento de estas sesiones algo les parece raro, vuelvan a estos tres principios, porque casi siempre explican por qué el sitio se comporta como lo hace.</w:t>
+        <w:t>Si en algún momento de estas sesiones algo les parece raro, vuelvan a estos tres principios, porque casi siempre explican por qué el sitio se comporta como lo hace.</w:t>
       </w:r>
     </w:p>
     <w:p>
@@ -2604,45 +365,25 @@
     <w:p>
       <w:r>
         <w:rPr/>
-        <w:t>Sobre el estado del modelo, lo digo en general y sin entrar en detalle: funciona, está dando buenos resultados y, como cualquier modelo, se puede mejorar. Tiene pruebas hechas, y mejora con más imágenes.</w:t>
+        <w:t>El modelo funciona y está dando buenos resultados, y como cualquier modelo, se puede mejorar con más imágenes. Un modelo así no aprende solo mientras está en línea. Si llegan imágenes nuevas, otras tinciones u otro tipo de célula, se vuelve a entrenar aparte y se cambia el archivo del modelo. Eso lo vemos el martes, con detalle.</w:t>
       </w:r>
     </w:p>
     <w:p>
       <w:r>
         <w:rPr/>
-        <w:t>Algo importante: un modelo así no aprende solo mientras está en línea. Si llegan imágenes nuevas, otras tinciones u otro tipo de célula, se vuelve a entrenar aparte y se cambia el archivo del modelo. Eso lo vemos el martes, con detalle.</w:t>
+        <w:t>Eso sí, tiene limitaciones. Es un modelo que se entrenó con un conjunto limitado de imágenes. En imágenes que se parecen a las de su entrenamiento, funciona bien. En imágenes muy distintas puede equivocarse, y por eso el sitio tiene avisos y por eso cada resultado se puede revisar. Lo que hace el sitio es dar números y mostrar cómo se obtuvieron. La interpretación científica de esos números le corresponde al grupo, y el sitio no la sustituye. Si me permiten una comparación, es como un instrumento de laboratorio. Una balanza no decide si el resultado de un experimento es bueno o malo, solo da el peso. Este sistema cuenta y mide, y lo hace de forma consistente y revisable. Qué significan esas cuentas y esas medidas es una pregunta de ustedes, que son quienes conocen la biología detrás.</w:t>
       </w:r>
     </w:p>
     <w:p>
       <w:r>
         <w:rPr/>
-        <w:t>También quiero adelantarles que el proyecto tuvo retos, y que los voy a contar como lo que fueron: dificultades que se resolvieron. Les doy un ejemplo. Cuando muchas células se empalman en un mismo punto, contarlas es muy difícil, y se creó una estrategia computacional para contarlas mejor.</w:t>
+        <w:t>El proyecto también tuvo sus retos. Al final de las sesiones les cuento cuáles fueron y cómo les dimos la vuelta. Les adelanto uno... cuando muchas células se empalman, pues, contarlas es muy difícil, y se creó una estrategia computacional para contarlas mejor.</w:t>
       </w:r>
     </w:p>
     <w:p>
       <w:r>
         <w:rPr/>
-        <w:t>Sobre las limitaciones, prefiero ser directo desde ahora, para que no haya sorpresas después. Es un modelo que se entrenó con un conjunto limitado de imágenes. En imágenes que se parecen a las de su entrenamiento, funciona bien. En imágenes muy distintas puede equivocarse, y por eso el sitio tiene avisos y por eso cada resultado se puede revisar. Esa franqueza es parte de cómo se usa bien una herramienta así. Lo que hace el sitio es dar números y mostrar cómo se obtuvieron. La interpretación científica de esos números le corresponde al grupo, y el sitio no la sustituye.</w:t>
-      </w:r>
-    </w:p>
-    <w:p>
-      <w:r>
-        <w:rPr/>
-        <w:t>Si me permiten una comparación, es como un instrumento de laboratorio. Una balanza no decide si el resultado de un experimento es bueno o malo, solo da el peso. Este sistema cuenta y mide, y lo hace de forma consistente y revisable. Qué significan esas cuentas y esas medidas es una pregunta de ustedes, que son quienes conocen la biología detrás.</w:t>
-      </w:r>
-    </w:p>
-    <w:p>
-      <w:pPr>
-        <w:pBdr>
-          <w:left w:val="single" w:sz="24" w:space="8" w:color="BF9000"/>
-        </w:pBdr>
-        <w:spacing w:before="80" w:after="160"/>
-        <w:ind w:left="397"/>
-        <w:shd w:val="clear" w:color="auto" w:fill="FFF2CC"/>
-      </w:pPr>
-      <w:r>
-        <w:rPr/>
-        <w:t>Al final de las sesiones les cuento los retos que enfrentamos y cómo les dimos la vuelta. Les adelanto uno... cuando muchas células se empalman, pues, contarlas es muy difícil.</w:t>
+        <w:t>Con esa idea clara, pasamos a una pregunta práctica: si ya tenemos una red que localiza y un código que mide, ¿cómo se pone todo eso al alcance de cualquier persona de la universidad?</w:t>
       </w:r>
     </w:p>
     <w:p>
@@ -2658,89 +399,7 @@
         <w:rPr>
           <w:i/>
         </w:rPr>
-        <w:t>0:19-0:27 · 8 min · 1,149 palabras, unos 6.2 min de habla</w:t>
-      </w:r>
-    </w:p>
-    <w:p>
-      <w:r>
-        <w:rPr>
-          <w:b/>
-        </w:rPr>
-        <w:t>Idea que debe quedar:</w:t>
-      </w:r>
-      <w:r>
-        <w:rPr/>
-        <w:t xml:space="preserve"> el modelo entrenado, solo, no hace nada. La plataforma web es lo que permite que cualquier persona de la universidad lo use, con una cuenta propia y sin programar.</w:t>
-      </w:r>
-    </w:p>
-    <w:p>
-      <w:r>
-        <w:rPr>
-          <w:b/>
-        </w:rPr>
-        <w:t>Ideas, en orden:</w:t>
-      </w:r>
-    </w:p>
-    <w:p>
-      <w:pPr>
-        <w:pStyle w:val="ListBullet"/>
-      </w:pPr>
-      <w:r>
-        <w:rPr/>
-        <w:t>La pregunta del ensayo: si ya existe la red, ¿por qué una página web y no correrla desde Colab?</w:t>
-      </w:r>
-    </w:p>
-    <w:p>
-      <w:pPr>
-        <w:pStyle w:val="ListBullet"/>
-      </w:pPr>
-      <w:r>
-        <w:rPr/>
-        <w:t>Qué es Colab y qué produce el entrenamiento: un archivo .pt que, solo, no hace nada.</w:t>
-      </w:r>
-    </w:p>
-    <w:p>
-      <w:pPr>
-        <w:pStyle w:val="ListBullet"/>
-      </w:pPr>
-      <w:r>
-        <w:rPr/>
-        <w:t>La plataforma le pone una interfaz; el acceso es con cuenta personal y privada.</w:t>
-      </w:r>
-    </w:p>
-    <w:p>
-      <w:pPr>
-        <w:pStyle w:val="ListBullet"/>
-      </w:pPr>
-      <w:r>
-        <w:rPr/>
-        <w:t>Palabras que van a salir: red neuronal, Colab, Python, Flask, modelo, servidor.</w:t>
-      </w:r>
-    </w:p>
-    <w:p>
-      <w:pPr>
-        <w:pStyle w:val="ListBullet"/>
-      </w:pPr>
-      <w:r>
-        <w:rPr/>
-        <w:t>Dos etapas: entrenamiento en Colab e inferencia en el servidor.</w:t>
-      </w:r>
-    </w:p>
-    <w:p>
-      <w:pPr>
-        <w:pStyle w:val="ListBullet"/>
-      </w:pPr>
-      <w:r>
-        <w:rPr/>
-        <w:t>El sitio como entorno educativo con seis secciones.</w:t>
-      </w:r>
-    </w:p>
-    <w:p>
-      <w:r>
-        <w:rPr>
-          <w:b/>
-        </w:rPr>
-        <w:t>Texto para decir:</w:t>
+        <w:t>0:18-0:26 · 8 min · 1,082 palabras, unos 6.2 min de habla</w:t>
       </w:r>
     </w:p>
     <w:p>
@@ -2758,33 +417,19 @@
     <w:p>
       <w:r>
         <w:rPr/>
-        <w:t>Ahora, una pregunta que salió cuando ensayamos esta presentación y que me parece muy buena: si ya tenemos la red neuronal que encuentra los espermatozoides, ¿para qué hacer además una página web? ¿No bastaría con correr la red directamente desde Google Colab?</w:t>
+        <w:t>Ahora, una pregunta que seguro se están haciendo: si ya tenemos la red neuronal que encuentra los espermatozoides, ¿para qué hacer además una página web? ¿No bastaría con correr la red directamente desde Google Colab?</w:t>
       </w:r>
     </w:p>
     <w:p>
       <w:r>
         <w:rPr/>
-        <w:t>Les explico qué es Colab, porque lo voy a mencionar varias veces. Google Colab es un cuaderno en la nube, un entorno donde se escribe código y se ejecuta sin instalar nada en la computadora. Ahí es donde se entrena el modelo. Y cuando termina el entrenamiento, lo que sale es un archivo, con extensión punto pt, que guarda lo que la red aprendió.</w:t>
-      </w:r>
-    </w:p>
-    <w:p>
-      <w:pPr>
-        <w:pBdr>
-          <w:left w:val="single" w:sz="24" w:space="8" w:color="BF9000"/>
-        </w:pBdr>
-        <w:spacing w:before="80" w:after="160"/>
-        <w:ind w:left="397"/>
-        <w:shd w:val="clear" w:color="auto" w:fill="FFF2CC"/>
-      </w:pPr>
-      <w:r>
-        <w:rPr/>
-        <w:t>El modelo es un archivo que, por sí solo, pues... no puede hacer nada. La plataforma web es lo que permite que cualquier persona de la comunidad universitaria use la inteligencia artificial desde un navegador.</w:t>
+        <w:t>Google Colab, que voy a mencionar varias veces, es un cuaderno en la nube, un entorno donde se escribe código y se ejecuta sin instalar nada en la computadora. Ahí es donde se entrena el modelo. Y cuando termina el entrenamiento, lo que sale es un archivo, con extensión punto pt, que guarda lo que la red aprendió.</w:t>
       </w:r>
     </w:p>
     <w:p>
       <w:r>
         <w:rPr/>
-        <w:t>Eso es lo que quiero que se lleven de este bloque. Ese archivo, por sí solo, es como un libro cerrado: tiene todo adentro, pero nadie lo puede leer. Necesitamos un sistema que lo abra, lo cargue y lo use. Eso es lo que hace la plataforma. Le pone una interfaz: botones para subir fotos y pantallas para ver los resultados.</w:t>
+        <w:t>El modelo es un archivo que, por sí solo, pues... no puede hacer nada. Es como un libro cerrado: tiene todo adentro, pero nadie lo puede leer. Necesitamos un sistema que lo abra, lo cargue y lo use, y eso es lo que hace la plataforma web. Le pone una interfaz, con botones para subir fotos y pantallas para ver los resultados. La plataforma web es lo que permite que cualquier persona de la comunidad universitaria use la inteligencia artificial desde un navegador.</w:t>
       </w:r>
     </w:p>
     <w:p>
@@ -2802,7 +447,7 @@
     <w:p>
       <w:r>
         <w:rPr/>
-        <w:t>Para entender cómo funciona una página web, una idea sencilla basta por ahora. Hay dos lados. De su lado está el navegador, que es el programa que usan para ver páginas. Del otro lado está el servidor, una computadora que está siempre encendida, conectada a internet, esperando peticiones. Cuando ustedes hacen clic en un botón, el navegador le manda una petición al servidor, el servidor hace el trabajo que corresponda y devuelve una respuesta, que el navegador dibuja en la pantalla. Así funciona desde la página de un periódico hasta este sitio. La diferencia es que, aquí, el trabajo del servidor incluye correr un modelo de inteligencia artificial sobre una imagen. El lunes vemos con detalle qué hace el servidor, y el martes vemos cómo se pone ese servidor en internet.</w:t>
+        <w:t>Para entender cómo funciona una página web, basta por ahora una idea sencilla. Hay dos lados. De su lado está el navegador, que es el programa que usan para ver páginas. Del otro lado está el servidor, una computadora que está siempre encendida, conectada a internet, esperando peticiones. Cuando ustedes hacen clic en un botón, el navegador le manda una petición al servidor, el servidor hace el trabajo que corresponda y devuelve una respuesta, que el navegador dibuja en la pantalla. Así funciona desde la página de un periódico hasta este sitio. La diferencia es que, aquí, el trabajo del servidor incluye correr un modelo de inteligencia artificial sobre una imagen. El lunes vemos con detalle qué hace el servidor, y el martes vemos cómo se pone ese servidor en internet.</w:t>
       </w:r>
     </w:p>
     <w:p>
@@ -2826,33 +471,7 @@
     <w:p>
       <w:r>
         <w:rPr/>
-        <w:t xml:space="preserve">Una red neuronal es un programa que aprende de ejemplos. Google Colab, como ya dije, es un entorno para programar en la nube. </w:t>
-      </w:r>
-    </w:p>
-    <w:p>
-      <w:pPr>
-        <w:pBdr>
-          <w:left w:val="single" w:sz="24" w:space="8" w:color="BF9000"/>
-        </w:pBdr>
-        <w:spacing w:before="80" w:after="160"/>
-        <w:ind w:left="397"/>
-        <w:shd w:val="clear" w:color="auto" w:fill="FFF2CC"/>
-      </w:pPr>
-      <w:r>
-        <w:rPr/>
-        <w:t>Antes de seguir, unas palabras que van a salir. Python es un lenguaje de programación, y Flask es una herramienta para hacer sitios web con Python. El sitio está hecho con las dos.</w:t>
-      </w:r>
-    </w:p>
-    <w:p>
-      <w:r>
-        <w:rPr/>
-        <w:t>El modelo es el archivo que guarda lo que la red aprendió. Y el servidor es la computadora donde el sitio está en línea, la que responde cuando alguien entra.</w:t>
-      </w:r>
-    </w:p>
-    <w:p>
-      <w:r>
-        <w:rPr/>
-        <w:t>También aparecen dos palabras que explico en la siguiente diapositiva, entrenamiento e inferencia, porque son las que más confunden y las que más importa distinguir.</w:t>
+        <w:t>Una red neuronal es un programa que aprende de ejemplos. Google Colab, como ya dije, es un entorno para programar en la nube. Python es un lenguaje de programación, y Flask es una herramienta para hacer sitios web con Python. El sitio está hecho con las dos. El modelo es el archivo que guarda lo que la red aprendió. Y el servidor es la computadora donde el sitio está en línea, la que responde cuando alguien entra. También aparecen dos palabras que explico en la siguiente diapositiva, entrenamiento e inferencia, porque son las que más confunden y las que más importa distinguir.</w:t>
       </w:r>
     </w:p>
     <w:p>
@@ -2870,21 +489,7 @@
     <w:p>
       <w:r>
         <w:rPr/>
-        <w:t>El desarrollo de la red neuronal ocurre en dos etapas, y están separadas a propósito.</w:t>
-      </w:r>
-    </w:p>
-    <w:p>
-      <w:pPr>
-        <w:pBdr>
-          <w:left w:val="single" w:sz="24" w:space="8" w:color="BF9000"/>
-        </w:pBdr>
-        <w:spacing w:before="80" w:after="160"/>
-        <w:ind w:left="397"/>
-        <w:shd w:val="clear" w:color="auto" w:fill="FFF2CC"/>
-      </w:pPr>
-      <w:r>
-        <w:rPr/>
-        <w:t>Entonces, el desarrollo de la red tiene dos etapas. Primero se entrena en Google Colab y, después, cuando queremos analizar fotos nuevas, usamos el modelo en el servidor. A eso se le llama inferencia, ¿va?</w:t>
+        <w:t>El desarrollo de la red tiene dos etapas, y están separadas a propósito. Primero se entrena en Google Colab y, después, cuando queremos analizar fotos nuevas, usamos el modelo en el servidor. A eso se le llama inferencia, ¿va?</w:t>
       </w:r>
     </w:p>
     <w:p>
@@ -2926,27 +531,13 @@
     <w:p>
       <w:r>
         <w:rPr/>
-        <w:t>Para terminar este bloque, una mirada general al sitio. Lo pensamos como un entorno educativo, con la herramienta de análisis como una de sus partes. Además de la red neuronal, el sitio presenta a las personas que colaboran y temas de biología de la reproducción. Es un sitio informativo que tiene una sección donde se analizan imágenes.</w:t>
-      </w:r>
-    </w:p>
-    <w:p>
-      <w:pPr>
-        <w:pBdr>
-          <w:left w:val="single" w:sz="24" w:space="8" w:color="BF9000"/>
-        </w:pBdr>
-        <w:spacing w:before="80" w:after="160"/>
-        <w:ind w:left="397"/>
-        <w:shd w:val="clear" w:color="auto" w:fill="FFF2CC"/>
-      </w:pPr>
-      <w:r>
-        <w:rPr/>
-        <w:t>El sitio tiene seis secciones. Ahorita las nombro, y en unos minutos las vemos una por una.</w:t>
+        <w:t>Para terminar este bloque, una mirada general al sitio. El sitio tiene seis secciones. Ahorita las nombro, y en unos minutos las vemos una por una. Son Inicio, Nosotros, Aliados, Infografías y videos, Inteligencia Artificial y Contacto.</w:t>
       </w:r>
     </w:p>
     <w:p>
       <w:r>
         <w:rPr/>
-        <w:t>Las seis secciones son: Inicio, Nosotros, Aliados, Infografías y videos, Inteligencia Artificial y Contacto. En la diapositiva las ven con una frase corta cada una. La que nos importa para el análisis es Inteligencia Artificial, y es la que necesita cuenta. Las demás se pueden recorrer sin iniciar sesión. Más adelante entramos al sitio y las vemos funcionando.</w:t>
+        <w:t>Lo pensamos como un entorno educativo, con la herramienta de análisis como una de sus partes. Además de la red neuronal, el sitio presenta a las personas que colaboran y temas de biología de la reproducción. Es un sitio informativo que tiene una sección donde se analizan imágenes. La que nos importa para el análisis es la de Inteligencia Artificial, y es la que necesita cuenta. Las demás se pueden recorrer sin iniciar sesión.</w:t>
       </w:r>
     </w:p>
     <w:p>
@@ -2968,80 +559,7 @@
         <w:rPr>
           <w:i/>
         </w:rPr>
-        <w:t>0:27-0:36 · 9 min · 1,292 palabras, unos 7.0 min de habla</w:t>
-      </w:r>
-    </w:p>
-    <w:p>
-      <w:r>
-        <w:rPr>
-          <w:b/>
-        </w:rPr>
-        <w:t>Idea que debe quedar:</w:t>
-      </w:r>
-      <w:r>
-        <w:rPr/>
-        <w:t xml:space="preserve"> para la computadora una fotografía es una tabla de números, y eso explica todo lo que vamos a medir.</w:t>
-      </w:r>
-    </w:p>
-    <w:p>
-      <w:r>
-        <w:rPr>
-          <w:b/>
-        </w:rPr>
-        <w:t>Ideas, en orden:</w:t>
-      </w:r>
-    </w:p>
-    <w:p>
-      <w:pPr>
-        <w:pStyle w:val="ListBullet"/>
-      </w:pPr>
-      <w:r>
-        <w:rPr/>
-        <w:t>¿Qué es una fotografía para una computadora? Una cuadrícula de píxeles, cada uno con un número.</w:t>
-      </w:r>
-    </w:p>
-    <w:p>
-      <w:pPr>
-        <w:pStyle w:val="ListBullet"/>
-      </w:pPr>
-      <w:r>
-        <w:rPr/>
-        <w:t>Brillo de 0 a 255 en gris; en color, tres números. Una foto grande tiene millones de píxeles.</w:t>
-      </w:r>
-    </w:p>
-    <w:p>
-      <w:pPr>
-        <w:pStyle w:val="ListBullet"/>
-      </w:pPr>
-      <w:r>
-        <w:rPr/>
-        <w:t>Una célula brillante es una zona de números altos; medir el área es contar píxeles.</w:t>
-      </w:r>
-    </w:p>
-    <w:p>
-      <w:pPr>
-        <w:pStyle w:val="ListBullet"/>
-      </w:pPr>
-      <w:r>
-        <w:rPr/>
-        <w:t>Formatos: BMP, PNG y TIFF conservan la imagen; JPG la comprime y mueve los bordes.</w:t>
-      </w:r>
-    </w:p>
-    <w:p>
-      <w:pPr>
-        <w:pStyle w:val="ListBullet"/>
-      </w:pPr>
-      <w:r>
-        <w:rPr/>
-        <w:t>La imagen no sabe cuánto mide un píxel; el sitio usa la misma escala, 60 píxeles por micra.</w:t>
-      </w:r>
-    </w:p>
-    <w:p>
-      <w:r>
-        <w:rPr>
-          <w:b/>
-        </w:rPr>
-        <w:t>Texto para decir:</w:t>
+        <w:t>0:26-0:35 · 9 min · 1,227 palabras, unos 7.0 min de habla</w:t>
       </w:r>
     </w:p>
     <w:p>
@@ -3063,23 +581,9 @@
       </w:r>
     </w:p>
     <w:p>
-      <w:pPr>
-        <w:pBdr>
-          <w:left w:val="single" w:sz="24" w:space="8" w:color="BF9000"/>
-        </w:pBdr>
-        <w:spacing w:before="80" w:after="160"/>
-        <w:ind w:left="397"/>
-        <w:shd w:val="clear" w:color="auto" w:fill="FFF2CC"/>
-      </w:pPr>
       <w:r>
         <w:rPr/>
-        <w:t>Para la computadora, una fotografía es, o sea, una tabla de números. Cada cuadrito, cada píxel, guarda cuánta luz tiene.</w:t>
-      </w:r>
-    </w:p>
-    <w:p>
-      <w:r>
-        <w:rPr/>
-        <w:t>Una fotografía digital es una cuadrícula de cuadritos. Cada cuadrito es un píxel, y cada píxel guarda un número. En una imagen en tonos de gris, ese número es el brillo, y va de cero, que es negro, a doscientos cincuenta y cinco, que es blanco. Los números intermedios son los grises. En una imagen a color no es un número sino tres, uno para el rojo, otro para el verde y otro para el azul, y con la mezcla de los tres sale el color de ese cuadrito.</w:t>
+        <w:t>Para la computadora, una fotografía es, o sea, una tabla de números. Cada cuadrito, cada píxel, guarda cuánta luz tiene. Es una cuadrícula de cuadritos, y cada píxel guarda un número. En una imagen en tonos de gris, ese número es el brillo, y va de cero, que es negro, a doscientos cincuenta y cinco, que es blanco. Los números intermedios son los grises. En una imagen a color no es un número sino tres, uno para el rojo, otro para el verde y otro para el azul, y con la mezcla de los tres sale el color de ese cuadrito.</w:t>
       </w:r>
     </w:p>
     <w:p>
@@ -3089,23 +593,9 @@
       </w:r>
     </w:p>
     <w:p>
-      <w:pPr>
-        <w:pBdr>
-          <w:left w:val="single" w:sz="24" w:space="8" w:color="BF9000"/>
-        </w:pBdr>
-        <w:spacing w:before="80" w:after="160"/>
-        <w:ind w:left="397"/>
-        <w:shd w:val="clear" w:color="auto" w:fill="FFF2CC"/>
-      </w:pPr>
       <w:r>
         <w:rPr/>
-        <w:t>Una foto grande tiene, por ejemplo, mil setecientos noventa y dos píxeles de ancho por mil trescientos setenta y cuatro de alto. Son casi dos millones y medio de números.</w:t>
-      </w:r>
-    </w:p>
-    <w:p>
-      <w:r>
-        <w:rPr/>
-        <w:t>Hagan la cuenta: casi dos millones y medio de cuadritos, cada uno con su número. La computadora los maneja todos a la vez sin problema, pero a un ojo humano eso no le dice nada. Lo que vemos como células, la computadora lo ve como un mar de números.</w:t>
+        <w:t>Una foto grande, de las que usamos, tiene por ejemplo mil setecientos noventa y dos píxeles de ancho por mil trescientos setenta y cuatro de alto. Hagan la cuenta: son casi dos millones y medio de cuadritos, cada uno con su número. La computadora los maneja todos a la vez sin problema, pero a un ojo humano eso no le dice nada. Lo que nosotros vemos como células, la computadora lo ve como un mar de números.</w:t>
       </w:r>
     </w:p>
     <w:p>
@@ -3135,53 +625,13 @@
     <w:p>
       <w:r>
         <w:rPr/>
-        <w:t>Ahora pensemos en una foto de fluorescencia. ¿Cómo se ve una célula dentro de esa tabla de números? Como una zona de números altos sobre un fondo de números bajos. La célula brilla, así que sus píxeles tienen valores grandes, y el fondo oscuro tiene valores pequeños.</w:t>
-      </w:r>
-    </w:p>
-    <w:p>
-      <w:pPr>
-        <w:pBdr>
-          <w:left w:val="single" w:sz="24" w:space="8" w:color="BF9000"/>
-        </w:pBdr>
-        <w:spacing w:before="80" w:after="160"/>
-        <w:ind w:left="397"/>
-        <w:shd w:val="clear" w:color="auto" w:fill="FFF2CC"/>
-      </w:pPr>
-      <w:r>
-        <w:rPr/>
-        <w:t>La computadora no ve células, solo números. Y nuestro trabajo es enseñarle qué patrón de números corresponde a un espermatozoide.</w:t>
+        <w:t>Ahora pensemos en una foto de fluorescencia. ¿Cómo se ve una célula dentro de esa tabla de números? Como una zona de números altos sobre un fondo de números bajos. La célula brilla, así que sus píxeles tienen valores grandes, y el fondo oscuro tiene valores pequeños. La computadora no ve células, solo números. Y nuestro trabajo es enseñarle qué patrón de números corresponde a un espermatozoide.</w:t>
       </w:r>
     </w:p>
     <w:p>
       <w:r>
         <w:rPr/>
-        <w:t>Esto cambia la forma de plantear el problema.</w:t>
-      </w:r>
-    </w:p>
-    <w:p>
-      <w:r>
-        <w:rPr/>
-        <w:t>Y esto también nos dice cómo se mide el tamaño. En la diapositiva les muestro una célula pequeñita dibujada con números. Los doce cuadritos más brillantes, los que tienen el borde marcado, son la célula.</w:t>
-      </w:r>
-    </w:p>
-    <w:p>
-      <w:pPr>
-        <w:pBdr>
-          <w:left w:val="single" w:sz="24" w:space="8" w:color="BF9000"/>
-        </w:pBdr>
-        <w:spacing w:before="80" w:after="160"/>
-        <w:ind w:left="397"/>
-        <w:shd w:val="clear" w:color="auto" w:fill="FFF2CC"/>
-      </w:pPr>
-      <w:r>
-        <w:rPr/>
-        <w:t>En este ejemplo, los números altos forman la célula. Si cuento los cuadritos que ocupa, doce, ya tengo su área: doce píxeles.</w:t>
-      </w:r>
-    </w:p>
-    <w:p>
-      <w:r>
-        <w:rPr/>
-        <w:t>Medir el área de una célula es contar cuántos píxeles ocupa. En una foto real serán cientos de píxeles por célula, pero la idea es exactamente la misma. Más adelante, con la escala del sitio, esos píxeles se convierten en micras.</w:t>
+        <w:t>Esto también nos dice cómo se mide el tamaño. En la diapositiva les muestro una célula pequeñita dibujada con números. Los doce cuadritos más brillantes, los que tienen el borde marcado, son la célula. Si cuento los cuadritos que ocupa, doce, ya tengo su área: doce píxeles. Medir el área de una célula es contar cuántos píxeles ocupa. En una foto real serán cientos de píxeles por célula, pero la idea es exactamente la misma. Más adelante, con la escala del sitio, esos píxeles se convierten en micras.</w:t>
       </w:r>
     </w:p>
     <w:p>
@@ -3205,33 +655,13 @@
     <w:p>
       <w:r>
         <w:rPr/>
-        <w:t>Un tema práctico: los formatos de archivo. No todos guardan la imagen igual.</w:t>
-      </w:r>
-    </w:p>
-    <w:p>
-      <w:pPr>
-        <w:pBdr>
-          <w:left w:val="single" w:sz="24" w:space="8" w:color="BF9000"/>
-        </w:pBdr>
-        <w:spacing w:before="80" w:after="160"/>
-        <w:ind w:left="397"/>
-        <w:shd w:val="clear" w:color="auto" w:fill="FFF2CC"/>
-      </w:pPr>
-      <w:r>
-        <w:rPr/>
-        <w:t>BMP, PNG y TIFF guardan la imagen tal cual. JPG la comprime, y al comprimirla puede mover los bordes de las células. Para medir, eso importa.</w:t>
+        <w:t>Un tema práctico: los formatos de archivo. No todos guardan la imagen igual. BMP, PNG y TIFF guardan la imagen tal cual. JPG la comprime para que pese menos, y al comprimirla puede mover los bordes de las células. Para medir, eso importa.</w:t>
       </w:r>
     </w:p>
     <w:p>
       <w:r>
         <w:rPr/>
-        <w:t>JPG, en cambio, comprime la imagen para que pese menos. En la diapositiva tengo la misma célula dos veces: a la izquierda con el borde nítido y a la derecha con el borde difuminado y con bloques raros, que es lo que pasa con la compresión.</w:t>
-      </w:r>
-    </w:p>
-    <w:p>
-      <w:r>
-        <w:rPr/>
-        <w:t>¿Por qué importa? Porque si el borde se difumina, el contorno cambia, y si el contorno cambia, cambia el área, y entonces cambian los números que nos interesan. El sitio acepta JPG, pero lo avisa. La recomendación es trabajar con los archivos originales del microscopio y evitar que pasen por aplicaciones de mensajería, que suelen comprimirlos sin que nos demos cuenta.</w:t>
+        <w:t>En la diapositiva tengo la misma célula dos veces: a la izquierda con el borde nítido y a la derecha con el borde difuminado y con bloques raros, que es lo que pasa con la compresión. ¿Por qué importa? Porque si el borde se difumina, el contorno cambia, y si el contorno cambia, cambia el área, y entonces cambian los números que nos interesan. El sitio acepta JPG, pero lo avisa. La recomendación es trabajar con los archivos originales del microscopio y evitar que pasen por aplicaciones de mensajería, que suelen comprimirlos sin que nos demos cuenta.</w:t>
       </w:r>
     </w:p>
     <w:p>
@@ -3255,39 +685,19 @@
     <w:p>
       <w:r>
         <w:rPr/>
-        <w:t>La última idea de este bloque es la escala. Una foto sabe cuántos píxeles mide, pero no sabe cuántas micras es cada píxel, es decir, cuánto mide en la realidad. Los archivos no guardan esa información.</w:t>
+        <w:t>La última idea de este bloque es la escala. Una foto sabe cuántos píxeles mide, pero no sabe cuántas micras es cada píxel, es decir, cuánto mide en la realidad. Los archivos no guardan esa información. Además, las imágenes pueden venir de distintos aumentos, por ejemplo de cuarenta X y de cien X, y cada aumento cambia lo que representa un píxel. Si queremos comparar fotos entre sí, necesitamos una forma de ponerlas en la misma medida.</w:t>
       </w:r>
     </w:p>
     <w:p>
       <w:r>
         <w:rPr/>
-        <w:t>Además, las imágenes pueden venir de distintos aumentos, por ejemplo de cuarenta X y de cien X, y cada aumento cambia lo que representa un píxel. Si queremos comparar fotos entre sí, necesitamos una forma de ponerlas en la misma medida.</w:t>
-      </w:r>
-    </w:p>
-    <w:p>
-      <w:pPr>
-        <w:pBdr>
-          <w:left w:val="single" w:sz="24" w:space="8" w:color="BF9000"/>
-        </w:pBdr>
-        <w:spacing w:before="80" w:after="160"/>
-        <w:ind w:left="397"/>
-        <w:shd w:val="clear" w:color="auto" w:fill="FFF2CC"/>
-      </w:pPr>
-      <w:r>
-        <w:rPr/>
-        <w:t>Una foto no sabe cuánto mide un píxel en la realidad. Por eso el sitio usa la misma escala en todas las imágenes, para estandarizar su tamaño, y cada resultado dice cuál.</w:t>
+        <w:t>Una foto no sabe cuánto mide un píxel en la realidad. Por eso el sitio usa la misma escala en todas las imágenes, para estandarizar su tamaño, y cada resultado dice cuál. Esa escala es de sesenta píxeles por micra. Cada resultado dice qué escala se usó, y la imagen marcada trae una regla de trescientos píxeles que equivalen a cinco micras. No voy a entrar hoy en cómo se define esa escala; eso lo vemos el lunes, cuando hablemos de cómo funciona el sistema por dentro.</w:t>
       </w:r>
     </w:p>
     <w:p>
       <w:r>
         <w:rPr/>
-        <w:t>Por eso el sitio usa la misma escala en todas las imágenes: sesenta píxeles por micra. Es una forma de estandarizar su tamaño y poder compararlas entre sí. Cada resultado dice qué escala se usó, y la imagen marcada trae una regla de trescientos píxeles que equivalen a cinco micras. No voy a entrar hoy en cómo se define esa escala; eso lo vemos el lunes, cuando hablemos de cómo funciona el sistema por dentro.</w:t>
-      </w:r>
-    </w:p>
-    <w:p>
-      <w:r>
-        <w:rPr/>
-        <w:t>Les doy dos conversiones concretas, para que la escala no se quede en abstracto. Si sesenta píxeles son una micra, entonces un largo de sesenta píxeles es una micra de largo, y un largo de trescientos píxeles son cinco micras, que es justo la regla que va dibujada en la imagen. Con las áreas hay un paso más. Un área se mide en unidades cuadradas, así que una micra cuadrada son sesenta por sesenta píxeles, es decir, tres mil seiscientos píxeles. Si una célula ocupa tres mil seiscientos píxeles, su área es de una micra cuadrada; si ocupa la mitad, de media micra cuadrada. Por eso, en el sitio, las áreas en micras cuadradas pueden salir como números pequeños.</w:t>
+        <w:t>Veámoslo con números. Si sesenta píxeles son una micra, entonces un largo de sesenta píxeles es una micra de largo, y un largo de trescientos píxeles son cinco micras, que es justo la regla que va dibujada en la imagen. Con las áreas hay un paso más. Un área se mide en unidades cuadradas, así que una micra cuadrada son sesenta por sesenta píxeles, es decir, tres mil seiscientos píxeles. Si una célula ocupa tres mil seiscientos píxeles, su área es de una micra cuadrada; si ocupa la mitad, de media micra cuadrada. Por eso, en el sitio, las áreas en micras cuadradas pueden salir como números pequeños.</w:t>
       </w:r>
     </w:p>
     <w:p>
@@ -3309,89 +719,7 @@
         <w:rPr>
           <w:i/>
         </w:rPr>
-        <w:t>0:36-0:46 · 10 min · 871 palabras, unos 4.7 min de habla</w:t>
-      </w:r>
-    </w:p>
-    <w:p>
-      <w:r>
-        <w:rPr>
-          <w:b/>
-        </w:rPr>
-        <w:t>Idea que debe quedar:</w:t>
-      </w:r>
-      <w:r>
-        <w:rPr/>
-        <w:t xml:space="preserve"> cualquier persona puede recorrer el sitio sin cuenta, y es sencillo, bilingüe y se adapta a la pantalla.</w:t>
-      </w:r>
-    </w:p>
-    <w:p>
-      <w:r>
-        <w:rPr>
-          <w:b/>
-        </w:rPr>
-        <w:t>Ideas, en orden:</w:t>
-      </w:r>
-    </w:p>
-    <w:p>
-      <w:pPr>
-        <w:pStyle w:val="ListBullet"/>
-      </w:pPr>
-      <w:r>
-        <w:rPr/>
-        <w:t>Inicio: nombre, lema, botón para analizar y espacio para la imagen principal.</w:t>
-      </w:r>
-    </w:p>
-    <w:p>
-      <w:pPr>
-        <w:pStyle w:val="ListBullet"/>
-      </w:pPr>
-      <w:r>
-        <w:rPr/>
-        <w:t>El menú con las seis secciones, el selector de idioma y el acceso para iniciar sesión.</w:t>
-      </w:r>
-    </w:p>
-    <w:p>
-      <w:pPr>
-        <w:pStyle w:val="ListBullet"/>
-      </w:pPr>
-      <w:r>
-        <w:rPr/>
-        <w:t>Nosotros, Aliados, Infografías y videos, y Contacto.</w:t>
-      </w:r>
-    </w:p>
-    <w:p>
-      <w:pPr>
-        <w:pStyle w:val="ListBullet"/>
-      </w:pPr>
-      <w:r>
-        <w:rPr/>
-        <w:t>Idioma: EN traduce todo el sitio con el servicio de Google.</w:t>
-      </w:r>
-    </w:p>
-    <w:p>
-      <w:pPr>
-        <w:pStyle w:val="ListBullet"/>
-      </w:pPr>
-      <w:r>
-        <w:rPr/>
-        <w:t>Pie de página: privacidad, licencia, enlaces.</w:t>
-      </w:r>
-    </w:p>
-    <w:p>
-      <w:pPr>
-        <w:pStyle w:val="ListBullet"/>
-      </w:pPr>
-      <w:r>
-        <w:rPr/>
-        <w:t>Para analizar imágenes hace falta una cuenta.</w:t>
-      </w:r>
-    </w:p>
-    <w:p>
-      <w:r>
-        <w:rPr>
-          <w:b/>
-        </w:rPr>
-        <w:t>Texto para decir:</w:t>
+        <w:t>0:35-0:45 · 10 min · 807 palabras, unos 4.6 min de habla</w:t>
       </w:r>
     </w:p>
     <w:p>
@@ -3415,41 +743,21 @@
       </w:r>
     </w:p>
     <w:p>
-      <w:pPr>
-        <w:pBdr>
-          <w:left w:val="single" w:sz="24" w:space="8" w:color="BF9000"/>
-        </w:pBdr>
-        <w:spacing w:before="80" w:after="160"/>
-        <w:ind w:left="397"/>
-        <w:shd w:val="clear" w:color="auto" w:fill="FFF2CC"/>
-      </w:pPr>
       <w:r>
         <w:rPr/>
-        <w:t>Bueno, ahora sí, voy a mostrarles el sitio, empezando como lo vería cualquier visitante, o sea, sin haber iniciado sesión.</w:t>
+        <w:t>Bueno, ahora sí, voy a mostrarles el sitio, empezando como lo vería cualquier visitante, o sea, sin haber iniciado sesión. Estoy compartiendo el navegador, y lo primero que ven es la página de inicio. Arriba, centrado, está el logotipo con el nombre del proyecto y su lema: «Análisis de imágenes de microscopio». Debajo hay una barra con el botón de menú a la izquierda, y a la derecha el selector de idioma y el acceso para iniciar sesión.</w:t>
       </w:r>
     </w:p>
     <w:p>
       <w:r>
         <w:rPr/>
-        <w:t>Estoy compartiendo el navegador. Lo primero que ven es la página de inicio. Arriba, centrado, está el logotipo con el nombre del proyecto y su lema: «Análisis de imágenes de microscopio». Debajo hay una barra con el botón de menú a la izquierda, y a la derecha el selector de idioma y el acceso para iniciar sesión.</w:t>
+        <w:t>En el cuerpo de la página está el título, una frase que resume lo que hace el sitio y un botón verde que dice «Analizar una imagen». A la derecha hay un recuadro punteado, reservado para una imagen principal que se va a poner cuando la tengamos. Más abajo hay tres tarjetas que cuentan el problema, el recorrido y los resultados, en el mismo orden en que lo estamos viendo hoy.</w:t>
       </w:r>
     </w:p>
     <w:p>
       <w:r>
         <w:rPr/>
-        <w:t>En el cuerpo de la página está el título, una frase que resume lo que hace el sitio y un botón verde que dice «Analizar una imagen». A la derecha hay un recuadro punteado que está reservado para una imagen principal, que se va a poner cuando la tengamos. Más abajo hay tres tarjetas que cuentan el problema, el recorrido y los resultados, en el mismo orden en que lo estamos viendo hoy.</w:t>
-      </w:r>
-    </w:p>
-    <w:p>
-      <w:r>
-        <w:rPr/>
-        <w:t>Quiero decir algo sobre el diseño: la interfaz ya es funcional, ya se puede usar completa, pero el diseño se sigue afinando. Lo que ven hoy no es la versión final de cómo se ve.</w:t>
-      </w:r>
-    </w:p>
-    <w:p>
-      <w:r>
-        <w:rPr/>
-        <w:t>Algo que cuidamos desde el principio es que la página se lea bien en cualquier pantalla. Si abren este mismo sitio en un teléfono, el menú se acomoda y el contenido se reordena, y no hace falta acercar con los dedos para leer. También es una página sobria a propósito: pocos colores, letra legible, nada que distraiga. Un sitio científico no necesita impresionar, necesita que cualquiera encuentre rápido lo que busca.</w:t>
+        <w:t>El diseño todavía lo estamos afinando, así que no es la versión final, pero todo funciona. Algo que cuidamos desde el principio es que la página se lea bien en cualquier pantalla. Si abren este mismo sitio en un teléfono, el menú se acomoda y el contenido se reordena, y no hace falta acercar con los dedos para leer. También es una página sobria a propósito: pocos colores, letra legible, nada que distraiga. Un sitio científico tiene que ser fácil de usar: que cualquiera encuentre rápido lo que busca.</w:t>
       </w:r>
     </w:p>
     <w:p>
@@ -3485,23 +793,9 @@
       </w:r>
     </w:p>
     <w:p>
-      <w:pPr>
-        <w:pBdr>
-          <w:left w:val="single" w:sz="24" w:space="8" w:color="BF9000"/>
-        </w:pBdr>
-        <w:spacing w:before="80" w:after="160"/>
-        <w:ind w:left="397"/>
-        <w:shd w:val="clear" w:color="auto" w:fill="FFF2CC"/>
-      </w:pPr>
       <w:r>
         <w:rPr/>
-        <w:t>En Aliados hay una tarjeta por persona, con su nombre, su fotografía y lo que estudió. Si alguien quiere aparecer, solo tiene que mandar sus datos.</w:t>
-      </w:r>
-    </w:p>
-    <w:p>
-      <w:r>
-        <w:rPr/>
-        <w:t>Es una cuadrícula de tarjetas, cuatro por fila, y todas se ven igual: el nombre arriba, la fotografía en el centro y debajo un texto breve. Me gusta que esta sección ponga caras y nombres. Un sistema de inteligencia artificial puede parecer algo abstracto y sin dueño, y aquí se ve que detrás hay personas, cada una con su formación y sus intereses.</w:t>
+        <w:t>En Aliados hay una tarjeta por persona, con su nombre, su fotografía y lo que estudió. Todas se ven igual, en una cuadrícula de cuatro por fila. Si alguien quiere aparecer, solo tiene que mandar sus datos. Me gusta que esta sección ponga caras y nombres. Un sistema de inteligencia artificial puede parecer algo abstracto y sin dueño, y aquí se ve que detrás hay personas, cada una con su formación y sus intereses.</w:t>
       </w:r>
     </w:p>
     <w:p>
@@ -3513,23 +807,9 @@
       </w:r>
     </w:p>
     <w:p>
-      <w:pPr>
-        <w:pBdr>
-          <w:left w:val="single" w:sz="24" w:space="8" w:color="BF9000"/>
-        </w:pBdr>
-        <w:spacing w:before="80" w:after="160"/>
-        <w:ind w:left="397"/>
-        <w:shd w:val="clear" w:color="auto" w:fill="FFF2CC"/>
-      </w:pPr>
       <w:r>
         <w:rPr/>
-        <w:t>Las infografías se abren en una ventana grande, como en un blog, con la imagen y su texto. Abajo hay videos de YouTube, dentro de la misma página.</w:t>
-      </w:r>
-    </w:p>
-    <w:p>
-      <w:r>
-        <w:rPr/>
-        <w:t>Cada infografía es una tarjeta, y el título va fuera de la imagen para que se lea bien. Los videos se reproducen sin que tengan que salir del sitio. Las infografías son una forma de explicar ideas difíciles con una imagen y un texto corto, y por eso las pusimos como complemento del análisis: en la propia pantalla de análisis aparecen unas recientes, para que quien está esperando o explorando pueda leer algo útil.</w:t>
+        <w:t>Las infografías se abren en una ventana grande, como en un blog, con la imagen y su texto. El título va fuera de la imagen, para que se lea bien. Y abajo hay videos de YouTube, que se reproducen dentro de la misma página, sin que tengan que salir del sitio. Las infografías son una forma de explicar ideas difíciles con una imagen y un texto corto, y por eso las pusimos también como complemento del análisis: en la propia pantalla de análisis aparecen unas recientes, para que quien está esperando o explorando pueda leer algo útil.</w:t>
       </w:r>
     </w:p>
     <w:p>
@@ -3557,27 +837,7 @@
     <w:p>
       <w:r>
         <w:rPr/>
-        <w:t>Ahora algo que a veces sorprende. Arriba a la derecha hay un selector de idioma. Si elijo EN, el sitio completo se traduce al inglés.</w:t>
-      </w:r>
-    </w:p>
-    <w:p>
-      <w:pPr>
-        <w:pBdr>
-          <w:left w:val="single" w:sz="24" w:space="8" w:color="BF9000"/>
-        </w:pBdr>
-        <w:spacing w:before="80" w:after="160"/>
-        <w:ind w:left="397"/>
-        <w:shd w:val="clear" w:color="auto" w:fill="FFF2CC"/>
-      </w:pPr>
-      <w:r>
-        <w:rPr/>
-        <w:t>Si elijo EN, el sitio completo se traduce con el servicio de Google, así que no hay dos versiones del sitio. La calidad es la de un traductor automático, pero los nombres propios no se traducen.</w:t>
-      </w:r>
-    </w:p>
-    <w:p>
-      <w:r>
-        <w:rPr/>
-        <w:t>Eso tiene una ventaja, que es que todo el sitio queda traducido sin trabajo extra, y una desventaja, que es que la calidad es la de un traductor automático. Para cuidar eso, los nombres propios y los nombres de archivo están marcados para que no se traduzcan. Vuelvo a español. La ventaja práctica es que si un colega de otro país quiere usarlo, o si alguien prefiere leer en inglés, puede hacerlo sin que tengamos que mantener dos sitios distintos.</w:t>
+        <w:t>Ahora algo que a veces sorprende. Arriba a la derecha hay un selector de idioma, y si elijo EN, el sitio completo se traduce al inglés. No hay dos versiones del sitio: la traducción la hace el servicio de Google que está integrado. Eso tiene una ventaja, que es que todo queda traducido sin trabajo extra, y una desventaja, que es que la calidad es la de un traductor automático. Para cuidar eso, los nombres propios y los nombres de archivo están marcados para que no se traduzcan. Vuelvo a español. En la práctica, si un colega de otro país quiere usarlo, o si alguien prefiere leer en inglés, puede hacerlo sin que tengamos que mantener dos sitios distintos.</w:t>
       </w:r>
     </w:p>
     <w:p>
@@ -3591,27 +851,13 @@
     <w:p>
       <w:r>
         <w:rPr/>
-        <w:t>Si bajo hasta el final de la página, está el pie. Tiene el nombre del proyecto y la institución, un contacto de ejemplo, los mismos enlaces del menú, y abajo dos cosas que pidió el grupo: el aviso de privacidad 2026 y la mención de la licencia Creative Commons, Atribución y No Comercial. El estilo es sobrio, con pocos colores, y se adapta a distintos tamaños de pantalla, así que también se puede ver desde un teléfono.</w:t>
-      </w:r>
-    </w:p>
-    <w:p>
-      <w:pPr>
-        <w:pBdr>
-          <w:left w:val="single" w:sz="24" w:space="8" w:color="BF9000"/>
-        </w:pBdr>
-        <w:spacing w:before="80" w:after="160"/>
-        <w:ind w:left="397"/>
-        <w:shd w:val="clear" w:color="auto" w:fill="FFF2CC"/>
-      </w:pPr>
-      <w:r>
-        <w:rPr/>
-        <w:t>Con esto queda la parte informativa. Lo que justifica el proyecto es el análisis de imágenes y, para usarlo, hace falta una cuenta.</w:t>
+        <w:t>Si bajo hasta el final de la página, está el pie. Tiene el nombre del proyecto y la institución, un contacto de ejemplo, los mismos enlaces del menú, y abajo el aviso de privacidad 2026 y la licencia Creative Commons, Atribución y No Comercial.</w:t>
       </w:r>
     </w:p>
     <w:p>
       <w:r>
         <w:rPr/>
-        <w:t>Hasta aquí todo se puede recorrer sin cuenta. Pero la sección que justifica el proyecto es la de Inteligencia Artificial, la que analiza imágenes, y esa sí necesita que alguien inicie sesión. Vamos a crear una cuenta.</w:t>
+        <w:t>Si fuera la primera vez que alguien entra, yo empezaría por Inicio, seguiría con Nosotros para entender qué es el proyecto y, si le interesa, pasaría a Inteligencia Artificial. Todas las páginas comparten el mismo encabezado, el mismo menú y el mismo pie, así que uno siempre sabe dónde está y cómo volver. Con esto queda la parte informativa. Hasta aquí todo se puede recorrer sin cuenta. Pero lo que justifica el proyecto es el análisis de imágenes, y para usarlo, hace falta una cuenta. Vamos a crear una.</w:t>
       </w:r>
     </w:p>
     <w:p>
@@ -3627,80 +873,7 @@
         <w:rPr>
           <w:i/>
         </w:rPr>
-        <w:t>0:46-0:52 · 6 min · 503 palabras, unos 2.7 min de habla</w:t>
-      </w:r>
-    </w:p>
-    <w:p>
-      <w:r>
-        <w:rPr>
-          <w:b/>
-        </w:rPr>
-        <w:t>Idea que debe quedar:</w:t>
-      </w:r>
-      <w:r>
-        <w:rPr/>
-        <w:t xml:space="preserve"> el sitio se recorre sin cuenta, pero para analizar imágenes hay que iniciar sesión, y eso hace que cada análisis sea privado.</w:t>
-      </w:r>
-    </w:p>
-    <w:p>
-      <w:r>
-        <w:rPr>
-          <w:b/>
-        </w:rPr>
-        <w:t>Ideas, en orden:</w:t>
-      </w:r>
-    </w:p>
-    <w:p>
-      <w:pPr>
-        <w:pStyle w:val="ListBullet"/>
-      </w:pPr>
-      <w:r>
-        <w:rPr/>
-        <w:t>«Mi cuenta» tiene dos columnas: entrar y crear cuenta.</w:t>
-      </w:r>
-    </w:p>
-    <w:p>
-      <w:pPr>
-        <w:pStyle w:val="ListBullet"/>
-      </w:pPr>
-      <w:r>
-        <w:rPr/>
-        <w:t>Tres datos: nombre, correo y contraseña de al menos ocho caracteres.</w:t>
-      </w:r>
-    </w:p>
-    <w:p>
-      <w:pPr>
-        <w:pStyle w:val="ListBullet"/>
-      </w:pPr>
-      <w:r>
-        <w:rPr/>
-        <w:t>Al registrarse, la sesión inicia en el acto y el sitio lleva a «Analizar imagen».</w:t>
-      </w:r>
-    </w:p>
-    <w:p>
-      <w:pPr>
-        <w:pStyle w:val="ListBullet"/>
-      </w:pPr>
-      <w:r>
-        <w:rPr/>
-        <w:t>Salir y volver a entrar; «Recordarme en este equipo».</w:t>
-      </w:r>
-    </w:p>
-    <w:p>
-      <w:pPr>
-        <w:pStyle w:val="ListBullet"/>
-      </w:pPr>
-      <w:r>
-        <w:rPr/>
-        <w:t>La contraseña se guarda cifrada; el acceso a la red es privado.</w:t>
-      </w:r>
-    </w:p>
-    <w:p>
-      <w:r>
-        <w:rPr>
-          <w:b/>
-        </w:rPr>
-        <w:t>Texto para decir:</w:t>
+        <w:t>0:45-0:51 · 6 min · 471 palabras, unos 2.7 min de habla</w:t>
       </w:r>
     </w:p>
     <w:p>
@@ -3730,29 +903,11 @@
         </w:rPr>
         <w:t>[Acción: escribir un nombre, un correo y una contraseña de ejemplo en la columna derecha y hacer clic en «Registrarme».]</w:t>
       </w:r>
-      <w:r>
-        <w:rPr/>
-        <w:t xml:space="preserve"> Si todo está bien, la cuenta se crea y la sesión inicia en el acto, con un mensaje de bienvenida. El sitio lleva directo a «Analizar imagen», y arriba a la derecha, donde decía «Iniciar sesión», ahora se lee el nombre de la persona y «Salir».</w:t>
-      </w:r>
-    </w:p>
-    <w:p>
-      <w:pPr>
-        <w:pBdr>
-          <w:left w:val="single" w:sz="24" w:space="8" w:color="BF9000"/>
-        </w:pBdr>
-        <w:spacing w:before="80" w:after="160"/>
-        <w:ind w:left="397"/>
-        <w:shd w:val="clear" w:color="auto" w:fill="FFF2CC"/>
-      </w:pPr>
-      <w:r>
-        <w:rPr/>
-        <w:t>Con la cuenta creada, el sitio me lleva directo a «Analizar imagen». Ya puedo subir mis fotos.</w:t>
-      </w:r>
     </w:p>
     <w:p>
       <w:r>
         <w:rPr/>
-        <w:t>Fíjense: no tuve que confirmar nada por correo ni esperar a que alguien me aprobara. Me registré y ya estoy dentro, y el sitio me llevó a la pantalla donde se suben las imágenes.</w:t>
+        <w:t>Si todo está bien, la cuenta se crea y la sesión inicia en el acto, con un mensaje de bienvenida. El sitio me lleva directo a «Analizar imagen», y arriba a la derecha, donde decía «Iniciar sesión», ahora se lee mi nombre y «Salir». Fíjense: no tuve que confirmar nada por correo ni esperar a que alguien me aprobara. Me registré y ya puedo subir mis fotos.</w:t>
       </w:r>
     </w:p>
     <w:p>
@@ -3766,7 +921,7 @@
     <w:p>
       <w:r>
         <w:rPr/>
-        <w:t>Voy a salir y a volver a entrar para que vean las dos cosas. Hay una casilla que dice «Recordarme en este equipo». Es cómoda si es una computadora personal, porque no hay que escribir la contraseña cada vez, pero no la recomiendo en una computadora compartida.</w:t>
+        <w:t>Voy a salir y a volver a entrar, para que vean las dos cosas. Hay una casilla que dice «Recordarme en este equipo». Es cómoda si es una computadora personal, porque no hay que escribir la contraseña cada vez, pero no la recomiendo en una computadora compartida.</w:t>
       </w:r>
     </w:p>
     <w:p>
@@ -3778,7 +933,7 @@
     <w:p>
       <w:r>
         <w:rPr/>
-        <w:t>Y una cosa que a veces intriga: ¿cómo sabe el sitio que soy yo mientras navego? Cuando inicio sesión, el sitio le da a mi navegador una especie de pase, que se llama cookie, y mi navegador lo manda en cada petición. Por eso el sitio sabe quién soy mientras me muevo de una pantalla a otra. La casilla de «Recordarme en este equipo» hace que ese pase dure más tiempo, y por eso conviene dejarla marcada solo en una computadora propia.</w:t>
+        <w:t>Y una cosa que a veces intriga: ¿cómo sabe el sitio que soy yo mientras navego? Cuando inicio sesión, el sitio le da a mi navegador una especie de pase, que se llama cookie, y mi navegador lo manda en cada petición. Por eso el sitio sabe quién soy mientras me muevo de una pantalla a otra. La casilla de «Recordarme en este equipo» hace que ese pase dure más tiempo, y por eso conviene marcarla solo en una computadora propia.</w:t>
       </w:r>
     </w:p>
     <w:p>
@@ -3788,23 +943,9 @@
       </w:r>
     </w:p>
     <w:p>
-      <w:pPr>
-        <w:pBdr>
-          <w:left w:val="single" w:sz="24" w:space="8" w:color="BF9000"/>
-        </w:pBdr>
-        <w:spacing w:before="80" w:after="160"/>
-        <w:ind w:left="397"/>
-        <w:shd w:val="clear" w:color="auto" w:fill="FFF2CC"/>
-      </w:pPr>
       <w:r>
         <w:rPr/>
-        <w:t>Para analizar imágenes hay que iniciar sesión. Así cada análisis pertenece a una persona y solo esa persona puede verlo.</w:t>
-      </w:r>
-    </w:p>
-    <w:p>
-      <w:r>
-        <w:rPr/>
-        <w:t>Quiero subrayar esto porque lo pidió el equipo que revisó la presentación: el acceso a la red neuronal es privado y se hace con un usuario. Cada análisis es de quien lo hizo, y nadie más puede verlo. Incluso si dos personas analizan exactamente la misma imagen, cada una tiene su propio análisis, con su nombre y su fecha, y ninguna ve el de la otra.</w:t>
+        <w:t>Si alguien olvida su contraseña, por ahora la salida es crear una cuenta con otro correo o avisarme. Para analizar imágenes hay que iniciar sesión. Así cada análisis pertenece a una persona y solo esa persona puede verlo. Y esto me parece importante: el acceso a la red neuronal es privado y se hace con un usuario. Incluso si dos personas analizan exactamente la misma imagen, cada una tiene su propio análisis, con su nombre y su fecha, y ninguna ve el de la otra.</w:t>
       </w:r>
     </w:p>
     <w:p>
@@ -3820,80 +961,7 @@
         <w:rPr>
           <w:i/>
         </w:rPr>
-        <w:t>0:52-1:01 · 9 min · 1,015 palabras, unos 5.5 min de habla</w:t>
-      </w:r>
-    </w:p>
-    <w:p>
-      <w:r>
-        <w:rPr>
-          <w:b/>
-        </w:rPr>
-        <w:t>Idea que debe quedar:</w:t>
-      </w:r>
-      <w:r>
-        <w:rPr/>
-        <w:t xml:space="preserve"> subir una imagen es sencillo, no hay parámetros que ajustar, y es normal que el análisis tarde.</w:t>
-      </w:r>
-    </w:p>
-    <w:p>
-      <w:r>
-        <w:rPr>
-          <w:b/>
-        </w:rPr>
-        <w:t>Ideas, en orden:</w:t>
-      </w:r>
-    </w:p>
-    <w:p>
-      <w:pPr>
-        <w:pStyle w:val="ListBullet"/>
-      </w:pPr>
-      <w:r>
-        <w:rPr/>
-        <w:t>El recuadro tiene solo lo necesario; no hay parámetros, a propósito.</w:t>
-      </w:r>
-    </w:p>
-    <w:p>
-      <w:pPr>
-        <w:pStyle w:val="ListBullet"/>
-      </w:pPr>
-      <w:r>
-        <w:rPr/>
-        <w:t>De una a diez imágenes, hasta 300 MB; formatos y advertencia del JPG.</w:t>
-      </w:r>
-    </w:p>
-    <w:p>
-      <w:pPr>
-        <w:pStyle w:val="ListBullet"/>
-      </w:pPr>
-      <w:r>
-        <w:rPr/>
-        <w:t>La imagen de ejemplo: sintética, para ver el flujo completo.</w:t>
-      </w:r>
-    </w:p>
-    <w:p>
-      <w:pPr>
-        <w:pStyle w:val="ListBullet"/>
-      </w:pPr>
-      <w:r>
-        <w:rPr/>
-        <w:t>La cubierta de espera; es normal que tarde y el aviso al minuto.</w:t>
-      </w:r>
-    </w:p>
-    <w:p>
-      <w:pPr>
-        <w:pStyle w:val="ListBullet"/>
-      </w:pPr>
-      <w:r>
-        <w:rPr/>
-        <w:t>Tiempos y qué pasa del otro lado mientras se espera.</w:t>
-      </w:r>
-    </w:p>
-    <w:p>
-      <w:r>
-        <w:rPr>
-          <w:b/>
-        </w:rPr>
-        <w:t>Texto para decir:</w:t>
+        <w:t>0:51-0:59 · 8 min · 843 palabras, unos 4.8 min de habla</w:t>
       </w:r>
     </w:p>
     <w:p>
@@ -3907,27 +975,13 @@
     <w:p>
       <w:r>
         <w:rPr/>
-        <w:t>Esta es la sección de Inteligencia Artificial, la pantalla «Analizar imagen». Quiero que se fijen en lo poco que hay. Una caja con un selector de archivos para subir las imágenes, una nota con los formatos, un botón verde que dice «Analizar» y debajo otro que dice «Probar con la imagen de ejemplo». Eso es todo.</w:t>
-      </w:r>
-    </w:p>
-    <w:p>
-      <w:pPr>
-        <w:pBdr>
-          <w:left w:val="single" w:sz="24" w:space="8" w:color="BF9000"/>
-        </w:pBdr>
-        <w:spacing w:before="80" w:after="160"/>
-        <w:ind w:left="397"/>
-        <w:shd w:val="clear" w:color="auto" w:fill="FFF2CC"/>
-      </w:pPr>
-      <w:r>
-        <w:rPr/>
-        <w:t>No hay parámetros ni opciones avanzadas, y es a propósito: así, dos personas que analicen la misma imagen obtienen el mismo resultado.</w:t>
+        <w:t>Esta es la sección de Inteligencia Artificial, la pantalla «Analizar imagen». Fíjense en lo poco que hay. Una caja con un selector de archivos para subir las imágenes, una nota con los formatos, un botón verde que dice «Analizar» y, debajo, otro que dice «Probar con la imagen de ejemplo».</w:t>
       </w:r>
     </w:p>
     <w:p>
       <w:r>
         <w:rPr/>
-        <w:t>Es una decisión de diseño. Podríamos haber puesto controles para ajustar el análisis, pero entonces cada persona lo ajustaría distinto y los resultados ya no se podrían comparar. Sin parámetros, la misma imagen da el mismo resultado, la analice quien la analice.</w:t>
+        <w:t>No hay parámetros ni opciones avanzadas, y es a propósito: así, dos personas que analicen la misma imagen obtienen el mismo resultado. Podríamos haber puesto controles para ajustar el análisis, pero entonces cada persona lo ajustaría distinto y los resultados ya no se podrían comparar. Sin parámetros, la misma imagen da el mismo resultado, la analice quien la analice.</w:t>
       </w:r>
     </w:p>
     <w:p>
@@ -3939,19 +993,13 @@
     <w:p>
       <w:r>
         <w:rPr/>
-        <w:t>Hagamos una cuenta rápida para saber qué esperar. Si una foto grande de fluorescencia tarda unos cuarenta segundos y subo diez, el análisis completo tarda unos siete minutos, porque se hacen una tras otra. Es poco para lo que se está haciendo, pero es mucho para quedarse mirando una pantalla, y por eso conviene saberlo de antemano. Una buena práctica es subir lotes de tamaño razonable y aprovechar la espera para otra cosa, sin cerrar la página.</w:t>
+        <w:t>Hagamos la cuenta. Si una foto grande de fluorescencia tarda unos cuarenta segundos y subo diez, el análisis completo tarda unos siete minutos, porque se hacen una tras otra. Es poco para lo que se está haciendo, pero es mucho para quedarse mirando una pantalla, y por eso conviene saberlo de antemano. Una buena práctica es subir lotes de tamaño razonable y aprovechar la espera para otra cosa, sin cerrar la página. Y si algo sale mal, por ejemplo se sube un archivo que no es una imagen o un formato que el sitio no acepta, el sitio lo avisa con un mensaje claro en la misma pantalla, y no se pierde nada.</w:t>
       </w:r>
     </w:p>
     <w:p>
       <w:r>
         <w:rPr/>
-        <w:t>Si algo sale mal, por ejemplo se sube un archivo que no es una imagen o un formato que el sitio no acepta, el sitio lo avisa con un mensaje claro en la misma pantalla, y no se pierde nada.</w:t>
-      </w:r>
-    </w:p>
-    <w:p>
-      <w:r>
-        <w:rPr/>
-        <w:t>Como no tengo aquí una foto propia para subir, voy a usar la imagen de ejemplo.</w:t>
+        <w:t>Más abajo, en esta misma pantalla, aparecen unas infografías recientes, para que la espera de un análisis largo pueda aprovecharse leyendo algo. Como no tengo aquí una foto propia para subir, voy a usar la imagen de ejemplo.</w:t>
       </w:r>
     </w:p>
     <w:p>
@@ -3961,9 +1009,11 @@
         </w:rPr>
         <w:t>[Acción: hacer clic en «Probar con la imagen de ejemplo».]</w:t>
       </w:r>
+    </w:p>
+    <w:p>
       <w:r>
         <w:rPr/>
-        <w:t xml:space="preserve"> Es una imagen sintética, dibujada para la prueba: óvalos de colores, cada uno con una línea verde que hace de cola, sobre un fondo negro. Sirve para ver el flujo completo sin tener una foto propia. No es una foto de microscopio real, y se los aclaro para que no se confundan con los números que van a ver. Que el sitio tenga una imagen de ejemplo es útil en una clase como esta, o cuando alguien quiere comprobar que todo funciona sin gastar una foto propia. Las cifras que salgan no dicen nada biológico, solo muestran cómo se leen.</w:t>
+        <w:t>Es una imagen sintética, dibujada para la prueba: óvalos de colores, cada uno con una línea verde que hace de cola, sobre un fondo negro. No es una foto de microscopio real. Que el sitio tenga una imagen de ejemplo es útil en una clase como esta, o cuando alguien quiere comprobar que todo funciona sin gastar una foto propia. Las cifras que salgan no dicen nada biológico, solo muestran cómo se leen.</w:t>
       </w:r>
     </w:p>
     <w:p>
@@ -3977,71 +1027,31 @@
     <w:p>
       <w:r>
         <w:rPr/>
-        <w:t>Apareció una cubierta con una barra verde que se mueve y un mensaje. Esa barra es solo de actividad: no marca cuánto falta, solo confirma que el sistema está trabajando. El mensaje dice que es normal que el análisis tarde y que no cierren la página. Piden no cerrarla porque es justo en esa pantalla donde el sitio va a entregar el resultado cuando termine. La barra no avanza de izquierda a derecha porque el sitio no puede saber de antemano cuánto va a tardar cada imagen; por eso es una barra de actividad y no una barra de progreso.</w:t>
-      </w:r>
-    </w:p>
-    <w:p>
-      <w:pPr>
-        <w:pBdr>
-          <w:left w:val="single" w:sz="24" w:space="8" w:color="BF9000"/>
-        </w:pBdr>
-        <w:spacing w:before="80" w:after="160"/>
-        <w:ind w:left="397"/>
-        <w:shd w:val="clear" w:color="auto" w:fill="FFF2CC"/>
-      </w:pPr>
-      <w:r>
-        <w:rPr/>
-        <w:t>Es normal que el análisis tarde, eh. Si pasa un minuto, el sitio avisa que el análisis sigue en curso.</w:t>
+        <w:t>Apareció una cubierta con una barra verde que se mueve y un mensaje. Esa barra es solo de actividad: no marca cuánto falta, solo confirma que el sistema está trabajando. No avanza de izquierda a derecha porque el sitio no puede saber de antemano cuánto va a tardar cada imagen. El mensaje dice que es normal que el análisis tarde y que no cierren la página, porque es justo en esa pantalla donde el sitio va a entregar el resultado cuando termine.</w:t>
       </w:r>
     </w:p>
     <w:p>
       <w:r>
         <w:rPr/>
-        <w:t>Ese aviso lo agregamos por una sugerencia que salió en el ensayo. Si pasa un minuto y todavía no termina, aparece otra línea que dice «Tu análisis sigue en curso». La idea es que quien espera sepa que no se trabó, y que la tardanza se entienda como algo normal y explicado, no como un fallo. Si la gente no sabe por qué tarda, piensa que el sistema es lento o complicado.</w:t>
+        <w:t>Es normal que el análisis tarde, eh. Si pasa un minuto, el sitio avisa que el análisis sigue en curso. Ese aviso lo agregamos para que quien espera sepa que el sistema no se trabó. Si la gente no sabe por qué tarda, piensa que el sistema es lento o complicado.</w:t>
       </w:r>
     </w:p>
     <w:p>
       <w:r>
         <w:rPr/>
-        <w:t>¿Cuánto tarda? En la computadora donde desarrollamos, una foto grande de fluorescencia tarda unos cuarenta segundos, y una de fondo claro entre diez y veinte. Si se suben varias, se analizan una tras otra y los tiempos se suman. Por eso el sitio tiene tiempos de espera amplios.</w:t>
-      </w:r>
-    </w:p>
-    <w:p>
-      <w:pPr>
-        <w:pBdr>
-          <w:left w:val="single" w:sz="24" w:space="8" w:color="BF9000"/>
-        </w:pBdr>
-        <w:spacing w:before="80" w:after="160"/>
-        <w:ind w:left="397"/>
-        <w:shd w:val="clear" w:color="auto" w:fill="FFF2CC"/>
-      </w:pPr>
-      <w:r>
-        <w:rPr/>
-        <w:t>Mientras esperamos, les cuento qué pasa del otro lado.</w:t>
+        <w:t>Mientras esperamos, les cuento qué pasa del otro lado. Primero, la imagen viaja a través de internet hasta el servidor. El servidor revisa el formato del archivo. Después mide el brillo de la imagen para saber si es de fondo oscuro o de fondo claro, y con eso elige cuál de los dos modelos va a usar. Luego analiza la imagen en recortes pequeños. La red devuelve un contorno por cada espermatozoide que encuentra, se juntan los resultados de todos los recortes y el código mide cada contorno. Todo eso ocurre en el procesador del servidor.</w:t>
       </w:r>
     </w:p>
     <w:p>
       <w:r>
         <w:rPr/>
-        <w:t>Y mientras esperamos, aprovecho para contarles qué está pasando del otro lado. Primero, la imagen viaja a través de internet hasta el servidor. El servidor revisa el formato del archivo. Después mide el brillo de la imagen para saber si es de fondo oscuro o de fondo claro, y con eso elige cuál de los dos modelos va a usar. Luego analiza la imagen en recortes pequeños. La red devuelve un contorno por cada espermatozoide que encuentra, se juntan los resultados de todos los recortes y el código mide cada contorno. Todo eso ocurre en el procesador del servidor.</w:t>
-      </w:r>
-    </w:p>
-    <w:p>
-      <w:r>
-        <w:rPr/>
-        <w:t>Les explico por qué se analiza por recortes. Las fotos son muy grandes y los espermatozoides son pequeños comparados con ellas. Analizar toda la imagen de golpe exigiría mucha memoria al servidor, y el detalle exacto de por qué se hace así lo vemos el lunes. Por eso se corta la imagen en trozos, se analiza cada trozo y después se unen los resultados. Al unirlos puede pasar que una misma célula aparezca en dos trozos vecinos, y entonces hay que quitar el repetido para no contarla dos veces. Todo eso se resuelve dentro del sistema, y es parte de lo que vemos el lunes.</w:t>
+        <w:t>Se analiza por recortes porque las fotos son muy grandes y los espermatozoides son pequeños comparados con ellas. Analizar toda la imagen de golpe exigiría mucha memoria al servidor, y el detalle exacto de por qué se hace así lo vemos el lunes. Por eso se corta la imagen en trozos, se analiza cada trozo y después se unen los resultados. Al unirlos puede pasar que una misma célula aparezca en dos trozos vecinos, y entonces hay que quitar el repetido para no contarla dos veces. Todo eso se resuelve dentro del sistema, y es parte de lo que vemos el lunes.</w:t>
       </w:r>
     </w:p>
     <w:p>
       <w:r>
         <w:rPr/>
         <w:t>Y el modelo se elige según el tipo de foto. Si la imagen tiene el fondo oscuro, como en fluorescencia, se usa el modelo de fluorescencia. Si el fondo es claro, se usa el de fondo claro. El sitio lo decide solo, midiendo el brillo, y la persona no tiene que elegir nada. Es otra decisión que se quitó de las manos de quien usa el sitio.</w:t>
-      </w:r>
-    </w:p>
-    <w:p>
-      <w:r>
-        <w:rPr/>
-        <w:t>No voy a entrar hoy en más detalle de los recortes ni de cómo se juntan los resultados. Eso es del lunes, que es cuando abrimos el sistema por dentro.</w:t>
       </w:r>
     </w:p>
     <w:p>
@@ -4071,80 +1081,7 @@
         <w:rPr>
           <w:i/>
         </w:rPr>
-        <w:t>1:01-1:15 · 14 min · 1,681 palabras, unos 9.1 min de habla</w:t>
-      </w:r>
-    </w:p>
-    <w:p>
-      <w:r>
-        <w:rPr>
-          <w:b/>
-        </w:rPr>
-        <w:t>Idea que debe quedar:</w:t>
-      </w:r>
-      <w:r>
-        <w:rPr/>
-        <w:t xml:space="preserve"> cada elemento de la pantalla se puede rastrear hasta un contorno de la imagen, y los números se leen siempre junto con la imagen y la gráfica.</w:t>
-      </w:r>
-    </w:p>
-    <w:p>
-      <w:r>
-        <w:rPr>
-          <w:b/>
-        </w:rPr>
-        <w:t>Ideas, en orden:</w:t>
-      </w:r>
-    </w:p>
-    <w:p>
-      <w:pPr>
-        <w:pStyle w:val="ListBullet"/>
-      </w:pPr>
-      <w:r>
-        <w:rPr/>
-        <w:t>Encabezado, aviso de escala, mensaje por imagen y datos del archivo.</w:t>
-      </w:r>
-    </w:p>
-    <w:p>
-      <w:pPr>
-        <w:pStyle w:val="ListBullet"/>
-      </w:pPr>
-      <w:r>
-        <w:rPr/>
-        <w:t>La imagen marcada y los tres datos principales; el largo y las cifras en píxeles.</w:t>
-      </w:r>
-    </w:p>
-    <w:p>
-      <w:pPr>
-        <w:pStyle w:val="ListBullet"/>
-      </w:pPr>
-      <w:r>
-        <w:rPr/>
-        <w:t>El histograma: cómo se construye y cómo se lee.</w:t>
-      </w:r>
-    </w:p>
-    <w:p>
-      <w:pPr>
-        <w:pStyle w:val="ListBullet"/>
-      </w:pPr>
-      <w:r>
-        <w:rPr/>
-        <w:t>El visor con zoom para revisar cada contorno.</w:t>
-      </w:r>
-    </w:p>
-    <w:p>
-      <w:pPr>
-        <w:pStyle w:val="ListBullet"/>
-      </w:pPr>
-      <w:r>
-        <w:rPr/>
-        <w:t>La tabla de detalle y la advertencia de leer los números con la imagen y la gráfica.</w:t>
-      </w:r>
-    </w:p>
-    <w:p>
-      <w:r>
-        <w:rPr>
-          <w:b/>
-        </w:rPr>
-        <w:t>Texto para decir:</w:t>
+        <w:t>0:59-1:12 · 13 min · 1,544 palabras, unos 8.8 min de habla</w:t>
       </w:r>
     </w:p>
     <w:p>
@@ -4164,71 +1101,25 @@
     <w:p>
       <w:r>
         <w:rPr/>
-        <w:t>Arriba está el título y, debajo, una línea con el nombre de quien hizo el análisis y la fecha y hora exactas, hasta el segundo. Parece un detalle menor, pero sirve para distinguir muchos análisis entre sí cuando uno acumula varios.</w:t>
+        <w:t>Arriba está el título y, debajo, una línea con el nombre de quien hizo el análisis y la fecha y hora exactas, hasta el segundo. Parece un detalle menor, pero sirve para distinguir muchos análisis entre sí cuando uno acumula varios. Enseguida hay un recuadro azul con el aviso de escala. Dice que, para estandarizar el tamaño de las imágenes, se usa la misma escala en todas: sesenta píxeles es una micra. Y agrega que la regla de la imagen marcada mide trescientos píxeles, es decir, cinco micras. Más abajo vamos a ver esa regla dibujada en la imagen. Entonces, arriba aparece quién hizo el análisis, con fecha y hora, y un aviso de escala que es igual para todas las imágenes.</w:t>
       </w:r>
     </w:p>
     <w:p>
       <w:r>
         <w:rPr/>
-        <w:t>Enseguida hay un recuadro azul con el aviso de escala. Dice que, para estandarizar el tamaño de las imágenes, se usa la misma escala en todas: sesenta píxeles es una micra. Y agrega que la regla de la imagen marcada mide trescientos píxeles, es decir, cinco micras. Más abajo vamos a ver esa regla dibujada en la imagen.</w:t>
-      </w:r>
-    </w:p>
-    <w:p>
-      <w:pPr>
-        <w:pBdr>
-          <w:left w:val="single" w:sz="24" w:space="8" w:color="BF9000"/>
-        </w:pBdr>
-        <w:spacing w:before="80" w:after="160"/>
-        <w:ind w:left="397"/>
-        <w:shd w:val="clear" w:color="auto" w:fill="FFF2CC"/>
-      </w:pPr>
-      <w:r>
-        <w:rPr/>
-        <w:t>Arriba aparece quién hizo el análisis, con fecha y hora, y un aviso de escala: el sitio usa la misma en todas las imágenes, sesenta píxeles por micra, para estandarizar su tamaño.</w:t>
+        <w:t>Después viene el nombre del archivo, y debajo un mensaje. Este mensaje, en verde, dice que todo salió bien: «La imagen fue analizada con éxito». Cada imagen trae su propio mensaje, y puede cambiar. Si la imagen estaba en un formato con compresión, avisa que los bordes pueden haberse alterado. Si se contaron muy pocos espermatozoides, menos de tres, avisa que la distribución de tamaños no es confiable. Y si no se encontró nada, dice en rojo que no se analizó. Entre un «no se pudo» honesto y un número dudoso, el sitio prefiere el primero.</w:t>
       </w:r>
     </w:p>
     <w:p>
       <w:r>
         <w:rPr/>
-        <w:t>Después viene el nombre del archivo, y debajo un mensaje. Este mensaje, en verde, dice que todo salió bien: «La imagen fue analizada con éxito».</w:t>
-      </w:r>
-    </w:p>
-    <w:p>
-      <w:pPr>
-        <w:pBdr>
-          <w:left w:val="single" w:sz="24" w:space="8" w:color="BF9000"/>
-        </w:pBdr>
-        <w:spacing w:before="80" w:after="160"/>
-        <w:ind w:left="397"/>
-        <w:shd w:val="clear" w:color="auto" w:fill="FFF2CC"/>
-      </w:pPr>
-      <w:r>
-        <w:rPr/>
-        <w:t>Cada imagen trae su propio mensaje. Si todo salió bien, es verde. Si hay algo que cuidar, como compresión o muy pocos espermatozoides, el sitio lo avisa. Prefiere decir «no se pudo» a darles un número dudoso.</w:t>
+        <w:t>Por ejemplo, si hoy subieran una foto en JPG, verían un aviso amarillo que dice que la imagen está en un formato con compresión y que los bordes pueden alterarse, y que recomienda usar BMP, PNG o TIFF. Es un aviso para que lo sepan, no un error: el análisis se hace igual. Cuando se suben varias imágenes, cada una trae su propio bloque, con su nombre, su mensaje, su imagen marcada, sus datos y su histograma, y al final de la página aparece una gráfica con el promedio de todas. Esa gráfica usa un rango común de tamaños para todas las imágenes, de modo que las barras se pueden comparar entre sí.</w:t>
       </w:r>
     </w:p>
     <w:p>
       <w:r>
         <w:rPr/>
-        <w:t>Ese mensaje puede cambiar. Si la imagen estaba en un formato con compresión, avisa que los bordes pueden haberse alterado. Si se contaron muy pocos espermatozoides, menos de tres, avisa que la distribución de tamaños no es confiable. Y si no se encontró nada, dice en rojo que no se analizó. Entre un «no se pudo» honesto y un número dudoso, el sitio prefiere el primero.</w:t>
-      </w:r>
-    </w:p>
-    <w:p>
-      <w:r>
-        <w:rPr/>
-        <w:t>Por ejemplo, si hoy subieran una foto en JPG, verían un aviso amarillo que dice que la imagen está en un formato con compresión y que los bordes pueden alterarse, y que recomienda usar BMP, PNG o TIFF. Es un aviso para que lo sepan, no un error: el análisis se hace igual.</w:t>
-      </w:r>
-    </w:p>
-    <w:p>
-      <w:r>
-        <w:rPr/>
-        <w:t>Cuando se suben varias imágenes, cada una trae su propio bloque, con su nombre, su mensaje, su imagen marcada, sus datos y su histograma, y al final de la página aparece una gráfica con el promedio de todas. Esa gráfica de promedios usa un rango común de tamaños para todas las imágenes, de modo que las barras se pueden comparar entre sí.</w:t>
-      </w:r>
-    </w:p>
-    <w:p>
-      <w:r>
-        <w:rPr/>
-        <w:t>Debajo hay una línea gris pequeña con los datos del archivo: el formato, las dimensiones en píxeles, el modo de color y el peso.</w:t>
+        <w:t>Debajo del mensaje hay una línea gris pequeña con los datos del archivo: el formato, las dimensiones en píxeles, el modo de color y el peso.</w:t>
       </w:r>
     </w:p>
     <w:p>
@@ -4254,7 +1145,7 @@
     <w:p>
       <w:r>
         <w:rPr/>
-        <w:t>Les pongo un ejemplo con números inventados y muy sencillos para que se vea la diferencia. Imaginen cinco células con áreas de diez, doce, once, trece y catorce unidades. La media es doce, y las áreas se alejan muy poco de ella: la desviación estándar sale en alrededor de uno y medio. Ahora imaginen otras cinco con áreas de dos, seis, doce, dieciocho y veintidós. La media también es doce, pero ahora las áreas se alejan mucho de ella, y la desviación estándar sale entre siete y ocho. Las dos poblaciones tienen la misma media y son muy distintas. Por eso el sitio da siempre la media y la desviación estándar juntas, y por eso la gráfica importa tanto: la media sola no cuenta esa diferencia.</w:t>
+        <w:t>Un ejemplo con números inventados y muy sencillos. Imaginen cinco células con áreas de diez, doce, once, trece y catorce unidades. La media es doce, y las áreas se alejan muy poco de ella: la desviación estándar sale en alrededor de uno y medio. Ahora imaginen otras cinco con áreas de dos, seis, doce, dieciocho y veintidós. La media también es doce, pero ahora las áreas se alejan mucho de ella, y la desviación estándar sale entre siete y ocho. Las dos poblaciones tienen la misma media y son muy distintas. Por eso el sitio da siempre la media y la desviación estándar juntas, y por eso la gráfica importa tanto: la media sola no cuenta esa diferencia.</w:t>
       </w:r>
     </w:p>
     <w:p>
@@ -4270,23 +1161,9 @@
       </w:r>
     </w:p>
     <w:p>
-      <w:pPr>
-        <w:pBdr>
-          <w:left w:val="single" w:sz="24" w:space="8" w:color="BF9000"/>
-        </w:pBdr>
-        <w:spacing w:before="80" w:after="160"/>
-        <w:ind w:left="397"/>
-        <w:shd w:val="clear" w:color="auto" w:fill="FFF2CC"/>
-      </w:pPr>
       <w:r>
         <w:rPr/>
-        <w:t>Cada número tiene un contorno detrás. Si dice ciento catorce, hay ciento catorce contornos que se pueden revisar uno por uno.</w:t>
-      </w:r>
-    </w:p>
-    <w:p>
-      <w:r>
-        <w:rPr/>
-        <w:t>Esto es lo que más quiero que se lleven de la pantalla: cada número tiene un contorno detrás. Si el conteo dice un número, hay exactamente esa cantidad de contornos en la imagen que se pueden revisar uno por uno. Nada sale de una caja cerrada.</w:t>
+        <w:t>Cada número tiene un contorno detrás. Si dice ciento catorce, hay ciento catorce contornos que se pueden revisar uno por uno. Con la imagen de ejemplo, es el número que ven ahora en pantalla.</w:t>
       </w:r>
     </w:p>
     <w:p>
@@ -4300,39 +1177,19 @@
     <w:p>
       <w:r>
         <w:rPr/>
-        <w:t>Debajo está una gráfica que se llama «Distribución de tamaños». Es un histograma. Les explico cómo se construye. Se toma la célula más pequeña y la más grande de la imagen, y el rango entre las dos se divide en diez intervalos iguales. En el eje horizontal están esos intervalos, con el área en píxeles. En el eje vertical está cuántas células cayeron en cada uno.</w:t>
-      </w:r>
-    </w:p>
-    <w:p>
-      <w:pPr>
-        <w:pBdr>
-          <w:left w:val="single" w:sz="24" w:space="8" w:color="BF9000"/>
-        </w:pBdr>
-        <w:spacing w:before="80" w:after="160"/>
-        <w:ind w:left="397"/>
-        <w:shd w:val="clear" w:color="auto" w:fill="FFF2CC"/>
-      </w:pPr>
-      <w:r>
-        <w:rPr/>
-        <w:t>El histograma divide el rango de áreas en diez intervalos iguales y cuenta cuántas células caen en cada uno. No supone ninguna forma: dibuja lo que se midió.</w:t>
+        <w:t>Debajo está una gráfica que se llama «Distribución de tamaños». Es un histograma. Se toma la célula más pequeña y la más grande de la imagen, y el rango entre las dos se divide en diez intervalos iguales. En el eje horizontal están esos intervalos, con el área en píxeles. En el eje vertical está cuántas células cayeron en cada uno. El histograma no supone ninguna forma: dibuja lo que se midió.</w:t>
       </w:r>
     </w:p>
     <w:p>
       <w:r>
         <w:rPr/>
-        <w:t>Una barra alta significa que hay muchas células con ese tamaño. Si las barras están repartidas parejo, los tamaños son muy variados. Algo importante: el histograma no supone ninguna forma. No asume que los tamaños se repartan de cierta manera. Dibuja lo que se midió y ya. Y si se suben varias imágenes, se usa un rango común para todas y aparece, además, una gráfica con los promedios.</w:t>
+        <w:t>Una barra alta significa que hay muchas células con ese tamaño. Se lee así, con dos formas típicas. Si las barras forman una sola montaña, con un centro claro y colas hacia los lados, los tamaños se concentran alrededor de un valor. Si aparecen dos montañas separadas, podría ser que haya dos grupos de tamaños distintos, pero también podría ser un problema de las marcas, así que antes de concluir nada hay que mirar la imagen. Y una barra aislada en el extremo derecho suele ser una célula muy grande, o varias células pegadas que se contaron como una. Cualquiera de esas lecturas se comprueba en la imagen marcada, y ahí es donde el visor nos va a servir. Y si se suben varias imágenes, se usa un rango común para todas y aparece, además, una gráfica con los promedios.</w:t>
       </w:r>
     </w:p>
     <w:p>
       <w:r>
         <w:rPr/>
-        <w:t>Les cuento cómo leerlo, con dos formas típicas. Si las barras forman una sola montaña, con un centro claro y colas hacia los lados, los tamaños se concentran alrededor de un valor. Si aparecen dos montañas separadas, podría ser que haya dos grupos de tamaños distintos, pero también podría ser un problema de las marcas, así que antes de concluir nada hay que mirar la imagen. Y una barra aislada en el extremo derecho suele ser una célula muy grande, o varias células pegadas que se contaron como una. Cualquiera de esas lecturas se comprueba en la imagen marcada, y ahí es donde el visor nos va a servir.</w:t>
-      </w:r>
-    </w:p>
-    <w:p>
-      <w:r>
-        <w:rPr/>
-        <w:t>Una aclaración: el sitio no interpreta los resultados ni los compara con valores de referencia. Eso lo hace el grupo. El sitio da los números y la gráfica; la lectura científica les corresponde a ustedes.</w:t>
+        <w:t>El sitio no interpreta los resultados ni los compara con valores de referencia. Eso lo hace el grupo. El sitio da los números y la gráfica; la lectura científica les corresponde a ustedes.</w:t>
       </w:r>
     </w:p>
     <w:p>
@@ -4346,33 +1203,13 @@
     <w:p>
       <w:r>
         <w:rPr/>
-        <w:t>Y para comprobar que los contornos son los correctos, tenemos el visor. Si hago clic sobre la imagen, se abre una ventana a pantalla completa. Arriba hay botones para acercar y alejar, para ajustar la imagen a la pantalla y para verla a tamaño real. También puedo acercar con la rueda del mouse y arrastrar para moverme.</w:t>
-      </w:r>
-    </w:p>
-    <w:p>
-      <w:pPr>
-        <w:pBdr>
-          <w:left w:val="single" w:sz="24" w:space="8" w:color="BF9000"/>
-        </w:pBdr>
-        <w:spacing w:before="80" w:after="160"/>
-        <w:ind w:left="397"/>
-        <w:shd w:val="clear" w:color="auto" w:fill="FFF2CC"/>
-      </w:pPr>
-      <w:r>
-        <w:rPr/>
-        <w:t>El visor sirve para comprobar con sus propios ojos que cada contorno sea de verdad un espermatozoide.</w:t>
+        <w:t>Y para comprobar que los contornos son los correctos, tenemos el visor. Si hago clic sobre la imagen, se abre una ventana a pantalla completa. Arriba hay botones para acercar y alejar, para ajustar la imagen a la pantalla y para verla a tamaño real. También puedo acercar con la rueda del mouse y arrastrar para moverme. Si paso el cursor por encima de un espermatozoide, aparece su número, su área y su largo, en píxeles y en micras. Este visor sirve para comprobar con sus propios ojos que cada contorno sea de verdad un espermatozoide. Si encuentran uno que no encierra una cabeza completa, ese es justo el tipo de cosa que conviene saber. Cierro el visor con la equis.</w:t>
       </w:r>
     </w:p>
     <w:p>
       <w:r>
         <w:rPr/>
-        <w:t>Si paso el cursor por encima de un espermatozoide, aparece su número, su área y su largo, en píxeles y en micras. Si encuentran uno que no encierra una cabeza completa, ese es justo el tipo de cosa que conviene saber. Cierro el visor con la equis.</w:t>
-      </w:r>
-    </w:p>
-    <w:p>
-      <w:r>
-        <w:rPr/>
-        <w:t>Les propongo una forma práctica de auditar un resultado. Elijan cinco números al azar de la tabla, ubiquen cada uno en la imagen con el visor y comprueben que el contorno encierra una cabeza completa. Si en esos cinco todo está bien, tienen una buena señal de que el análisis es confiable. Si en esos cinco encuentran varios problemas, desconfíen del conteo y de las medidas y revisen con más cuidado, porque el modelo puede estar teniendo dificultades con ese tipo de imagen. Es una revisión de pocos minutos y vale la pena hacerla antes de usar los números.</w:t>
+        <w:t>Una forma práctica de auditar un resultado: elijan cinco números al azar de la tabla, ubiquen cada uno en la imagen con el visor y comprueben que el contorno encierra una cabeza completa. Si en esos cinco todo está bien, tienen una buena señal de que el análisis es confiable. Si en esos cinco encuentran varios problemas, desconfíen del conteo y de las medidas y revisen con más cuidado, porque el modelo puede estar teniendo dificultades con ese tipo de imagen. Es una revisión de pocos minutos y vale la pena hacerla antes de usar los números.</w:t>
       </w:r>
     </w:p>
     <w:p>
@@ -4386,47 +1223,13 @@
     <w:p>
       <w:r>
         <w:rPr/>
-        <w:t>Más abajo está el detalle por espermatozoide: una tabla con una fila por célula. Las columnas son el número, el área y el largo en píxeles, y el área y el largo en micras. El número es el mismo que aparece en la imagen, así que pueden ir de una fila de la tabla a su contorno en la fotografía. Es la misma información que trae el archivo CSV que vamos a descargar en un momento.</w:t>
+        <w:t>Más abajo está el detalle por espermatozoide: una tabla con una fila por célula. Las columnas son el número, el área y el largo en píxeles, y el área y el largo en micras. El número es el mismo que aparece en la imagen, así que pueden ir de una fila de la tabla a su contorno en la fotografía. Es la misma información que trae el archivo CSV que vamos a descargar en un momento. Para que se vea cómo se lee una fila, imaginen una con un área de trescientos sesenta píxeles. Dividida entre tres mil seiscientos, da una décima de micra cuadrada. Y si el largo de esa fila fuera de treinta píxeles, dividido entre sesenta daría media micra. Son números inventados, pero la cuenta es siempre esa, y cualquiera puede repetirla.</w:t>
       </w:r>
     </w:p>
     <w:p>
       <w:r>
         <w:rPr/>
-        <w:t>Antes de pasar al siguiente bloque, una advertencia sobre cómo leer todo esto.</w:t>
-      </w:r>
-    </w:p>
-    <w:p>
-      <w:pPr>
-        <w:pBdr>
-          <w:left w:val="single" w:sz="24" w:space="8" w:color="BF9000"/>
-        </w:pBdr>
-        <w:spacing w:before="80" w:after="160"/>
-        <w:ind w:left="397"/>
-        <w:shd w:val="clear" w:color="auto" w:fill="FFF2CC"/>
-      </w:pPr>
-      <w:r>
-        <w:rPr/>
-        <w:t>La media sin la gráfica puede engañar. Antes de confiar en un número, miren la imagen marcada y el histograma.</w:t>
-      </w:r>
-    </w:p>
-    <w:p>
-      <w:pPr>
-        <w:pBdr>
-          <w:left w:val="single" w:sz="24" w:space="8" w:color="BF9000"/>
-        </w:pBdr>
-        <w:spacing w:before="80" w:after="160"/>
-        <w:ind w:left="397"/>
-        <w:shd w:val="clear" w:color="auto" w:fill="FFF2CC"/>
-      </w:pPr>
-      <w:r>
-        <w:rPr/>
-        <w:t>Un ejemplo con números inventados: una foto con ciento veinte células y otra con ochenta. Eso no quiere decir que una muestra tenga más. Cada foto cuenta lo que había en esa zona.</w:t>
-      </w:r>
-    </w:p>
-    <w:p>
-      <w:r>
-        <w:rPr/>
-        <w:t>Les pongo un ejemplo, y es con números inventados, para que no se confundan. Imaginen que una foto tiene ciento veinte células y otra tiene ochenta. Eso no significa que una muestra tenga más células que la otra, porque cada foto cuenta lo que había en esa zona del campo del microscopio, y esa zona puede ser distinta. Y si lo que se quiere es decir que el tamaño medio de dos grupos es distinto, eso solo se puede afirmar con una prueba estadística, y esa decisión la toma el grupo a partir de los datos del CSV. Los números del sitio son un punto de partida para ese análisis. No lo reemplazan.</w:t>
+        <w:t>Antes de pasar al siguiente tema, una advertencia sobre cómo leer todo esto. La media sin la gráfica puede engañar. Antes de confiar en un número, miren la imagen marcada y el histograma. Un ejemplo con números inventados: una foto con ciento veinte células y otra con ochenta. Eso no quiere decir que una muestra tenga más. Cada foto cuenta lo que había en esa zona del campo del microscopio, y esa zona puede ser distinta. Y si lo que se quiere es decir que el tamaño medio de dos grupos es distinto, eso solo se puede afirmar con una prueba estadística, y esa decisión la toma el grupo a partir de los datos del CSV. Los números del sitio son el punto de partida de ese análisis.</w:t>
       </w:r>
     </w:p>
     <w:p>
@@ -4442,80 +1245,7 @@
         <w:rPr>
           <w:i/>
         </w:rPr>
-        <w:t>1:15-1:26 · 11 min · 1,156 palabras, unos 6.2 min de habla</w:t>
-      </w:r>
-    </w:p>
-    <w:p>
-      <w:r>
-        <w:rPr>
-          <w:b/>
-        </w:rPr>
-        <w:t>Idea que debe quedar:</w:t>
-      </w:r>
-      <w:r>
-        <w:rPr/>
-        <w:t xml:space="preserve"> el modelo no es perfecto: puede equivocarse, el sitio avisa cuando no puede analizar, y la forma de mejorar es con más datos, más variados y mejor etiquetados.</w:t>
-      </w:r>
-    </w:p>
-    <w:p>
-      <w:r>
-        <w:rPr>
-          <w:b/>
-        </w:rPr>
-        <w:t>Ideas, en orden:</w:t>
-      </w:r>
-    </w:p>
-    <w:p>
-      <w:pPr>
-        <w:pStyle w:val="ListBullet"/>
-      </w:pPr>
-      <w:r>
-        <w:rPr/>
-        <w:t>¿Qué pasa si subo una imagen que no es de espermatozoides?</w:t>
-      </w:r>
-    </w:p>
-    <w:p>
-      <w:pPr>
-        <w:pStyle w:val="ListBullet"/>
-      </w:pPr>
-      <w:r>
-        <w:rPr/>
-        <w:t>El sitio prefiere no analizar a dar un número dudoso; aun así, no hay garantía.</w:t>
-      </w:r>
-    </w:p>
-    <w:p>
-      <w:pPr>
-        <w:pStyle w:val="ListBullet"/>
-      </w:pPr>
-      <w:r>
-        <w:rPr/>
-        <w:t>Falso positivo, en biología; alucinación, en programación.</w:t>
-      </w:r>
-    </w:p>
-    <w:p>
-      <w:pPr>
-        <w:pStyle w:val="ListBullet"/>
-      </w:pPr>
-      <w:r>
-        <w:rPr/>
-        <w:t>Por qué pasa: la red solo aprende de lo que vio.</w:t>
-      </w:r>
-    </w:p>
-    <w:p>
-      <w:pPr>
-        <w:pStyle w:val="ListBullet"/>
-      </w:pPr>
-      <w:r>
-        <w:rPr/>
-        <w:t>Cómo se mejora: más datos, más variados y mejor etiquetados; qué puede hacer cada persona.</w:t>
-      </w:r>
-    </w:p>
-    <w:p>
-      <w:r>
-        <w:rPr>
-          <w:b/>
-        </w:rPr>
-        <w:t>Texto para decir:</w:t>
+        <w:t>1:12-1:23 · 11 min · 1,008 palabras, unos 5.8 min de habla</w:t>
       </w:r>
     </w:p>
     <w:p>
@@ -4533,7 +1263,7 @@
     <w:p>
       <w:r>
         <w:rPr/>
-        <w:t>Hasta ahora todo salió bien, porque usamos una imagen pensada para que saliera bien. Ahora la pregunta incómoda: ¿qué pasa si subo una imagen que no es de espermatozoides? Preparé tres imágenes de libre uso, por ejemplo de células de hígado y de riñón, para probarlo en vivo.</w:t>
+        <w:t>Hasta ahora todo salió bien, porque usamos una imagen pensada para que saliera bien. Ahora, la pregunta incómoda: ¿qué pasa si subo una imagen que no es de espermatozoides? Preparé dos imágenes de otros tejidos, una de hígado y otra de riñón, para probarlo en vivo.</w:t>
       </w:r>
     </w:p>
     <w:p>
@@ -4541,61 +1271,31 @@
         <w:rPr>
           <w:color w:val="C00000"/>
         </w:rPr>
-        <w:t>[Acción: en «Analizar imagen», elegir con el selector de archivos las tres imágenes preparadas (por ejemplo, células de hígado y de riñón) y hacer clic en «Analizar». Esperar el resultado.]</w:t>
-      </w:r>
-      <w:r>
-        <w:rPr/>
-        <w:t xml:space="preserve"> Mostrar lo que el sitio realmente responda: un mensaje en rojo sobre la imagen o, si marca algo, la imagen con sus contornos.</w:t>
+        <w:t>[Acción: en «Analizar imagen», elegir con el selector de archivos las dos imágenes preparadas (Hígado 40x Núm 5 y Riñón 40x Núm 21) y hacer clic en «Analizar». Esperar el resultado. Mostrar lo que el sitio realmente responda: un mensaje en rojo sobre la imagen o, si marca algo, la imagen con sus contornos.]</w:t>
       </w:r>
     </w:p>
     <w:p>
       <w:r>
         <w:rPr/>
-        <w:t>Voy a seleccionar las tres imágenes y a hacer clic en «Analizar». Les voy a mostrar lo que el sitio responda de verdad, sea lo que sea. No preparé el resultado de antemano, y no sé exactamente qué va a decir con cada una, así que lo vemos juntos. Mientras corre, recuerden lo que dijimos hace un rato: el modelo se entrenó con fotos de espermatozoides, y estas son de otro tipo de célula, así que se trata de una prueba justa de qué hace el sistema ante algo que no conoce. Lo que espero es que, en el mejor caso, el sitio me diga que no es factible analizarlas.</w:t>
-      </w:r>
-    </w:p>
-    <w:p>
-      <w:pPr>
-        <w:pBdr>
-          <w:left w:val="single" w:sz="24" w:space="8" w:color="BF9000"/>
-        </w:pBdr>
-        <w:spacing w:before="80" w:after="160"/>
-        <w:ind w:left="397"/>
-        <w:shd w:val="clear" w:color="auto" w:fill="FFF2CC"/>
-      </w:pPr>
-      <w:r>
-        <w:rPr/>
-        <w:t>Si subo una imagen que no es de espermatozoides, lo que espero es que el sitio me diga que no es factible analizarla. Entre un aviso claro y un número dudoso, prefiere el aviso.</w:t>
+        <w:t>Voy a seleccionar las dos imágenes y a hacer clic en «Analizar». Les voy a mostrar lo que el sitio responda de verdad, sea lo que sea. No preparé el resultado de antemano, y no sé exactamente qué va a decir con cada una, así que lo vemos juntos. Mientras corre, recuerden lo que dijimos hace un rato: el modelo se entrenó con fotos de espermatozoides, y estas son de otro tipo de célula, así que es una prueba justa de qué hace el sistema ante algo que no conoce.</w:t>
       </w:r>
     </w:p>
     <w:p>
       <w:r>
         <w:rPr/>
-        <w:t>Esa respuesta, que dice que no se encontraron espermatozoides o que la imagen es de mala calidad y que no es factible analizarla, es parte del diseño. El sitio prefiere no analizar a inventar un resultado. Y esto conecta con el primer principio de hace rato, el de no suponer.</w:t>
+        <w:t>Si subo una imagen que no es de espermatozoides, lo que espero es que el sitio me diga que no es factible analizarla. Esa respuesta, que dice que no se encontraron espermatozoides o que la imagen es de mala calidad, es parte del diseño, y es la que ven en la diapositiva, con la imagen de hígado. Entre un aviso claro y un número dudoso, prefiere el aviso. Y esto conecta con el primer principio de hace rato, el de no suponer.</w:t>
       </w:r>
     </w:p>
     <w:p>
       <w:r>
         <w:rPr/>
-        <w:t>Si el sitio marcó algo en alguna de las tres imágenes, ese es un buen ejemplo de falso positivo, y no hay que esconderlo. Lo abrimos en el visor y vemos qué encerró el contorno: una zona más oscura, un borde, un trozo de algo que se parece a lo que el modelo aprendió. Un caso así enseña más que diez casos que salieron bien, porque muestra exactamente dónde está el límite de lo que el modelo sabe.</w:t>
+        <w:t>Si el sitio marcó algo en alguna de las dos imágenes, ese es un buen ejemplo de falso positivo, y no hay que esconderlo. Lo abrimos en el visor y vemos qué encerró el contorno: una zona más oscura, un borde, un trozo de algo que se parece a lo que el modelo aprendió. Un caso así enseña más que diez casos que salieron bien, porque muestra exactamente dónde está el límite de lo que el modelo sabe.</w:t>
       </w:r>
     </w:p>
     <w:p>
       <w:r>
         <w:rPr/>
-        <w:t>Pero tengo que ser honesto con ustedes. Que el sitio avise en estos casos no es una garantía. La red aprendió de un conjunto limitado de imágenes, y puede marcar manchas que se le parezcan a lo que aprendió a reconocer. Nadie debería darle un resultado por bueno sin mirarlo.</w:t>
-      </w:r>
-    </w:p>
-    <w:p>
-      <w:r>
-        <w:rPr/>
-        <w:t>Para entender por qué pasa esto, hay una idea previa que condiciona cómo se escucha el resto del curso. Una red neuronal no entiende qué es un espermatozoide. No tiene el concepto, no sabe de biología, no sabe qué es una célula ni para qué sirve contarla. Lo que tiene es una enorme colección de números ajustados, de modo que ante ciertos patrones de píxeles produce una salida que coincide con lo que las personas marcaron en los ejemplos. Es un reconocedor de patrones muy sofisticado, y nada más. Eso no le quita mérito, y sirve para razonar sobre cuándo va a funcionar y cuándo no.</w:t>
-      </w:r>
-    </w:p>
-    <w:p>
-      <w:r>
-        <w:rPr/>
-        <w:t>Si le muestro una imagen parecida a las de su entrenamiento, va a funcionar. Si le muestro algo muy distinto, no tiene cómo saber que se equivoca, y va a producir una salida con la misma seguridad aparente. Esa es la parte que más cuidado exige: el modelo no duda. Puede marcar algo con el mismo aspecto de firmeza con el que marca un espermatozoide perfecto. Por eso la revisión de las personas no es opcional.</w:t>
+        <w:t>Que el sitio avise en estos casos no es una garantía. La red aprendió de un conjunto limitado de imágenes, y puede marcar manchas que se le parezcan a lo que aprendió a reconocer. Nadie debería darle un resultado por bueno sin mirarlo.</w:t>
       </w:r>
     </w:p>
     <w:p>
@@ -4617,29 +1317,11 @@
         </w:rPr>
         <w:t>[Acción: mostrar un caso con un falso positivo, si existe: abrir el visor sobre un contorno que encierre una mancha, una sombra o un trozo de cola y no una cabeza completa.]</w:t>
       </w:r>
-      <w:r>
-        <w:rPr/>
-        <w:t xml:space="preserve"> A veces el modelo marca como espermatozoide algo que no lo es: una sombra, una mancha o un trozo de cola. En la diapositiva lo ven dibujado: tres espermatozoides bien marcados y una mancha con un contorno naranja que dice «¿mancha o célula?».</w:t>
-      </w:r>
-    </w:p>
-    <w:p>
-      <w:pPr>
-        <w:pBdr>
-          <w:left w:val="single" w:sz="24" w:space="8" w:color="BF9000"/>
-        </w:pBdr>
-        <w:spacing w:before="80" w:after="160"/>
-        <w:ind w:left="397"/>
-        <w:shd w:val="clear" w:color="auto" w:fill="FFF2CC"/>
-      </w:pPr>
-      <w:r>
-        <w:rPr/>
-        <w:t>A veces el modelo marca algo que parece un espermatozoide y no lo es. En biología se le llama falso positivo; en programación, pues, alucinación.</w:t>
-      </w:r>
     </w:p>
     <w:p>
       <w:r>
         <w:rPr/>
-        <w:t>Un falso positivo es eso: el modelo dice que hay algo donde no lo hay. En programación y en inteligencia artificial a esto también se le llama alucinación. Es un fenómeno conocido, y se presenta en modelos de muchos tipos. Les pasa en general cuando se topan con algo que se parece a lo que aprendieron.</w:t>
+        <w:t>A veces el modelo marca algo que parece un espermatozoide y no lo es: una sombra, una mancha o un trozo de cola. En la diapositiva lo ven dibujado: tres espermatozoides bien marcados y una mancha con un contorno naranja que dice «¿mancha o célula?». En biología se le llama falso positivo; en programación, pues, alucinación. Es un fenómeno conocido, y se presenta en modelos de muchos tipos.</w:t>
       </w:r>
     </w:p>
     <w:p>
@@ -4651,51 +1333,37 @@
     <w:p>
       <w:r>
         <w:rPr/>
-        <w:t>Existe también el error contrario, que es menos visible. Un falso negativo es no marcar un espermatozoide que sí está. Cuando el modelo se salta una célula, no hay contorno que revisar, y por eso es más difícil de notar que un falso positivo. Es otra razón para mirar la imagen entera y no solo los contornos que sí aparecen. Si ven en la foto una cabeza brillante que no tiene número, ese es un falso negativo, y también es útil saberlo.</w:t>
+        <w:t>Hay una idea que condiciona cómo se escucha el resto del curso. Una red neuronal no entiende qué es un espermatozoide. No tiene el concepto, no sabe de biología, no sabe qué es una célula ni para qué sirve contarla. Lo que tiene es una enorme colección de números ajustados, de modo que ante ciertos patrones de píxeles produce una salida que coincide con lo que las personas marcaron en los ejemplos. Es un reconocedor de patrones muy sofisticado, y nada más. Eso no le quita mérito, y sirve para razonar sobre cuándo va a funcionar y cuándo no.</w:t>
       </w:r>
     </w:p>
     <w:p>
       <w:r>
         <w:rPr/>
-        <w:t>Entre los dos tipos de error hay un equilibrio. Un modelo muy cuidadoso, que solo marca cuando está seguro, comete menos falsos positivos pero se salta más células. Uno muy generoso marca casi todo, pero se equivoca más seguido al marcar. Cómo se ajusta ese equilibrio es una decisión de diseño.</w:t>
+        <w:t>Si le muestro una imagen parecida a las de su entrenamiento, va a funcionar. Si le muestro algo muy distinto, no tiene cómo saber que se equivoca, y va a producir una salida con la misma seguridad aparente. Esa es la parte que más cuidado exige: el modelo no duda. Puede marcar algo con el mismo aspecto de firmeza con el que marca un espermatozoide perfecto. Por eso la revisión de las personas no es opcional.</w:t>
+      </w:r>
+    </w:p>
+    <w:p>
+      <w:r>
+        <w:rPr/>
+        <w:t>Existe también el error contrario, que es menos visible. Un falso negativo es no marcar un espermatozoide que sí está. Cuando el modelo se salta una célula, no hay contorno que revisar, y por eso es más difícil de notar que un falso positivo. Es otra razón para mirar la imagen entera y no solo los contornos que sí aparecen. Si ven en la foto una cabeza brillante que no tiene número, ese es un falso negativo, y también es útil saberlo. Entre los dos tipos de error hay un equilibrio. Un modelo muy cuidadoso, que solo marca cuando está seguro, comete menos falsos positivos pero se salta más células. Uno muy generoso marca casi todo, pero se equivoca más seguido al marcar. Cómo se ajusta ese equilibrio es una decisión de diseño.</w:t>
+      </w:r>
+    </w:p>
+    <w:p>
+      <w:r>
+        <w:rPr/>
+        <w:t>¿Y cómo se mejora? Con más datos, más variados y mejor etiquetados. Es decir, con más imágenes, de más condiciones, y con las marcas hechas con cuidado. Si aun así no alcanzara, habría que cambiar de arquitectura, que es la forma en la que está construida la red, y eso es una decisión mayor. Un modelo mejora con ejemplos de sus propios errores, y eso lo vemos en la última sesión. Mientras tanto, de aquí sale un hábito muy útil: revisar la imagen marcada antes de confiar en un número.</w:t>
+      </w:r>
+    </w:p>
+    <w:p>
+      <w:r>
+        <w:rPr/>
+        <w:t>Si alguien se pregunta si el modelo mejora solo con el uso, la respuesta es que no. Un modelo en línea no aprende de las imágenes que analiza. Para mejorarlo hay que reunir imágenes nuevas, etiquetarlas, entrenar otra vez en Colab y cambiar el archivo del modelo en el servidor. Eso es lo que vemos el martes.</w:t>
       </w:r>
     </w:p>
     <w:p>
       <w:r>
         <w:rPr/>
         <w:t>Y si un resultado les parece raro, hay una pequeña lista de cosas que pueden revisar. Primero, el tipo de imagen: ¿se parece a las que el modelo conoce? Segundo, el formato: ¿es un archivo original o uno que pasó por compresión? Tercero, el aviso que muestra el sitio: ¿dice algo sobre la imagen? Cuarto, el visor: ¿los contornos encierran lo que deberían? Y quinto, un conteo manual de una zona pequeña, para comparar con lo que marcó el modelo. Con esas cinco comprobaciones se sabe, casi siempre, si el resultado se puede usar.</w:t>
-      </w:r>
-    </w:p>
-    <w:p>
-      <w:r>
-        <w:rPr/>
-        <w:t>¿Y cómo se mejora? Con más datos, más variados y mejor etiquetados. Es decir, con más imágenes, de más condiciones, y con las marcas hechas con cuidado. Si aun así no alcanzara, habría que cambiar de arquitectura, que es la forma en la que está construida la red, y eso es una decisión mayor.</w:t>
-      </w:r>
-    </w:p>
-    <w:p>
-      <w:pPr>
-        <w:pBdr>
-          <w:left w:val="single" w:sz="24" w:space="8" w:color="BF9000"/>
-        </w:pBdr>
-        <w:spacing w:before="80" w:after="160"/>
-        <w:ind w:left="397"/>
-        <w:shd w:val="clear" w:color="auto" w:fill="FFF2CC"/>
-      </w:pPr>
-      <w:r>
-        <w:rPr/>
-        <w:t>Un modelo mejora con ejemplos de sus propios errores. Por eso el grupo es quien puede hacerlo mejor: tiene las imágenes y el criterio para etiquetarlas.</w:t>
-      </w:r>
-    </w:p>
-    <w:p>
-      <w:r>
-        <w:rPr/>
-        <w:t>Y de ahí sale lo que me parece más importante de este bloque. Un hábito muy útil es revisar la imagen marcada y guardar las imágenes que el modelo analiza con dificultad. Esas son las más valiosas para volver a entrenar.</w:t>
-      </w:r>
-    </w:p>
-    <w:p>
-      <w:r>
-        <w:rPr/>
-        <w:t>Si alguien se pregunta si el modelo mejora solo con el uso, la respuesta es que no. Un modelo en línea no aprende de las imágenes que analiza. Para mejorarlo hay que reunir imágenes nuevas, etiquetarlas, entrenar otra vez en Colab y cambiar el archivo del modelo en el servidor. Eso es lo que vemos el martes.</w:t>
       </w:r>
     </w:p>
     <w:p>
@@ -4711,80 +1379,7 @@
         <w:rPr>
           <w:i/>
         </w:rPr>
-        <w:t>1:26-1:32 · 6 min · 661 palabras, unos 3.6 min de habla</w:t>
-      </w:r>
-    </w:p>
-    <w:p>
-      <w:r>
-        <w:rPr>
-          <w:b/>
-        </w:rPr>
-        <w:t>Idea que debe quedar:</w:t>
-      </w:r>
-      <w:r>
-        <w:rPr/>
-        <w:t xml:space="preserve"> el CSV es el dato para trabajar, el PDF es el informe para compartir, y cada análisis es privado y queda guardado.</w:t>
-      </w:r>
-    </w:p>
-    <w:p>
-      <w:r>
-        <w:rPr>
-          <w:b/>
-        </w:rPr>
-        <w:t>Ideas, en orden:</w:t>
-      </w:r>
-    </w:p>
-    <w:p>
-      <w:pPr>
-        <w:pStyle w:val="ListBullet"/>
-      </w:pPr>
-      <w:r>
-        <w:rPr/>
-        <w:t>Al final de la página: Imprimir, Descargar PDF y Descargar CSV.</w:t>
-      </w:r>
-    </w:p>
-    <w:p>
-      <w:pPr>
-        <w:pStyle w:val="ListBullet"/>
-      </w:pPr>
-      <w:r>
-        <w:rPr/>
-        <w:t>CSV: una fila por espermatozoide, seis columnas, para seguir trabajando.</w:t>
-      </w:r>
-    </w:p>
-    <w:p>
-      <w:pPr>
-        <w:pStyle w:val="ListBullet"/>
-      </w:pPr>
-      <w:r>
-        <w:rPr/>
-        <w:t>PDF: informe con portada, una página por imagen y gráfica de promedios.</w:t>
-      </w:r>
-    </w:p>
-    <w:p>
-      <w:pPr>
-        <w:pStyle w:val="ListBullet"/>
-      </w:pPr>
-      <w:r>
-        <w:rPr/>
-        <w:t>«Mis análisis»: qué se guarda y qué no.</w:t>
-      </w:r>
-    </w:p>
-    <w:p>
-      <w:pPr>
-        <w:pStyle w:val="ListBullet"/>
-      </w:pPr>
-      <w:r>
-        <w:rPr/>
-        <w:t>Privacidad: cada análisis es de quien lo hizo; guardar los originales.</w:t>
-      </w:r>
-    </w:p>
-    <w:p>
-      <w:r>
-        <w:rPr>
-          <w:b/>
-        </w:rPr>
-        <w:t>Texto para decir:</w:t>
+        <w:t>1:23-1:29 · 6 min · 602 palabras, unos 3.4 min de habla</w:t>
       </w:r>
     </w:p>
     <w:p>
@@ -4804,13 +1399,7 @@
     <w:p>
       <w:r>
         <w:rPr/>
-        <w:t>El CSV es un archivo de texto con una fila por espermatozoide y seis columnas: la imagen de la que viene, el número del espermatozoide, el área y el largo en píxeles, y el área y el largo en micras. Se abre en una hoja de cálculo o con código, y sirve para seguir trabajando con los datos: hacer comparaciones, estadística, gráficas propias. Como la primera columna trae el nombre de la imagen, si subieron varias pueden separar los datos por imagen o por condición, ordenarlos, filtrarlos, calcular promedios por grupo y hacer sus propias gráficas con las herramientas que ya usan.</w:t>
-      </w:r>
-    </w:p>
-    <w:p>
-      <w:r>
-        <w:rPr/>
-        <w:t>Esta es la razón por la que dije que el sitio no interpreta los resultados. El sitio llega hasta los datos; lo que sigue, la comparación entre condiciones y las pruebas estadísticas, es trabajo del grupo, y el CSV es el punto de partida.</w:t>
+        <w:t>El CSV es un archivo de texto con una fila por espermatozoide y seis columnas: la imagen de la que viene, el número del espermatozoide, el área y el largo en píxeles, y el área y el largo en micras. Se abre en una hoja de cálculo o con código, y sirve para seguir trabajando con los datos: hacer comparaciones, estadística, gráficas propias. Como la primera columna trae el nombre de la imagen, si subieron varias pueden separar los datos por imagen o por condición, ordenarlos, filtrarlos, calcular promedios por grupo y hacer sus propias gráficas con las herramientas que ya usan. Esta es la razón por la que dije que el sitio no interpreta los resultados. El sitio llega hasta los datos; lo que sigue, la comparación entre condiciones y las pruebas estadísticas, es trabajo del grupo, y el CSV es el punto de partida.</w:t>
       </w:r>
     </w:p>
     <w:p>
@@ -4820,23 +1409,9 @@
       </w:r>
     </w:p>
     <w:p>
-      <w:pPr>
-        <w:pBdr>
-          <w:left w:val="single" w:sz="24" w:space="8" w:color="BF9000"/>
-        </w:pBdr>
-        <w:spacing w:before="80" w:after="160"/>
-        <w:ind w:left="397"/>
-        <w:shd w:val="clear" w:color="auto" w:fill="FFF2CC"/>
-      </w:pPr>
       <w:r>
         <w:rPr/>
-        <w:t>El CSV es el dato para trabajar. El PDF es el informe para compartir. Conviene guardar los dos.</w:t>
-      </w:r>
-    </w:p>
-    <w:p>
-      <w:r>
-        <w:rPr/>
-        <w:t>Y el botón de Imprimir oculta el menú y los botones, y deja solo el análisis, para imprimir limpio.</w:t>
+        <w:t>El CSV es el dato para trabajar. El PDF es el informe para compartir. Conviene guardar los dos. Y el botón de Imprimir oculta el menú y los botones, y deja solo el análisis, para imprimir limpio.</w:t>
       </w:r>
     </w:p>
     <w:p>
@@ -4854,61 +1429,21 @@
       </w:r>
     </w:p>
     <w:p>
-      <w:pPr>
-        <w:pBdr>
-          <w:left w:val="single" w:sz="24" w:space="8" w:color="BF9000"/>
-        </w:pBdr>
-        <w:spacing w:before="80" w:after="160"/>
-        <w:ind w:left="397"/>
-        <w:shd w:val="clear" w:color="auto" w:fill="FFF2CC"/>
-      </w:pPr>
       <w:r>
         <w:rPr/>
-        <w:t>En «Mis análisis» queda una fila por cada análisis, con sus enlaces al PDF y al CSV. Al abrirlo, se ve igual que cuando terminó.</w:t>
+        <w:t>Sobre qué se guarda y qué no: el sitio guarda los resultados, una copia reducida de la imagen marcada y el PDF. Lo que no guarda son las imágenes originales: se borran del servidor en cuanto termina el análisis. Las imágenes que suben se borran del servidor cuando termina el análisis, así que guarden sus originales en su propia computadora. Eso significa que si quieren volver a ver o volver a analizar una imagen, tienen que conservar su original. El sitio no se las puede devolver.</w:t>
       </w:r>
     </w:p>
     <w:p>
       <w:r>
         <w:rPr/>
-        <w:t>Hablemos de qué se guarda y qué no, porque es importante para la privacidad. El sitio guarda los resultados, una copia reducida de la imagen marcada y el PDF. Lo que no guarda son las imágenes originales: se borran del servidor en cuanto termina el análisis.</w:t>
-      </w:r>
-    </w:p>
-    <w:p>
-      <w:pPr>
-        <w:pBdr>
-          <w:left w:val="single" w:sz="24" w:space="8" w:color="BF9000"/>
-        </w:pBdr>
-        <w:spacing w:before="80" w:after="160"/>
-        <w:ind w:left="397"/>
-        <w:shd w:val="clear" w:color="auto" w:fill="FFF2CC"/>
-      </w:pPr>
-      <w:r>
-        <w:rPr/>
-        <w:t>Las imágenes que suben se borran del servidor cuando termina el análisis. Guarden sus originales en su propia computadora.</w:t>
+        <w:t>Esto tiene una consecuencia a favor de la privacidad: mientras menos material de las personas guarde el servidor, menos hay que proteger. Y sobre la privacidad de los análisis: cada análisis es de quien lo hizo, y solo esa persona puede verlo. Nadie más puede abrirlo.</w:t>
       </w:r>
     </w:p>
     <w:p>
       <w:r>
         <w:rPr/>
-        <w:t>Eso significa que si quieren volver a ver o volver a analizar una imagen, tienen que conservar su original en su propia computadora. El sitio no se las puede devolver.</w:t>
-      </w:r>
-    </w:p>
-    <w:p>
-      <w:r>
-        <w:rPr/>
-        <w:t>Esto tiene una consecuencia a favor de la privacidad: mientras menos material de las personas guarde el servidor, menos hay que proteger. Lo que sí se guarda es lo necesario para consultar el análisis después: los resultados, una copia reducida de la imagen marcada y el informe en PDF.</w:t>
-      </w:r>
-    </w:p>
-    <w:p>
-      <w:r>
-        <w:rPr/>
-        <w:t>Y una buena práctica de orden: guarden en una misma carpeta los originales, el CSV y el PDF de cada análisis, con el mismo nombre de condición. Dentro de unos meses, cuando alguien pregunte de dónde salió un número, esa carpeta va a contestar la pregunta.</w:t>
-      </w:r>
-    </w:p>
-    <w:p>
-      <w:r>
-        <w:rPr/>
-        <w:t>Y sobre la privacidad: cada análisis es de quien lo hizo, y solo esa persona puede verlo. Nadie más puede abrirlo.</w:t>
+        <w:t>Una buena práctica de orden: guarden en una misma carpeta los originales, el CSV y el PDF de cada análisis, con el mismo nombre de condición. Dentro de unos meses, cuando alguien pregunte de dónde salió un número, esa carpeta va a contestar la pregunta.</w:t>
       </w:r>
     </w:p>
     <w:p>
@@ -4918,9 +1453,11 @@
         </w:rPr>
         <w:t>[Acción: hacer clic en «Salir», arriba a la derecha; el sitio vuelve a mostrar «Iniciar sesión».]</w:t>
       </w:r>
+    </w:p>
+    <w:p>
       <w:r>
         <w:rPr/>
-        <w:t xml:space="preserve"> Hago clic en «Salir», y el sitio vuelve a mostrar «Iniciar sesión». Con esto cerramos el recorrido del sistema.</w:t>
+        <w:t>Hago clic en «Salir», y el sitio vuelve a mostrar «Iniciar sesión». Con esto cerramos el recorrido del sistema.</w:t>
       </w:r>
     </w:p>
     <w:p>
@@ -4936,62 +1473,7 @@
         <w:rPr>
           <w:i/>
         </w:rPr>
-        <w:t>1:32-1:36 · 4 min · 464 palabras, unos 2.5 min de habla</w:t>
-      </w:r>
-    </w:p>
-    <w:p>
-      <w:r>
-        <w:rPr>
-          <w:b/>
-        </w:rPr>
-        <w:t>Idea que debe quedar:</w:t>
-      </w:r>
-      <w:r>
-        <w:rPr/>
-        <w:t xml:space="preserve"> el sitio convierte una fotografía en datos confiables y descargables, y la siguiente pregunta es cómo sabe la red dónde hay un espermatozoide.</w:t>
-      </w:r>
-    </w:p>
-    <w:p>
-      <w:r>
-        <w:rPr>
-          <w:b/>
-        </w:rPr>
-        <w:t>Ideas, en orden:</w:t>
-      </w:r>
-    </w:p>
-    <w:p>
-      <w:pPr>
-        <w:pStyle w:val="ListBullet"/>
-      </w:pPr>
-      <w:r>
-        <w:rPr/>
-        <w:t>Resumen en cuatro frases: el problema, la idea, el sitio y la privacidad.</w:t>
-      </w:r>
-    </w:p>
-    <w:p>
-      <w:pPr>
-        <w:pStyle w:val="ListBullet"/>
-      </w:pPr>
-      <w:r>
-        <w:rPr/>
-        <w:t>Cinco hábitos para usar el sitio.</w:t>
-      </w:r>
-    </w:p>
-    <w:p>
-      <w:pPr>
-        <w:pStyle w:val="ListBullet"/>
-      </w:pPr>
-      <w:r>
-        <w:rPr/>
-        <w:t>La pregunta de mañana y el adelanto del lunes.</w:t>
-      </w:r>
-    </w:p>
-    <w:p>
-      <w:r>
-        <w:rPr>
-          <w:b/>
-        </w:rPr>
-        <w:t>Texto para decir:</w:t>
+        <w:t>1:29-1:33 · 4 min · 394 palabras, unos 2.3 min de habla</w:t>
       </w:r>
     </w:p>
     <w:p>
@@ -5009,27 +1491,7 @@
     <w:p>
       <w:r>
         <w:rPr/>
-        <w:t>Para cerrar, un resumen de lo que vimos en dos horas, en cuatro frases.</w:t>
-      </w:r>
-    </w:p>
-    <w:p>
-      <w:pPr>
-        <w:pBdr>
-          <w:left w:val="single" w:sz="24" w:space="8" w:color="BF9000"/>
-        </w:pBdr>
-        <w:spacing w:before="80" w:after="160"/>
-        <w:ind w:left="397"/>
-        <w:shd w:val="clear" w:color="auto" w:fill="FFF2CC"/>
-      </w:pPr>
-      <w:r>
-        <w:rPr/>
-        <w:t>Para cerrar: el problema era contar y medir a mano; la idea, que la red localiza y el código mide; el sitio, que convierte una foto en datos que se pueden revisar y descargar; y cada análisis es de quien lo hizo.</w:t>
-      </w:r>
-    </w:p>
-    <w:p>
-      <w:r>
-        <w:rPr/>
-        <w:t>Si tuvieran que quedarse con una sola idea de hoy, que sea la segunda: la red localiza y el código mide. De ahí salen casi todas las decisiones que vieron en el sitio, desde los avisos hasta la escala declarada en cada resultado.</w:t>
+        <w:t>Para cerrar, un resumen de lo que vimos en estas dos horas. El problema era contar y medir a mano. La idea, que la red localiza y el código mide. El sitio convierte una foto en datos que se pueden revisar y descargar. Y cada análisis es de quien lo hizo. Si tuvieran que quedarse con una sola idea de hoy, que sea la segunda: la red localiza y el código mide. De ahí salen casi todas las decisiones que vieron en el sitio, desde los avisos hasta la escala declarada en cada resultado.</w:t>
       </w:r>
     </w:p>
     <w:p>
@@ -5041,33 +1503,13 @@
           <w:b/>
           <w:color w:val="1F4E79"/>
         </w:rPr>
-        <w:t>[Diapositiva · Cinco hábitos para usar el sitio]</w:t>
+        <w:t>[Diapositiva · Cuatro hábitos para resultados confiables]</w:t>
       </w:r>
     </w:p>
     <w:p>
       <w:r>
         <w:rPr/>
-        <w:t>Y les dejo cinco hábitos para usar el sitio de la mejor manera.</w:t>
-      </w:r>
-    </w:p>
-    <w:p>
-      <w:pPr>
-        <w:pBdr>
-          <w:left w:val="single" w:sz="24" w:space="8" w:color="BF9000"/>
-        </w:pBdr>
-        <w:spacing w:before="80" w:after="160"/>
-        <w:ind w:left="397"/>
-        <w:shd w:val="clear" w:color="auto" w:fill="FFF2CC"/>
-      </w:pPr>
-      <w:r>
-        <w:rPr/>
-        <w:t>Cinco hábitos para llevarse: usar los archivos originales, agrupar las imágenes por tipo, revisar la imagen marcada antes de confiar en un número, guardar el CSV y guardar las imágenes difíciles.</w:t>
-      </w:r>
-    </w:p>
-    <w:p>
-      <w:r>
-        <w:rPr/>
-        <w:t>Los cinco tienen una razón de fondo parecida: cuidar lo que entra al sistema y lo que sale de él. Con originales y fotos agrupadas, los resultados se pueden comparar. Revisando la imagen marcada, no se confía a ciegas. El CSV es lo que permite seguir trabajando después. Y las imágenes difíciles son las que más enseñan al modelo cuando llegue el momento de volver a entrenarlo.</w:t>
+        <w:t>Y les dejo cuatro hábitos para llevarse: usar los archivos originales, agrupar las imágenes por tipo, revisar la imagen marcada antes de confiar en un número y guardar el CSV. Los cuatro tienen una razón de fondo parecida: cuidar lo que entra al sistema y lo que sale de él. Con originales y fotos agrupadas, los resultados se pueden comparar. Revisando la imagen marcada, no se confía a ciegas. Y el CSV es lo que permite seguir trabajando con los datos después.</w:t>
       </w:r>
     </w:p>
     <w:p>
@@ -5085,27 +1527,7 @@
     <w:p>
       <w:r>
         <w:rPr/>
-        <w:t>Y termino con una pregunta que seguramente ya se hicieron varios.</w:t>
-      </w:r>
-    </w:p>
-    <w:p>
-      <w:pPr>
-        <w:pBdr>
-          <w:left w:val="single" w:sz="24" w:space="8" w:color="BF9000"/>
-        </w:pBdr>
-        <w:spacing w:before="80" w:after="160"/>
-        <w:ind w:left="397"/>
-        <w:shd w:val="clear" w:color="auto" w:fill="FFF2CC"/>
-      </w:pPr>
-      <w:r>
-        <w:rPr/>
-        <w:t>Seguramente muchos se preguntan cómo sabe el sistema dónde hay un espermatozoide... bueno, esa es la pregunta de mañana: cómo aprende una computadora.</w:t>
-      </w:r>
-    </w:p>
-    <w:p>
-      <w:r>
-        <w:rPr/>
-        <w:t>Hoy vimos que la red localiza, pero no vimos cómo aprendió a hacerlo. Eso es lo que vamos a ver mañana, sábado a las nueve de la mañana: qué es una neurona, qué es una red, cómo mira una imagen una red convolucional y cómo aprende a partir de ejemplos. Es la sesión más pesada, así que los espero con ganas.</w:t>
+        <w:t>Y termino con una pregunta que seguramente ya se hicieron varios. Seguramente muchos se preguntan cómo sabe el sistema dónde hay un espermatozoide... bueno, esa es la pregunta de mañana: cómo aprende una computadora. Hoy vimos que la red localiza, pero no vimos cómo aprendió a hacerlo. Eso es lo que vamos a ver mañana, sábado a las nueve de la mañana: qué es una neurona, qué es una red, cómo mira una imagen una red convolucional y cómo aprende a partir de ejemplos. Es la sesión más pesada, así que los espero con ganas.</w:t>
       </w:r>
     </w:p>
     <w:p>
@@ -5115,23 +1537,9 @@
       </w:r>
     </w:p>
     <w:p>
-      <w:pPr>
-        <w:pBdr>
-          <w:left w:val="single" w:sz="24" w:space="8" w:color="BF9000"/>
-        </w:pBdr>
-        <w:spacing w:before="80" w:after="160"/>
-        <w:ind w:left="397"/>
-        <w:shd w:val="clear" w:color="auto" w:fill="FFF2CC"/>
-      </w:pPr>
       <w:r>
         <w:rPr/>
-        <w:t>El lunes vemos cómo funciona por dentro, y ahí les cuento los retos: las células empalmadas, los falsos positivos y la escala. Gracias por conectarse.</w:t>
-      </w:r>
-    </w:p>
-    <w:p>
-      <w:r>
-        <w:rPr/>
-        <w:t>Y el lunes abrimos el sistema por dentro: la parte de atrás, qué pasa cuando suben una imagen, y los retos que mencioné, como las células empalmadas, los falsos positivos y la escala. Gracias por conectarse, y quedo atento a las preguntas.</w:t>
+        <w:t>El lunes vemos cómo funciona por dentro, y ahí les cuento los retos: las células empalmadas, los falsos positivos y la escala. Gracias por conectarse, y quedo atento a las preguntas.</w:t>
       </w:r>
     </w:p>
     <w:p>
@@ -5444,7 +1852,7 @@
               <w:rPr>
                 <w:sz w:val="20"/>
               </w:rPr>
-              <w:t>Lo que vimos hoy · Cinco hábitos para usar el sitio · ¿Cómo sabe el sistema dónde hay un espermatozoide?</w:t>
+              <w:t>Lo que vimos hoy · Cuatro hábitos para resultados confiables · ¿Cómo sabe el sistema dónde hay un espermatozoide?</w:t>
             </w:r>
           </w:p>
         </w:tc>

</xml_diff>